<commit_message>
docs(project): declare Helmsman with the LLM Wiki in docx, deck and script
Paragraph [58] of the docx now names both methods and how they split
the work: the author answers product questions, the agent decides the
technical ones and runs research subagents when a decision waits on an
external fact. The reference list gains the agent-dotfiles entry. The
deck moves the AI declaration to its own slide 11 with the two methods
side by side, slide 10 keeps the classification, and the script gains
the matching card, the renumbering and three likely questions.

Closes #72
</commit_message>
<xml_diff>
--- a/dist/projeto-de-pesquisa.docx
+++ b/dist/projeto-de-pesquisa.docx
@@ -1402,7 +1402,7 @@
           <w:b w:val="0"/>
           <w:i w:val="0"/>
         </w:rPr>
-        <w:t xml:space="preserve">O levantamento das fontes deste projeto foi feito com apoio de um </w:t>
+        <w:t xml:space="preserve">Duas partes deste projeto foram feitas com apoio de um agente de codificação. O levantamento das fontes usou um </w:t>
       </w:r>
       <w:r>
         <w:rPr>
@@ -1416,7 +1416,21 @@
           <w:b w:val="0"/>
           <w:i w:val="0"/>
         </w:rPr>
-        <w:t xml:space="preserve">, padrão descrito por Karpathy (2026) e mantido no repositório do projeto (YuukiFST, 2026b). Nesse arranjo, as fontes brutas ficam guardadas sem alteração, um agente de codificação escreve as páginas de síntese, cada operação entra em um registro cronológico e as dúvidas vão para uma fila de revisão. O autor curou as fontes e revisou cada síntese, e cada afirmação citada neste texto foi conferida na obra original, com o trecho copiado ao lado do veredito. A Portaria CNPq nº 2.664/2026 pede que o uso de inteligência artificial generativa seja declarado com a ferramenta e a finalidade (Brasil, 2026). A ferramenta foi o Claude Code, e a finalidade foi que o agente entendesse o tema do projeto e ajudasse a buscar mais artigos sobre o tema escolhido. O autor responde pelo texto final.</w:t>
+        <w:t xml:space="preserve">, padrão descrito por Karpathy (2026) e mantido no repositório do projeto (YuukiFST, 2026c). Nesse arranjo, as fontes brutas ficam guardadas sem alteração, o agente escreve as páginas de síntese, cada operação entra em um registro cronológico e as dúvidas vão para uma fila de revisão. O autor curou as fontes e revisou cada síntese, e cada afirmação citada neste texto foi conferida na obra original, com o trecho copiado ao lado do veredito. A especificação do Finn usou o Helmsman, uma rotina escrita pelo autor (YuukiFST, 2026a) que separa as perguntas de um projeto em dois grupos: o que o sistema deve fazer, que só o autor responde, e como construir, que o agente decide sozinho e registra como </w:t>
+      </w:r>
+      <w:r>
+        <w:rPr>
+          <w:b w:val="0"/>
+          <w:i/>
+        </w:rPr>
+        <w:t xml:space="preserve">ticket</w:t>
+      </w:r>
+      <w:r>
+        <w:rPr>
+          <w:b w:val="0"/>
+          <w:i w:val="0"/>
+        </w:rPr>
+        <w:t xml:space="preserve">, com as alternativas e o critério. Quando uma decisão depende de um fato externo, como o preço de uma API, o agente dispara subagentes de pesquisa e só decide com o resultado em mãos. A Portaria CNPq nº 2.664/2026 pede que o uso de inteligência artificial generativa seja declarado com a ferramenta e a finalidade (Brasil, 2026). A ferramenta foi o Claude Code, e a finalidade foi entender o tema do projeto, buscar mais artigos sobre ele e registrar as decisões de produto e de pilha do Finn antes do experimento. O autor responde pelo texto final e por cada decisão de produto.</w:t>
       </w:r>
     </w:p>
     <w:p>
@@ -1514,7 +1528,7 @@
           <w:b w:val="0"/>
           <w:i w:val="0"/>
         </w:rPr>
-        <w:t xml:space="preserve"> de sistema maior, e traz subagentes, permissões e compactação de contexto. As versões serão fixadas na adoção e registradas no repositório (YuukiFST, 2026b). Este projeto não escreve </w:t>
+        <w:t xml:space="preserve"> de sistema maior, e traz subagentes, permissões e compactação de contexto. As versões serão fixadas na adoção e registradas no repositório (YuukiFST, 2026c). Este projeto não escreve </w:t>
       </w:r>
       <w:r>
         <w:rPr>
@@ -1556,7 +1570,7 @@
           <w:b w:val="0"/>
           <w:i w:val="0"/>
         </w:rPr>
-        <w:t xml:space="preserve">O produto será o Finn, um SaaS multiempresa em que a empresa cliente fala com o próprio financeiro por voz e recebe lançamento, relatório e aviso no celular (YuukiFST, 2026a). As decisões de produto e de pilha foram registradas antes deste experimento em 21 </w:t>
+        <w:t xml:space="preserve">O produto será o Finn, um SaaS multiempresa em que a empresa cliente fala com o próprio financeiro por voz e recebe lançamento, relatório e aviso no celular (YuukiFST, 2026b). As decisões de produto e de pilha foram registradas antes deste experimento em 21 </w:t>
       </w:r>
       <w:r>
         <w:rPr>
@@ -4019,7 +4033,7 @@
           <w:b w:val="0"/>
           <w:i w:val="0"/>
         </w:rPr>
-        <w:t xml:space="preserve">YUUKIFST. Finn: SaaS universal de financeiro por voz. 2026a. Repositório de código. Disponível em: https://github.com/YuukiFST/Finn. Acesso em: 14 set. 2026.</w:t>
+        <w:t xml:space="preserve">YUUKIFST. agent-dotfiles: skill Helmsman, mapa de decisões para agentes de codificação. 2026a. Repositório de código. Disponível em: https://github.com/YuukiFST/agent-dotfiles/tree/main/skills/helmsman. Acesso em: 15 set. 2026.</w:t>
       </w:r>
     </w:p>
     <w:p>
@@ -4031,7 +4045,19 @@
           <w:b w:val="0"/>
           <w:i w:val="0"/>
         </w:rPr>
-        <w:t xml:space="preserve">YUUKIFST. harness-bench: executor, prompts, testes de aceitação, dados brutos e scripts de análise deste projeto. 2026b. Repositório de código. Disponível em: https://github.com/YuukiFST/harness-bench. Acesso em: 28 ago. 2026.</w:t>
+        <w:t xml:space="preserve">YUUKIFST. Finn: SaaS universal de financeiro por voz. 2026b. Repositório de código. Disponível em: https://github.com/YuukiFST/Finn. Acesso em: 14 set. 2026.</w:t>
+      </w:r>
+    </w:p>
+    <w:p>
+      <w:pPr>
+        <w:spacing w:after="240" w:line="240" w:lineRule="auto"/>
+      </w:pPr>
+      <w:r>
+        <w:rPr>
+          <w:b w:val="0"/>
+          <w:i w:val="0"/>
+        </w:rPr>
+        <w:t xml:space="preserve">YUUKIFST. harness-bench: executor, prompts, testes de aceitação, dados brutos e scripts de análise deste projeto. 2026c. Repositório de código. Disponível em: https://github.com/YuukiFST/harness-bench. Acesso em: 28 ago. 2026.</w:t>
       </w:r>
     </w:p>
     <w:p>

</xml_diff>

<commit_message>
docs(project): make the subtitle delimit the theme instead of naming the method
The subtitle read "tokens e taxa de sucesso do OpenCode e do pi na construção
de um mesmo SaaS sob um mesmo modelo", which presents the two tools and the
SaaS as the object of study. They are the way the study is run; the object is
the effect of the harness on tokens and success rate with the model held
fixed, as the theme paragraph [29] already says. The subtitle now mirrors
[29]; the general objective [33] and H1 [45] state the harness effect first
and name OpenCode, pi and Finn as arms and product. The script's opening and
the two cards that quote [33] and [45] follow, as do the explainer notes.
Each docx edit has its dated script under tools/. Closes #74
</commit_message>
<xml_diff>
--- a/dist/projeto-de-pesquisa.docx
+++ b/dist/projeto-de-pesquisa.docx
@@ -78,7 +78,7 @@
           <w:i w:val="0"/>
           <w:sz w:val="32"/>
         </w:rPr>
-        <w:t xml:space="preserve">O HARNESS COMO DECISÃO DO DESENVOLVEDOR: TOKENS E TAXA DE SUCESSO DO OPENCODE E DO PI NA CONSTRUÇÃO DE UM MESMO SAAS SOB UM MESMO MODELO</w:t>
+        <w:t xml:space="preserve">O HARNESS COMO DECISÃO DO DESENVOLVEDOR: EFEITO SOBRE TOKENS E TAXA DE SUCESSO DE AGENTES DE CODIFICAÇÃO NA CONSTRUÇÃO DE UM MESMO PRODUTO COM O MODELO DE LINGUAGEM FIXO</w:t>
       </w:r>
     </w:p>
     <w:p/>
@@ -136,7 +136,7 @@
           <w:i w:val="0"/>
           <w:sz w:val="28"/>
         </w:rPr>
-        <w:t xml:space="preserve">O HARNESS COMO DECISÃO DO DESENVOLVEDOR: TOKENS E TAXA DE SUCESSO DO OPENCODE E DO PI NA CONSTRUÇÃO DE UM MESMO SAAS SOB UM MESMO MODELO</w:t>
+        <w:t xml:space="preserve">O HARNESS COMO DECISÃO DO DESENVOLVEDOR: EFEITO SOBRE TOKENS E TAXA DE SUCESSO DE AGENTES DE CODIFICAÇÃO NA CONSTRUÇÃO DE UM MESMO PRODUTO COM O MODELO DE LINGUAGEM FIXO</w:t>
       </w:r>
     </w:p>
     <w:p>
@@ -546,7 +546,35 @@
           <w:b w:val="0"/>
           <w:i w:val="0"/>
         </w:rPr>
-        <w:t xml:space="preserve">Medir, com o modelo de linguagem mantido fixo, a diferença de tokens consumidos e de taxa de sucesso entre o OpenCode e o pi na construção do mesmo SaaS a partir da mesma especificação, separando a parte dessa diferença que vem da carga fixa por requisição, e entregar o resultado como critério de escolha reproduzível pelo desenvolvedor.</w:t>
+        <w:t xml:space="preserve">Medir, com o modelo de linguagem mantido fixo, a diferença de tokens consumidos e de taxa de sucesso atribuível ao </w:t>
+      </w:r>
+      <w:r>
+        <w:rPr>
+          <w:b w:val="0"/>
+          <w:i/>
+        </w:rPr>
+        <w:t xml:space="preserve">harness</w:t>
+      </w:r>
+      <w:r>
+        <w:rPr>
+          <w:b w:val="0"/>
+          <w:i w:val="0"/>
+        </w:rPr>
+        <w:t xml:space="preserve"> na construção do mesmo produto de software a partir da mesma especificação, tomando como braços dois </w:t>
+      </w:r>
+      <w:r>
+        <w:rPr>
+          <w:b w:val="0"/>
+          <w:i/>
+        </w:rPr>
+        <w:t xml:space="preserve">harnesses</w:t>
+      </w:r>
+      <w:r>
+        <w:rPr>
+          <w:b w:val="0"/>
+          <w:i w:val="0"/>
+        </w:rPr>
+        <w:t xml:space="preserve"> de código aberto, o OpenCode e o pi, separando a parte dessa diferença que vem da carga fixa por requisição, e entregar o resultado como critério de escolha reproduzível pelo desenvolvedor.</w:t>
       </w:r>
     </w:p>
     <w:p>
@@ -837,7 +865,21 @@
           <w:b w:val="0"/>
           <w:i w:val="0"/>
         </w:rPr>
-        <w:t xml:space="preserve">H1: entre o OpenCode e o pi executando o mesmo modelo, a diferença de tokens gastos para construir o Finn a partir da mesma especificação é de ordem prática relevante para quem paga a conta, comparável à diferença obtida ao se trocar de modelo sob um </w:t>
+        <w:t xml:space="preserve">H1: entre dois </w:t>
+      </w:r>
+      <w:r>
+        <w:rPr>
+          <w:b w:val="0"/>
+          <w:i/>
+        </w:rPr>
+        <w:t xml:space="preserve">harnesses</w:t>
+      </w:r>
+      <w:r>
+        <w:rPr>
+          <w:b w:val="0"/>
+          <w:i w:val="0"/>
+        </w:rPr>
+        <w:t xml:space="preserve"> executando o mesmo modelo, o OpenCode e o pi, a diferença de tokens gastos para construir o mesmo produto, o Finn, a partir da mesma especificação é de ordem prática relevante para quem paga a conta, comparável à diferença obtida ao se trocar de modelo sob um </w:t>
       </w:r>
       <w:r>
         <w:rPr>

</xml_diff>

<commit_message>
docs(project): remove causal closers and colon cadence from the prose
Two passes over paragraphs [41]-[181]: no-ai-slop against the patterns
in docs/research/estrutura-do-projeto-e-revisao.md section 5, then
humanizer. Facts, numbers, denominators and citations unchanged; direct
quotes untouched. Also points the summary entry of section 2 to page 2,
where Word paginates it.
</commit_message>
<xml_diff>
--- a/dist/projeto-de-pesquisa.docx
+++ b/dist/projeto-de-pesquisa.docx
@@ -513,7 +513,7 @@
         </w:rPr>
         <w:t xml:space="preserve">2 REFERENCIAL TEÓRICO</w:t>
         <w:tab/>
-        <w:t xml:space="preserve">3</w:t>
+        <w:t xml:space="preserve">2</w:t>
       </w:r>
     </w:p>
     <w:p>
@@ -703,7 +703,7 @@
           <w:iCs w:val="0"/>
           <w:rtl w:val="0"/>
         </w:rPr>
-        <w:t xml:space="preserve">As ferramentas seguem o mesmo movimento: Next.js, TanStack e Effect se adaptam ao trabalho de agentes. Escolher o modelo deixou de bastar; o desenvolvedor, na assinatura, e a empresa, em escala, precisam conhecer o que avança junto, e o </w:t>
+        <w:t xml:space="preserve">Ferramentas como Next.js, TanStack e Effect também se adaptam ao trabalho de agentes. Escolher o modelo deixou de bastar; o desenvolvedor, na assinatura, e a empresa, em escala, precisam conhecer o que avança junto, e o </w:t>
       </w:r>
       <w:r>
         <w:rPr>
@@ -723,7 +723,7 @@
           <w:iCs w:val="0"/>
           <w:rtl w:val="0"/>
         </w:rPr>
-        <w:t xml:space="preserve"> é a parte dessa escolha que ninguém mediu na construção de um produto inteiro, já que as comparações publicadas usam tarefas isoladas. Este projeto mede esse custo construindo o Finn duas vezes, com o OpenCode e com o pi, sobre o mesmo modelo e a mesma especificação, com os tokens contados fora do </w:t>
+        <w:t xml:space="preserve"> é a parte dessa escolha que ninguém mediu na construção de um produto inteiro. As comparações publicadas usam tarefas isoladas. Este projeto mede esse custo construindo o Finn duas vezes, com o OpenCode e com o pi, sobre o mesmo modelo e a mesma especificação, com os tokens contados fora do </w:t>
       </w:r>
       <w:r>
         <w:rPr>
@@ -1700,7 +1700,7 @@
           <w:iCs w:val="0"/>
           <w:rtl w:val="0"/>
         </w:rPr>
-        <w:t xml:space="preserve">” (Ning et al., 2026, tradução nossa). Lee et al. (2026, Tabela 7) mostram que essas decisões são isoláveis: uma busca que edita só o código do </w:t>
+        <w:t xml:space="preserve">” (Ning et al., 2026, tradução nossa). Lee et al. (2026, Tabela 7) mostram que essas decisões são isoláveis. Uma busca que edita só o código do </w:t>
       </w:r>
       <w:r>
         <w:rPr>
@@ -1720,7 +1720,7 @@
           <w:iCs w:val="0"/>
           <w:rtl w:val="0"/>
         </w:rPr>
-        <w:t xml:space="preserve">, com o modelo fixo, chegou a 76,4% no TerminalBench-2 (89 tarefas, Claude Opus 4.6) contra 74,7% do Terminus-KIRA, de onde partiu. Este projeto responde pelo lado da medição: separa, em cada requisição, a carga fixa do conteúdo da conversa, ao longo de um produto completo.</w:t>
+        <w:t xml:space="preserve">, com o modelo fixo, chegou a 76,4% no TerminalBench-2 (89 tarefas, Claude Opus 4.6) contra 74,7% do Terminus-KIRA, de onde partiu. Este projeto responde pelo lado da medição e separa, em cada requisição, a carga fixa do conteúdo da conversa, ao longo de um produto completo.</w:t>
       </w:r>
     </w:p>
     <w:p>
@@ -1816,7 +1816,7 @@
           <w:iCs w:val="0"/>
           <w:rtl w:val="0"/>
         </w:rPr>
-        <w:t xml:space="preserve">As métricas serão tokens por construção, ao lado da fração de testes aprovados, e o Succ/Mtok (sucessos por milhão de tokens) de Lin et al. (2026). O efeito é específico do modelo e pode inverter de sinal: no Holistic Agent Leaderboard, os modelos da Anthropic vão melhor com o BrowserUse e os da OpenAI com o SeeAct (Kapoor et al., 2025), e o FrontierHarness registra, para o Claude Code, </w:t>
+        <w:t xml:space="preserve">As métricas serão tokens por construção, ao lado da fração de testes aprovados, e o Succ/Mtok (sucessos por milhão de tokens) de Lin et al. (2026). O efeito é específico do modelo e pode inverter de sinal. No Holistic Agent Leaderboard, os modelos da Anthropic vão melhor com o BrowserUse e os da OpenAI com o SeeAct (Kapoor et al., 2025), e o FrontierHarness registra, para o Claude Code, </w:t>
       </w:r>
       <w:r>
         <w:rPr>
@@ -1876,7 +1876,7 @@
           <w:iCs w:val="0"/>
           <w:rtl w:val="0"/>
         </w:rPr>
-        <w:t xml:space="preserve">Quanto à finalidade, a pesquisa é aplicada; o produto é um critério de escolha para o desenvolvedor e a empresa. Quanto à abordagem, é quali-quantitativa: tokens e sucesso são medidas quantitativas, e a atribuição da diferença à carga fixa ou aos passos é qualitativa. Quanto aos objetivos, é exploratória, já que dois </w:t>
+        <w:t xml:space="preserve">Quanto à finalidade, a pesquisa é aplicada; o produto é um critério de escolha para o desenvolvedor e a empresa. Quanto à abordagem, é quali-quantitativa: tokens e sucesso são medidas quantitativas, e a atribuição da diferença à carga fixa ou aos passos é qualitativa. Quanto aos objetivos, é exploratória; dois </w:t>
       </w:r>
       <w:r>
         <w:rPr>
@@ -1934,7 +1934,7 @@
           <w:iCs w:val="0"/>
           <w:rtl w:val="0"/>
         </w:rPr>
-        <w:t xml:space="preserve">Duas partes deste projeto usaram um agente de codificação, declarado conforme a Portaria CNPq nº 2.664/2026 (Brasil, 2026): a ferramenta foi o Claude Code e a finalidade foi entender o tema, buscar artigos e registrar as decisões de produto e de pilha do Finn antes do experimento. O levantamento das fontes seguiu o </w:t>
+        <w:t xml:space="preserve">Duas partes deste projeto usaram um agente de codificação, declarado conforme a Portaria CNPq nº 2.664/2026 (Brasil, 2026). A ferramenta foi o Claude Code; a finalidade, entender o tema, buscar artigos e registrar as decisões de produto e de pilha do Finn antes do experimento. O levantamento das fontes seguiu o </w:t>
       </w:r>
       <w:r>
         <w:rPr>
@@ -2032,7 +2032,7 @@
           <w:iCs w:val="0"/>
           <w:rtl w:val="0"/>
         </w:rPr>
-        <w:t xml:space="preserve"> de sistema e tokens por requisição, na primeira e a cada passo. É determinística, não consome cota e fornece a carga fixa de que H2 depende. A Camada 2 mede a construção do produto contra o modelo real; consome cota e é estocástica. Mais bytes por requisição não significam resultado pior; a Camada 2 diz quanto dessa carga chega ao resultado.</w:t>
+        <w:t xml:space="preserve"> de sistema e tokens por requisição, na primeira e a cada passo. É determinística, não consome cota e fornece a carga fixa de que H2 depende. A Camada 2 mede a construção do produto contra o modelo real; consome cota e é estocástica. A Camada 2 também diz quanto dessa carga por requisição pesa no resultado.</w:t>
       </w:r>
     </w:p>
     <w:p>
@@ -2110,27 +2110,7 @@
           <w:iCs w:val="0"/>
           <w:rtl w:val="0"/>
         </w:rPr>
-        <w:t xml:space="preserve"> maior, subagentes, permissões e compactação de contexto. As versões serão fixadas e registradas no repositório (YuukiFST, 2026c). O projeto não escreve </w:t>
-      </w:r>
-      <w:r>
-        <w:rPr>
-          <w:b w:val="0"/>
-          <w:i/>
-          <w:bCs w:val="0"/>
-          <w:iCs w:val="0"/>
-          <w:rtl w:val="0"/>
-        </w:rPr>
-        <w:t xml:space="preserve">harness</w:t>
-      </w:r>
-      <w:r>
-        <w:rPr>
-          <w:b w:val="0"/>
-          <w:i w:val="0"/>
-          <w:bCs w:val="0"/>
-          <w:iCs w:val="0"/>
-          <w:rtl w:val="0"/>
-        </w:rPr>
-        <w:t xml:space="preserve"> algum; escreve o instrumento, os </w:t>
+        <w:t xml:space="preserve"> maior, subagentes, permissões e compactação de contexto. As versões serão fixadas e registradas no repositório (YuukiFST, 2026c). O projeto escreve apenas o instrumento, os </w:t>
       </w:r>
       <w:r>
         <w:rPr>
@@ -2288,7 +2268,7 @@
           <w:iCs w:val="0"/>
           <w:rtl w:val="0"/>
         </w:rPr>
-        <w:t xml:space="preserve"> idêntico para os dois braços; o que o agente construiu em uma unidade é o ponto de partida da seguinte, e o autor não escreve código no espaço de trabalho. A pontuação será a fração dos testes de aceitação aprovados, escritos pelo autor antes da execução, mantidos fora do espaço de trabalho e rodados sobre uma cópia dele ao fim de cada unidade; nunca os testes do próprio agente, já que um modelo que alucina uma API escreve testes que simulam a alucinação. Uma unidade conta como concluída quando todos os seus testes passam, e a construção, quando todos passam ao fim.</w:t>
+        <w:t xml:space="preserve"> idêntico para os dois braços; o que o agente construiu em uma unidade é o ponto de partida da seguinte, e o autor não escreve código no espaço de trabalho. A pontuação será a fração dos testes de aceitação aprovados. O autor os escreverá antes da execução, os manterá fora do espaço de trabalho e os rodará sobre uma cópia dele ao fim de cada unidade. Os testes do próprio agente não contam, porque um modelo que alucina uma API escreve testes que simulam a alucinação. Uma unidade conta como concluída quando todos os seus testes passam, e a construção, quando todos passam ao fim.</w:t>
       </w:r>
     </w:p>
     <w:p>
@@ -2326,27 +2306,7 @@
           <w:iCs w:val="0"/>
           <w:rtl w:val="0"/>
         </w:rPr>
-        <w:t xml:space="preserve"> (Opencode, 2026b), relatados em separado, já que o efeito do </w:t>
-      </w:r>
-      <w:r>
-        <w:rPr>
-          <w:b w:val="0"/>
-          <w:i/>
-          <w:bCs w:val="0"/>
-          <w:iCs w:val="0"/>
-          <w:rtl w:val="0"/>
-        </w:rPr>
-        <w:t xml:space="preserve">harness</w:t>
-      </w:r>
-      <w:r>
-        <w:rPr>
-          <w:b w:val="0"/>
-          <w:i w:val="0"/>
-          <w:bCs w:val="0"/>
-          <w:iCs w:val="0"/>
-          <w:rtl w:val="0"/>
-        </w:rPr>
-        <w:t xml:space="preserve"> é específico do modelo. Se a ordenação entre os braços se inverter entre os níveis, a inversão é o resultado.</w:t>
+        <w:t xml:space="preserve"> (Opencode, 2026b), com resultados relatados por nível. Uma inversão da ordenação entre os braços de um nível para o outro será reportada como resultado.</w:t>
       </w:r>
     </w:p>
     <w:p>
@@ -2516,7 +2476,7 @@
           <w:iCs w:val="0"/>
           <w:rtl w:val="0"/>
         </w:rPr>
-        <w:t xml:space="preserve">. Os parâmetros de amostragem serão registrados sem normalização, já que o </w:t>
+        <w:t xml:space="preserve">. Os parâmetros de amostragem serão registrados sem normalização. O </w:t>
       </w:r>
       <w:r>
         <w:rPr>
@@ -2536,7 +2496,7 @@
           <w:iCs w:val="0"/>
           <w:rtl w:val="0"/>
         </w:rPr>
-        <w:t xml:space="preserve"> não os honra e Miller (2024) desaconselha mexer na temperatura para reduzir variância. O isolamento de ambiente será verificado por um portão que falha fechado.</w:t>
+        <w:t xml:space="preserve"> não os honra, e Miller (2024) desaconselha mexer na temperatura para reduzir variância. O isolamento de ambiente será verificado por um portão que falha fechado.</w:t>
       </w:r>
     </w:p>
     <w:p>
@@ -2555,7 +2515,7 @@
           <w:iCs w:val="0"/>
           <w:rtl w:val="0"/>
         </w:rPr>
-        <w:t xml:space="preserve">Cada célula (braço, nível) receberá n ≥ 3 construções completas após descartes, na função redutora de variância que Miller (2024) atribui à reamostragem. Os resultados sairão como mediana com dispersão, já que requisições idênticas podem variar em tokens de saída no nível gratuito. Se a cota não comportar a matriz, a cobertura será reduzida antes das repetições.</w:t>
+        <w:t xml:space="preserve">Cada célula (braço, nível) receberá n ≥ 3 construções completas após descartes, na função redutora de variância que Miller (2024) atribui à reamostragem. Os resultados sairão como mediana com dispersão; no nível gratuito, requisições idênticas podem variar em tokens de saída. Se a cota não comportar a matriz, a cobertura será reduzida antes das repetições.</w:t>
       </w:r>
     </w:p>
     <w:p>
@@ -2573,7 +2533,7 @@
           <w:iCs w:val="0"/>
           <w:rtl w:val="0"/>
         </w:rPr>
-        <w:t xml:space="preserve">A medida principal será o total de tokens por construção, sempre ao lado da fração final de testes aprovados, para que um braço que falhe barato não pareça o mais barato. A comparação inferencial será o teste de Wilcoxon dos postos sinalizados, bilateral, α = 0,05, pareado por unidade, sobre tokens por unidade e Succ/Mtok por unidade: não paramétrico porque nove pares não sustentam suposição distribucional, pareado porque a dificuldade da unidade é o maior fator de perturbação (Miller, 2024). As unidades não são independentes, pois a seguinte parte do que o mesmo braço construiu; essa dependência é parte do custo do </w:t>
+        <w:t xml:space="preserve">A medida principal será o total de tokens por construção, sempre ao lado da fração final de testes aprovados, para que um braço que falhe barato não pareça o mais barato. A comparação inferencial será o teste de Wilcoxon dos postos sinalizados, bilateral, α = 0,05, pareado por unidade, sobre tokens por unidade e Succ/Mtok por unidade. O teste é não paramétrico porque nove pares não sustentam suposição distribucional, e pareado porque a dificuldade da unidade é o maior fator de perturbação (Miller, 2024). As unidades não são independentes, pois a seguinte parte do que o mesmo braço construiu; essa dependência é parte do custo do </w:t>
       </w:r>
       <w:r>
         <w:rPr>
@@ -2611,7 +2571,7 @@
           <w:iCs w:val="0"/>
           <w:rtl w:val="0"/>
         </w:rPr>
-        <w:t xml:space="preserve">Cada unidade de cada construção receberá uma classe. Unidade não concluída é resultado: entra com a fração de testes aprovada e a construção segue, estouro de relógio incluído, já que repetir converteria indisponibilidade do serviço em diferença entre </w:t>
+        <w:t xml:space="preserve">Cada unidade de cada construção receberá uma classe. Unidade não concluída conta como resultado, com a fração de testes aprovada, e a construção segue, estouro de relógio incluído; repetir converteria indisponibilidade do serviço em diferença entre </w:t>
       </w:r>
       <w:r>
         <w:rPr>
@@ -2651,7 +2611,7 @@
           <w:iCs w:val="0"/>
           <w:rtl w:val="0"/>
         </w:rPr>
-        <w:t xml:space="preserve">, porque o código de saída não discrimina o desfecho.</w:t>
+        <w:t xml:space="preserve">; o código de saída não discrimina o desfecho.</w:t>
       </w:r>
     </w:p>
     <w:p>
@@ -2688,7 +2648,7 @@
           <w:iCs w:val="0"/>
           <w:rtl w:val="0"/>
         </w:rPr>
-        <w:t xml:space="preserve">Quatro limitações de partida. O efeito do </w:t>
+        <w:t xml:space="preserve">O projeto parte de quatro limitações. O efeito do </w:t>
       </w:r>
       <w:r>
         <w:rPr>
@@ -2708,7 +2668,7 @@
           <w:iCs w:val="0"/>
           <w:rtl w:val="0"/>
         </w:rPr>
-        <w:t xml:space="preserve"> é específico do modelo e pode inverter de sinal; as conclusões valem por nível, e o objetivo (5) testa isso. O produto é um único SaaS sobre uma única pilha; outras pilhas ficam como trabalho futuro. A especificação é do autor e cada braço carrega os próprios erros de uma unidade à seguinte; a mitigação é a mesma entrada, o mesmo espaço vazio e a comparação pareada por unidade. Os valores absolutos não são comparáveis a placares públicos, já que o produto é próprio; a comparação válida é entre os braços, e o custo em dinheiro entra como contrafactual rotulado sobre tarifas pagas publicadas.</w:t>
+        <w:t xml:space="preserve"> é específico do modelo e pode inverter de sinal; as conclusões valem por nível, e o objetivo (5) testa isso. O produto é um único SaaS sobre uma única pilha; outras pilhas ficam como trabalho futuro. A especificação é do autor e cada braço carrega os próprios erros de uma unidade à seguinte; a mitigação é a mesma entrada, o mesmo espaço vazio e a comparação pareada por unidade. Como o produto é próprio, os valores absolutos não são comparáveis a placares públicos; a comparação válida é entre os braços, e o custo em dinheiro entra como contrafactual rotulado sobre tarifas pagas publicadas.</w:t>
       </w:r>
     </w:p>
     <w:p>
@@ -3093,7 +3053,7 @@
           <w:iCs w:val="0"/>
           <w:rtl w:val="0"/>
         </w:rPr>
-        <w:t xml:space="preserve">O total em dinheiro é zero. O limite real é a cota do nível gratuito do </w:t>
+        <w:t xml:space="preserve">O total em dinheiro é zero; o limite é a cota do nível gratuito do </w:t>
       </w:r>
       <w:r>
         <w:rPr>
@@ -3113,7 +3073,7 @@
           <w:iCs w:val="0"/>
           <w:rtl w:val="0"/>
         </w:rPr>
-        <w:t xml:space="preserve">, a ser medida nas unidades-piloto; cada construção rodará em lotes ao longo de dias, retomada na fronteira entre unidades, e o custo monetário aparecerá só como contrafactual sobre tarifas pagas publicadas.</w:t>
+        <w:t xml:space="preserve">, a ser medida nas unidades-piloto. Cada construção rodará em lotes ao longo de dias, retomada na fronteira entre unidades, e o custo monetário aparecerá só como contrafactual sobre tarifas pagas publicadas.</w:t>
       </w:r>
     </w:p>
     <w:p>

</xml_diff>

<commit_message>
docs(project): rebuild the docx around HarnessTax and SoL-Pi
The author asked for a simple document under 10 pages; it had 12.
HarnessTax replaces FrontierHarness as the justification data and SoL-Pi
opposes it in the first gap, which H2 decides. H1 now covers success rate
and names a refutation test. The limitations gain unit dependence under
Wilcoxon and the free tier swapping the model. In-text et al. goes
italic and every reference title bold, per the course handouts.

tools/docx_edits_2026-09-23.py reproduces the file from 89fccf9.
</commit_message>
<xml_diff>
--- a/dist/projeto-de-pesquisa.docx
+++ b/dist/projeto-de-pesquisa.docx
@@ -160,7 +160,7 @@
           <w:szCs w:val="32"/>
           <w:rtl w:val="0"/>
         </w:rPr>
-        <w:t xml:space="preserve">COMO O HARNESS ALTERA O CUSTO E O DESEMPENHO DE UM MODELO DE LINGUAGEM: TOKENS E TAXA DE SUCESSO DE AGENTES DE CODIFICAÇÃO COM O MODELO FIXO</w:t>
+        <w:t xml:space="preserve">O HARNESS NO CUSTO E NO DESEMPENHO DE AGENTES DE CODIFICAÇÃO: TOKENS E TAXA DE SUCESSO COM O MODELO FIXO</w:t>
       </w:r>
     </w:p>
     <w:p>
@@ -321,7 +321,7 @@
           <w:szCs w:val="32"/>
           <w:rtl w:val="0"/>
         </w:rPr>
-        <w:t xml:space="preserve">COMO O HARNESS ALTERA O CUSTO E O DESEMPENHO DE UM MODELO DE LINGUAGEM: TOKENS E TAXA DE SUCESSO DE AGENTES DE CODIFICAÇÃO COM O MODELO FIXO</w:t>
+        <w:t xml:space="preserve">O HARNESS NO CUSTO E NO DESEMPENHO DE AGENTES DE CODIFICAÇÃO: TOKENS E TAXA DE SUCESSO COM O MODELO FIXO</w:t>
       </w:r>
     </w:p>
     <w:p>
@@ -530,7 +530,7 @@
         </w:rPr>
         <w:t xml:space="preserve">3 MATERIAL E MÉTODO</w:t>
         <w:tab/>
-        <w:t xml:space="preserve">4</w:t>
+        <w:t xml:space="preserve">3</w:t>
       </w:r>
     </w:p>
     <w:p>
@@ -547,7 +547,7 @@
         </w:rPr>
         <w:t xml:space="preserve">4 ORÇAMENTO</w:t>
         <w:tab/>
-        <w:t xml:space="preserve">7</w:t>
+        <w:t xml:space="preserve">5</w:t>
       </w:r>
     </w:p>
     <w:p>
@@ -564,7 +564,7 @@
         </w:rPr>
         <w:t xml:space="preserve">5 CRONOGRAMA</w:t>
         <w:tab/>
-        <w:t xml:space="preserve">7</w:t>
+        <w:t xml:space="preserve">5</w:t>
       </w:r>
     </w:p>
     <w:p>
@@ -586,7 +586,7 @@
         </w:rPr>
         <w:t xml:space="preserve">6 REFERÊNCIAS</w:t>
         <w:tab/>
-        <w:t xml:space="preserve">8</w:t>
+        <w:t xml:space="preserve">5</w:t>
       </w:r>
     </w:p>
     <w:p>
@@ -645,7 +645,7 @@
           <w:iCs w:val="0"/>
           <w:rtl w:val="0"/>
         </w:rPr>
-        <w:t xml:space="preserve">Os agentes de codificação avançam em duas frentes: o modelo de linguagem e a camada de software ao redor dele, o </w:t>
+        <w:t xml:space="preserve">Um agente de codificação tem duas partes: o modelo de linguagem e o </w:t>
       </w:r>
       <w:r>
         <w:rPr>
@@ -665,7 +665,27 @@
           <w:iCs w:val="0"/>
           <w:rtl w:val="0"/>
         </w:rPr>
-        <w:t xml:space="preserve"> (Claude Code, Codex, Cursor, OpenCode, pi), que muda o que o mesmo modelo custa e entrega. No FrontierHarness (Runta, 2026), doze configurações de nove </w:t>
+        <w:t xml:space="preserve">, o software ao redor dele que monta o contexto, expõe as ferramentas e conduz a execução (Claude Code, Codex, OpenCode, pi). Pan </w:t>
+      </w:r>
+      <w:r>
+        <w:rPr>
+          <w:b w:val="0"/>
+          <w:i/>
+          <w:bCs w:val="0"/>
+          <w:iCs w:val="0"/>
+          <w:rtl w:val="0"/>
+        </w:rPr>
+        <w:t xml:space="preserve">et al.</w:t>
+      </w:r>
+      <w:r>
+        <w:rPr>
+          <w:b w:val="0"/>
+          <w:i w:val="0"/>
+          <w:bCs w:val="0"/>
+          <w:iCs w:val="0"/>
+          <w:rtl w:val="0"/>
+        </w:rPr>
+        <w:t xml:space="preserve"> (2026), da Universidade da Califórnia em Berkeley, avaliaram sete modelos em três </w:t>
       </w:r>
       <w:r>
         <w:rPr>
@@ -685,7 +705,27 @@
           <w:iCs w:val="0"/>
           <w:rtl w:val="0"/>
         </w:rPr>
-        <w:t xml:space="preserve"> sobre o mesmo modelo ficam entre 50,0% e 66,7% de aprovação, e o custo por tarefa concluída vai de US$ 1,05 a US$ 18,34; o pi conclui 60,0% a US$ 2,43 e o OpenCode 50,0% a US$ 3,24.</w:t>
+        <w:t xml:space="preserve"> e concluíram que a escolha do </w:t>
+      </w:r>
+      <w:r>
+        <w:rPr>
+          <w:b w:val="0"/>
+          <w:i/>
+          <w:bCs w:val="0"/>
+          <w:iCs w:val="0"/>
+          <w:rtl w:val="0"/>
+        </w:rPr>
+        <w:t xml:space="preserve">harness</w:t>
+      </w:r>
+      <w:r>
+        <w:rPr>
+          <w:b w:val="0"/>
+          <w:i w:val="0"/>
+          <w:bCs w:val="0"/>
+          <w:iCs w:val="0"/>
+          <w:rtl w:val="0"/>
+        </w:rPr>
+        <w:t xml:space="preserve"> quase não muda a taxa de sucesso, mas muda o custo. No SWE-bench Lite, o Claude Fable 5 resolve 97,8% das tentativas no Claude Code e 96,7% no pi, e o Claude Code custa cerca do dobro por tentativa (US$ 1,33 contra US$ 0,67).</w:t>
       </w:r>
     </w:p>
     <w:p>
@@ -703,7 +743,7 @@
           <w:iCs w:val="0"/>
           <w:rtl w:val="0"/>
         </w:rPr>
-        <w:t xml:space="preserve">Ferramentas como Next.js, TanStack e Effect também se adaptam ao trabalho de agentes. Escolher o modelo deixou de bastar; o desenvolvedor, na assinatura, e a empresa, em escala, precisam conhecer o que avança junto, e o </w:t>
+        <w:t xml:space="preserve">Quem paga por tokens paga também essa diferença, que os autores chamam de imposto do </w:t>
       </w:r>
       <w:r>
         <w:rPr>
@@ -723,7 +763,47 @@
           <w:iCs w:val="0"/>
           <w:rtl w:val="0"/>
         </w:rPr>
-        <w:t xml:space="preserve"> é a parte dessa escolha que ninguém mediu na construção de um produto inteiro. As comparações publicadas usam tarefas isoladas. Este projeto mede esse custo construindo o Finn duas vezes, com o OpenCode e com o pi, sobre o mesmo modelo e a mesma especificação, com os tokens contados fora do </w:t>
+        <w:t xml:space="preserve">. Essas medições usam tarefas isoladas de </w:t>
+      </w:r>
+      <w:r>
+        <w:rPr>
+          <w:b w:val="0"/>
+          <w:i/>
+          <w:bCs w:val="0"/>
+          <w:iCs w:val="0"/>
+          <w:rtl w:val="0"/>
+        </w:rPr>
+        <w:t xml:space="preserve">benchmarks</w:t>
+      </w:r>
+      <w:r>
+        <w:rPr>
+          <w:b w:val="0"/>
+          <w:i w:val="0"/>
+          <w:bCs w:val="0"/>
+          <w:iCs w:val="0"/>
+          <w:rtl w:val="0"/>
+        </w:rPr>
+        <w:t xml:space="preserve"> que os modelos podem ter visto no treino, e os próprios autores apontam como próximo passo medir o </w:t>
+      </w:r>
+      <w:r>
+        <w:rPr>
+          <w:b w:val="0"/>
+          <w:i/>
+          <w:bCs w:val="0"/>
+          <w:iCs w:val="0"/>
+          <w:rtl w:val="0"/>
+        </w:rPr>
+        <w:t xml:space="preserve">harness</w:t>
+      </w:r>
+      <w:r>
+        <w:rPr>
+          <w:b w:val="0"/>
+          <w:i w:val="0"/>
+          <w:bCs w:val="0"/>
+          <w:iCs w:val="0"/>
+          <w:rtl w:val="0"/>
+        </w:rPr>
+        <w:t xml:space="preserve"> em fluxos reais de desenvolvimento, com tarefas de várias sessões. Este projeto constrói o mesmo produto, o Finn, com o OpenCode e com o pi, sobre o mesmo modelo e a mesma especificação, e conta os tokens fora do </w:t>
       </w:r>
       <w:r>
         <w:rPr>
@@ -800,27 +880,7 @@
           <w:iCs w:val="0"/>
           <w:rtl w:val="0"/>
         </w:rPr>
-        <w:t xml:space="preserve"> sobre o custo e o desempenho de um modelo de linguagem fixo: quantos tokens e que taxa de sucesso o mesmo modelo entrega ao construir o mesmo produto sob dois </w:t>
-      </w:r>
-      <w:r>
-        <w:rPr>
-          <w:b w:val="0"/>
-          <w:i/>
-          <w:bCs w:val="0"/>
-          <w:iCs w:val="0"/>
-          <w:rtl w:val="0"/>
-        </w:rPr>
-        <w:t xml:space="preserve">harnesses</w:t>
-      </w:r>
-      <w:r>
-        <w:rPr>
-          <w:b w:val="0"/>
-          <w:i w:val="0"/>
-          <w:bCs w:val="0"/>
-          <w:iCs w:val="0"/>
-          <w:rtl w:val="0"/>
-        </w:rPr>
-        <w:t xml:space="preserve"> diferentes.</w:t>
+        <w:t xml:space="preserve"> sobre o custo e o desempenho de um modelo de linguagem fixo na construção de um produto de software completo.</w:t>
       </w:r>
     </w:p>
     <w:p>
@@ -857,7 +917,7 @@
           <w:iCs w:val="0"/>
           <w:rtl w:val="0"/>
         </w:rPr>
-        <w:t xml:space="preserve">Com o modelo já escolhido, quanto mudam o custo em tokens e a taxa de sucesso ao construir o mesmo software com um </w:t>
+        <w:t xml:space="preserve">Com o modelo fixo, quanto mudam o custo em tokens e a taxa de sucesso ao construir o mesmo software com um </w:t>
       </w:r>
       <w:r>
         <w:rPr>
@@ -877,7 +937,7 @@
           <w:iCs w:val="0"/>
           <w:rtl w:val="0"/>
         </w:rPr>
-        <w:t xml:space="preserve"> em vez de outro, e quanto dessa diferença vem da carga fixa que cada </w:t>
+        <w:t xml:space="preserve"> em vez de outro, e quanto da diferença de custo vem da carga fixa que cada </w:t>
       </w:r>
       <w:r>
         <w:rPr>
@@ -954,7 +1014,7 @@
           <w:iCs w:val="0"/>
           <w:rtl w:val="0"/>
         </w:rPr>
-        <w:t xml:space="preserve"> na construção do mesmo produto a partir da mesma especificação, com o OpenCode e o pi como braços, separando a parcela que vem da carga fixa por requisição, e entregar o resultado como critério de escolha reproduzível.</w:t>
+        <w:t xml:space="preserve"> na construção do mesmo produto a partir da mesma especificação, com o OpenCode e o pi como braços, e separar a parcela que vem da carga fixa por requisição.</w:t>
       </w:r>
     </w:p>
     <w:p>
@@ -991,7 +1051,27 @@
           <w:iCs w:val="0"/>
           <w:rtl w:val="0"/>
         </w:rPr>
-        <w:t xml:space="preserve">1) construir o instrumento externo que conta requisições, tokens e latência por braço;</w:t>
+        <w:t xml:space="preserve">1) construir o </w:t>
+      </w:r>
+      <w:r>
+        <w:rPr>
+          <w:b w:val="0"/>
+          <w:i/>
+          <w:bCs w:val="0"/>
+          <w:iCs w:val="0"/>
+          <w:rtl w:val="0"/>
+        </w:rPr>
+        <w:t xml:space="preserve">proxy</w:t>
+      </w:r>
+      <w:r>
+        <w:rPr>
+          <w:b w:val="0"/>
+          <w:i w:val="0"/>
+          <w:bCs w:val="0"/>
+          <w:iCs w:val="0"/>
+          <w:rtl w:val="0"/>
+        </w:rPr>
+        <w:t xml:space="preserve"> que conta requisições, tokens e latência por braço;</w:t>
       </w:r>
     </w:p>
     <w:p>
@@ -1009,7 +1089,7 @@
           <w:iCs w:val="0"/>
           <w:rtl w:val="0"/>
         </w:rPr>
-        <w:t xml:space="preserve">2) escrever a especificação do Finn em nove unidades, com testes de aceitação do autor;</w:t>
+        <w:t xml:space="preserve">2) escrever a especificação do Finn em nove unidades, com testes de aceitação;</w:t>
       </w:r>
     </w:p>
     <w:p>
@@ -1027,7 +1107,47 @@
           <w:iCs w:val="0"/>
           <w:rtl w:val="0"/>
         </w:rPr>
-        <w:t xml:space="preserve">3) preparar o espaço de trabalho inicial idêntico para os braços, congelado por hash;</w:t>
+        <w:t xml:space="preserve">3) construir o Finn nos dois </w:t>
+      </w:r>
+      <w:r>
+        <w:rPr>
+          <w:b w:val="0"/>
+          <w:i/>
+          <w:bCs w:val="0"/>
+          <w:iCs w:val="0"/>
+          <w:rtl w:val="0"/>
+        </w:rPr>
+        <w:t xml:space="preserve">harnesses</w:t>
+      </w:r>
+      <w:r>
+        <w:rPr>
+          <w:b w:val="0"/>
+          <w:i w:val="0"/>
+          <w:bCs w:val="0"/>
+          <w:iCs w:val="0"/>
+          <w:rtl w:val="0"/>
+        </w:rPr>
+        <w:t xml:space="preserve">, com o mesmo modelo, </w:t>
+      </w:r>
+      <w:r>
+        <w:rPr>
+          <w:b w:val="0"/>
+          <w:i/>
+          <w:bCs w:val="0"/>
+          <w:iCs w:val="0"/>
+          <w:rtl w:val="0"/>
+        </w:rPr>
+        <w:t xml:space="preserve">prompt</w:t>
+      </w:r>
+      <w:r>
+        <w:rPr>
+          <w:b w:val="0"/>
+          <w:i w:val="0"/>
+          <w:bCs w:val="0"/>
+          <w:iCs w:val="0"/>
+          <w:rtl w:val="0"/>
+        </w:rPr>
+        <w:t xml:space="preserve"> e espaço inicial;</w:t>
       </w:r>
     </w:p>
     <w:p>
@@ -1045,47 +1165,7 @@
           <w:iCs w:val="0"/>
           <w:rtl w:val="0"/>
         </w:rPr>
-        <w:t xml:space="preserve">4) construir o Finn nos dois </w:t>
-      </w:r>
-      <w:r>
-        <w:rPr>
-          <w:b w:val="0"/>
-          <w:i/>
-          <w:bCs w:val="0"/>
-          <w:iCs w:val="0"/>
-          <w:rtl w:val="0"/>
-        </w:rPr>
-        <w:t xml:space="preserve">harnesses</w:t>
-      </w:r>
-      <w:r>
-        <w:rPr>
-          <w:b w:val="0"/>
-          <w:i w:val="0"/>
-          <w:bCs w:val="0"/>
-          <w:iCs w:val="0"/>
-          <w:rtl w:val="0"/>
-        </w:rPr>
-        <w:t xml:space="preserve">, mesmo modelo e </w:t>
-      </w:r>
-      <w:r>
-        <w:rPr>
-          <w:b w:val="0"/>
-          <w:i/>
-          <w:bCs w:val="0"/>
-          <w:iCs w:val="0"/>
-          <w:rtl w:val="0"/>
-        </w:rPr>
-        <w:t xml:space="preserve">prompts</w:t>
-      </w:r>
-      <w:r>
-        <w:rPr>
-          <w:b w:val="0"/>
-          <w:i w:val="0"/>
-          <w:bCs w:val="0"/>
-          <w:iCs w:val="0"/>
-          <w:rtl w:val="0"/>
-        </w:rPr>
-        <w:t xml:space="preserve">, com repetição;</w:t>
+        <w:t xml:space="preserve">4) repetir em um segundo modelo e verificar se a ordenação dos braços se mantém;</w:t>
       </w:r>
     </w:p>
     <w:p>
@@ -1103,7 +1183,47 @@
           <w:iCs w:val="0"/>
           <w:rtl w:val="0"/>
         </w:rPr>
-        <w:t xml:space="preserve">5) repetir em um segundo modelo e verificar se a ordenação entre os braços se mantém;</w:t>
+        <w:t xml:space="preserve">5) comparar os tokens relatados por cada </w:t>
+      </w:r>
+      <w:r>
+        <w:rPr>
+          <w:b w:val="0"/>
+          <w:i/>
+          <w:bCs w:val="0"/>
+          <w:iCs w:val="0"/>
+          <w:rtl w:val="0"/>
+        </w:rPr>
+        <w:t xml:space="preserve">harness</w:t>
+      </w:r>
+      <w:r>
+        <w:rPr>
+          <w:b w:val="0"/>
+          <w:i w:val="0"/>
+          <w:bCs w:val="0"/>
+          <w:iCs w:val="0"/>
+          <w:rtl w:val="0"/>
+        </w:rPr>
+        <w:t xml:space="preserve"> com os medidos no </w:t>
+      </w:r>
+      <w:r>
+        <w:rPr>
+          <w:b w:val="0"/>
+          <w:i/>
+          <w:bCs w:val="0"/>
+          <w:iCs w:val="0"/>
+          <w:rtl w:val="0"/>
+        </w:rPr>
+        <w:t xml:space="preserve">proxy</w:t>
+      </w:r>
+      <w:r>
+        <w:rPr>
+          <w:b w:val="0"/>
+          <w:i w:val="0"/>
+          <w:bCs w:val="0"/>
+          <w:iCs w:val="0"/>
+          <w:rtl w:val="0"/>
+        </w:rPr>
+        <w:t xml:space="preserve">;</w:t>
       </w:r>
     </w:p>
     <w:p>
@@ -1121,45 +1241,7 @@
           <w:iCs w:val="0"/>
           <w:rtl w:val="0"/>
         </w:rPr>
-        <w:t xml:space="preserve">6) medir a divergência entre tokens relatados pelo </w:t>
-      </w:r>
-      <w:r>
-        <w:rPr>
-          <w:b w:val="0"/>
-          <w:i/>
-          <w:bCs w:val="0"/>
-          <w:iCs w:val="0"/>
-          <w:rtl w:val="0"/>
-        </w:rPr>
-        <w:t xml:space="preserve">harness</w:t>
-      </w:r>
-      <w:r>
-        <w:rPr>
-          <w:b w:val="0"/>
-          <w:i w:val="0"/>
-          <w:bCs w:val="0"/>
-          <w:iCs w:val="0"/>
-          <w:rtl w:val="0"/>
-        </w:rPr>
-        <w:t xml:space="preserve"> e medidos no instrumento;</w:t>
-      </w:r>
-    </w:p>
-    <w:p>
-      <w:pPr>
-        <w:spacing w:after="0" w:line="360" w:lineRule="auto"/>
-        <w:ind w:left="709" w:firstLine="0"/>
-        <w:jc w:val="both"/>
-        <w:rPr/>
-      </w:pPr>
-      <w:r>
-        <w:rPr>
-          <w:b w:val="0"/>
-          <w:i w:val="0"/>
-          <w:bCs w:val="0"/>
-          <w:iCs w:val="0"/>
-          <w:rtl w:val="0"/>
-        </w:rPr>
-        <w:t xml:space="preserve">7) publicar executor, </w:t>
+        <w:t xml:space="preserve">6) publicar executor, </w:t>
       </w:r>
       <w:r>
         <w:rPr>
@@ -1179,7 +1261,7 @@
           <w:iCs w:val="0"/>
           <w:rtl w:val="0"/>
         </w:rPr>
-        <w:t xml:space="preserve">, testes, dados e scripts, reexecutáveis a custo zero.</w:t>
+        <w:t xml:space="preserve">, testes, dados e scripts de análise.</w:t>
       </w:r>
     </w:p>
     <w:p>
@@ -1216,7 +1298,7 @@
           <w:iCs w:val="0"/>
           <w:rtl w:val="0"/>
         </w:rPr>
-        <w:t xml:space="preserve">Pesquisa aplicada, quali-quantitativa, exploratória e experimental, de método dedutivo. Os dados virão de um </w:t>
+        <w:t xml:space="preserve">Pesquisa aplicada, quali-quantitativa, exploratória e experimental, de método dedutivo. Um </w:t>
       </w:r>
       <w:r>
         <w:rPr>
@@ -1256,27 +1338,7 @@
           <w:iCs w:val="0"/>
           <w:rtl w:val="0"/>
         </w:rPr>
-        <w:t xml:space="preserve"> e o modelo, que contará requisições, tokens e latência igual para os dois braços. Cada braço construirá o Finn do zero, em nove unidades, ao menos três vezes. Espera-se obter a diferença de tokens e de taxa de sucesso atribuível ao </w:t>
-      </w:r>
-      <w:r>
-        <w:rPr>
-          <w:b w:val="0"/>
-          <w:i/>
-          <w:bCs w:val="0"/>
-          <w:iCs w:val="0"/>
-          <w:rtl w:val="0"/>
-        </w:rPr>
-        <w:t xml:space="preserve">harness</w:t>
-      </w:r>
-      <w:r>
-        <w:rPr>
-          <w:b w:val="0"/>
-          <w:i w:val="0"/>
-          <w:bCs w:val="0"/>
-          <w:iCs w:val="0"/>
-          <w:rtl w:val="0"/>
-        </w:rPr>
-        <w:t xml:space="preserve">, comparada por teste pareado por unidade. A seção 3 detalha material, método e estatística.</w:t>
+        <w:t xml:space="preserve"> e o modelo contará requisições, tokens e latência da mesma forma para os dois braços. Cada braço construirá o Finn do zero, em nove unidades, ao menos três vezes, e a diferença entre os braços será comparada unidade a unidade.</w:t>
       </w:r>
     </w:p>
     <w:p>
@@ -1313,7 +1375,7 @@
           <w:iCs w:val="0"/>
           <w:rtl w:val="0"/>
         </w:rPr>
-        <w:t xml:space="preserve">H1: entre o OpenCode e o pi sobre o mesmo modelo, a diferença de tokens para construir o Finn a partir da mesma especificação é relevante para quem paga, comparável à de trocar de modelo sob um </w:t>
+        <w:t xml:space="preserve">H1: com o modelo fixo, o </w:t>
       </w:r>
       <w:r>
         <w:rPr>
@@ -1333,7 +1395,7 @@
           <w:iCs w:val="0"/>
           <w:rtl w:val="0"/>
         </w:rPr>
-        <w:t xml:space="preserve"> fixo. H1 será refutada se os intervalos de tokens por construção se sobrepuserem e o teste pareado por unidade não apontar diferença.</w:t>
+        <w:t xml:space="preserve"> muda mais o custo do que o sucesso. Os tokens por unidade diferem entre o OpenCode e o pi, e a fração de testes aprovados fica igual. H1 será refutada se o teste pareado não apontar diferença de tokens ou se apontar diferença de sucesso.</w:t>
       </w:r>
     </w:p>
     <w:p>
@@ -1371,27 +1433,7 @@
           <w:iCs w:val="0"/>
           <w:rtl w:val="0"/>
         </w:rPr>
-        <w:t xml:space="preserve"> de sistema e esquemas de ferramenta, medidos na Camada 1) explica a maior parte dessa diferença; o número de passos por unidade, a menor. H2 será refutada se os passos explicarem a maior parte, desfecho possível se o </w:t>
-      </w:r>
-      <w:r>
-        <w:rPr>
-          <w:b w:val="0"/>
-          <w:i/>
-          <w:bCs w:val="0"/>
-          <w:iCs w:val="0"/>
-          <w:rtl w:val="0"/>
-        </w:rPr>
-        <w:t xml:space="preserve">harness</w:t>
-      </w:r>
-      <w:r>
-        <w:rPr>
-          <w:b w:val="0"/>
-          <w:i w:val="0"/>
-          <w:bCs w:val="0"/>
-          <w:iCs w:val="0"/>
-          <w:rtl w:val="0"/>
-        </w:rPr>
-        <w:t xml:space="preserve"> com mais ferramentas concluir a unidade em menos passos.</w:t>
+        <w:t xml:space="preserve"> de sistema e esquemas de ferramenta) explica a maior parte da diferença de tokens, e o número de passos explica a menor. H2 será refutada se os passos ou o conteúdo da conversa explicarem a maior parte.</w:t>
       </w:r>
     </w:p>
     <w:p>
@@ -1409,7 +1451,7 @@
           <w:iCs w:val="0"/>
           <w:rtl w:val="0"/>
         </w:rPr>
-        <w:t xml:space="preserve">Este trabalho tem seis seções. A seção 1 traz justificativa, tema, problema, objetivos, metodologia e hipóteses. A seção 2 posiciona o trabalho na literatura e delimita as pendências que ele responde. A seção 3 descreve material e método: classificação, camadas de medição, braços, produto e especificação, limites, estatística e limitações. A seção 4 apresenta o orçamento, a seção 5 o cronograma e a seção 6 as referências.</w:t>
+        <w:t xml:space="preserve">Após esta introdução, a seção 2 apresenta o referencial teórico e a seção 3, o material e método. As seções 4, 5 e 6 trazem o orçamento, o cronograma e as referências.</w:t>
       </w:r>
     </w:p>
     <w:p>
@@ -1449,7 +1491,27 @@
           <w:iCs w:val="0"/>
           <w:rtl w:val="0"/>
         </w:rPr>
-        <w:t xml:space="preserve">Segundo Ning et al. (2026, §2, tradução nossa), um </w:t>
+        <w:t xml:space="preserve">Segundo Ning </w:t>
+      </w:r>
+      <w:r>
+        <w:rPr>
+          <w:b w:val="0"/>
+          <w:i/>
+          <w:bCs w:val="0"/>
+          <w:iCs w:val="0"/>
+          <w:rtl w:val="0"/>
+        </w:rPr>
+        <w:t xml:space="preserve">et al.</w:t>
+      </w:r>
+      <w:r>
+        <w:rPr>
+          <w:b w:val="0"/>
+          <w:i w:val="0"/>
+          <w:bCs w:val="0"/>
+          <w:iCs w:val="0"/>
+          <w:rtl w:val="0"/>
+        </w:rPr>
+        <w:t xml:space="preserve"> (2026, §2, tradução nossa), um </w:t>
       </w:r>
       <w:r>
         <w:rPr>
@@ -1469,27 +1531,27 @@
           <w:iCs w:val="0"/>
           <w:rtl w:val="0"/>
         </w:rPr>
-        <w:t xml:space="preserve"> “converte um modelo de linguagem sem estado em um agente funcional ao ancorar suas saídas em execução externa, estado persistente e realimentação verificável”. Wang et al. (2026) o descrevem pelo que faz: monta os </w:t>
-      </w:r>
-      <w:r>
-        <w:rPr>
-          <w:b w:val="0"/>
-          <w:i/>
-          <w:bCs w:val="0"/>
-          <w:iCs w:val="0"/>
-          <w:rtl w:val="0"/>
-        </w:rPr>
-        <w:t xml:space="preserve">prompts</w:t>
-      </w:r>
-      <w:r>
-        <w:rPr>
-          <w:b w:val="0"/>
-          <w:i w:val="0"/>
-          <w:bCs w:val="0"/>
-          <w:iCs w:val="0"/>
-          <w:rtl w:val="0"/>
-        </w:rPr>
-        <w:t xml:space="preserve">, gerencia o estado, invoca as ferramentas e coordena o laço. O pi é um laço próximo do ReAct mínimo (Yao et al., 2022), com quatro ferramentas; o OpenCode traz planejamento, compactação, subagentes e permissões. Lin et al. (2026) delimitam o que essa camada contém:</w:t>
+        <w:t xml:space="preserve"> “converte um modelo de linguagem sem estado em um agente funcional ao ancorar suas saídas em execução externa, estado persistente e realimentação verificável”. Lin </w:t>
+      </w:r>
+      <w:r>
+        <w:rPr>
+          <w:b w:val="0"/>
+          <w:i/>
+          <w:bCs w:val="0"/>
+          <w:iCs w:val="0"/>
+          <w:rtl w:val="0"/>
+        </w:rPr>
+        <w:t xml:space="preserve">et al.</w:t>
+      </w:r>
+      <w:r>
+        <w:rPr>
+          <w:b w:val="0"/>
+          <w:i w:val="0"/>
+          <w:bCs w:val="0"/>
+          <w:iCs w:val="0"/>
+          <w:rtl w:val="0"/>
+        </w:rPr>
+        <w:t xml:space="preserve"> (2026) delimitam o que essa camada contém:</w:t>
       </w:r>
     </w:p>
     <w:p>
@@ -1544,7 +1606,39 @@
           <w:i w:val="0"/>
           <w:rtl w:val="0"/>
         </w:rPr>
-        <w:t xml:space="preserve">É só esse conjunto que varia entre os braços deste experimento; o modelo fica fixo.</w:t>
+        <w:t xml:space="preserve">Só esse conjunto varia entre os braços deste experimento. O pi envia quatro ferramentas e um </w:t>
+      </w:r>
+      <w:r>
+        <w:rPr>
+          <w:b w:val="0"/>
+          <w:i/>
+          <w:rtl w:val="0"/>
+        </w:rPr>
+        <w:t xml:space="preserve">prompt</w:t>
+      </w:r>
+      <w:r>
+        <w:rPr>
+          <w:b w:val="0"/>
+          <w:i w:val="0"/>
+          <w:rtl w:val="0"/>
+        </w:rPr>
+        <w:t xml:space="preserve"> de sistema curto, e o OpenCode envia mais ferramentas, um </w:t>
+      </w:r>
+      <w:r>
+        <w:rPr>
+          <w:b w:val="0"/>
+          <w:i/>
+          <w:rtl w:val="0"/>
+        </w:rPr>
+        <w:t xml:space="preserve">prompt</w:t>
+      </w:r>
+      <w:r>
+        <w:rPr>
+          <w:b w:val="0"/>
+          <w:i w:val="0"/>
+          <w:rtl w:val="0"/>
+        </w:rPr>
+        <w:t xml:space="preserve"> maior, subagentes e permissões.</w:t>
       </w:r>
     </w:p>
     <w:p>
@@ -1562,7 +1656,27 @@
           <w:iCs w:val="0"/>
           <w:rtl w:val="0"/>
         </w:rPr>
-        <w:t xml:space="preserve">A interface entre modelo e ambiente é objeto de projeto desde Yang et al. (2024). Na Tabela 1 de Lin et al. (2026), </w:t>
+        <w:t xml:space="preserve">Na Tabela 1 de Lin </w:t>
+      </w:r>
+      <w:r>
+        <w:rPr>
+          <w:b w:val="0"/>
+          <w:i/>
+          <w:bCs w:val="0"/>
+          <w:iCs w:val="0"/>
+          <w:rtl w:val="0"/>
+        </w:rPr>
+        <w:t xml:space="preserve">et al.</w:t>
+      </w:r>
+      <w:r>
+        <w:rPr>
+          <w:b w:val="0"/>
+          <w:i w:val="0"/>
+          <w:bCs w:val="0"/>
+          <w:iCs w:val="0"/>
+          <w:rtl w:val="0"/>
+        </w:rPr>
+        <w:t xml:space="preserve"> (2026), </w:t>
       </w:r>
       <w:r>
         <w:rPr>
@@ -1582,7 +1696,27 @@
           <w:iCs w:val="0"/>
           <w:rtl w:val="0"/>
         </w:rPr>
-        <w:t xml:space="preserve"> escritos por humanos sobre um modelo congelado (GPT-5.4, Terminal-Bench 2, 89 tarefas) vão de 47,2% de aprovação no OpenCode a 71,9% no Codex, 24,7 pontos percentuais (cálculo do autor). Zhang et al. (2026) enunciam a Binding Constraint Thesis: com modelos de fronteira comparáveis, a parcela do desempenho que vem do </w:t>
+        <w:t xml:space="preserve"> escritos por humanos sobre o GPT-5.4 vão de 47,2% de aprovação no OpenCode a 71,9% no Codex, no Terminal-Bench 2. Zhang </w:t>
+      </w:r>
+      <w:r>
+        <w:rPr>
+          <w:b w:val="0"/>
+          <w:i/>
+          <w:bCs w:val="0"/>
+          <w:iCs w:val="0"/>
+          <w:rtl w:val="0"/>
+        </w:rPr>
+        <w:t xml:space="preserve">et al.</w:t>
+      </w:r>
+      <w:r>
+        <w:rPr>
+          <w:b w:val="0"/>
+          <w:i w:val="0"/>
+          <w:bCs w:val="0"/>
+          <w:iCs w:val="0"/>
+          <w:rtl w:val="0"/>
+        </w:rPr>
+        <w:t xml:space="preserve"> (2026) sustentam que, entre modelos de fronteira comparáveis, a parcela do desempenho que vem do </w:t>
       </w:r>
       <w:r>
         <w:rPr>
@@ -1602,47 +1736,47 @@
           <w:iCs w:val="0"/>
           <w:rtl w:val="0"/>
         </w:rPr>
-        <w:t xml:space="preserve"> é comparável ou maior que a do modelo. Em Alier Forment et al. (2026), os dois </w:t>
-      </w:r>
-      <w:r>
-        <w:rPr>
-          <w:b w:val="0"/>
-          <w:i/>
-          <w:bCs w:val="0"/>
-          <w:iCs w:val="0"/>
-          <w:rtl w:val="0"/>
-        </w:rPr>
-        <w:t xml:space="preserve">scaffoldings</w:t>
-      </w:r>
-      <w:r>
-        <w:rPr>
-          <w:b w:val="0"/>
-          <w:i w:val="0"/>
-          <w:bCs w:val="0"/>
-          <w:iCs w:val="0"/>
-          <w:rtl w:val="0"/>
-        </w:rPr>
-        <w:t xml:space="preserve"> sem MCP saíram de 5,0x a 28x mais baratos que os cinco com MCP, e o pi foi o mais barato. Três fontes não revisadas por pares apontam o mesmo. O HarnessRank (2026) ordena </w:t>
-      </w:r>
-      <w:r>
-        <w:rPr>
-          <w:b w:val="0"/>
-          <w:i/>
-          <w:bCs w:val="0"/>
-          <w:iCs w:val="0"/>
-          <w:rtl w:val="0"/>
-        </w:rPr>
-        <w:t xml:space="preserve">harnesses</w:t>
-      </w:r>
-      <w:r>
-        <w:rPr>
-          <w:b w:val="0"/>
-          <w:i w:val="0"/>
-          <w:bCs w:val="0"/>
-          <w:iCs w:val="0"/>
-          <w:rtl w:val="0"/>
-        </w:rPr>
-        <w:t xml:space="preserve"> por aprovação com modelo fixo e publica custo ao lado. No FrontierHarness (Runta, 2026), o Codex conclui 66,7% das tarefas a US$ 3,47 por tarefa e o Claude Code 63,3% a US$ 18,34, 5,3x mais caro (cálculo do autor). A Databricks registra custo por tarefa variando mais de 2x sem mudança de qualidade (Databricks, 2026 apud Earendil, 2026).</w:t>
+        <w:t xml:space="preserve"> é comparável ou maior que a do modelo. Pan </w:t>
+      </w:r>
+      <w:r>
+        <w:rPr>
+          <w:b w:val="0"/>
+          <w:i/>
+          <w:bCs w:val="0"/>
+          <w:iCs w:val="0"/>
+          <w:rtl w:val="0"/>
+        </w:rPr>
+        <w:t xml:space="preserve">et al.</w:t>
+      </w:r>
+      <w:r>
+        <w:rPr>
+          <w:b w:val="0"/>
+          <w:i w:val="0"/>
+          <w:bCs w:val="0"/>
+          <w:iCs w:val="0"/>
+          <w:rtl w:val="0"/>
+        </w:rPr>
+        <w:t xml:space="preserve"> (2026) mediram outra coisa no SWE-bench Lite: o efeito médio do </w:t>
+      </w:r>
+      <w:r>
+        <w:rPr>
+          <w:b w:val="0"/>
+          <w:i/>
+          <w:bCs w:val="0"/>
+          <w:iCs w:val="0"/>
+          <w:rtl w:val="0"/>
+        </w:rPr>
+        <w:t xml:space="preserve">harness</w:t>
+      </w:r>
+      <w:r>
+        <w:rPr>
+          <w:b w:val="0"/>
+          <w:i w:val="0"/>
+          <w:bCs w:val="0"/>
+          <w:iCs w:val="0"/>
+          <w:rtl w:val="0"/>
+        </w:rPr>
+        <w:t xml:space="preserve"> sobre a taxa de sucesso ficou dentro de ±2%, enquanto o Claude Code custou cerca de 2,0 vezes o pi. Como as fontes divergem sobre o sucesso, este projeto mede sucesso e custo juntos.</w:t>
       </w:r>
     </w:p>
     <w:p>
@@ -1660,27 +1794,67 @@
           <w:iCs w:val="0"/>
           <w:rtl w:val="0"/>
         </w:rPr>
-        <w:t xml:space="preserve">A primeira pendência é a atribuição. As comparações publicadas usam tarefas isoladas e agregam </w:t>
-      </w:r>
-      <w:r>
-        <w:rPr>
-          <w:b w:val="0"/>
-          <w:i/>
-          <w:bCs w:val="0"/>
-          <w:iCs w:val="0"/>
-          <w:rtl w:val="0"/>
-        </w:rPr>
-        <w:t xml:space="preserve">prompt</w:t>
-      </w:r>
-      <w:r>
-        <w:rPr>
-          <w:b w:val="0"/>
-          <w:i w:val="0"/>
-          <w:bCs w:val="0"/>
-          <w:iCs w:val="0"/>
-          <w:rtl w:val="0"/>
-        </w:rPr>
-        <w:t xml:space="preserve">, ferramentas, contexto e laço sem separá-los. Ning et al. (2026) nomeiam a lacuna em §5.2.1 e pedem, em §5.2.7, “métricas que isolem componentes do </w:t>
+        <w:t xml:space="preserve">A primeira pendência é saber de onde vem a diferença de custo. Pan </w:t>
+      </w:r>
+      <w:r>
+        <w:rPr>
+          <w:b w:val="0"/>
+          <w:i/>
+          <w:bCs w:val="0"/>
+          <w:iCs w:val="0"/>
+          <w:rtl w:val="0"/>
+        </w:rPr>
+        <w:t xml:space="preserve">et al.</w:t>
+      </w:r>
+      <w:r>
+        <w:rPr>
+          <w:b w:val="0"/>
+          <w:i w:val="0"/>
+          <w:bCs w:val="0"/>
+          <w:iCs w:val="0"/>
+          <w:rtl w:val="0"/>
+        </w:rPr>
+        <w:t xml:space="preserve"> (2026) apontam a primeira requisição. O contexto inicial do Claude Code passa de dez vezes o do pi, com número de turnos parecido (15,3 contra 15,4 no Claude Fable 5). Liu </w:t>
+      </w:r>
+      <w:r>
+        <w:rPr>
+          <w:b w:val="0"/>
+          <w:i/>
+          <w:bCs w:val="0"/>
+          <w:iCs w:val="0"/>
+          <w:rtl w:val="0"/>
+        </w:rPr>
+        <w:t xml:space="preserve">et al.</w:t>
+      </w:r>
+      <w:r>
+        <w:rPr>
+          <w:b w:val="0"/>
+          <w:i w:val="0"/>
+          <w:bCs w:val="0"/>
+          <w:iCs w:val="0"/>
+          <w:rtl w:val="0"/>
+        </w:rPr>
+        <w:t xml:space="preserve"> (2026) apontam o resto da conversa. Mudando só a execução das ações, a compactação de contexto e o tratamento das observações, cortaram de 44,7% a 49,0% dos tokens em relação ao pi e mantiveram de 93,7% a 94,3% da pontuação dele. Ning </w:t>
+      </w:r>
+      <w:r>
+        <w:rPr>
+          <w:b w:val="0"/>
+          <w:i/>
+          <w:bCs w:val="0"/>
+          <w:iCs w:val="0"/>
+          <w:rtl w:val="0"/>
+        </w:rPr>
+        <w:t xml:space="preserve">et al.</w:t>
+      </w:r>
+      <w:r>
+        <w:rPr>
+          <w:b w:val="0"/>
+          <w:i w:val="0"/>
+          <w:bCs w:val="0"/>
+          <w:iCs w:val="0"/>
+          <w:rtl w:val="0"/>
+        </w:rPr>
+        <w:t xml:space="preserve"> (2026, §5.2.7, tradução nossa) pedem “métricas que isolem componentes do </w:t>
       </w:r>
       <w:r>
         <w:rPr>
@@ -1700,27 +1874,7 @@
           <w:iCs w:val="0"/>
           <w:rtl w:val="0"/>
         </w:rPr>
-        <w:t xml:space="preserve">” (Ning et al., 2026, tradução nossa). Lee et al. (2026, Tabela 7) mostram que essas decisões são isoláveis. Uma busca que edita só o código do </w:t>
-      </w:r>
-      <w:r>
-        <w:rPr>
-          <w:b w:val="0"/>
-          <w:i/>
-          <w:bCs w:val="0"/>
-          <w:iCs w:val="0"/>
-          <w:rtl w:val="0"/>
-        </w:rPr>
-        <w:t xml:space="preserve">harness</w:t>
-      </w:r>
-      <w:r>
-        <w:rPr>
-          <w:b w:val="0"/>
-          <w:i w:val="0"/>
-          <w:bCs w:val="0"/>
-          <w:iCs w:val="0"/>
-          <w:rtl w:val="0"/>
-        </w:rPr>
-        <w:t xml:space="preserve">, com o modelo fixo, chegou a 76,4% no TerminalBench-2 (89 tarefas, Claude Opus 4.6) contra 74,7% do Terminus-KIRA, de onde partiu. Este projeto responde pelo lado da medição e separa, em cada requisição, a carga fixa do conteúdo da conversa, ao longo de um produto completo.</w:t>
+        <w:t xml:space="preserve">”, e H2 testa se pesa mais a carga fixa ou a conversa.</w:t>
       </w:r>
     </w:p>
     <w:p>
@@ -1738,7 +1892,7 @@
           <w:iCs w:val="0"/>
           <w:rtl w:val="0"/>
         </w:rPr>
-        <w:t xml:space="preserve">A segunda pendência é a instrumentação. O que um </w:t>
+        <w:t xml:space="preserve">A segunda pendência é a instrumentação. Cada </w:t>
       </w:r>
       <w:r>
         <w:rPr>
@@ -1758,27 +1912,27 @@
           <w:iCs w:val="0"/>
           <w:rtl w:val="0"/>
         </w:rPr>
-        <w:t xml:space="preserve"> relata sobre o próprio custo diverge do que gasta, e cada um omite um conjunto diferente de chamadas ao modelo. Kapoor et al. (2024) mostram que a avaliação de agentes ignora o custo e erra sobre a origem dos ganhos; Kapoor et al. (2025) registram que comparações entre </w:t>
-      </w:r>
-      <w:r>
-        <w:rPr>
-          <w:b w:val="0"/>
-          <w:i/>
-          <w:bCs w:val="0"/>
-          <w:iCs w:val="0"/>
-          <w:rtl w:val="0"/>
-        </w:rPr>
-        <w:t xml:space="preserve">harnesses</w:t>
-      </w:r>
-      <w:r>
-        <w:rPr>
-          <w:b w:val="0"/>
-          <w:i w:val="0"/>
-          <w:bCs w:val="0"/>
-          <w:iCs w:val="0"/>
-          <w:rtl w:val="0"/>
-        </w:rPr>
-        <w:t xml:space="preserve"> são raras. A medição deste projeto ocorre em um </w:t>
+        <w:t xml:space="preserve"> conta turnos e tokens do seu jeito, e Pan </w:t>
+      </w:r>
+      <w:r>
+        <w:rPr>
+          <w:b w:val="0"/>
+          <w:i/>
+          <w:bCs w:val="0"/>
+          <w:iCs w:val="0"/>
+          <w:rtl w:val="0"/>
+        </w:rPr>
+        <w:t xml:space="preserve">et al.</w:t>
+      </w:r>
+      <w:r>
+        <w:rPr>
+          <w:b w:val="0"/>
+          <w:i w:val="0"/>
+          <w:bCs w:val="0"/>
+          <w:iCs w:val="0"/>
+          <w:rtl w:val="0"/>
+        </w:rPr>
+        <w:t xml:space="preserve"> (2026) registram que a definição de turno varia entre eles. Aqui a medição ocorre em um </w:t>
       </w:r>
       <w:r>
         <w:rPr>
@@ -1798,7 +1952,27 @@
           <w:iCs w:val="0"/>
           <w:rtl w:val="0"/>
         </w:rPr>
-        <w:t xml:space="preserve"> externo, e o objetivo (6) quantifica a divergência.</w:t>
+        <w:t xml:space="preserve"> externo, igual para os dois braços, e o objetivo (5) compara essa medida com o relato de cada </w:t>
+      </w:r>
+      <w:r>
+        <w:rPr>
+          <w:b w:val="0"/>
+          <w:i/>
+          <w:bCs w:val="0"/>
+          <w:iCs w:val="0"/>
+          <w:rtl w:val="0"/>
+        </w:rPr>
+        <w:t xml:space="preserve">harness</w:t>
+      </w:r>
+      <w:r>
+        <w:rPr>
+          <w:b w:val="0"/>
+          <w:i w:val="0"/>
+          <w:bCs w:val="0"/>
+          <w:iCs w:val="0"/>
+          <w:rtl w:val="0"/>
+        </w:rPr>
+        <w:t xml:space="preserve">.</w:t>
       </w:r>
     </w:p>
     <w:p>
@@ -1816,27 +1990,67 @@
           <w:iCs w:val="0"/>
           <w:rtl w:val="0"/>
         </w:rPr>
-        <w:t xml:space="preserve">As métricas serão tokens por construção, ao lado da fração de testes aprovados, e o Succ/Mtok (sucessos por milhão de tokens) de Lin et al. (2026). O efeito é específico do modelo e pode inverter de sinal. No Holistic Agent Leaderboard, os modelos da Anthropic vão melhor com o BrowserUse e os da OpenAI com o SeeAct (Kapoor et al., 2025), e o FrontierHarness registra, para o Claude Code, </w:t>
-      </w:r>
-      <w:r>
-        <w:rPr>
-          <w:b w:val="0"/>
-          <w:i/>
-          <w:bCs w:val="0"/>
-          <w:iCs w:val="0"/>
-          <w:rtl w:val="0"/>
-        </w:rPr>
-        <w:t xml:space="preserve">cache</w:t>
-      </w:r>
-      <w:r>
-        <w:rPr>
-          <w:b w:val="0"/>
-          <w:i w:val="0"/>
-          <w:bCs w:val="0"/>
-          <w:iCs w:val="0"/>
-          <w:rtl w:val="0"/>
-        </w:rPr>
-        <w:t xml:space="preserve"> de 25,0% ponderado por tokens contra 67,8% na célula mediana (Runta, 2026). O desenho terá dois níveis de modelo, com conclusões por nível.</w:t>
+        <w:t xml:space="preserve">As métricas serão tokens por construção, ao lado da fração de testes aprovados, e o Succ/Mtok (sucessos por milhão de tokens) de Lin </w:t>
+      </w:r>
+      <w:r>
+        <w:rPr>
+          <w:b w:val="0"/>
+          <w:i/>
+          <w:bCs w:val="0"/>
+          <w:iCs w:val="0"/>
+          <w:rtl w:val="0"/>
+        </w:rPr>
+        <w:t xml:space="preserve">et al.</w:t>
+      </w:r>
+      <w:r>
+        <w:rPr>
+          <w:b w:val="0"/>
+          <w:i w:val="0"/>
+          <w:bCs w:val="0"/>
+          <w:iCs w:val="0"/>
+          <w:rtl w:val="0"/>
+        </w:rPr>
+        <w:t xml:space="preserve"> (2026). O efeito também depende do modelo, pois em nove de doze comparações de Pan </w:t>
+      </w:r>
+      <w:r>
+        <w:rPr>
+          <w:b w:val="0"/>
+          <w:i/>
+          <w:bCs w:val="0"/>
+          <w:iCs w:val="0"/>
+          <w:rtl w:val="0"/>
+        </w:rPr>
+        <w:t xml:space="preserve">et al.</w:t>
+      </w:r>
+      <w:r>
+        <w:rPr>
+          <w:b w:val="0"/>
+          <w:i w:val="0"/>
+          <w:bCs w:val="0"/>
+          <w:iCs w:val="0"/>
+          <w:rtl w:val="0"/>
+        </w:rPr>
+        <w:t xml:space="preserve"> (2026) o maior sucesso veio de um </w:t>
+      </w:r>
+      <w:r>
+        <w:rPr>
+          <w:b w:val="0"/>
+          <w:i/>
+          <w:bCs w:val="0"/>
+          <w:iCs w:val="0"/>
+          <w:rtl w:val="0"/>
+        </w:rPr>
+        <w:t xml:space="preserve">harness</w:t>
+      </w:r>
+      <w:r>
+        <w:rPr>
+          <w:b w:val="0"/>
+          <w:i w:val="0"/>
+          <w:bCs w:val="0"/>
+          <w:iCs w:val="0"/>
+          <w:rtl w:val="0"/>
+        </w:rPr>
+        <w:t xml:space="preserve"> de outro fornecedor. Por isso o desenho terá dois níveis de modelo.</w:t>
       </w:r>
     </w:p>
     <w:p>
@@ -1876,7 +2090,7 @@
           <w:iCs w:val="0"/>
           <w:rtl w:val="0"/>
         </w:rPr>
-        <w:t xml:space="preserve">Quanto à finalidade, a pesquisa é aplicada; o produto é um critério de escolha para o desenvolvedor e a empresa. Quanto à abordagem, é quali-quantitativa: tokens e sucesso são medidas quantitativas, e a atribuição da diferença à carga fixa ou aos passos é qualitativa. Quanto aos objetivos, é exploratória; dois </w:t>
+        <w:t xml:space="preserve">A pesquisa é aplicada quanto à finalidade, quali-quantitativa quanto à abordagem, exploratória quanto aos objetivos, experimental quanto aos procedimentos e dedutiva quanto ao método. É exploratória porque não há comparação publicada de </w:t>
       </w:r>
       <w:r>
         <w:rPr>
@@ -1896,7 +2110,7 @@
           <w:iCs w:val="0"/>
           <w:rtl w:val="0"/>
         </w:rPr>
-        <w:t xml:space="preserve"> construindo o mesmo produto completo a partir da mesma especificação não têm precedente publicado. Quanto aos procedimentos, é experimental, com variável independente manipulada (o </w:t>
+        <w:t xml:space="preserve"> construindo o mesmo produto completo. O </w:t>
       </w:r>
       <w:r>
         <w:rPr>
@@ -1916,7 +2130,7 @@
           <w:iCs w:val="0"/>
           <w:rtl w:val="0"/>
         </w:rPr>
-        <w:t xml:space="preserve">) e variáveis controladas (modelo, especificação, espaço de trabalho inicial e limites). Quanto ao método, é dedutiva, com hipóteses declaradas antes da coleta.</w:t>
+        <w:t xml:space="preserve"> é a variável manipulada, e modelo, especificação, espaço de trabalho inicial e limites ficam controlados.</w:t>
       </w:r>
     </w:p>
     <w:p>
@@ -1934,7 +2148,7 @@
           <w:iCs w:val="0"/>
           <w:rtl w:val="0"/>
         </w:rPr>
-        <w:t xml:space="preserve">Duas partes deste projeto usaram um agente de codificação, declarado conforme a Portaria CNPq nº 2.664/2026 (Brasil, 2026). A ferramenta foi o Claude Code; a finalidade, entender o tema, buscar artigos e registrar as decisões de produto e de pilha do Finn antes do experimento. O levantamento das fontes seguiu o </w:t>
+        <w:t xml:space="preserve">Conforme a Portaria CNPq nº 2.664/2026 (Brasil, 2026), declara-se o uso do Claude Code no levantamento das fontes, organizado pelo método </w:t>
       </w:r>
       <w:r>
         <w:rPr>
@@ -1954,27 +2168,7 @@
           <w:iCs w:val="0"/>
           <w:rtl w:val="0"/>
         </w:rPr>
-        <w:t xml:space="preserve"> de Karpathy (2026), mantido no repositório (YuukiFST, 2026c): fontes brutas guardadas sem alteração, páginas de síntese escritas pelo agente, registro cronológico e fila de revisão. O autor curou as fontes e conferiu cada afirmação citada na obra original. A especificação do Finn usou o Helmsman (YuukiFST, 2026a), rotina do autor que separa o que o sistema faz, respondido só pelo autor, de como construir, decidido pelo agente e registrado em </w:t>
-      </w:r>
-      <w:r>
-        <w:rPr>
-          <w:b w:val="0"/>
-          <w:i/>
-          <w:bCs w:val="0"/>
-          <w:iCs w:val="0"/>
-          <w:rtl w:val="0"/>
-        </w:rPr>
-        <w:t xml:space="preserve">ticket</w:t>
-      </w:r>
-      <w:r>
-        <w:rPr>
-          <w:b w:val="0"/>
-          <w:i w:val="0"/>
-          <w:bCs w:val="0"/>
-          <w:iCs w:val="0"/>
-          <w:rtl w:val="0"/>
-        </w:rPr>
-        <w:t xml:space="preserve"> com alternativas e critério; decisões que dependem de fato externo passam por subagentes de pesquisa. O autor responde pelo texto final e por cada decisão de produto.</w:t>
+        <w:t xml:space="preserve"> de Karpathy (2026) no repositório do projeto (YuukiFST, 2026c), e na especificação do Finn, feita com o Helmsman (YuukiFST, 2026a). O autor conferiu cada afirmação citada na obra original e responde pelo texto e pelas decisões de produto.</w:t>
       </w:r>
     </w:p>
     <w:p>
@@ -1992,7 +2186,7 @@
           <w:iCs w:val="0"/>
           <w:rtl w:val="0"/>
         </w:rPr>
-        <w:t xml:space="preserve">A medição terá duas camadas. A Camada 1 mede a forma da requisição contra um </w:t>
+        <w:t xml:space="preserve">A medição terá duas camadas. A Camada 1 mede, contra um </w:t>
       </w:r>
       <w:r>
         <w:rPr>
@@ -2012,7 +2206,7 @@
           <w:iCs w:val="0"/>
           <w:rtl w:val="0"/>
         </w:rPr>
-        <w:t xml:space="preserve"> simulado: esquemas de ferramenta, bytes de </w:t>
+        <w:t xml:space="preserve"> simulado, os esquemas de ferramenta, o </w:t>
       </w:r>
       <w:r>
         <w:rPr>
@@ -2032,7 +2226,7 @@
           <w:iCs w:val="0"/>
           <w:rtl w:val="0"/>
         </w:rPr>
-        <w:t xml:space="preserve"> de sistema e tokens por requisição, na primeira e a cada passo. É determinística, não consome cota e fornece a carga fixa de que H2 depende. A Camada 2 mede a construção do produto contra o modelo real; consome cota e é estocástica. A Camada 2 também diz quanto dessa carga por requisição pesa no resultado.</w:t>
+        <w:t xml:space="preserve"> de sistema e os tokens de cada requisição, e fornece a carga fixa que H2 usa. A Camada 2 mede a construção do produto contra o modelo real.</w:t>
       </w:r>
     </w:p>
     <w:p>
@@ -2050,7 +2244,7 @@
           <w:iCs w:val="0"/>
           <w:rtl w:val="0"/>
         </w:rPr>
-        <w:t xml:space="preserve">Os braços serão o OpenCode (Opencode, 2026a) e o pi (Earendil, 2026): código aberto, sem interface (opencode run e pi --mode json) e URL base compatível com a API da OpenAI, o que os faz atravessar o </w:t>
+        <w:t xml:space="preserve">Os braços serão o OpenCode (Opencode, 2026a) e o pi (Earendil, 2026). Os dois são de código aberto, rodam sem interface e aceitam URL base compatível com a API da OpenAI, o que permite passá-los pelo </w:t>
       </w:r>
       <w:r>
         <w:rPr>
@@ -2070,67 +2264,7 @@
           <w:iCs w:val="0"/>
           <w:rtl w:val="0"/>
         </w:rPr>
-        <w:t xml:space="preserve">. O pi envia quatro ferramentas e um </w:t>
-      </w:r>
-      <w:r>
-        <w:rPr>
-          <w:b w:val="0"/>
-          <w:i/>
-          <w:bCs w:val="0"/>
-          <w:iCs w:val="0"/>
-          <w:rtl w:val="0"/>
-        </w:rPr>
-        <w:t xml:space="preserve">prompt</w:t>
-      </w:r>
-      <w:r>
-        <w:rPr>
-          <w:b w:val="0"/>
-          <w:i w:val="0"/>
-          <w:bCs w:val="0"/>
-          <w:iCs w:val="0"/>
-          <w:rtl w:val="0"/>
-        </w:rPr>
-        <w:t xml:space="preserve"> de sistema curto, sem subagentes nem permissões; o OpenCode envia mais esquemas, </w:t>
-      </w:r>
-      <w:r>
-        <w:rPr>
-          <w:b w:val="0"/>
-          <w:i/>
-          <w:bCs w:val="0"/>
-          <w:iCs w:val="0"/>
-          <w:rtl w:val="0"/>
-        </w:rPr>
-        <w:t xml:space="preserve">prompt</w:t>
-      </w:r>
-      <w:r>
-        <w:rPr>
-          <w:b w:val="0"/>
-          <w:i w:val="0"/>
-          <w:bCs w:val="0"/>
-          <w:iCs w:val="0"/>
-          <w:rtl w:val="0"/>
-        </w:rPr>
-        <w:t xml:space="preserve"> maior, subagentes, permissões e compactação de contexto. As versões serão fixadas e registradas no repositório (YuukiFST, 2026c). O projeto escreve apenas o instrumento, os </w:t>
-      </w:r>
-      <w:r>
-        <w:rPr>
-          <w:b w:val="0"/>
-          <w:i/>
-          <w:bCs w:val="0"/>
-          <w:iCs w:val="0"/>
-          <w:rtl w:val="0"/>
-        </w:rPr>
-        <w:t xml:space="preserve">prompts</w:t>
-      </w:r>
-      <w:r>
-        <w:rPr>
-          <w:b w:val="0"/>
-          <w:i w:val="0"/>
-          <w:bCs w:val="0"/>
-          <w:iCs w:val="0"/>
-          <w:rtl w:val="0"/>
-        </w:rPr>
-        <w:t xml:space="preserve"> e os testes de aceitação.</w:t>
+        <w:t xml:space="preserve">. As versões serão fixadas e registradas no repositório (YuukiFST, 2026c).</w:t>
       </w:r>
     </w:p>
     <w:p>
@@ -2148,7 +2282,7 @@
           <w:iCs w:val="0"/>
           <w:rtl w:val="0"/>
         </w:rPr>
-        <w:t xml:space="preserve">O produto será o Finn, SaaS multiempresa em que a empresa cliente fala com o próprio financeiro por voz e recebe lançamento, relatório e aviso no celular (YuukiFST, 2026b). Produto e pilha foram decididos antes do experimento em 21 </w:t>
+        <w:t xml:space="preserve">O produto será o Finn, SaaS multiempresa em que a empresa cliente fala com o próprio financeiro por voz e recebe lançamento, relatório e aviso no celular (YuukiFST, 2026b). Produto e pilha foram decididos antes do experimento, em 21 </w:t>
       </w:r>
       <w:r>
         <w:rPr>
@@ -2168,67 +2302,7 @@
           <w:iCs w:val="0"/>
           <w:rtl w:val="0"/>
         </w:rPr>
-        <w:t xml:space="preserve"> fechados. A partir deles o autor escreverá uma especificação única, congelada por SHA-256: produto, pilha (TypeScript, TanStack Start, tRPC, Drizzle ORM, PostgreSQL, Vitest), restrições e nove unidades, uma por </w:t>
-      </w:r>
-      <w:r>
-        <w:rPr>
-          <w:b w:val="0"/>
-          <w:i/>
-          <w:bCs w:val="0"/>
-          <w:iCs w:val="0"/>
-          <w:rtl w:val="0"/>
-        </w:rPr>
-        <w:t xml:space="preserve">ticket</w:t>
-      </w:r>
-      <w:r>
-        <w:rPr>
-          <w:b w:val="0"/>
-          <w:i w:val="0"/>
-          <w:bCs w:val="0"/>
-          <w:iCs w:val="0"/>
-          <w:rtl w:val="0"/>
-        </w:rPr>
-        <w:t xml:space="preserve"> técnico, em ordem de dependência: separação por empresa, governança, </w:t>
-      </w:r>
-      <w:r>
-        <w:rPr>
-          <w:b w:val="0"/>
-          <w:i/>
-          <w:bCs w:val="0"/>
-          <w:iCs w:val="0"/>
-          <w:rtl w:val="0"/>
-        </w:rPr>
-        <w:t xml:space="preserve">flags</w:t>
-      </w:r>
-      <w:r>
-        <w:rPr>
-          <w:b w:val="0"/>
-          <w:i w:val="0"/>
-          <w:bCs w:val="0"/>
-          <w:iCs w:val="0"/>
-          <w:rtl w:val="0"/>
-        </w:rPr>
-        <w:t xml:space="preserve">, </w:t>
-      </w:r>
-      <w:r>
-        <w:rPr>
-          <w:b w:val="0"/>
-          <w:i/>
-          <w:bCs w:val="0"/>
-          <w:iCs w:val="0"/>
-          <w:rtl w:val="0"/>
-        </w:rPr>
-        <w:t xml:space="preserve">pipeline</w:t>
-      </w:r>
-      <w:r>
-        <w:rPr>
-          <w:b w:val="0"/>
-          <w:i w:val="0"/>
-          <w:bCs w:val="0"/>
-          <w:iCs w:val="0"/>
-          <w:rtl w:val="0"/>
-        </w:rPr>
-        <w:t xml:space="preserve"> de voz, confirmação da transcrição, auditoria, relatório, agendador e cobrança. O executor invoca o </w:t>
+        <w:t xml:space="preserve">. O autor escreverá uma especificação única, congelada por SHA-256, com a pilha (TypeScript, TanStack Start, tRPC, Drizzle ORM, PostgreSQL, Vitest) e nove unidades em ordem de dependência. O executor chama o </w:t>
       </w:r>
       <w:r>
         <w:rPr>
@@ -2248,7 +2322,7 @@
           <w:iCs w:val="0"/>
           <w:rtl w:val="0"/>
         </w:rPr>
-        <w:t xml:space="preserve"> uma vez por unidade, em ordem, com </w:t>
+        <w:t xml:space="preserve"> uma vez por unidade, com o mesmo </w:t>
       </w:r>
       <w:r>
         <w:rPr>
@@ -2268,7 +2342,7 @@
           <w:iCs w:val="0"/>
           <w:rtl w:val="0"/>
         </w:rPr>
-        <w:t xml:space="preserve"> idêntico para os dois braços; o que o agente construiu em uma unidade é o ponto de partida da seguinte, e o autor não escreve código no espaço de trabalho. A pontuação será a fração dos testes de aceitação aprovados. O autor os escreverá antes da execução, os manterá fora do espaço de trabalho e os rodará sobre uma cópia dele ao fim de cada unidade. Os testes do próprio agente não contam, porque um modelo que alucina uma API escreve testes que simulam a alucinação. Uma unidade conta como concluída quando todos os seus testes passam, e a construção, quando todos passam ao fim.</w:t>
+        <w:t xml:space="preserve"> nos dois braços, e cada unidade parte do que o agente construiu na anterior. O autor não escreve código no espaço de trabalho.</w:t>
       </w:r>
     </w:p>
     <w:p>
@@ -2286,27 +2360,7 @@
           <w:iCs w:val="0"/>
           <w:rtl w:val="0"/>
         </w:rPr>
-        <w:t xml:space="preserve">Serão dois níveis de modelo, primário e de robustez, gratuitos e no mesmo </w:t>
-      </w:r>
-      <w:r>
-        <w:rPr>
-          <w:b w:val="0"/>
-          <w:i/>
-          <w:bCs w:val="0"/>
-          <w:iCs w:val="0"/>
-          <w:rtl w:val="0"/>
-        </w:rPr>
-        <w:t xml:space="preserve">gateway</w:t>
-      </w:r>
-      <w:r>
-        <w:rPr>
-          <w:b w:val="0"/>
-          <w:i w:val="0"/>
-          <w:bCs w:val="0"/>
-          <w:iCs w:val="0"/>
-          <w:rtl w:val="0"/>
-        </w:rPr>
-        <w:t xml:space="preserve"> (Opencode, 2026b), com resultados relatados por nível. Uma inversão da ordenação entre os braços de um nível para o outro será reportada como resultado.</w:t>
+        <w:t xml:space="preserve">A pontuação será a fração dos testes de aceitação aprovados. O autor escreverá os testes antes da execução, os manterá fora do espaço de trabalho e os rodará sobre uma cópia dele ao fim de cada unidade. Os testes escritos pelo agente não contam, e uma unidade conta como concluída quando todos os seus testes passam.</w:t>
       </w:r>
     </w:p>
     <w:p>
@@ -2320,30 +2374,18 @@
         <w:rPr>
           <w:b w:val="0"/>
           <w:i w:val="0"/>
-          <w:rtl w:val="0"/>
-        </w:rPr>
-        <w:t xml:space="preserve">O instrumento será um </w:t>
-      </w:r>
-      <w:r>
-        <w:rPr>
-          <w:b w:val="0"/>
-          <w:i/>
-          <w:rtl w:val="0"/>
-        </w:rPr>
-        <w:t xml:space="preserve">proxy</w:t>
-      </w:r>
-      <w:r>
-        <w:rPr>
-          <w:b w:val="0"/>
-          <w:i w:val="0"/>
-          <w:rtl w:val="0"/>
-        </w:rPr>
-        <w:t xml:space="preserve"> reverso entre cada braço e o </w:t>
-      </w:r>
-      <w:r>
-        <w:rPr>
-          <w:b w:val="0"/>
-          <w:i/>
+          <w:bCs w:val="0"/>
+          <w:iCs w:val="0"/>
+          <w:rtl w:val="0"/>
+        </w:rPr>
+        <w:t xml:space="preserve">Serão dois níveis de modelo, primário e de robustez, ambos gratuitos no mesmo </w:t>
+      </w:r>
+      <w:r>
+        <w:rPr>
+          <w:b w:val="0"/>
+          <w:i/>
+          <w:bCs w:val="0"/>
+          <w:iCs w:val="0"/>
           <w:rtl w:val="0"/>
         </w:rPr>
         <w:t xml:space="preserve">gateway</w:t>
@@ -2352,73 +2394,11 @@
         <w:rPr>
           <w:b w:val="0"/>
           <w:i w:val="0"/>
-          <w:rtl w:val="0"/>
-        </w:rPr>
-        <w:t xml:space="preserve">, que forçará o relatório de uso em cada requisição. Os tokens serão contados no </w:t>
-      </w:r>
-      <w:r>
-        <w:rPr>
-          <w:b w:val="0"/>
-          <w:i/>
-          <w:rtl w:val="0"/>
-        </w:rPr>
-        <w:t xml:space="preserve">proxy</w:t>
-      </w:r>
-      <w:r>
-        <w:rPr>
-          <w:b w:val="0"/>
-          <w:i w:val="0"/>
-          <w:rtl w:val="0"/>
-        </w:rPr>
-        <w:t xml:space="preserve">, sobre os bytes transmitidos, com um único tokenizador para os dois braços. O relatório do </w:t>
-      </w:r>
-      <w:r>
-        <w:rPr>
-          <w:b w:val="0"/>
-          <w:i/>
-          <w:rtl w:val="0"/>
-        </w:rPr>
-        <w:t xml:space="preserve">harness</w:t>
-      </w:r>
-      <w:r>
-        <w:rPr>
-          <w:b w:val="0"/>
-          <w:i w:val="0"/>
-          <w:rtl w:val="0"/>
-        </w:rPr>
-        <w:t xml:space="preserve"> e o do </w:t>
-      </w:r>
-      <w:r>
-        <w:rPr>
-          <w:b w:val="0"/>
-          <w:i/>
-          <w:rtl w:val="0"/>
-        </w:rPr>
-        <w:t xml:space="preserve">gateway</w:t>
-      </w:r>
-      <w:r>
-        <w:rPr>
-          <w:b w:val="0"/>
-          <w:i w:val="0"/>
-          <w:rtl w:val="0"/>
-        </w:rPr>
-        <w:t xml:space="preserve"> incluem conteúdo injetado que nenhum braço enviou, um deslocamento aditivo que não se cancela em razão e cobraria de cada braço um excedente proporcional ao número de passos. As contagens do </w:t>
-      </w:r>
-      <w:r>
-        <w:rPr>
-          <w:b w:val="0"/>
-          <w:i/>
-          <w:rtl w:val="0"/>
-        </w:rPr>
-        <w:t xml:space="preserve">gateway</w:t>
-      </w:r>
-      <w:r>
-        <w:rPr>
-          <w:b w:val="0"/>
-          <w:i w:val="0"/>
-          <w:rtl w:val="0"/>
-        </w:rPr>
-        <w:t xml:space="preserve"> ficam para verificação cruzada e cálculo de custo, e a divergência será reportada por braço.</w:t>
+          <w:bCs w:val="0"/>
+          <w:iCs w:val="0"/>
+          <w:rtl w:val="0"/>
+        </w:rPr>
+        <w:t xml:space="preserve"> (Opencode, 2026b), com resultados relatados por nível. Se a ordenação dos braços inverter de um nível para o outro, a inversão será reportada como resultado.</w:t>
       </w:r>
     </w:p>
     <w:p>
@@ -2432,18 +2412,30 @@
         <w:rPr>
           <w:b w:val="0"/>
           <w:i w:val="0"/>
-          <w:bCs w:val="0"/>
-          <w:iCs w:val="0"/>
-          <w:rtl w:val="0"/>
-        </w:rPr>
-        <w:t xml:space="preserve">Haverá um único limite, idêntico para os dois braços: relógio de parede por unidade, três vezes a maior mediana dos braços nas unidades-piloto. O número de passos não será limitado, porque um teto de passos é decisão de projeto de </w:t>
-      </w:r>
-      <w:r>
-        <w:rPr>
-          <w:b w:val="0"/>
-          <w:i/>
-          <w:bCs w:val="0"/>
-          <w:iCs w:val="0"/>
+          <w:rtl w:val="0"/>
+        </w:rPr>
+        <w:t xml:space="preserve">O </w:t>
+      </w:r>
+      <w:r>
+        <w:rPr>
+          <w:b w:val="0"/>
+          <w:i/>
+          <w:rtl w:val="0"/>
+        </w:rPr>
+        <w:t xml:space="preserve">proxy</w:t>
+      </w:r>
+      <w:r>
+        <w:rPr>
+          <w:b w:val="0"/>
+          <w:i w:val="0"/>
+          <w:rtl w:val="0"/>
+        </w:rPr>
+        <w:t xml:space="preserve"> contará os tokens sobre os bytes transmitidos, com o mesmo tokenizador para os dois braços. As contagens do </w:t>
+      </w:r>
+      <w:r>
+        <w:rPr>
+          <w:b w:val="0"/>
+          <w:i/>
           <w:rtl w:val="0"/>
         </w:rPr>
         <w:t xml:space="preserve">harness</w:t>
@@ -2452,38 +2444,14 @@
         <w:rPr>
           <w:b w:val="0"/>
           <w:i w:val="0"/>
-          <w:bCs w:val="0"/>
-          <w:iCs w:val="0"/>
-          <w:rtl w:val="0"/>
-        </w:rPr>
-        <w:t xml:space="preserve"> e apagaria a diferença sob teste. O comprimento máximo de saída será forçado igual pelo </w:t>
-      </w:r>
-      <w:r>
-        <w:rPr>
-          <w:b w:val="0"/>
-          <w:i/>
-          <w:bCs w:val="0"/>
-          <w:iCs w:val="0"/>
-          <w:rtl w:val="0"/>
-        </w:rPr>
-        <w:t xml:space="preserve">proxy</w:t>
-      </w:r>
-      <w:r>
-        <w:rPr>
-          <w:b w:val="0"/>
-          <w:i w:val="0"/>
-          <w:bCs w:val="0"/>
-          <w:iCs w:val="0"/>
-          <w:rtl w:val="0"/>
-        </w:rPr>
-        <w:t xml:space="preserve">. Os parâmetros de amostragem serão registrados sem normalização. O </w:t>
-      </w:r>
-      <w:r>
-        <w:rPr>
-          <w:b w:val="0"/>
-          <w:i/>
-          <w:bCs w:val="0"/>
-          <w:iCs w:val="0"/>
+          <w:rtl w:val="0"/>
+        </w:rPr>
+        <w:t xml:space="preserve"> e do </w:t>
+      </w:r>
+      <w:r>
+        <w:rPr>
+          <w:b w:val="0"/>
+          <w:i/>
           <w:rtl w:val="0"/>
         </w:rPr>
         <w:t xml:space="preserve">gateway</w:t>
@@ -2492,11 +2460,9 @@
         <w:rPr>
           <w:b w:val="0"/>
           <w:i w:val="0"/>
-          <w:bCs w:val="0"/>
-          <w:iCs w:val="0"/>
-          <w:rtl w:val="0"/>
-        </w:rPr>
-        <w:t xml:space="preserve"> não os honra, e Miller (2024) desaconselha mexer na temperatura para reduzir variância. O isolamento de ambiente será verificado por um portão que falha fechado.</w:t>
+          <w:rtl w:val="0"/>
+        </w:rPr>
+        <w:t xml:space="preserve"> servem só para verificação cruzada.</w:t>
       </w:r>
     </w:p>
     <w:p>
@@ -2508,14 +2474,33 @@
       </w:pPr>
       <w:r>
         <w:rPr>
-          <w:rFonts w:ascii="Gungsuh" w:cs="Gungsuh" w:eastAsia="Gungsuh" w:hAnsi="Gungsuh"/>
-          <w:b w:val="0"/>
-          <w:i w:val="0"/>
-          <w:bCs w:val="0"/>
-          <w:iCs w:val="0"/>
-          <w:rtl w:val="0"/>
-        </w:rPr>
-        <w:t xml:space="preserve">Cada célula (braço, nível) receberá n ≥ 3 construções completas após descartes, na função redutora de variância que Miller (2024) atribui à reamostragem. Os resultados sairão como mediana com dispersão; no nível gratuito, requisições idênticas podem variar em tokens de saída. Se a cota não comportar a matriz, a cobertura será reduzida antes das repetições.</w:t>
+          <w:b w:val="0"/>
+          <w:i w:val="0"/>
+          <w:bCs w:val="0"/>
+          <w:iCs w:val="0"/>
+          <w:rtl w:val="0"/>
+        </w:rPr>
+        <w:t xml:space="preserve">Haverá um único limite, igual para os dois braços: tempo de relógio por unidade, de três vezes a maior mediana dos braços nas unidades-piloto. O número de passos fica livre, porque um teto de passos é decisão de projeto de </w:t>
+      </w:r>
+      <w:r>
+        <w:rPr>
+          <w:b w:val="0"/>
+          <w:i/>
+          <w:bCs w:val="0"/>
+          <w:iCs w:val="0"/>
+          <w:rtl w:val="0"/>
+        </w:rPr>
+        <w:t xml:space="preserve">harness</w:t>
+      </w:r>
+      <w:r>
+        <w:rPr>
+          <w:b w:val="0"/>
+          <w:i w:val="0"/>
+          <w:bCs w:val="0"/>
+          <w:iCs w:val="0"/>
+          <w:rtl w:val="0"/>
+        </w:rPr>
+        <w:t xml:space="preserve"> e apagaria a diferença sob teste.</w:t>
       </w:r>
     </w:p>
     <w:p>
@@ -2527,33 +2512,14 @@
       </w:pPr>
       <w:r>
         <w:rPr>
-          <w:b w:val="0"/>
-          <w:i w:val="0"/>
-          <w:bCs w:val="0"/>
-          <w:iCs w:val="0"/>
-          <w:rtl w:val="0"/>
-        </w:rPr>
-        <w:t xml:space="preserve">A medida principal será o total de tokens por construção, sempre ao lado da fração final de testes aprovados, para que um braço que falhe barato não pareça o mais barato. A comparação inferencial será o teste de Wilcoxon dos postos sinalizados, bilateral, α = 0,05, pareado por unidade, sobre tokens por unidade e Succ/Mtok por unidade. O teste é não paramétrico porque nove pares não sustentam suposição distribucional, e pareado porque a dificuldade da unidade é o maior fator de perturbação (Miller, 2024). As unidades não são independentes, pois a seguinte parte do que o mesmo braço construiu; essa dependência é parte do custo do </w:t>
-      </w:r>
-      <w:r>
-        <w:rPr>
-          <w:b w:val="0"/>
-          <w:i/>
-          <w:bCs w:val="0"/>
-          <w:iCs w:val="0"/>
-          <w:rtl w:val="0"/>
-        </w:rPr>
-        <w:t xml:space="preserve">harness</w:t>
-      </w:r>
-      <w:r>
-        <w:rPr>
-          <w:b w:val="0"/>
-          <w:i w:val="0"/>
-          <w:bCs w:val="0"/>
-          <w:iCs w:val="0"/>
-          <w:rtl w:val="0"/>
-        </w:rPr>
-        <w:t xml:space="preserve"> e será reportada por unidade. Com n = 3 e 9 unidades, a diferença mínima detectável é de cerca de 0,76σ. Para H2, os tokens de cada unidade serão decompostos em carga fixa (Camada 1 multiplicada pelo número de passos) e conversa, com a parcela de cada uma reportada por unidade e por construção. As predições serão pré-registradas por nível, e um resultado nulo para H2 será reportado.</w:t>
+          <w:rFonts w:ascii="Gungsuh" w:cs="Gungsuh" w:eastAsia="Gungsuh" w:hAnsi="Gungsuh"/>
+          <w:b w:val="0"/>
+          <w:i w:val="0"/>
+          <w:bCs w:val="0"/>
+          <w:iCs w:val="0"/>
+          <w:rtl w:val="0"/>
+        </w:rPr>
+        <w:t xml:space="preserve">Cada combinação de braço e nível terá ao menos três construções completas válidas, relatadas em mediana e dispersão.</w:t>
       </w:r>
     </w:p>
     <w:p>
@@ -2571,66 +2537,7 @@
           <w:iCs w:val="0"/>
           <w:rtl w:val="0"/>
         </w:rPr>
-        <w:t xml:space="preserve">Cada unidade de cada construção receberá uma classe. Unidade não concluída conta como resultado, com a fração de testes aprovada, e a construção segue, estouro de relógio incluído; repetir converteria indisponibilidade do serviço em diferença entre </w:t>
-      </w:r>
-      <w:r>
-        <w:rPr>
-          <w:b w:val="0"/>
-          <w:i/>
-          <w:bCs w:val="0"/>
-          <w:iCs w:val="0"/>
-          <w:rtl w:val="0"/>
-        </w:rPr>
-        <w:t xml:space="preserve">harnesses</w:t>
-      </w:r>
-      <w:r>
-        <w:rPr>
-          <w:b w:val="0"/>
-          <w:i w:val="0"/>
-          <w:bCs w:val="0"/>
-          <w:iCs w:val="0"/>
-          <w:rtl w:val="0"/>
-        </w:rPr>
-        <w:t xml:space="preserve">. Medição inconfiável descarta a construção inteira, registrada, sem reparo nem repetição. A classe vem do registro do </w:t>
-      </w:r>
-      <w:r>
-        <w:rPr>
-          <w:b w:val="0"/>
-          <w:i/>
-          <w:bCs w:val="0"/>
-          <w:iCs w:val="0"/>
-          <w:rtl w:val="0"/>
-        </w:rPr>
-        <w:t xml:space="preserve">proxy</w:t>
-      </w:r>
-      <w:r>
-        <w:rPr>
-          <w:b w:val="0"/>
-          <w:i w:val="0"/>
-          <w:bCs w:val="0"/>
-          <w:iCs w:val="0"/>
-          <w:rtl w:val="0"/>
-        </w:rPr>
-        <w:t xml:space="preserve">; o código de saída não discrimina o desfecho.</w:t>
-      </w:r>
-    </w:p>
-    <w:p>
-      <w:pPr>
-        <w:spacing w:after="0" w:before="120" w:line="360" w:lineRule="auto"/>
-        <w:rPr/>
-      </w:pPr>
-      <w:r>
-        <w:rPr>
-          <w:b w:val="1"/>
-          <w:bCs w:val="1"/>
-          <w:rtl w:val="0"/>
-        </w:rPr>
-        <w:t xml:space="preserve">Limitações e ameaças à validade</w:t>
-      </w:r>
-      <w:r>
-        <w:rPr>
-          <w:rtl w:val="0"/>
-        </w:rPr>
+        <w:t xml:space="preserve">A comparação usará o teste de Wilcoxon dos postos sinalizados, bilateral, α = 0,05, sobre tokens, fração de testes aprovados e Succ/Mtok, pareado por unidade porque a dificuldade da unidade é a maior fonte de variação (Miller, 2024). Para H2, os tokens de cada unidade serão divididos em carga fixa (Camada 1 vezes o número de passos) e conversa. As predições serão registradas antes da coleta.</w:t>
       </w:r>
     </w:p>
     <w:p>
@@ -2648,7 +2555,44 @@
           <w:iCs w:val="0"/>
           <w:rtl w:val="0"/>
         </w:rPr>
-        <w:t xml:space="preserve">O projeto parte de quatro limitações. O efeito do </w:t>
+        <w:t xml:space="preserve">Unidade não concluída conta como resultado, com a fração de testes aprovada, e a construção segue. Medição não confiável, como a troca do modelo servido no meio da coleta, descarta a construção inteira.</w:t>
+      </w:r>
+    </w:p>
+    <w:p>
+      <w:pPr>
+        <w:spacing w:after="0" w:before="120" w:line="360" w:lineRule="auto"/>
+        <w:rPr/>
+      </w:pPr>
+      <w:r>
+        <w:rPr>
+          <w:b w:val="1"/>
+          <w:bCs w:val="1"/>
+          <w:rtl w:val="0"/>
+        </w:rPr>
+        <w:t xml:space="preserve">Limitações e ameaças à validade</w:t>
+      </w:r>
+      <w:r>
+        <w:rPr>
+          <w:rtl w:val="0"/>
+        </w:rPr>
+      </w:r>
+    </w:p>
+    <w:p>
+      <w:pPr>
+        <w:spacing w:after="0" w:line="360" w:lineRule="auto"/>
+        <w:ind w:firstLine="709"/>
+        <w:jc w:val="both"/>
+        <w:rPr/>
+      </w:pPr>
+      <w:r>
+        <w:rPr>
+          <w:b w:val="0"/>
+          <w:i w:val="0"/>
+          <w:bCs w:val="0"/>
+          <w:iCs w:val="0"/>
+          <w:rtl w:val="0"/>
+        </w:rPr>
+        <w:t xml:space="preserve">O projeto tem quatro limitações. O efeito do </w:t>
       </w:r>
       <w:r>
         <w:rPr>
@@ -2668,7 +2612,27 @@
           <w:iCs w:val="0"/>
           <w:rtl w:val="0"/>
         </w:rPr>
-        <w:t xml:space="preserve"> é específico do modelo e pode inverter de sinal; as conclusões valem por nível, e o objetivo (5) testa isso. O produto é um único SaaS sobre uma única pilha; outras pilhas ficam como trabalho futuro. A especificação é do autor e cada braço carrega os próprios erros de uma unidade à seguinte; a mitigação é a mesma entrada, o mesmo espaço vazio e a comparação pareada por unidade. Como o produto é próprio, os valores absolutos não são comparáveis a placares públicos; a comparação válida é entre os braços, e o custo em dinheiro entra como contrafactual rotulado sobre tarifas pagas publicadas.</w:t>
+        <w:t xml:space="preserve"> depende do modelo, então as conclusões valem por nível. O produto é um único SaaS em uma única pilha. Cada braço carrega os próprios erros de uma unidade à seguinte, então as unidades não são independentes, embora o teste de Wilcoxon suponha que sejam; o valor-p será lido como indicativo, ao lado da diferença e da dispersão. Por fim, o nível gratuito do </w:t>
+      </w:r>
+      <w:r>
+        <w:rPr>
+          <w:b w:val="0"/>
+          <w:i/>
+          <w:bCs w:val="0"/>
+          <w:iCs w:val="0"/>
+          <w:rtl w:val="0"/>
+        </w:rPr>
+        <w:t xml:space="preserve">gateway</w:t>
+      </w:r>
+      <w:r>
+        <w:rPr>
+          <w:b w:val="0"/>
+          <w:i w:val="0"/>
+          <w:bCs w:val="0"/>
+          <w:iCs w:val="0"/>
+          <w:rtl w:val="0"/>
+        </w:rPr>
+        <w:t xml:space="preserve"> pode trocar o modelo ou cortar a cota durante a coleta.</w:t>
       </w:r>
     </w:p>
     <w:p>
@@ -2808,16 +2772,33 @@
             </w:pPr>
             <w:r>
               <w:rPr>
+                <w:b w:val="0"/>
+                <w:i w:val="0"/>
                 <w:sz w:val="22"/>
                 <w:szCs w:val="22"/>
                 <w:rtl w:val="0"/>
               </w:rPr>
-              <w:t xml:space="preserve">Inferência dos modelos (dois níveis, nível gratuito do gateway)</w:t>
-            </w:r>
-            <w:r>
-              <w:rPr>
-                <w:rtl w:val="0"/>
-              </w:rPr>
+              <w:t xml:space="preserve">Inferência dos modelos (dois níveis, nível gratuito do </w:t>
+            </w:r>
+            <w:r>
+              <w:rPr>
+                <w:b w:val="0"/>
+                <w:i/>
+                <w:sz w:val="22"/>
+                <w:szCs w:val="22"/>
+                <w:rtl w:val="0"/>
+              </w:rPr>
+              <w:t xml:space="preserve">gateway</w:t>
+            </w:r>
+            <w:r>
+              <w:rPr>
+                <w:b w:val="0"/>
+                <w:i w:val="0"/>
+                <w:sz w:val="22"/>
+                <w:szCs w:val="22"/>
+                <w:rtl w:val="0"/>
+              </w:rPr>
+              <w:t xml:space="preserve">)</w:t>
             </w:r>
           </w:p>
         </w:tc>
@@ -2860,8 +2841,8 @@
             <w:r>
               <w:rPr>
                 <w:b w:val="0"/>
+                <w:i/>
                 <w:bCs w:val="0"/>
-                <w:i w:val="1"/>
                 <w:iCs w:val="1"/>
                 <w:sz w:val="22"/>
                 <w:szCs w:val="22"/>
@@ -2872,19 +2853,14 @@
             <w:r>
               <w:rPr>
                 <w:b w:val="0"/>
+                <w:i w:val="0"/>
                 <w:bCs w:val="0"/>
-                <w:i w:val="0"/>
-                <w:iCs w:val="0"/>
+                <w:iCs w:val="1"/>
                 <w:sz w:val="22"/>
                 <w:szCs w:val="22"/>
                 <w:rtl w:val="0"/>
               </w:rPr>
-              <w:t xml:space="preserve"> e ferramentas (OpenCode e pi, código aberto; Node.js e PostgreSQL)</w:t>
-            </w:r>
-            <w:r>
-              <w:rPr>
-                <w:rtl w:val="0"/>
-              </w:rPr>
+              <w:t xml:space="preserve"> e ferramentas de código aberto</w:t>
             </w:r>
           </w:p>
         </w:tc>
@@ -3040,44 +3016,6 @@
     </w:p>
     <w:p>
       <w:pPr>
-        <w:spacing w:after="0" w:line="360" w:lineRule="auto"/>
-        <w:ind w:firstLine="709"/>
-        <w:jc w:val="both"/>
-        <w:rPr/>
-      </w:pPr>
-      <w:r>
-        <w:rPr>
-          <w:b w:val="0"/>
-          <w:i w:val="0"/>
-          <w:bCs w:val="0"/>
-          <w:iCs w:val="0"/>
-          <w:rtl w:val="0"/>
-        </w:rPr>
-        <w:t xml:space="preserve">O total em dinheiro é zero; o limite é a cota do nível gratuito do </w:t>
-      </w:r>
-      <w:r>
-        <w:rPr>
-          <w:b w:val="0"/>
-          <w:i/>
-          <w:bCs w:val="0"/>
-          <w:iCs w:val="0"/>
-          <w:rtl w:val="0"/>
-        </w:rPr>
-        <w:t xml:space="preserve">gateway</w:t>
-      </w:r>
-      <w:r>
-        <w:rPr>
-          <w:b w:val="0"/>
-          <w:i w:val="0"/>
-          <w:bCs w:val="0"/>
-          <w:iCs w:val="0"/>
-          <w:rtl w:val="0"/>
-        </w:rPr>
-        <w:t xml:space="preserve">, a ser medida nas unidades-piloto. Cada construção rodará em lotes ao longo de dias, retomada na fronteira entre unidades, e o custo monetário aparecerá só como contrafactual sobre tarifas pagas publicadas.</w:t>
-      </w:r>
-    </w:p>
-    <w:p>
-      <w:pPr>
         <w:keepNext w:val="1"/>
         <w:spacing w:after="120" w:before="240" w:line="360" w:lineRule="auto"/>
         <w:rPr/>
@@ -3096,24 +3034,6 @@
         <w:rPr>
           <w:rtl w:val="0"/>
         </w:rPr>
-      </w:r>
-    </w:p>
-    <w:p>
-      <w:pPr>
-        <w:spacing w:after="0" w:line="360" w:lineRule="auto"/>
-        <w:ind w:firstLine="709"/>
-        <w:jc w:val="both"/>
-        <w:rPr/>
-      </w:pPr>
-      <w:r>
-        <w:rPr>
-          <w:b w:val="0"/>
-          <w:i w:val="0"/>
-          <w:bCs w:val="0"/>
-          <w:iCs w:val="0"/>
-          <w:rtl w:val="0"/>
-        </w:rPr>
-        <w:t xml:space="preserve">A cota gratuita é o limite vinculante, então a cadência é de um lote da matriz por dia. A folga fica na execução da matriz e na escrita da especificação e dos testes. Os meses vão de agosto de 2026 a janeiro de 2027; a escrita do projeto foi concluída em setembro de 2026, mês de entrega, e os experimentos começam em outubro.</w:t>
       </w:r>
     </w:p>
     <w:p>
@@ -3500,16 +3420,13 @@
             </w:pPr>
             <w:r>
               <w:rPr>
+                <w:b w:val="0"/>
+                <w:i w:val="0"/>
                 <w:sz w:val="18"/>
                 <w:szCs w:val="18"/>
                 <w:rtl w:val="0"/>
               </w:rPr>
-              <w:t xml:space="preserve">DEFINIÇÃO DO TEMA, DO PROBLEMA E DAS HIPÓTESES</w:t>
-            </w:r>
-            <w:r>
-              <w:rPr>
-                <w:rtl w:val="0"/>
-              </w:rPr>
+              <w:t xml:space="preserve">DEFINIÇÃO DO TEMA E DAS HIPÓTESES</w:t>
             </w:r>
           </w:p>
         </w:tc>
@@ -3635,19 +3552,14 @@
             <w:r>
               <w:rPr>
                 <w:b w:val="0"/>
+                <w:i w:val="0"/>
                 <w:bCs w:val="0"/>
-                <w:i w:val="0"/>
                 <w:iCs w:val="0"/>
                 <w:sz w:val="18"/>
                 <w:szCs w:val="18"/>
                 <w:rtl w:val="0"/>
               </w:rPr>
-              <w:t xml:space="preserve">CONSTRUÇÃO DO INSTRUMENTO, DA ESPECIFICAÇÃO E DOS TESTES DE ACEITAÇÃO</w:t>
-            </w:r>
-            <w:r>
-              <w:rPr>
-                <w:rtl w:val="0"/>
-              </w:rPr>
+              <w:t xml:space="preserve">CONSTRUÇÃO DO PROXY E DOS TESTES</w:t>
             </w:r>
           </w:p>
         </w:tc>
@@ -4512,16 +4424,13 @@
             </w:pPr>
             <w:r>
               <w:rPr>
+                <w:b w:val="0"/>
+                <w:i w:val="0"/>
                 <w:sz w:val="18"/>
                 <w:szCs w:val="18"/>
                 <w:rtl w:val="0"/>
               </w:rPr>
-              <w:t xml:space="preserve">REVISÃO FINAL E PREPARAÇÃO DA APRESENTAÇÃO</w:t>
-            </w:r>
-            <w:r>
-              <w:rPr>
-                <w:rtl w:val="0"/>
-              </w:rPr>
+              <w:t xml:space="preserve">REVISÃO FINAL E APRESENTAÇÃO</w:t>
             </w:r>
           </w:p>
         </w:tc>
@@ -4673,26 +4582,265 @@
       </w:pPr>
       <w:r>
         <w:rPr>
-          <w:rtl w:val="0"/>
-        </w:rPr>
-        <w:t xml:space="preserve">ALIER FORMENT, Marc; CASAÑ GUERRERO, María José; GARCÍA-PEÑALVO, Francisco José; PEREIRA, Juanan. </w:t>
+          <w:b w:val="0"/>
+          <w:bCs w:val="0"/>
+          <w:i w:val="0"/>
+          <w:iCs w:val="0"/>
+          <w:rtl w:val="0"/>
+        </w:rPr>
+        <w:t xml:space="preserve">BRASIL. Conselho Nacional de Desenvolvimento Científico e Tecnológico. </w:t>
       </w:r>
       <w:r>
         <w:rPr>
           <w:b w:val="1"/>
           <w:bCs w:val="1"/>
-          <w:rtl w:val="0"/>
-        </w:rPr>
-        <w:t xml:space="preserve">The scaffolding matters more than the interface</w:t>
-      </w:r>
-      <w:r>
-        <w:rPr>
-          <w:rtl w:val="0"/>
-        </w:rPr>
-        <w:t xml:space="preserve">: a controlled comparison of MCP and CLI tool use across seven agent scaffoldings, five language models, and one software task. arXiv:2608.08654, 2026. </w:t>
-      </w:r>
-      <w:r>
-        <w:rPr>
+          <w:i w:val="0"/>
+          <w:iCs w:val="0"/>
+          <w:rtl w:val="0"/>
+        </w:rPr>
+        <w:t xml:space="preserve">Portaria CNPq nº 2.664, de 6 de março de 2026</w:t>
+      </w:r>
+      <w:r>
+        <w:rPr>
+          <w:b w:val="0"/>
+          <w:bCs w:val="0"/>
+          <w:i w:val="0"/>
+          <w:iCs w:val="0"/>
+          <w:rtl w:val="0"/>
+        </w:rPr>
+        <w:t xml:space="preserve">. Institui a Política de Integridade na Atividade Científica do CNPq. Diário Oficial da União: seção 1, Brasília, DF, p. 4, 11 mar. 2026. Disponível em: http://memoria2.cnpq.br/web/guest/view/-/journal_content/56_INSTANCE_0oED/10157/23142775. Acesso em: 11 set. 2026.</w:t>
+      </w:r>
+      <w:r>
+        <w:rPr>
+          <w:rtl w:val="0"/>
+        </w:rPr>
+      </w:r>
+    </w:p>
+    <w:p>
+      <w:pPr>
+        <w:spacing w:after="240" w:line="240" w:lineRule="auto"/>
+        <w:rPr/>
+      </w:pPr>
+      <w:r>
+        <w:rPr>
+          <w:rtl w:val="0"/>
+        </w:rPr>
+        <w:t xml:space="preserve">EARENDIL. </w:t>
+      </w:r>
+      <w:r>
+        <w:rPr>
+          <w:b w:val="1"/>
+          <w:bCs w:val="1"/>
+          <w:rtl w:val="0"/>
+        </w:rPr>
+        <w:t xml:space="preserve">Pi, minimal and performant</w:t>
+      </w:r>
+      <w:r>
+        <w:rPr>
+          <w:rtl w:val="0"/>
+        </w:rPr>
+        <w:t xml:space="preserve">. 2026. Publicação de blogue institucional. Disponível em: https://earendil.com/posts/pi-autoresearch-and-databricks/. Acesso em: 28 ago. 2026.</w:t>
+      </w:r>
+    </w:p>
+    <w:p>
+      <w:pPr>
+        <w:spacing w:after="240" w:line="240" w:lineRule="auto"/>
+        <w:rPr/>
+      </w:pPr>
+      <w:r>
+        <w:rPr>
+          <w:b w:val="0"/>
+          <w:i w:val="0"/>
+          <w:bCs w:val="0"/>
+          <w:iCs w:val="0"/>
+          <w:rtl w:val="0"/>
+        </w:rPr>
+        <w:t xml:space="preserve">KARPATHY, Andrej. </w:t>
+      </w:r>
+      <w:r>
+        <w:rPr>
+          <w:b/>
+          <w:i w:val="0"/>
+          <w:bCs w:val="0"/>
+          <w:iCs w:val="0"/>
+          <w:rtl w:val="0"/>
+        </w:rPr>
+        <w:t xml:space="preserve">LLM Wiki</w:t>
+      </w:r>
+      <w:r>
+        <w:rPr>
+          <w:b w:val="0"/>
+          <w:i w:val="0"/>
+          <w:bCs w:val="0"/>
+          <w:iCs w:val="0"/>
+          <w:rtl w:val="0"/>
+        </w:rPr>
+        <w:t xml:space="preserve">: a pattern for building personal knowledge bases using LLMs. 2026. Gist (GitHub). Disponível em: https://gist.github.com/karpathy/442a6bf555914893e9891c11519de94f. Acesso em: 14 set. 2026.</w:t>
+      </w:r>
+    </w:p>
+    <w:p>
+      <w:pPr>
+        <w:spacing w:after="240" w:line="240" w:lineRule="auto"/>
+        <w:rPr/>
+      </w:pPr>
+      <w:r>
+        <w:rPr>
+          <w:b w:val="0"/>
+          <w:i w:val="0"/>
+          <w:rtl w:val="0"/>
+        </w:rPr>
+        <w:t xml:space="preserve">LIN, Jiahang </w:t>
+      </w:r>
+      <w:r>
+        <w:rPr>
+          <w:b w:val="0"/>
+          <w:i/>
+          <w:rtl w:val="0"/>
+        </w:rPr>
+        <w:t xml:space="preserve">et al.</w:t>
+      </w:r>
+      <w:r>
+        <w:rPr>
+          <w:b w:val="0"/>
+          <w:i w:val="0"/>
+          <w:rtl w:val="0"/>
+        </w:rPr>
+        <w:t xml:space="preserve"> </w:t>
+      </w:r>
+      <w:r>
+        <w:rPr>
+          <w:b/>
+          <w:i w:val="0"/>
+          <w:rtl w:val="0"/>
+        </w:rPr>
+        <w:t xml:space="preserve">Agentic harness engineering</w:t>
+      </w:r>
+      <w:r>
+        <w:rPr>
+          <w:b w:val="0"/>
+          <w:i w:val="0"/>
+          <w:rtl w:val="0"/>
+        </w:rPr>
+        <w:t xml:space="preserve">: observability-driven automatic evolution of coding-agent harnesses. arXiv:2604.25850, 2026. </w:t>
+      </w:r>
+      <w:r>
+        <w:rPr>
+          <w:b w:val="0"/>
+          <w:i/>
+          <w:rtl w:val="0"/>
+        </w:rPr>
+        <w:t xml:space="preserve">Preprint</w:t>
+      </w:r>
+      <w:r>
+        <w:rPr>
+          <w:b w:val="0"/>
+          <w:i w:val="0"/>
+          <w:rtl w:val="0"/>
+        </w:rPr>
+        <w:t xml:space="preserve">, não revisado por pares. Disponível em: https://arxiv.org/abs/2604.25850. Acesso em: 28 ago. 2026.</w:t>
+      </w:r>
+    </w:p>
+    <w:p>
+      <w:pPr>
+        <w:spacing w:after="240" w:line="240" w:lineRule="auto"/>
+        <w:rPr/>
+      </w:pPr>
+      <w:r>
+        <w:rPr>
+          <w:b w:val="0"/>
+          <w:i w:val="0"/>
+          <w:rtl w:val="0"/>
+        </w:rPr>
+        <w:t xml:space="preserve">LIU, Haozhe </w:t>
+      </w:r>
+      <w:r>
+        <w:rPr>
+          <w:b w:val="0"/>
+          <w:i/>
+          <w:rtl w:val="0"/>
+        </w:rPr>
+        <w:t xml:space="preserve">et al.</w:t>
+      </w:r>
+      <w:r>
+        <w:rPr>
+          <w:b w:val="0"/>
+          <w:i w:val="0"/>
+          <w:rtl w:val="0"/>
+        </w:rPr>
+        <w:t xml:space="preserve"> </w:t>
+      </w:r>
+      <w:r>
+        <w:rPr>
+          <w:b/>
+          <w:i w:val="0"/>
+          <w:rtl w:val="0"/>
+        </w:rPr>
+        <w:t xml:space="preserve">SoL-Pi</w:t>
+      </w:r>
+      <w:r>
+        <w:rPr>
+          <w:b w:val="0"/>
+          <w:i w:val="0"/>
+          <w:rtl w:val="0"/>
+        </w:rPr>
+        <w:t xml:space="preserve">: recursively scaling auto-research loops for efficient agent harness. arXiv:2609.20519, 2026. </w:t>
+      </w:r>
+      <w:r>
+        <w:rPr>
+          <w:b w:val="0"/>
+          <w:i/>
+          <w:rtl w:val="0"/>
+        </w:rPr>
+        <w:t xml:space="preserve">Preprint</w:t>
+      </w:r>
+      <w:r>
+        <w:rPr>
+          <w:b w:val="0"/>
+          <w:i w:val="0"/>
+          <w:rtl w:val="0"/>
+        </w:rPr>
+        <w:t xml:space="preserve">, não revisado por pares. Disponível em: https://arxiv.org/abs/2609.20519. Acesso em: 23 set. 2026.</w:t>
+      </w:r>
+    </w:p>
+    <w:p>
+      <w:pPr>
+        <w:spacing w:after="240" w:line="240" w:lineRule="auto"/>
+        <w:rPr/>
+      </w:pPr>
+      <w:r>
+        <w:rPr>
+          <w:b w:val="0"/>
+          <w:bCs w:val="0"/>
+          <w:i w:val="0"/>
+          <w:iCs w:val="0"/>
+          <w:rtl w:val="0"/>
+        </w:rPr>
+        <w:t xml:space="preserve">MILLER, Evan. </w:t>
+      </w:r>
+      <w:r>
+        <w:rPr>
+          <w:b w:val="1"/>
+          <w:bCs w:val="1"/>
+          <w:i w:val="0"/>
+          <w:iCs w:val="0"/>
+          <w:rtl w:val="0"/>
+        </w:rPr>
+        <w:t xml:space="preserve">Adding error bars to evals</w:t>
+      </w:r>
+      <w:r>
+        <w:rPr>
+          <w:b w:val="0"/>
+          <w:bCs w:val="0"/>
+          <w:i w:val="0"/>
+          <w:iCs w:val="0"/>
+          <w:rtl w:val="0"/>
+        </w:rPr>
+        <w:t xml:space="preserve">: a statistical approach to language model evaluations. arXiv:2411.00640, 2024. </w:t>
+      </w:r>
+      <w:r>
+        <w:rPr>
+          <w:b w:val="0"/>
+          <w:bCs w:val="0"/>
           <w:i w:val="1"/>
           <w:iCs w:val="1"/>
           <w:rtl w:val="0"/>
@@ -4701,9 +4849,18 @@
       </w:r>
       <w:r>
         <w:rPr>
-          <w:rtl w:val="0"/>
-        </w:rPr>
-        <w:t xml:space="preserve">, não revisado por pares. Disponível em: https://arxiv.org/abs/2608.08654. Acesso em: 9 set. 2026.</w:t>
+          <w:b w:val="0"/>
+          <w:bCs w:val="0"/>
+          <w:i w:val="0"/>
+          <w:iCs w:val="0"/>
+          <w:rtl w:val="0"/>
+        </w:rPr>
+        <w:t xml:space="preserve">, não revisado por pares. Disponível em: https://arxiv.org/abs/2411.00640. Acesso em: 28 ago. 2026.</w:t>
+      </w:r>
+      <w:r>
+        <w:rPr>
+          <w:rtl w:val="0"/>
+        </w:rPr>
       </w:r>
     </w:p>
     <w:p>
@@ -4713,116 +4870,37 @@
       </w:pPr>
       <w:r>
         <w:rPr>
-          <w:b w:val="0"/>
-          <w:bCs w:val="0"/>
-          <w:i w:val="0"/>
-          <w:iCs w:val="0"/>
-          <w:rtl w:val="0"/>
-        </w:rPr>
-        <w:t xml:space="preserve">BRASIL. Conselho Nacional de Desenvolvimento Científico e Tecnológico. </w:t>
+          <w:rtl w:val="0"/>
+        </w:rPr>
+        <w:t xml:space="preserve">NING, Xuying </w:t>
+      </w:r>
+      <w:r>
+        <w:rPr>
+          <w:i w:val="1"/>
+          <w:iCs w:val="1"/>
+          <w:rtl w:val="0"/>
+        </w:rPr>
+        <w:t xml:space="preserve">et al.</w:t>
+      </w:r>
+      <w:r>
+        <w:rPr>
+          <w:rtl w:val="0"/>
+        </w:rPr>
+        <w:t xml:space="preserve"> </w:t>
       </w:r>
       <w:r>
         <w:rPr>
           <w:b w:val="1"/>
           <w:bCs w:val="1"/>
-          <w:i w:val="0"/>
-          <w:iCs w:val="0"/>
-          <w:rtl w:val="0"/>
-        </w:rPr>
-        <w:t xml:space="preserve">Portaria CNPq nº 2.664, de 6 de março de 2026</w:t>
-      </w:r>
-      <w:r>
-        <w:rPr>
-          <w:b w:val="0"/>
-          <w:bCs w:val="0"/>
-          <w:i w:val="0"/>
-          <w:iCs w:val="0"/>
-          <w:rtl w:val="0"/>
-        </w:rPr>
-        <w:t xml:space="preserve">. Institui a Política de Integridade na Atividade Científica do CNPq. Diário Oficial da União: seção 1, Brasília, DF, p. 4, 11 mar. 2026. Disponível em: http://memoria2.cnpq.br/web/guest/view/-/journal_content/56_INSTANCE_0oED/10157/23142775. Acesso em: 11 set. 2026.</w:t>
-      </w:r>
-      <w:r>
-        <w:rPr>
-          <w:rtl w:val="0"/>
-        </w:rPr>
-      </w:r>
-    </w:p>
-    <w:p>
-      <w:pPr>
-        <w:spacing w:after="240" w:line="240" w:lineRule="auto"/>
-        <w:rPr/>
-      </w:pPr>
-      <w:r>
-        <w:rPr>
-          <w:rtl w:val="0"/>
-        </w:rPr>
-        <w:t xml:space="preserve">EARENDIL. </w:t>
-      </w:r>
-      <w:r>
-        <w:rPr>
-          <w:b w:val="1"/>
-          <w:bCs w:val="1"/>
-          <w:rtl w:val="0"/>
-        </w:rPr>
-        <w:t xml:space="preserve">Pi, minimal and performant</w:t>
-      </w:r>
-      <w:r>
-        <w:rPr>
-          <w:rtl w:val="0"/>
-        </w:rPr>
-        <w:t xml:space="preserve">. 2026. Publicação de blogue institucional. Disponível em: https://earendil.com/posts/pi-autoresearch-and-databricks/. Acesso em: 28 ago. 2026.</w:t>
-      </w:r>
-    </w:p>
-    <w:p>
-      <w:pPr>
-        <w:spacing w:after="240" w:line="240" w:lineRule="auto"/>
-        <w:rPr/>
-      </w:pPr>
-      <w:r>
-        <w:rPr>
-          <w:rtl w:val="0"/>
-        </w:rPr>
-        <w:t xml:space="preserve">HARNESSRANK. </w:t>
-      </w:r>
-      <w:r>
-        <w:rPr>
-          <w:b w:val="1"/>
-          <w:bCs w:val="1"/>
-          <w:rtl w:val="0"/>
-        </w:rPr>
-        <w:t xml:space="preserve">HarnessRank</w:t>
-      </w:r>
-      <w:r>
-        <w:rPr>
-          <w:rtl w:val="0"/>
-        </w:rPr>
-        <w:t xml:space="preserve">: coding-agent harness rankings. 2026. Disponível em: https://harnessrank.net/. Acesso em: 28 ago. 2026.</w:t>
-      </w:r>
-    </w:p>
-    <w:p>
-      <w:pPr>
-        <w:spacing w:after="240" w:line="240" w:lineRule="auto"/>
-        <w:rPr/>
-      </w:pPr>
-      <w:r>
-        <w:rPr>
-          <w:rtl w:val="0"/>
-        </w:rPr>
-        <w:t xml:space="preserve">KAPOOR, Sayash; STROEBL, Benedikt; SIEGEL, Zachary S.; NADGIR, Nitya; NARAYANAN, Arvind. </w:t>
-      </w:r>
-      <w:r>
-        <w:rPr>
-          <w:b w:val="1"/>
-          <w:bCs w:val="1"/>
-          <w:rtl w:val="0"/>
-        </w:rPr>
-        <w:t xml:space="preserve">AI agents that matter</w:t>
-      </w:r>
-      <w:r>
-        <w:rPr>
-          <w:rtl w:val="0"/>
-        </w:rPr>
-        <w:t xml:space="preserve">. arXiv:2407.01502, 2024. </w:t>
+          <w:rtl w:val="0"/>
+        </w:rPr>
+        <w:t xml:space="preserve">Code as agent harness</w:t>
+      </w:r>
+      <w:r>
+        <w:rPr>
+          <w:rtl w:val="0"/>
+        </w:rPr>
+        <w:t xml:space="preserve">. arXiv:2605.18747, 2026. </w:t>
       </w:r>
       <w:r>
         <w:rPr>
@@ -4836,7 +4914,7 @@
         <w:rPr>
           <w:rtl w:val="0"/>
         </w:rPr>
-        <w:t xml:space="preserve">, não revisado por pares. Disponível em: https://arxiv.org/abs/2407.01502. Acesso em: 28 ago. 2026.</w:t>
+        <w:t xml:space="preserve">, não revisado por pares. Disponível em: https://arxiv.org/abs/2605.18747. Acesso em: 28 ago. 2026.</w:t>
       </w:r>
     </w:p>
     <w:p>
@@ -4846,541 +4924,292 @@
       </w:pPr>
       <w:r>
         <w:rPr>
-          <w:rtl w:val="0"/>
-        </w:rPr>
-        <w:t xml:space="preserve">KAPOOR, Sayash </w:t>
-      </w:r>
-      <w:r>
-        <w:rPr>
-          <w:i w:val="1"/>
-          <w:iCs w:val="1"/>
+          <w:b w:val="0"/>
+          <w:i w:val="0"/>
+          <w:bCs w:val="0"/>
+          <w:iCs w:val="0"/>
+          <w:rtl w:val="0"/>
+        </w:rPr>
+        <w:t xml:space="preserve">OPENCODE. </w:t>
+      </w:r>
+      <w:r>
+        <w:rPr>
+          <w:b/>
+          <w:i w:val="0"/>
+          <w:bCs w:val="0"/>
+          <w:iCs w:val="0"/>
+          <w:rtl w:val="0"/>
+        </w:rPr>
+        <w:t xml:space="preserve">OpenCode</w:t>
+      </w:r>
+      <w:r>
+        <w:rPr>
+          <w:b w:val="0"/>
+          <w:i w:val="0"/>
+          <w:bCs w:val="0"/>
+          <w:iCs w:val="0"/>
+          <w:rtl w:val="0"/>
+        </w:rPr>
+        <w:t xml:space="preserve">: the open source coding agent. 2026a. Repositório de código. Disponível em: https://github.com/anomalyco/opencode. Acesso em: 14 set. 2026.</w:t>
+      </w:r>
+    </w:p>
+    <w:p>
+      <w:pPr>
+        <w:spacing w:after="240" w:line="240" w:lineRule="auto"/>
+        <w:rPr/>
+      </w:pPr>
+      <w:r>
+        <w:rPr>
+          <w:b w:val="0"/>
+          <w:i w:val="0"/>
+          <w:bCs w:val="0"/>
+          <w:iCs w:val="0"/>
+          <w:rtl w:val="0"/>
+        </w:rPr>
+        <w:t xml:space="preserve">OPENCODE. </w:t>
+      </w:r>
+      <w:r>
+        <w:rPr>
+          <w:b/>
+          <w:i w:val="0"/>
+          <w:bCs w:val="0"/>
+          <w:iCs w:val="0"/>
+          <w:rtl w:val="0"/>
+        </w:rPr>
+        <w:t xml:space="preserve">Zen</w:t>
+      </w:r>
+      <w:r>
+        <w:rPr>
+          <w:b w:val="0"/>
+          <w:i w:val="0"/>
+          <w:bCs w:val="0"/>
+          <w:iCs w:val="0"/>
+          <w:rtl w:val="0"/>
+        </w:rPr>
+        <w:t xml:space="preserve">. 2026b. Documentação do produto. Disponível em: https://opencode.ai/docs/zen/. Acesso em: 28 ago. 2026.</w:t>
+      </w:r>
+    </w:p>
+    <w:p>
+      <w:pPr>
+        <w:spacing w:after="240" w:line="240" w:lineRule="auto"/>
+        <w:rPr/>
+      </w:pPr>
+      <w:r>
+        <w:rPr>
+          <w:b w:val="0"/>
+          <w:i w:val="0"/>
+          <w:bCs w:val="0"/>
+          <w:iCs w:val="0"/>
+          <w:rtl w:val="0"/>
+        </w:rPr>
+        <w:t xml:space="preserve">PAN, Melissa Z. </w:t>
+      </w:r>
+      <w:r>
+        <w:rPr>
+          <w:b w:val="0"/>
+          <w:i/>
+          <w:bCs w:val="0"/>
+          <w:iCs w:val="0"/>
           <w:rtl w:val="0"/>
         </w:rPr>
         <w:t xml:space="preserve">et al.</w:t>
       </w:r>
       <w:r>
         <w:rPr>
+          <w:b w:val="0"/>
+          <w:i w:val="0"/>
+          <w:bCs w:val="0"/>
+          <w:iCs w:val="0"/>
           <w:rtl w:val="0"/>
         </w:rPr>
         <w:t xml:space="preserve"> </w:t>
       </w:r>
       <w:r>
         <w:rPr>
-          <w:b w:val="1"/>
-          <w:bCs w:val="1"/>
-          <w:rtl w:val="0"/>
-        </w:rPr>
-        <w:t xml:space="preserve">Holistic Agent Leaderboard</w:t>
-      </w:r>
-      <w:r>
-        <w:rPr>
-          <w:rtl w:val="0"/>
-        </w:rPr>
-        <w:t xml:space="preserve">: the missing infrastructure for AI agent evaluation. arXiv:2510.11977, 2025. </w:t>
-      </w:r>
-      <w:r>
-        <w:rPr>
-          <w:i w:val="1"/>
-          <w:iCs w:val="1"/>
+          <w:b/>
+          <w:i w:val="0"/>
+          <w:bCs w:val="0"/>
+          <w:iCs w:val="0"/>
+          <w:rtl w:val="0"/>
+        </w:rPr>
+        <w:t xml:space="preserve">HarnessTax</w:t>
+      </w:r>
+      <w:r>
+        <w:rPr>
+          <w:b w:val="0"/>
+          <w:i w:val="0"/>
+          <w:bCs w:val="0"/>
+          <w:iCs w:val="0"/>
+          <w:rtl w:val="0"/>
+        </w:rPr>
+        <w:t xml:space="preserve">: how much does the harness matter for coding agents? 2026. Publicação de blogue de pesquisa, não revisada por pares. Disponível em: https://harnesstax.github.io/. Acesso em: 23 set. 2026.</w:t>
+      </w:r>
+    </w:p>
+    <w:p>
+      <w:pPr>
+        <w:spacing w:after="240" w:line="240" w:lineRule="auto"/>
+        <w:rPr/>
+      </w:pPr>
+      <w:r>
+        <w:rPr>
+          <w:b w:val="0"/>
+          <w:i w:val="0"/>
+          <w:bCs w:val="0"/>
+          <w:iCs w:val="0"/>
+          <w:rtl w:val="0"/>
+        </w:rPr>
+        <w:t xml:space="preserve">YUUKIFST. </w:t>
+      </w:r>
+      <w:r>
+        <w:rPr>
+          <w:b/>
+          <w:i w:val="0"/>
+          <w:bCs w:val="0"/>
+          <w:iCs w:val="0"/>
+          <w:rtl w:val="0"/>
+        </w:rPr>
+        <w:t xml:space="preserve">agent-dotfiles</w:t>
+      </w:r>
+      <w:r>
+        <w:rPr>
+          <w:b w:val="0"/>
+          <w:i w:val="0"/>
+          <w:bCs w:val="0"/>
+          <w:iCs w:val="0"/>
+          <w:rtl w:val="0"/>
+        </w:rPr>
+        <w:t xml:space="preserve">: skill Helmsman, mapa de decisões para agentes de codificação. 2026a. Repositório de código. Disponível em: https://github.com/YuukiFST/agent-dotfiles/tree/main/skills/helmsman. Acesso em: 15 set. 2026.</w:t>
+      </w:r>
+    </w:p>
+    <w:p>
+      <w:pPr>
+        <w:spacing w:after="240" w:line="240" w:lineRule="auto"/>
+        <w:rPr/>
+      </w:pPr>
+      <w:r>
+        <w:rPr>
+          <w:b w:val="0"/>
+          <w:i w:val="0"/>
+          <w:bCs w:val="0"/>
+          <w:iCs w:val="0"/>
+          <w:rtl w:val="0"/>
+        </w:rPr>
+        <w:t xml:space="preserve">YUUKIFST. </w:t>
+      </w:r>
+      <w:r>
+        <w:rPr>
+          <w:b/>
+          <w:i w:val="0"/>
+          <w:bCs w:val="0"/>
+          <w:iCs w:val="0"/>
+          <w:rtl w:val="0"/>
+        </w:rPr>
+        <w:t xml:space="preserve">Finn</w:t>
+      </w:r>
+      <w:r>
+        <w:rPr>
+          <w:b w:val="0"/>
+          <w:i w:val="0"/>
+          <w:bCs w:val="0"/>
+          <w:iCs w:val="0"/>
+          <w:rtl w:val="0"/>
+        </w:rPr>
+        <w:t xml:space="preserve">: SaaS universal de financeiro por voz. 2026b. Repositório de código. Disponível em: https://github.com/YuukiFST/Finn. Acesso em: 14 set. 2026.</w:t>
+      </w:r>
+    </w:p>
+    <w:p>
+      <w:pPr>
+        <w:spacing w:after="240" w:line="240" w:lineRule="auto"/>
+        <w:rPr/>
+      </w:pPr>
+      <w:r>
+        <w:rPr>
+          <w:b w:val="0"/>
+          <w:i w:val="0"/>
+          <w:bCs w:val="0"/>
+          <w:iCs w:val="0"/>
+          <w:rtl w:val="0"/>
+        </w:rPr>
+        <w:t xml:space="preserve">YUUKIFST. </w:t>
+      </w:r>
+      <w:r>
+        <w:rPr>
+          <w:b/>
+          <w:i w:val="0"/>
+          <w:bCs w:val="0"/>
+          <w:iCs w:val="0"/>
+          <w:rtl w:val="0"/>
+        </w:rPr>
+        <w:t xml:space="preserve">harness-bench</w:t>
+      </w:r>
+      <w:r>
+        <w:rPr>
+          <w:b w:val="0"/>
+          <w:i w:val="0"/>
+          <w:bCs w:val="0"/>
+          <w:iCs w:val="0"/>
+          <w:rtl w:val="0"/>
+        </w:rPr>
+        <w:t xml:space="preserve">: executor, prompts, testes de aceitação, dados brutos e scripts de análise deste projeto. 2026c. Repositório de código. Disponível em: https://github.com/YuukiFST/harness-bench. Acesso em: 28 ago. 2026.</w:t>
+      </w:r>
+    </w:p>
+    <w:p>
+      <w:pPr>
+        <w:spacing w:after="240" w:line="240" w:lineRule="auto"/>
+        <w:rPr/>
+      </w:pPr>
+      <w:r>
+        <w:rPr>
+          <w:b w:val="0"/>
+          <w:i w:val="0"/>
+          <w:rtl w:val="0"/>
+        </w:rPr>
+        <w:t xml:space="preserve">ZHANG, Yunbei </w:t>
+      </w:r>
+      <w:r>
+        <w:rPr>
+          <w:b w:val="0"/>
+          <w:i/>
+          <w:rtl w:val="0"/>
+        </w:rPr>
+        <w:t xml:space="preserve">et al.</w:t>
+      </w:r>
+      <w:r>
+        <w:rPr>
+          <w:b w:val="0"/>
+          <w:i w:val="0"/>
+          <w:rtl w:val="0"/>
+        </w:rPr>
+        <w:t xml:space="preserve"> </w:t>
+      </w:r>
+      <w:r>
+        <w:rPr>
+          <w:b/>
+          <w:i w:val="0"/>
+          <w:rtl w:val="0"/>
+        </w:rPr>
+        <w:t xml:space="preserve">Stop comparing LLM agents without disclosing the harness</w:t>
+      </w:r>
+      <w:r>
+        <w:rPr>
+          <w:b w:val="0"/>
+          <w:i w:val="0"/>
+          <w:rtl w:val="0"/>
+        </w:rPr>
+        <w:t xml:space="preserve">. arXiv:2605.23950, 2026. </w:t>
+      </w:r>
+      <w:r>
+        <w:rPr>
+          <w:b w:val="0"/>
+          <w:i/>
           <w:rtl w:val="0"/>
         </w:rPr>
         <w:t xml:space="preserve">Preprint</w:t>
       </w:r>
       <w:r>
         <w:rPr>
-          <w:rtl w:val="0"/>
-        </w:rPr>
-        <w:t xml:space="preserve">, não revisado por pares. Disponível em: https://arxiv.org/abs/2510.11977. Acesso em: 28 ago. 2026.</w:t>
-      </w:r>
-    </w:p>
-    <w:p>
-      <w:pPr>
-        <w:spacing w:after="240" w:line="240" w:lineRule="auto"/>
-        <w:rPr/>
-      </w:pPr>
-      <w:r>
-        <w:rPr>
-          <w:b w:val="0"/>
-          <w:bCs w:val="0"/>
-          <w:i w:val="0"/>
-          <w:iCs w:val="0"/>
-          <w:rtl w:val="0"/>
-        </w:rPr>
-        <w:t xml:space="preserve">KARPATHY, Andrej. LLM Wiki: a pattern for building personal knowledge bases using LLMs. 2026. Gist (GitHub). Disponível em: https://gist.github.com/karpathy/442a6bf555914893e9891c11519de94f. Acesso em: 14 set. 2026.</w:t>
-      </w:r>
-      <w:r>
-        <w:rPr>
-          <w:rtl w:val="0"/>
-        </w:rPr>
-      </w:r>
-    </w:p>
-    <w:p>
-      <w:pPr>
-        <w:spacing w:after="240" w:line="240" w:lineRule="auto"/>
-        <w:rPr/>
-      </w:pPr>
-      <w:r>
-        <w:rPr>
-          <w:rtl w:val="0"/>
-        </w:rPr>
-        <w:t xml:space="preserve">LEE, Yoonho; NAIR, Roshen; ZHANG, Qizheng; LEE, Kangwook; KHATTAB, Omar; FINN, Chelsea. </w:t>
-      </w:r>
-      <w:r>
-        <w:rPr>
-          <w:b w:val="1"/>
-          <w:bCs w:val="1"/>
-          <w:rtl w:val="0"/>
-        </w:rPr>
-        <w:t xml:space="preserve">Meta-Harness</w:t>
-      </w:r>
-      <w:r>
-        <w:rPr>
-          <w:rtl w:val="0"/>
-        </w:rPr>
-        <w:t xml:space="preserve">: end-to-end optimization of model harnesses. arXiv:2603.28052, 2026. </w:t>
-      </w:r>
-      <w:r>
-        <w:rPr>
-          <w:i w:val="1"/>
-          <w:iCs w:val="1"/>
-          <w:rtl w:val="0"/>
-        </w:rPr>
-        <w:t xml:space="preserve">Preprint</w:t>
-      </w:r>
-      <w:r>
-        <w:rPr>
-          <w:rtl w:val="0"/>
-        </w:rPr>
-        <w:t xml:space="preserve">, não revisado por pares. Disponível em: https://arxiv.org/abs/2603.28052. Acesso em: 9 set. 2026.</w:t>
-      </w:r>
-    </w:p>
-    <w:p>
-      <w:pPr>
-        <w:spacing w:after="240" w:line="240" w:lineRule="auto"/>
-        <w:rPr/>
-      </w:pPr>
-      <w:r>
-        <w:rPr>
-          <w:rtl w:val="0"/>
-        </w:rPr>
-        <w:t xml:space="preserve">LIN, Jiahang; LIU, Shichun; PAN, Chengjun; LIN, Lizhi; DOU, Shihan; XI, Zhiheng; HUANG, Xuanjing; YAN, Hang; HAN, Zhenhua; GUI, Tao; JIANG, Yu-Gang. </w:t>
-      </w:r>
-      <w:r>
-        <w:rPr>
-          <w:b w:val="1"/>
-          <w:bCs w:val="1"/>
-          <w:rtl w:val="0"/>
-        </w:rPr>
-        <w:t xml:space="preserve">Agentic harness engineering</w:t>
-      </w:r>
-      <w:r>
-        <w:rPr>
-          <w:rtl w:val="0"/>
-        </w:rPr>
-        <w:t xml:space="preserve">: observability-driven automatic evolution of coding-agent harnesses. arXiv:2604.25850, 2026. </w:t>
-      </w:r>
-      <w:r>
-        <w:rPr>
-          <w:i w:val="1"/>
-          <w:iCs w:val="1"/>
-          <w:rtl w:val="0"/>
-        </w:rPr>
-        <w:t xml:space="preserve">Preprint</w:t>
-      </w:r>
-      <w:r>
-        <w:rPr>
-          <w:rtl w:val="0"/>
-        </w:rPr>
-        <w:t xml:space="preserve">, não revisado por pares. Disponível em: https://arxiv.org/abs/2604.25850. Acesso em: 28 ago. 2026.</w:t>
-      </w:r>
-    </w:p>
-    <w:p>
-      <w:pPr>
-        <w:spacing w:after="240" w:line="240" w:lineRule="auto"/>
-        <w:rPr/>
-      </w:pPr>
-      <w:r>
-        <w:rPr>
-          <w:b w:val="0"/>
-          <w:bCs w:val="0"/>
-          <w:i w:val="0"/>
-          <w:iCs w:val="0"/>
-          <w:rtl w:val="0"/>
-        </w:rPr>
-        <w:t xml:space="preserve">MILLER, Evan. </w:t>
-      </w:r>
-      <w:r>
-        <w:rPr>
-          <w:b w:val="1"/>
-          <w:bCs w:val="1"/>
-          <w:i w:val="0"/>
-          <w:iCs w:val="0"/>
-          <w:rtl w:val="0"/>
-        </w:rPr>
-        <w:t xml:space="preserve">Adding error bars to evals</w:t>
-      </w:r>
-      <w:r>
-        <w:rPr>
-          <w:b w:val="0"/>
-          <w:bCs w:val="0"/>
-          <w:i w:val="0"/>
-          <w:iCs w:val="0"/>
-          <w:rtl w:val="0"/>
-        </w:rPr>
-        <w:t xml:space="preserve">: a statistical approach to language model evaluations. arXiv:2411.00640, 2024. </w:t>
-      </w:r>
-      <w:r>
-        <w:rPr>
-          <w:b w:val="0"/>
-          <w:bCs w:val="0"/>
-          <w:i w:val="1"/>
-          <w:iCs w:val="1"/>
-          <w:rtl w:val="0"/>
-        </w:rPr>
-        <w:t xml:space="preserve">Preprint</w:t>
-      </w:r>
-      <w:r>
-        <w:rPr>
-          <w:b w:val="0"/>
-          <w:bCs w:val="0"/>
-          <w:i w:val="0"/>
-          <w:iCs w:val="0"/>
-          <w:rtl w:val="0"/>
-        </w:rPr>
-        <w:t xml:space="preserve">, não revisado por pares. Disponível em: https://arxiv.org/abs/2411.00640. Acesso em: 28 ago. 2026.</w:t>
-      </w:r>
-      <w:r>
-        <w:rPr>
-          <w:rtl w:val="0"/>
-        </w:rPr>
-      </w:r>
-    </w:p>
-    <w:p>
-      <w:pPr>
-        <w:spacing w:after="240" w:line="240" w:lineRule="auto"/>
-        <w:rPr/>
-      </w:pPr>
-      <w:r>
-        <w:rPr>
-          <w:rtl w:val="0"/>
-        </w:rPr>
-        <w:t xml:space="preserve">NING, Xuying </w:t>
-      </w:r>
-      <w:r>
-        <w:rPr>
-          <w:i w:val="1"/>
-          <w:iCs w:val="1"/>
-          <w:rtl w:val="0"/>
-        </w:rPr>
-        <w:t xml:space="preserve">et al.</w:t>
-      </w:r>
-      <w:r>
-        <w:rPr>
-          <w:rtl w:val="0"/>
-        </w:rPr>
-        <w:t xml:space="preserve"> </w:t>
-      </w:r>
-      <w:r>
-        <w:rPr>
-          <w:b w:val="1"/>
-          <w:bCs w:val="1"/>
-          <w:rtl w:val="0"/>
-        </w:rPr>
-        <w:t xml:space="preserve">Code as agent harness</w:t>
-      </w:r>
-      <w:r>
-        <w:rPr>
-          <w:rtl w:val="0"/>
-        </w:rPr>
-        <w:t xml:space="preserve">. arXiv:2605.18747, 2026. </w:t>
-      </w:r>
-      <w:r>
-        <w:rPr>
-          <w:i w:val="1"/>
-          <w:iCs w:val="1"/>
-          <w:rtl w:val="0"/>
-        </w:rPr>
-        <w:t xml:space="preserve">Preprint</w:t>
-      </w:r>
-      <w:r>
-        <w:rPr>
-          <w:rtl w:val="0"/>
-        </w:rPr>
-        <w:t xml:space="preserve">, não revisado por pares. Disponível em: https://arxiv.org/abs/2605.18747. Acesso em: 28 ago. 2026.</w:t>
-      </w:r>
-    </w:p>
-    <w:p>
-      <w:pPr>
-        <w:spacing w:after="240" w:line="240" w:lineRule="auto"/>
-        <w:rPr/>
-      </w:pPr>
-      <w:r>
-        <w:rPr>
-          <w:b w:val="0"/>
-          <w:bCs w:val="0"/>
-          <w:i w:val="0"/>
-          <w:iCs w:val="0"/>
-          <w:rtl w:val="0"/>
-        </w:rPr>
-        <w:t xml:space="preserve">OPENCODE. OpenCode: the open source coding agent. 2026a. Repositório de código. Disponível em: https://github.com/anomalyco/opencode. Acesso em: 14 set. 2026.</w:t>
-      </w:r>
-      <w:r>
-        <w:rPr>
-          <w:rtl w:val="0"/>
-        </w:rPr>
-      </w:r>
-    </w:p>
-    <w:p>
-      <w:pPr>
-        <w:spacing w:after="240" w:line="240" w:lineRule="auto"/>
-        <w:rPr/>
-      </w:pPr>
-      <w:r>
-        <w:rPr>
-          <w:b w:val="0"/>
-          <w:bCs w:val="0"/>
-          <w:i w:val="0"/>
-          <w:iCs w:val="0"/>
-          <w:rtl w:val="0"/>
-        </w:rPr>
-        <w:t xml:space="preserve">OPENCODE. Zen. 2026b. Documentação do produto. Disponível em: https://opencode.ai/docs/zen/. Acesso em: 28 ago. 2026.</w:t>
-      </w:r>
-      <w:r>
-        <w:rPr>
-          <w:rtl w:val="0"/>
-        </w:rPr>
-      </w:r>
-    </w:p>
-    <w:p>
-      <w:pPr>
-        <w:spacing w:after="240" w:line="240" w:lineRule="auto"/>
-        <w:rPr/>
-      </w:pPr>
-      <w:r>
-        <w:rPr>
-          <w:rtl w:val="0"/>
-        </w:rPr>
-        <w:t xml:space="preserve">RUNTA. </w:t>
-      </w:r>
-      <w:r>
-        <w:rPr>
-          <w:b w:val="1"/>
-          <w:bCs w:val="1"/>
-          <w:rtl w:val="0"/>
-        </w:rPr>
-        <w:t xml:space="preserve">Introducing the FrontierHarness eval</w:t>
-      </w:r>
-      <w:r>
-        <w:rPr>
-          <w:rtl w:val="0"/>
-        </w:rPr>
-        <w:t xml:space="preserve">. 2026. Publicação de blogue institucional. Disponível em: https://runta.com/blog/introducing-frontierharness-eval/. Acesso em: 9 set. 2026.</w:t>
-      </w:r>
-    </w:p>
-    <w:p>
-      <w:pPr>
-        <w:spacing w:after="240" w:line="240" w:lineRule="auto"/>
-        <w:rPr/>
-      </w:pPr>
-      <w:r>
-        <w:rPr>
-          <w:rtl w:val="0"/>
-        </w:rPr>
-        <w:t xml:space="preserve">WANG, Ruhan </w:t>
-      </w:r>
-      <w:r>
-        <w:rPr>
-          <w:i w:val="1"/>
-          <w:iCs w:val="1"/>
-          <w:rtl w:val="0"/>
-        </w:rPr>
-        <w:t xml:space="preserve">et al.</w:t>
-      </w:r>
-      <w:r>
-        <w:rPr>
-          <w:rtl w:val="0"/>
-        </w:rPr>
-        <w:t xml:space="preserve"> </w:t>
-      </w:r>
-      <w:r>
-        <w:rPr>
-          <w:b w:val="1"/>
-          <w:bCs w:val="1"/>
-          <w:rtl w:val="0"/>
-        </w:rPr>
-        <w:t xml:space="preserve">Harness Handbook</w:t>
-      </w:r>
-      <w:r>
-        <w:rPr>
-          <w:rtl w:val="0"/>
-        </w:rPr>
-        <w:t xml:space="preserve">: making evolving agent harnesses readable, navigable, and editable. arXiv:2607.13285, 2026. </w:t>
-      </w:r>
-      <w:r>
-        <w:rPr>
-          <w:i w:val="1"/>
-          <w:iCs w:val="1"/>
-          <w:rtl w:val="0"/>
-        </w:rPr>
-        <w:t xml:space="preserve">Preprint</w:t>
-      </w:r>
-      <w:r>
-        <w:rPr>
-          <w:rtl w:val="0"/>
-        </w:rPr>
-        <w:t xml:space="preserve">, não revisado por pares. Disponível em: https://arxiv.org/abs/2607.13285. Acesso em: 9 set. 2026.</w:t>
-      </w:r>
-    </w:p>
-    <w:p>
-      <w:pPr>
-        <w:spacing w:after="240" w:line="240" w:lineRule="auto"/>
-        <w:rPr/>
-      </w:pPr>
-      <w:r>
-        <w:rPr>
-          <w:rtl w:val="0"/>
-        </w:rPr>
-        <w:t xml:space="preserve">YANG, John; JIMENEZ, Carlos E.; WETTIG, Alexander; LIERET, Kilian; YAO, Shunyu; NARASIMHAN, Karthik; PRESS, Ofir. </w:t>
-      </w:r>
-      <w:r>
-        <w:rPr>
-          <w:b w:val="1"/>
-          <w:bCs w:val="1"/>
-          <w:rtl w:val="0"/>
-        </w:rPr>
-        <w:t xml:space="preserve">SWE-agent</w:t>
-      </w:r>
-      <w:r>
-        <w:rPr>
-          <w:rtl w:val="0"/>
-        </w:rPr>
-        <w:t xml:space="preserve">: agent-computer interfaces enable automated software engineering. arXiv:2405.15793, 2024. Trabalho apresentado na Conference on Neural Information Processing Systems (NeurIPS), 2024. Disponível em: https://arxiv.org/abs/2405.15793. Acesso em: 28 ago. 2026.</w:t>
-      </w:r>
-    </w:p>
-    <w:p>
-      <w:pPr>
-        <w:spacing w:after="240" w:line="240" w:lineRule="auto"/>
-        <w:rPr/>
-      </w:pPr>
-      <w:r>
-        <w:rPr>
-          <w:rtl w:val="0"/>
-        </w:rPr>
-        <w:t xml:space="preserve">YAO, Shunyu; ZHAO, Jeffrey; YU, Dian; DU, Nan; SHAFRAN, Izhak; NARASIMHAN, Karthik; CAO, Yuan. </w:t>
-      </w:r>
-      <w:r>
-        <w:rPr>
-          <w:b w:val="1"/>
-          <w:bCs w:val="1"/>
-          <w:rtl w:val="0"/>
-        </w:rPr>
-        <w:t xml:space="preserve">ReAct</w:t>
-      </w:r>
-      <w:r>
-        <w:rPr>
-          <w:rtl w:val="0"/>
-        </w:rPr>
-        <w:t xml:space="preserve">: synergizing reasoning and acting in language models. arXiv:2210.03629, 2022. Trabalho apresentado na International Conference on Learning Representations (ICLR), 2023. Disponível em: https://arxiv.org/abs/2210.03629. Acesso em: 28 ago. 2026.</w:t>
-      </w:r>
-    </w:p>
-    <w:p>
-      <w:pPr>
-        <w:spacing w:after="240" w:line="240" w:lineRule="auto"/>
-        <w:rPr/>
-      </w:pPr>
-      <w:r>
-        <w:rPr>
-          <w:b w:val="0"/>
-          <w:bCs w:val="0"/>
-          <w:i w:val="0"/>
-          <w:iCs w:val="0"/>
-          <w:rtl w:val="0"/>
-        </w:rPr>
-        <w:t xml:space="preserve">YUUKIFST. agent-dotfiles: skill Helmsman, mapa de decisões para agentes de codificação. 2026a. Repositório de código. Disponível em: https://github.com/YuukiFST/agent-dotfiles/tree/main/skills/helmsman. Acesso em: 15 set. 2026.</w:t>
-      </w:r>
-      <w:r>
-        <w:rPr>
-          <w:rtl w:val="0"/>
-        </w:rPr>
-      </w:r>
-    </w:p>
-    <w:p>
-      <w:pPr>
-        <w:spacing w:after="240" w:line="240" w:lineRule="auto"/>
-        <w:rPr/>
-      </w:pPr>
-      <w:r>
-        <w:rPr>
-          <w:b w:val="0"/>
-          <w:bCs w:val="0"/>
-          <w:i w:val="0"/>
-          <w:iCs w:val="0"/>
-          <w:rtl w:val="0"/>
-        </w:rPr>
-        <w:t xml:space="preserve">YUUKIFST. Finn: SaaS universal de financeiro por voz. 2026b. Repositório de código. Disponível em: https://github.com/YuukiFST/Finn. Acesso em: 14 set. 2026.</w:t>
-      </w:r>
-      <w:r>
-        <w:rPr>
-          <w:rtl w:val="0"/>
-        </w:rPr>
-      </w:r>
-    </w:p>
-    <w:p>
-      <w:pPr>
-        <w:spacing w:after="240" w:line="240" w:lineRule="auto"/>
-        <w:rPr/>
-      </w:pPr>
-      <w:r>
-        <w:rPr>
-          <w:b w:val="0"/>
-          <w:bCs w:val="0"/>
-          <w:i w:val="0"/>
-          <w:iCs w:val="0"/>
-          <w:rtl w:val="0"/>
-        </w:rPr>
-        <w:t xml:space="preserve">YUUKIFST. harness-bench: executor, prompts, testes de aceitação, dados brutos e scripts de análise deste projeto. 2026c. Repositório de código. Disponível em: https://github.com/YuukiFST/harness-bench. Acesso em: 28 ago. 2026.</w:t>
-      </w:r>
-      <w:r>
-        <w:rPr>
-          <w:rtl w:val="0"/>
-        </w:rPr>
-      </w:r>
-    </w:p>
-    <w:p>
-      <w:pPr>
-        <w:spacing w:after="240" w:line="240" w:lineRule="auto"/>
-        <w:rPr/>
-      </w:pPr>
-      <w:r>
-        <w:rPr>
-          <w:rtl w:val="0"/>
-        </w:rPr>
-        <w:t xml:space="preserve">ZHANG, Yunbei; WANG, Janet; GE, Yingqiang; XU, Weijie; HAMM, Jihun; REDDY, Chandan K. </w:t>
-      </w:r>
-      <w:r>
-        <w:rPr>
-          <w:b w:val="1"/>
-          <w:bCs w:val="1"/>
-          <w:rtl w:val="0"/>
-        </w:rPr>
-        <w:t xml:space="preserve">Stop comparing LLM agents without disclosing the harness</w:t>
-      </w:r>
-      <w:r>
-        <w:rPr>
-          <w:rtl w:val="0"/>
-        </w:rPr>
-        <w:t xml:space="preserve">. arXiv:2605.23950, 2026. </w:t>
-      </w:r>
-      <w:r>
-        <w:rPr>
-          <w:i w:val="1"/>
-          <w:iCs w:val="1"/>
-          <w:rtl w:val="0"/>
-        </w:rPr>
-        <w:t xml:space="preserve">Preprint</w:t>
-      </w:r>
-      <w:r>
-        <w:rPr>
+          <w:b w:val="0"/>
+          <w:i w:val="0"/>
           <w:rtl w:val="0"/>
         </w:rPr>
         <w:t xml:space="preserve">, não revisado por pares. Disponível em: https://arxiv.org/abs/2605.23950. Acesso em: 28 ago. 2026.</w:t>

</xml_diff>

<commit_message>
docs(project): schedule matrix execution and analysis in October
Tabela 2 now matches the deck: both phases move to October and the empty
December and January columns go, as in the course template. The table lost
22 dump paragraphs, so the deck and script cite the new reference indices.
</commit_message>
<xml_diff>
--- a/dist/projeto-de-pesquisa.docx
+++ b/dist/projeto-de-pesquisa.docx
@@ -3074,21 +3074,17 @@
       </w:tblPr>
       <w:tblGrid>
         <w:gridCol w:w="4309"/>
-        <w:gridCol w:w="952"/>
-        <w:gridCol w:w="952"/>
-        <w:gridCol w:w="952"/>
-        <w:gridCol w:w="952"/>
-        <w:gridCol w:w="952"/>
-        <w:gridCol w:w="952"/>
+        <w:gridCol w:w="1428"/>
+        <w:gridCol w:w="1428"/>
+        <w:gridCol w:w="1428"/>
+        <w:gridCol w:w="1428"/>
         <w:tblGridChange w:id="0">
           <w:tblGrid>
             <w:gridCol w:w="4309"/>
-            <w:gridCol w:w="952"/>
-            <w:gridCol w:w="952"/>
-            <w:gridCol w:w="952"/>
-            <w:gridCol w:w="952"/>
-            <w:gridCol w:w="952"/>
-            <w:gridCol w:w="952"/>
+            <w:gridCol w:w="1428"/>
+            <w:gridCol w:w="1428"/>
+            <w:gridCol w:w="1428"/>
+            <w:gridCol w:w="1428"/>
           </w:tblGrid>
         </w:tblGridChange>
       </w:tblGrid>
@@ -3221,56 +3217,6 @@
             </w:r>
           </w:p>
         </w:tc>
-        <w:tc>
-          <w:tcPr/>
-          <w:p>
-            <w:pPr>
-              <w:spacing w:after="20" w:before="20" w:lineRule="auto"/>
-              <w:jc w:val="center"/>
-              <w:rPr/>
-            </w:pPr>
-            <w:r>
-              <w:rPr>
-                <w:b w:val="1"/>
-                <w:bCs w:val="1"/>
-                <w:sz w:val="18"/>
-                <w:szCs w:val="18"/>
-                <w:rtl w:val="0"/>
-              </w:rPr>
-              <w:t xml:space="preserve">DEZEMBRO</w:t>
-            </w:r>
-            <w:r>
-              <w:rPr>
-                <w:rtl w:val="0"/>
-              </w:rPr>
-            </w:r>
-          </w:p>
-        </w:tc>
-        <w:tc>
-          <w:tcPr/>
-          <w:p>
-            <w:pPr>
-              <w:spacing w:after="20" w:before="20" w:lineRule="auto"/>
-              <w:jc w:val="center"/>
-              <w:rPr/>
-            </w:pPr>
-            <w:r>
-              <w:rPr>
-                <w:b w:val="1"/>
-                <w:bCs w:val="1"/>
-                <w:sz w:val="18"/>
-                <w:szCs w:val="18"/>
-                <w:rtl w:val="0"/>
-              </w:rPr>
-              <w:t xml:space="preserve">JANEIRO</w:t>
-            </w:r>
-            <w:r>
-              <w:rPr>
-                <w:rtl w:val="0"/>
-              </w:rPr>
-            </w:r>
-          </w:p>
-        </w:tc>
       </w:tr>
       <w:tr>
         <w:trPr>
@@ -3375,36 +3321,6 @@
             </w:r>
           </w:p>
         </w:tc>
-        <w:tc>
-          <w:tcPr/>
-          <w:p>
-            <w:pPr>
-              <w:spacing w:after="20" w:before="20" w:lineRule="auto"/>
-              <w:jc w:val="center"/>
-              <w:rPr/>
-            </w:pPr>
-            <w:r>
-              <w:rPr>
-                <w:rtl w:val="0"/>
-              </w:rPr>
-            </w:r>
-          </w:p>
-        </w:tc>
-        <w:tc>
-          <w:tcPr/>
-          <w:p>
-            <w:pPr>
-              <w:spacing w:after="20" w:before="20" w:lineRule="auto"/>
-              <w:jc w:val="center"/>
-              <w:rPr/>
-            </w:pPr>
-            <w:r>
-              <w:rPr>
-                <w:rtl w:val="0"/>
-              </w:rPr>
-            </w:r>
-          </w:p>
-        </w:tc>
       </w:tr>
       <w:tr>
         <w:trPr>
@@ -3506,36 +3422,6 @@
             </w:r>
           </w:p>
         </w:tc>
-        <w:tc>
-          <w:tcPr/>
-          <w:p>
-            <w:pPr>
-              <w:spacing w:after="20" w:before="20" w:lineRule="auto"/>
-              <w:jc w:val="center"/>
-              <w:rPr/>
-            </w:pPr>
-            <w:r>
-              <w:rPr>
-                <w:rtl w:val="0"/>
-              </w:rPr>
-            </w:r>
-          </w:p>
-        </w:tc>
-        <w:tc>
-          <w:tcPr/>
-          <w:p>
-            <w:pPr>
-              <w:spacing w:after="20" w:before="20" w:lineRule="auto"/>
-              <w:jc w:val="center"/>
-              <w:rPr/>
-            </w:pPr>
-            <w:r>
-              <w:rPr>
-                <w:rtl w:val="0"/>
-              </w:rPr>
-            </w:r>
-          </w:p>
-        </w:tc>
       </w:tr>
       <w:tr>
         <w:trPr>
@@ -3639,36 +3525,6 @@
             </w:r>
           </w:p>
         </w:tc>
-        <w:tc>
-          <w:tcPr/>
-          <w:p>
-            <w:pPr>
-              <w:spacing w:after="20" w:before="20" w:lineRule="auto"/>
-              <w:jc w:val="center"/>
-              <w:rPr/>
-            </w:pPr>
-            <w:r>
-              <w:rPr>
-                <w:rtl w:val="0"/>
-              </w:rPr>
-            </w:r>
-          </w:p>
-        </w:tc>
-        <w:tc>
-          <w:tcPr/>
-          <w:p>
-            <w:pPr>
-              <w:spacing w:after="20" w:before="20" w:lineRule="auto"/>
-              <w:jc w:val="center"/>
-              <w:rPr/>
-            </w:pPr>
-            <w:r>
-              <w:rPr>
-                <w:rtl w:val="0"/>
-              </w:rPr>
-            </w:r>
-          </w:p>
-        </w:tc>
       </w:tr>
       <w:tr>
         <w:trPr>
@@ -3759,36 +3615,6 @@
             </w:r>
           </w:p>
         </w:tc>
-        <w:tc>
-          <w:tcPr/>
-          <w:p>
-            <w:pPr>
-              <w:spacing w:after="20" w:before="20" w:lineRule="auto"/>
-              <w:jc w:val="center"/>
-              <w:rPr/>
-            </w:pPr>
-            <w:r>
-              <w:rPr>
-                <w:rtl w:val="0"/>
-              </w:rPr>
-            </w:r>
-          </w:p>
-        </w:tc>
-        <w:tc>
-          <w:tcPr/>
-          <w:p>
-            <w:pPr>
-              <w:spacing w:after="20" w:before="20" w:lineRule="auto"/>
-              <w:jc w:val="center"/>
-              <w:rPr/>
-            </w:pPr>
-            <w:r>
-              <w:rPr>
-                <w:rtl w:val="0"/>
-              </w:rPr>
-            </w:r>
-          </w:p>
-        </w:tc>
       </w:tr>
       <w:tr>
         <w:trPr>
@@ -3879,36 +3705,6 @@
             </w:r>
           </w:p>
         </w:tc>
-        <w:tc>
-          <w:tcPr/>
-          <w:p>
-            <w:pPr>
-              <w:spacing w:after="20" w:before="20" w:lineRule="auto"/>
-              <w:jc w:val="center"/>
-              <w:rPr/>
-            </w:pPr>
-            <w:r>
-              <w:rPr>
-                <w:rtl w:val="0"/>
-              </w:rPr>
-            </w:r>
-          </w:p>
-        </w:tc>
-        <w:tc>
-          <w:tcPr/>
-          <w:p>
-            <w:pPr>
-              <w:spacing w:after="20" w:before="20" w:lineRule="auto"/>
-              <w:jc w:val="center"/>
-              <w:rPr/>
-            </w:pPr>
-            <w:r>
-              <w:rPr>
-                <w:rtl w:val="0"/>
-              </w:rPr>
-            </w:r>
-          </w:p>
-        </w:tc>
       </w:tr>
       <w:tr>
         <w:trPr>
@@ -3999,36 +3795,6 @@
             </w:r>
           </w:p>
         </w:tc>
-        <w:tc>
-          <w:tcPr/>
-          <w:p>
-            <w:pPr>
-              <w:spacing w:after="20" w:before="20" w:lineRule="auto"/>
-              <w:jc w:val="center"/>
-              <w:rPr/>
-            </w:pPr>
-            <w:r>
-              <w:rPr>
-                <w:rtl w:val="0"/>
-              </w:rPr>
-            </w:r>
-          </w:p>
-        </w:tc>
-        <w:tc>
-          <w:tcPr/>
-          <w:p>
-            <w:pPr>
-              <w:spacing w:after="20" w:before="20" w:lineRule="auto"/>
-              <w:jc w:val="center"/>
-              <w:rPr/>
-            </w:pPr>
-            <w:r>
-              <w:rPr>
-                <w:rtl w:val="0"/>
-              </w:rPr>
-            </w:r>
-          </w:p>
-        </w:tc>
       </w:tr>
       <w:tr>
         <w:trPr>
@@ -4097,36 +3863,6 @@
             </w:pPr>
             <w:r>
               <w:rPr>
-                <w:rtl w:val="0"/>
-              </w:rPr>
-            </w:r>
-          </w:p>
-        </w:tc>
-        <w:tc>
-          <w:tcPr/>
-          <w:p>
-            <w:pPr>
-              <w:spacing w:after="20" w:before="20" w:lineRule="auto"/>
-              <w:jc w:val="center"/>
-              <w:rPr/>
-            </w:pPr>
-            <w:r>
-              <w:rPr>
-                <w:rtl w:val="0"/>
-              </w:rPr>
-            </w:r>
-          </w:p>
-        </w:tc>
-        <w:tc>
-          <w:tcPr/>
-          <w:p>
-            <w:pPr>
-              <w:spacing w:after="20" w:before="20" w:lineRule="auto"/>
-              <w:jc w:val="center"/>
-              <w:rPr/>
-            </w:pPr>
-            <w:r>
-              <w:rPr>
                 <w:sz w:val="18"/>
                 <w:szCs w:val="18"/>
                 <w:rtl w:val="0"/>
@@ -4148,14 +3884,6 @@
               <w:jc w:val="center"/>
               <w:rPr/>
             </w:pPr>
-            <w:r>
-              <w:rPr>
-                <w:sz w:val="18"/>
-                <w:szCs w:val="18"/>
-                <w:rtl w:val="0"/>
-              </w:rPr>
-              <w:t xml:space="preserve">X</w:t>
-            </w:r>
             <w:r>
               <w:rPr>
                 <w:rtl w:val="0"/>
@@ -4231,57 +3959,27 @@
             </w:pPr>
             <w:r>
               <w:rPr>
-                <w:rtl w:val="0"/>
-              </w:rPr>
-            </w:r>
-          </w:p>
-        </w:tc>
-        <w:tc>
-          <w:tcPr/>
-          <w:p>
-            <w:pPr>
-              <w:spacing w:after="20" w:before="20" w:lineRule="auto"/>
-              <w:jc w:val="center"/>
-              <w:rPr/>
-            </w:pPr>
-            <w:r>
-              <w:rPr>
-                <w:rtl w:val="0"/>
-              </w:rPr>
-            </w:r>
-          </w:p>
-        </w:tc>
-        <w:tc>
-          <w:tcPr/>
-          <w:p>
-            <w:pPr>
-              <w:spacing w:after="20" w:before="20" w:lineRule="auto"/>
-              <w:jc w:val="center"/>
-              <w:rPr/>
-            </w:pPr>
-            <w:r>
-              <w:rPr>
-                <w:rtl w:val="0"/>
-              </w:rPr>
-            </w:r>
-          </w:p>
-        </w:tc>
-        <w:tc>
-          <w:tcPr/>
-          <w:p>
-            <w:pPr>
-              <w:spacing w:after="20" w:before="20" w:lineRule="auto"/>
-              <w:jc w:val="center"/>
-              <w:rPr/>
-            </w:pPr>
-            <w:r>
-              <w:rPr>
                 <w:sz w:val="18"/>
                 <w:szCs w:val="18"/>
                 <w:rtl w:val="0"/>
               </w:rPr>
               <w:t xml:space="preserve">X</w:t>
             </w:r>
+            <w:r>
+              <w:rPr>
+                <w:rtl w:val="0"/>
+              </w:rPr>
+            </w:r>
+          </w:p>
+        </w:tc>
+        <w:tc>
+          <w:tcPr/>
+          <w:p>
+            <w:pPr>
+              <w:spacing w:after="20" w:before="20" w:lineRule="auto"/>
+              <w:jc w:val="center"/>
+              <w:rPr/>
+            </w:pPr>
             <w:r>
               <w:rPr>
                 <w:rtl w:val="0"/>
@@ -4379,36 +4077,6 @@
             </w:r>
           </w:p>
         </w:tc>
-        <w:tc>
-          <w:tcPr/>
-          <w:p>
-            <w:pPr>
-              <w:spacing w:after="20" w:before="20" w:lineRule="auto"/>
-              <w:jc w:val="center"/>
-              <w:rPr/>
-            </w:pPr>
-            <w:r>
-              <w:rPr>
-                <w:rtl w:val="0"/>
-              </w:rPr>
-            </w:r>
-          </w:p>
-        </w:tc>
-        <w:tc>
-          <w:tcPr/>
-          <w:p>
-            <w:pPr>
-              <w:spacing w:after="20" w:before="20" w:lineRule="auto"/>
-              <w:jc w:val="center"/>
-              <w:rPr/>
-            </w:pPr>
-            <w:r>
-              <w:rPr>
-                <w:rtl w:val="0"/>
-              </w:rPr>
-            </w:r>
-          </w:p>
-        </w:tc>
       </w:tr>
       <w:tr>
         <w:trPr>
@@ -4465,36 +4133,6 @@
               </w:rPr>
               <w:t xml:space="preserve">X</w:t>
             </w:r>
-            <w:r>
-              <w:rPr>
-                <w:rtl w:val="0"/>
-              </w:rPr>
-            </w:r>
-          </w:p>
-        </w:tc>
-        <w:tc>
-          <w:tcPr/>
-          <w:p>
-            <w:pPr>
-              <w:spacing w:after="20" w:before="20" w:lineRule="auto"/>
-              <w:jc w:val="center"/>
-              <w:rPr/>
-            </w:pPr>
-            <w:r>
-              <w:rPr>
-                <w:rtl w:val="0"/>
-              </w:rPr>
-            </w:r>
-          </w:p>
-        </w:tc>
-        <w:tc>
-          <w:tcPr/>
-          <w:p>
-            <w:pPr>
-              <w:spacing w:after="20" w:before="20" w:lineRule="auto"/>
-              <w:jc w:val="center"/>
-              <w:rPr/>
-            </w:pPr>
             <w:r>
               <w:rPr>
                 <w:rtl w:val="0"/>

</xml_diff>

<commit_message>
fix(project): fit Tabela 2 inside the text block
The cronograma table was wider than the page text block and stuck out past
both margins; it now uses the same width as Tabela 1. Eight X marks had no
size and rendered larger than the rest of the table.
</commit_message>
<xml_diff>
--- a/dist/projeto-de-pesquisa.docx
+++ b/dist/projeto-de-pesquisa.docx
@@ -3059,7 +3059,7 @@
     <w:tbl>
       <w:tblPr>
         <w:tblStyle w:val="Table2"/>
-        <w:tblW w:w="10021.000000000002" w:type="dxa"/>
+        <w:tblW w:w="9071" w:type="dxa"/>
         <w:jc w:val="center"/>
         <w:tblBorders>
           <w:top w:color="000000" w:space="0" w:sz="4" w:val="single"/>
@@ -3070,21 +3070,25 @@
           <w:insideV w:color="000000" w:space="0" w:sz="4" w:val="single"/>
         </w:tblBorders>
         <w:tblLayout w:type="fixed"/>
+        <w:tblCellMar>
+          <w:left w:w="57" w:type="dxa"/>
+          <w:right w:w="57" w:type="dxa"/>
+        </w:tblCellMar>
         <w:tblLook w:val="0400"/>
       </w:tblPr>
       <w:tblGrid>
-        <w:gridCol w:w="4309"/>
-        <w:gridCol w:w="1428"/>
-        <w:gridCol w:w="1428"/>
-        <w:gridCol w:w="1428"/>
-        <w:gridCol w:w="1428"/>
+        <w:gridCol w:w="4191"/>
+        <w:gridCol w:w="1220"/>
+        <w:gridCol w:w="1220"/>
+        <w:gridCol w:w="1220"/>
+        <w:gridCol w:w="1220"/>
         <w:tblGridChange w:id="0">
           <w:tblGrid>
-            <w:gridCol w:w="4309"/>
-            <w:gridCol w:w="1428"/>
-            <w:gridCol w:w="1428"/>
-            <w:gridCol w:w="1428"/>
-            <w:gridCol w:w="1428"/>
+            <w:gridCol w:w="4191"/>
+            <w:gridCol w:w="1220"/>
+            <w:gridCol w:w="1220"/>
+            <w:gridCol w:w="1220"/>
+            <w:gridCol w:w="1220"/>
           </w:tblGrid>
         </w:tblGridChange>
       </w:tblGrid>
@@ -3563,6 +3567,8 @@
             </w:pPr>
             <w:r>
               <w:rPr>
+                <w:sz w:val="18"/>
+                <w:szCs w:val="18"/>
                 <w:rtl w:val="0"/>
               </w:rPr>
               <w:t xml:space="preserve">X</w:t>
@@ -3579,6 +3585,8 @@
             </w:pPr>
             <w:r>
               <w:rPr>
+                <w:sz w:val="18"/>
+                <w:szCs w:val="18"/>
                 <w:rtl w:val="0"/>
               </w:rPr>
               <w:t xml:space="preserve">X</w:t>
@@ -3653,6 +3661,8 @@
             </w:pPr>
             <w:r>
               <w:rPr>
+                <w:sz w:val="18"/>
+                <w:szCs w:val="18"/>
                 <w:rtl w:val="0"/>
               </w:rPr>
               <w:t xml:space="preserve">X</w:t>
@@ -3669,6 +3679,8 @@
             </w:pPr>
             <w:r>
               <w:rPr>
+                <w:sz w:val="18"/>
+                <w:szCs w:val="18"/>
                 <w:rtl w:val="0"/>
               </w:rPr>
               <w:t xml:space="preserve">X</w:t>
@@ -3743,6 +3755,8 @@
             </w:pPr>
             <w:r>
               <w:rPr>
+                <w:sz w:val="18"/>
+                <w:szCs w:val="18"/>
                 <w:rtl w:val="0"/>
               </w:rPr>
               <w:t xml:space="preserve">X</w:t>
@@ -3759,6 +3773,8 @@
             </w:pPr>
             <w:r>
               <w:rPr>
+                <w:sz w:val="18"/>
+                <w:szCs w:val="18"/>
                 <w:rtl w:val="0"/>
               </w:rPr>
               <w:t xml:space="preserve">X</w:t>
@@ -4025,6 +4041,8 @@
             </w:pPr>
             <w:r>
               <w:rPr>
+                <w:sz w:val="18"/>
+                <w:szCs w:val="18"/>
                 <w:rtl w:val="0"/>
               </w:rPr>
               <w:t xml:space="preserve">X</w:t>
@@ -4041,6 +4059,8 @@
             </w:pPr>
             <w:r>
               <w:rPr>
+                <w:sz w:val="18"/>
+                <w:szCs w:val="18"/>
                 <w:rtl w:val="0"/>
               </w:rPr>
               <w:t xml:space="preserve">X</w:t>

</xml_diff>

<commit_message>
docs(project): count tokens at the gateway, schedule ends in October
Applies the author's 2026-09-24 revision and the four edit passes that
followed: reference build and Young (2025), table sources back under
Tabelas 1 and 2, "system prompt" as the single term, and in 24e the
measurement of [61], [75], [80] and [83] aligned with docs/spec/11.
Tabela 2 drops November: reference build, proxy and tests run in
October only. Word still counts 9 pages.
</commit_message>
<xml_diff>
--- a/dist/projeto-de-pesquisa.docx
+++ b/dist/projeto-de-pesquisa.docx
@@ -153,8 +153,8 @@
       <w:r>
         <w:rPr>
           <w:b w:val="0"/>
-          <w:i w:val="0"/>
-          <w:bCs w:val="0"/>
+          <w:bCs w:val="0"/>
+          <w:i w:val="0"/>
           <w:iCs w:val="0"/>
           <w:sz w:val="32"/>
           <w:szCs w:val="32"/>
@@ -162,6 +162,11 @@
         </w:rPr>
         <w:t xml:space="preserve">O HARNESS NO CUSTO E NO DESEMPENHO DE AGENTES DE CODIFICAÇÃO: TOKENS E TAXA DE SUCESSO COM O MODELO FIXO</w:t>
       </w:r>
+      <w:r>
+        <w:rPr>
+          <w:rtl w:val="0"/>
+        </w:rPr>
+      </w:r>
     </w:p>
     <w:p>
       <w:pPr>
@@ -314,14 +319,19 @@
       <w:r>
         <w:rPr>
           <w:b w:val="0"/>
-          <w:i w:val="0"/>
-          <w:bCs w:val="0"/>
+          <w:bCs w:val="0"/>
+          <w:i w:val="0"/>
           <w:iCs w:val="0"/>
           <w:sz w:val="32"/>
           <w:szCs w:val="32"/>
           <w:rtl w:val="0"/>
         </w:rPr>
         <w:t xml:space="preserve">O HARNESS NO CUSTO E NO DESEMPENHO DE AGENTES DE CODIFICAÇÃO: TOKENS E TAXA DE SUCESSO COM O MODELO FIXO</w:t>
+      </w:r>
+      <w:r>
+        <w:rPr>
+          <w:rtl w:val="0"/>
+        </w:rPr>
       </w:r>
     </w:p>
     <w:p>
@@ -645,7 +655,7 @@
           <w:iCs w:val="0"/>
           <w:rtl w:val="0"/>
         </w:rPr>
-        <w:t xml:space="preserve">Um agente de codificação tem duas partes: o modelo de linguagem e o </w:t>
+        <w:t xml:space="preserve">Um </w:t>
       </w:r>
       <w:r>
         <w:rPr>
@@ -655,6 +665,26 @@
           <w:iCs w:val="0"/>
           <w:rtl w:val="0"/>
         </w:rPr>
+        <w:t xml:space="preserve">coding agent</w:t>
+      </w:r>
+      <w:r>
+        <w:rPr>
+          <w:b w:val="0"/>
+          <w:i w:val="0"/>
+          <w:bCs w:val="0"/>
+          <w:iCs w:val="0"/>
+          <w:rtl w:val="0"/>
+        </w:rPr>
+        <w:t xml:space="preserve"> tem duas partes: o modelo de linguagem e o </w:t>
+      </w:r>
+      <w:r>
+        <w:rPr>
+          <w:b w:val="0"/>
+          <w:i/>
+          <w:bCs w:val="0"/>
+          <w:iCs w:val="0"/>
+          <w:rtl w:val="0"/>
+        </w:rPr>
         <w:t xml:space="preserve">harness</w:t>
       </w:r>
       <w:r>
@@ -665,7 +695,7 @@
           <w:iCs w:val="0"/>
           <w:rtl w:val="0"/>
         </w:rPr>
-        <w:t xml:space="preserve">, o software ao redor dele que monta o contexto, expõe as ferramentas e conduz a execução (Claude Code, Codex, OpenCode, pi). Pan </w:t>
+        <w:t xml:space="preserve">, o software ao redor dele que monta o contexto, expõe as ferramentas e conduz a execução. Pan </w:t>
       </w:r>
       <w:r>
         <w:rPr>
@@ -725,7 +755,7 @@
           <w:iCs w:val="0"/>
           <w:rtl w:val="0"/>
         </w:rPr>
-        <w:t xml:space="preserve"> quase não muda a taxa de sucesso, mas muda o custo. No SWE-bench Lite, o Claude Fable 5 resolve 97,8% das tentativas no Claude Code e 96,7% no pi, e o Claude Code custa cerca do dobro por tentativa (US$ 1,33 contra US$ 0,67).</w:t>
+        <w:t xml:space="preserve"> influencia notavelmente o custo. No SWE-bench Lite, o Claude Fable 5 resolve 97,8% das tentativas no Claude Code e 96,7% no Pi, e o Claude Code custa cerca do dobro por tentativa (US$ 1,33 contra US$ 0,67).</w:t>
       </w:r>
     </w:p>
     <w:p>
@@ -803,7 +833,7 @@
           <w:iCs w:val="0"/>
           <w:rtl w:val="0"/>
         </w:rPr>
-        <w:t xml:space="preserve"> em fluxos reais de desenvolvimento, com tarefas de várias sessões. Este projeto constrói o mesmo produto, o Finn, com o OpenCode e com o pi, sobre o mesmo modelo e a mesma especificação, e conta os tokens fora do </w:t>
+        <w:t xml:space="preserve"> em fluxos reais de desenvolvimento, com tarefas de várias sessões. Este projeto constrói o mesmo produto, o Finn, com o OpenCode e com o Pi, sobre o mesmo modelo e a mesma especificação, e conta os tokens fora do </w:t>
       </w:r>
       <w:r>
         <w:rPr>
@@ -855,8 +885,8 @@
       <w:r>
         <w:rPr>
           <w:b w:val="0"/>
-          <w:i w:val="0"/>
-          <w:bCs w:val="0"/>
+          <w:bCs w:val="0"/>
+          <w:i w:val="0"/>
           <w:iCs w:val="0"/>
           <w:rtl w:val="0"/>
         </w:rPr>
@@ -865,9 +895,9 @@
       <w:r>
         <w:rPr>
           <w:b w:val="0"/>
-          <w:i/>
-          <w:bCs w:val="0"/>
-          <w:iCs w:val="0"/>
+          <w:bCs w:val="0"/>
+          <w:i w:val="1"/>
+          <w:iCs w:val="1"/>
           <w:rtl w:val="0"/>
         </w:rPr>
         <w:t xml:space="preserve">harness</w:t>
@@ -875,12 +905,17 @@
       <w:r>
         <w:rPr>
           <w:b w:val="0"/>
-          <w:i w:val="0"/>
-          <w:bCs w:val="0"/>
+          <w:bCs w:val="0"/>
+          <w:i w:val="0"/>
           <w:iCs w:val="0"/>
           <w:rtl w:val="0"/>
         </w:rPr>
         <w:t xml:space="preserve"> sobre o custo e o desempenho de um modelo de linguagem fixo na construção de um produto de software completo.</w:t>
+      </w:r>
+      <w:r>
+        <w:rPr>
+          <w:rtl w:val="0"/>
+        </w:rPr>
       </w:r>
     </w:p>
     <w:p>
@@ -917,7 +952,7 @@
           <w:iCs w:val="0"/>
           <w:rtl w:val="0"/>
         </w:rPr>
-        <w:t xml:space="preserve">Com o modelo fixo, quanto mudam o custo em tokens e a taxa de sucesso ao construir o mesmo software com um </w:t>
+        <w:t xml:space="preserve">Com o modelo fixo, quanto a escolha do </w:t>
       </w:r>
       <w:r>
         <w:rPr>
@@ -937,7 +972,7 @@
           <w:iCs w:val="0"/>
           <w:rtl w:val="0"/>
         </w:rPr>
-        <w:t xml:space="preserve"> em vez de outro, e quanto da diferença de custo vem da carga fixa que cada </w:t>
+        <w:t xml:space="preserve"> pode influenciar no custo e na taxa de sucesso ao construir o mesmo software com um </w:t>
       </w:r>
       <w:r>
         <w:rPr>
@@ -957,7 +992,7 @@
           <w:iCs w:val="0"/>
           <w:rtl w:val="0"/>
         </w:rPr>
-        <w:t xml:space="preserve"> envia em toda requisição?</w:t>
+        <w:t xml:space="preserve"> em vez de outro?</w:t>
       </w:r>
     </w:p>
     <w:p>
@@ -1014,7 +1049,7 @@
           <w:iCs w:val="0"/>
           <w:rtl w:val="0"/>
         </w:rPr>
-        <w:t xml:space="preserve"> na construção do mesmo produto a partir da mesma especificação, com o OpenCode e o pi como braços, e separar a parcela que vem da carga fixa por requisição.</w:t>
+        <w:t xml:space="preserve"> na construção do mesmo produto a partir da mesma especificação, com o OpenCode e o Pi como braços, e separar a parcela que vem da carga fixa por requisição.</w:t>
       </w:r>
     </w:p>
     <w:p>
@@ -1046,8 +1081,8 @@
       <w:r>
         <w:rPr>
           <w:b w:val="0"/>
-          <w:i w:val="0"/>
-          <w:bCs w:val="0"/>
+          <w:bCs w:val="0"/>
+          <w:i w:val="0"/>
           <w:iCs w:val="0"/>
           <w:rtl w:val="0"/>
         </w:rPr>
@@ -1056,9 +1091,9 @@
       <w:r>
         <w:rPr>
           <w:b w:val="0"/>
-          <w:i/>
-          <w:bCs w:val="0"/>
-          <w:iCs w:val="0"/>
+          <w:bCs w:val="0"/>
+          <w:i w:val="1"/>
+          <w:iCs w:val="1"/>
           <w:rtl w:val="0"/>
         </w:rPr>
         <w:t xml:space="preserve">proxy</w:t>
@@ -1066,12 +1101,17 @@
       <w:r>
         <w:rPr>
           <w:b w:val="0"/>
-          <w:i w:val="0"/>
-          <w:bCs w:val="0"/>
+          <w:bCs w:val="0"/>
+          <w:i w:val="0"/>
           <w:iCs w:val="0"/>
           <w:rtl w:val="0"/>
         </w:rPr>
         <w:t xml:space="preserve"> que conta requisições, tokens e latência por braço;</w:t>
+      </w:r>
+      <w:r>
+        <w:rPr>
+          <w:rtl w:val="0"/>
+        </w:rPr>
       </w:r>
     </w:p>
     <w:p>
@@ -1089,7 +1129,7 @@
           <w:iCs w:val="0"/>
           <w:rtl w:val="0"/>
         </w:rPr>
-        <w:t xml:space="preserve">2) escrever a especificação do Finn em nove unidades, com testes de aceitação;</w:t>
+        <w:t xml:space="preserve">2) construir o Finn de referência e extrair dele a especificação e os testes;</w:t>
       </w:r>
     </w:p>
     <w:p>
@@ -1102,8 +1142,8 @@
       <w:r>
         <w:rPr>
           <w:b w:val="0"/>
-          <w:i w:val="0"/>
-          <w:bCs w:val="0"/>
+          <w:bCs w:val="0"/>
+          <w:i w:val="0"/>
           <w:iCs w:val="0"/>
           <w:rtl w:val="0"/>
         </w:rPr>
@@ -1112,9 +1152,9 @@
       <w:r>
         <w:rPr>
           <w:b w:val="0"/>
-          <w:i/>
-          <w:bCs w:val="0"/>
-          <w:iCs w:val="0"/>
+          <w:bCs w:val="0"/>
+          <w:i w:val="1"/>
+          <w:iCs w:val="1"/>
           <w:rtl w:val="0"/>
         </w:rPr>
         <w:t xml:space="preserve">harnesses</w:t>
@@ -1122,8 +1162,8 @@
       <w:r>
         <w:rPr>
           <w:b w:val="0"/>
-          <w:i w:val="0"/>
-          <w:bCs w:val="0"/>
+          <w:bCs w:val="0"/>
+          <w:i w:val="0"/>
           <w:iCs w:val="0"/>
           <w:rtl w:val="0"/>
         </w:rPr>
@@ -1132,9 +1172,9 @@
       <w:r>
         <w:rPr>
           <w:b w:val="0"/>
-          <w:i/>
-          <w:bCs w:val="0"/>
-          <w:iCs w:val="0"/>
+          <w:bCs w:val="0"/>
+          <w:i w:val="1"/>
+          <w:iCs w:val="1"/>
           <w:rtl w:val="0"/>
         </w:rPr>
         <w:t xml:space="preserve">prompt</w:t>
@@ -1142,12 +1182,17 @@
       <w:r>
         <w:rPr>
           <w:b w:val="0"/>
-          <w:i w:val="0"/>
-          <w:bCs w:val="0"/>
+          <w:bCs w:val="0"/>
+          <w:i w:val="0"/>
           <w:iCs w:val="0"/>
           <w:rtl w:val="0"/>
         </w:rPr>
         <w:t xml:space="preserve"> e espaço inicial;</w:t>
+      </w:r>
+      <w:r>
+        <w:rPr>
+          <w:rtl w:val="0"/>
+        </w:rPr>
       </w:r>
     </w:p>
     <w:p>
@@ -1160,12 +1205,17 @@
       <w:r>
         <w:rPr>
           <w:b w:val="0"/>
-          <w:i w:val="0"/>
-          <w:bCs w:val="0"/>
+          <w:bCs w:val="0"/>
+          <w:i w:val="0"/>
           <w:iCs w:val="0"/>
           <w:rtl w:val="0"/>
         </w:rPr>
         <w:t xml:space="preserve">4) repetir em um segundo modelo e verificar se a ordenação dos braços se mantém;</w:t>
+      </w:r>
+      <w:r>
+        <w:rPr>
+          <w:rtl w:val="0"/>
+        </w:rPr>
       </w:r>
     </w:p>
     <w:p>
@@ -1178,8 +1228,8 @@
       <w:r>
         <w:rPr>
           <w:b w:val="0"/>
-          <w:i w:val="0"/>
-          <w:bCs w:val="0"/>
+          <w:bCs w:val="0"/>
+          <w:i w:val="0"/>
           <w:iCs w:val="0"/>
           <w:rtl w:val="0"/>
         </w:rPr>
@@ -1188,9 +1238,9 @@
       <w:r>
         <w:rPr>
           <w:b w:val="0"/>
-          <w:i/>
-          <w:bCs w:val="0"/>
-          <w:iCs w:val="0"/>
+          <w:bCs w:val="0"/>
+          <w:i w:val="1"/>
+          <w:iCs w:val="1"/>
           <w:rtl w:val="0"/>
         </w:rPr>
         <w:t xml:space="preserve">harness</w:t>
@@ -1198,8 +1248,8 @@
       <w:r>
         <w:rPr>
           <w:b w:val="0"/>
-          <w:i w:val="0"/>
-          <w:bCs w:val="0"/>
+          <w:bCs w:val="0"/>
+          <w:i w:val="0"/>
           <w:iCs w:val="0"/>
           <w:rtl w:val="0"/>
         </w:rPr>
@@ -1208,9 +1258,9 @@
       <w:r>
         <w:rPr>
           <w:b w:val="0"/>
-          <w:i/>
-          <w:bCs w:val="0"/>
-          <w:iCs w:val="0"/>
+          <w:bCs w:val="0"/>
+          <w:i w:val="1"/>
+          <w:iCs w:val="1"/>
           <w:rtl w:val="0"/>
         </w:rPr>
         <w:t xml:space="preserve">proxy</w:t>
@@ -1218,12 +1268,17 @@
       <w:r>
         <w:rPr>
           <w:b w:val="0"/>
-          <w:i w:val="0"/>
-          <w:bCs w:val="0"/>
+          <w:bCs w:val="0"/>
+          <w:i w:val="0"/>
           <w:iCs w:val="0"/>
           <w:rtl w:val="0"/>
         </w:rPr>
         <w:t xml:space="preserve">;</w:t>
+      </w:r>
+      <w:r>
+        <w:rPr>
+          <w:rtl w:val="0"/>
+        </w:rPr>
       </w:r>
     </w:p>
     <w:p>
@@ -1236,8 +1291,8 @@
       <w:r>
         <w:rPr>
           <w:b w:val="0"/>
-          <w:i w:val="0"/>
-          <w:bCs w:val="0"/>
+          <w:bCs w:val="0"/>
+          <w:i w:val="0"/>
           <w:iCs w:val="0"/>
           <w:rtl w:val="0"/>
         </w:rPr>
@@ -1246,9 +1301,9 @@
       <w:r>
         <w:rPr>
           <w:b w:val="0"/>
-          <w:i/>
-          <w:bCs w:val="0"/>
-          <w:iCs w:val="0"/>
+          <w:bCs w:val="0"/>
+          <w:i w:val="1"/>
+          <w:iCs w:val="1"/>
           <w:rtl w:val="0"/>
         </w:rPr>
         <w:t xml:space="preserve">prompts</w:t>
@@ -1256,12 +1311,17 @@
       <w:r>
         <w:rPr>
           <w:b w:val="0"/>
-          <w:i w:val="0"/>
-          <w:bCs w:val="0"/>
+          <w:bCs w:val="0"/>
+          <w:i w:val="0"/>
           <w:iCs w:val="0"/>
           <w:rtl w:val="0"/>
         </w:rPr>
         <w:t xml:space="preserve">, testes, dados e scripts de análise.</w:t>
+      </w:r>
+      <w:r>
+        <w:rPr>
+          <w:rtl w:val="0"/>
+        </w:rPr>
       </w:r>
     </w:p>
     <w:p>
@@ -1338,7 +1398,7 @@
           <w:iCs w:val="0"/>
           <w:rtl w:val="0"/>
         </w:rPr>
-        <w:t xml:space="preserve"> e o modelo contará requisições, tokens e latência da mesma forma para os dois braços. Cada braço construirá o Finn do zero, em nove unidades, ao menos três vezes, e a diferença entre os braços será comparada unidade a unidade.</w:t>
+        <w:t xml:space="preserve"> e o modelo contará requisições, tokens e latência da mesma forma para os dois braços. Cada braço construirá o Finn do zero ao menos três vezes, a partir da especificação extraída do Finn de referência do autor, e a diferença entre os braços será comparada unidade a unidade.</w:t>
       </w:r>
     </w:p>
     <w:p>
@@ -1395,7 +1455,7 @@
           <w:iCs w:val="0"/>
           <w:rtl w:val="0"/>
         </w:rPr>
-        <w:t xml:space="preserve"> muda mais o custo do que o sucesso. Os tokens por unidade diferem entre o OpenCode e o pi, e a fração de testes aprovados fica igual. H1 será refutada se o teste pareado não apontar diferença de tokens ou se apontar diferença de sucesso.</w:t>
+        <w:t xml:space="preserve"> muda mais o custo do que o sucesso. Os tokens por unidade diferem entre o OpenCode e o Pi, e a fração de testes aprovados fica igual. H1 será refutada se o teste pareado não apontar diferença de tokens ou se a fração final de testes aprovados diferir.</w:t>
       </w:r>
     </w:p>
     <w:p>
@@ -1408,8 +1468,8 @@
       <w:r>
         <w:rPr>
           <w:b w:val="0"/>
-          <w:i w:val="0"/>
-          <w:bCs w:val="0"/>
+          <w:bCs w:val="0"/>
+          <w:i w:val="0"/>
           <w:iCs w:val="0"/>
           <w:rtl w:val="0"/>
         </w:rPr>
@@ -1417,23 +1477,26 @@
       </w:r>
       <w:r>
         <w:rPr>
-          <w:b w:val="0"/>
-          <w:i/>
-          <w:bCs w:val="0"/>
-          <w:iCs w:val="0"/>
-          <w:rtl w:val="0"/>
-        </w:rPr>
-        <w:t xml:space="preserve">prompt</w:t>
-      </w:r>
-      <w:r>
-        <w:rPr>
-          <w:b w:val="0"/>
-          <w:i w:val="0"/>
-          <w:bCs w:val="0"/>
-          <w:iCs w:val="0"/>
-          <w:rtl w:val="0"/>
-        </w:rPr>
-        <w:t xml:space="preserve"> de sistema e esquemas de ferramenta) explica a maior parte da diferença de tokens, e o número de passos explica a menor. H2 será refutada se os passos ou o conteúdo da conversa explicarem a maior parte.</w:t>
+          <w:i w:val="1"/>
+          <w:iCs w:val="1"/>
+          <w:rtl w:val="0"/>
+        </w:rPr>
+        <w:t xml:space="preserve">system prompt</w:t>
+      </w:r>
+      <w:r>
+        <w:rPr>
+          <w:b w:val="0"/>
+          <w:bCs w:val="0"/>
+          <w:i w:val="0"/>
+          <w:iCs w:val="0"/>
+          <w:rtl w:val="0"/>
+        </w:rPr>
+        <w:t xml:space="preserve"> e esquemas de ferramenta) explica a maior parte da diferença de tokens, e o número de passos explica a menor. H2 será refutada se os passos ou o conteúdo da conversa explicarem a maior parte.</w:t>
+      </w:r>
+      <w:r>
+        <w:rPr>
+          <w:rtl w:val="0"/>
+        </w:rPr>
       </w:r>
     </w:p>
     <w:p>
@@ -1446,12 +1509,17 @@
       <w:r>
         <w:rPr>
           <w:b w:val="0"/>
-          <w:i w:val="0"/>
-          <w:bCs w:val="0"/>
+          <w:bCs w:val="0"/>
+          <w:i w:val="0"/>
           <w:iCs w:val="0"/>
           <w:rtl w:val="0"/>
         </w:rPr>
         <w:t xml:space="preserve">Após esta introdução, a seção 2 apresenta o referencial teórico e a seção 3, o material e método. As seções 4, 5 e 6 trazem o orçamento, o cronograma e as referências.</w:t>
+      </w:r>
+      <w:r>
+        <w:rPr>
+          <w:rtl w:val="0"/>
+        </w:rPr>
       </w:r>
     </w:p>
     <w:p>
@@ -1486,8 +1554,8 @@
       <w:r>
         <w:rPr>
           <w:b w:val="0"/>
-          <w:i w:val="0"/>
-          <w:bCs w:val="0"/>
+          <w:bCs w:val="0"/>
+          <w:i w:val="0"/>
           <w:iCs w:val="0"/>
           <w:rtl w:val="0"/>
         </w:rPr>
@@ -1496,9 +1564,9 @@
       <w:r>
         <w:rPr>
           <w:b w:val="0"/>
-          <w:i/>
-          <w:bCs w:val="0"/>
-          <w:iCs w:val="0"/>
+          <w:bCs w:val="0"/>
+          <w:i w:val="1"/>
+          <w:iCs w:val="1"/>
           <w:rtl w:val="0"/>
         </w:rPr>
         <w:t xml:space="preserve">et al.</w:t>
@@ -1506,8 +1574,8 @@
       <w:r>
         <w:rPr>
           <w:b w:val="0"/>
-          <w:i w:val="0"/>
-          <w:bCs w:val="0"/>
+          <w:bCs w:val="0"/>
+          <w:i w:val="0"/>
           <w:iCs w:val="0"/>
           <w:rtl w:val="0"/>
         </w:rPr>
@@ -1516,9 +1584,9 @@
       <w:r>
         <w:rPr>
           <w:b w:val="0"/>
-          <w:i/>
-          <w:bCs w:val="0"/>
-          <w:iCs w:val="0"/>
+          <w:bCs w:val="0"/>
+          <w:i w:val="1"/>
+          <w:iCs w:val="1"/>
           <w:rtl w:val="0"/>
         </w:rPr>
         <w:t xml:space="preserve">harness</w:t>
@@ -1526,8 +1594,8 @@
       <w:r>
         <w:rPr>
           <w:b w:val="0"/>
-          <w:i w:val="0"/>
-          <w:bCs w:val="0"/>
+          <w:bCs w:val="0"/>
+          <w:i w:val="0"/>
           <w:iCs w:val="0"/>
           <w:rtl w:val="0"/>
         </w:rPr>
@@ -1536,9 +1604,9 @@
       <w:r>
         <w:rPr>
           <w:b w:val="0"/>
-          <w:i/>
-          <w:bCs w:val="0"/>
-          <w:iCs w:val="0"/>
+          <w:bCs w:val="0"/>
+          <w:i w:val="1"/>
+          <w:iCs w:val="1"/>
           <w:rtl w:val="0"/>
         </w:rPr>
         <w:t xml:space="preserve">et al.</w:t>
@@ -1546,12 +1614,17 @@
       <w:r>
         <w:rPr>
           <w:b w:val="0"/>
-          <w:i w:val="0"/>
-          <w:bCs w:val="0"/>
+          <w:bCs w:val="0"/>
+          <w:i w:val="0"/>
           <w:iCs w:val="0"/>
           <w:rtl w:val="0"/>
         </w:rPr>
         <w:t xml:space="preserve"> (2026) delimitam o que essa camada contém:</w:t>
+      </w:r>
+      <w:r>
+        <w:rPr>
+          <w:rtl w:val="0"/>
+        </w:rPr>
       </w:r>
     </w:p>
     <w:p>
@@ -1563,34 +1636,53 @@
       </w:pPr>
       <w:r>
         <w:rPr>
+          <w:b w:val="0"/>
+          <w:i w:val="0"/>
           <w:sz w:val="20"/>
           <w:szCs w:val="20"/>
           <w:rtl w:val="0"/>
         </w:rPr>
-        <w:t xml:space="preserve">Na prática, esse progresso depende não apenas do modelo de linguagem subjacente, mas igualmente dos componentes de engenharia que o cercam: o prompt de sistema que molda o estilo de trabalho, as ferramentas que expõem o sistema de arquivos e o shell, e o middleware que controla contexto, execução e recuperação. Esse conjunto de componentes externos ao modelo e editáveis é chamado coletivamente de harness do agente. (Lin </w:t>
-      </w:r>
-      <w:r>
-        <w:rPr>
-          <w:i w:val="1"/>
-          <w:iCs w:val="1"/>
+        <w:t xml:space="preserve">Na prática, esse progresso depende não apenas do modelo de linguagem subjacente, mas igualmente dos componentes de engenharia que o cercam: o </w:t>
+      </w:r>
+      <w:r>
+        <w:rPr>
+          <w:b w:val="0"/>
+          <w:i/>
           <w:sz w:val="20"/>
           <w:szCs w:val="20"/>
           <w:rtl w:val="0"/>
         </w:rPr>
-        <w:t xml:space="preserve">et al.</w:t>
-      </w:r>
-      <w:r>
-        <w:rPr>
+        <w:t xml:space="preserve">system prompt</w:t>
+      </w:r>
+      <w:r>
+        <w:rPr>
+          <w:b w:val="0"/>
+          <w:i w:val="0"/>
           <w:sz w:val="20"/>
           <w:szCs w:val="20"/>
           <w:rtl w:val="0"/>
         </w:rPr>
+        <w:t xml:space="preserve"> que molda o estilo de trabalho, as ferramentas que expõem o sistema de arquivos e o shell, e o middleware que controla contexto, execução e recuperação. Esse conjunto de componentes externos ao modelo e editáveis é chamado coletivamente de harness do agente. (Lin </w:t>
+      </w:r>
+      <w:r>
+        <w:rPr>
+          <w:b w:val="0"/>
+          <w:i/>
+          <w:sz w:val="20"/>
+          <w:szCs w:val="20"/>
+          <w:rtl w:val="0"/>
+        </w:rPr>
+        <w:t xml:space="preserve">et al.</w:t>
+      </w:r>
+      <w:r>
+        <w:rPr>
+          <w:b w:val="0"/>
+          <w:i w:val="0"/>
+          <w:sz w:val="20"/>
+          <w:szCs w:val="20"/>
+          <w:rtl w:val="0"/>
+        </w:rPr>
         <w:t xml:space="preserve">, 2026, §1, tradução nossa).</w:t>
-      </w:r>
-      <w:r>
-        <w:rPr>
-          <w:rtl w:val="0"/>
-        </w:rPr>
       </w:r>
     </w:p>
     <w:p>
@@ -1604,14 +1696,38 @@
         <w:rPr>
           <w:b w:val="0"/>
           <w:i w:val="0"/>
-          <w:rtl w:val="0"/>
-        </w:rPr>
-        <w:t xml:space="preserve">Só esse conjunto varia entre os braços deste experimento. O pi envia quatro ferramentas e um </w:t>
+          <w:bCs w:val="0"/>
+          <w:iCs w:val="0"/>
+          <w:rtl w:val="0"/>
+        </w:rPr>
+        <w:t xml:space="preserve">Só esse conjunto varia entre os braços deste experimento. O Pi envia quatro ferramentas e um </w:t>
       </w:r>
       <w:r>
         <w:rPr>
           <w:b w:val="0"/>
           <w:i/>
+          <w:bCs w:val="0"/>
+          <w:iCs w:val="0"/>
+          <w:rtl w:val="0"/>
+        </w:rPr>
+        <w:t xml:space="preserve">system prompt</w:t>
+      </w:r>
+      <w:r>
+        <w:rPr>
+          <w:b w:val="0"/>
+          <w:i w:val="0"/>
+          <w:bCs w:val="0"/>
+          <w:iCs w:val="0"/>
+          <w:rtl w:val="0"/>
+        </w:rPr>
+        <w:t xml:space="preserve"> curto, e o OpenCode envia mais ferramentas, um </w:t>
+      </w:r>
+      <w:r>
+        <w:rPr>
+          <w:b w:val="0"/>
+          <w:i/>
+          <w:bCs w:val="0"/>
+          <w:iCs w:val="0"/>
           <w:rtl w:val="0"/>
         </w:rPr>
         <w:t xml:space="preserve">prompt</w:t>
@@ -1620,22 +1736,8 @@
         <w:rPr>
           <w:b w:val="0"/>
           <w:i w:val="0"/>
-          <w:rtl w:val="0"/>
-        </w:rPr>
-        <w:t xml:space="preserve"> de sistema curto, e o OpenCode envia mais ferramentas, um </w:t>
-      </w:r>
-      <w:r>
-        <w:rPr>
-          <w:b w:val="0"/>
-          <w:i/>
-          <w:rtl w:val="0"/>
-        </w:rPr>
-        <w:t xml:space="preserve">prompt</w:t>
-      </w:r>
-      <w:r>
-        <w:rPr>
-          <w:b w:val="0"/>
-          <w:i w:val="0"/>
+          <w:bCs w:val="0"/>
+          <w:iCs w:val="0"/>
           <w:rtl w:val="0"/>
         </w:rPr>
         <w:t xml:space="preserve"> maior, subagentes e permissões.</w:t>
@@ -1776,7 +1878,7 @@
           <w:iCs w:val="0"/>
           <w:rtl w:val="0"/>
         </w:rPr>
-        <w:t xml:space="preserve"> sobre a taxa de sucesso ficou dentro de ±2%, enquanto o Claude Code custou cerca de 2,0 vezes o pi. Como as fontes divergem sobre o sucesso, este projeto mede sucesso e custo juntos.</w:t>
+        <w:t xml:space="preserve"> sobre a taxa de sucesso ficou dentro de ±2%, enquanto o Claude Code custou cerca de 2,0 vezes o Pi. Como as fontes divergem sobre o sucesso, este projeto mede sucesso e custo juntos.</w:t>
       </w:r>
     </w:p>
     <w:p>
@@ -1814,7 +1916,7 @@
           <w:iCs w:val="0"/>
           <w:rtl w:val="0"/>
         </w:rPr>
-        <w:t xml:space="preserve"> (2026) apontam a primeira requisição. O contexto inicial do Claude Code passa de dez vezes o do pi, com número de turnos parecido (15,3 contra 15,4 no Claude Fable 5). Liu </w:t>
+        <w:t xml:space="preserve"> (2026) apontam a primeira requisição. O contexto inicial do Claude Code passa de dez vezes o do Pi, com número de turnos parecido (15,3 contra 15,4 no Claude Fable 5). Liu </w:t>
       </w:r>
       <w:r>
         <w:rPr>
@@ -1834,7 +1936,7 @@
           <w:iCs w:val="0"/>
           <w:rtl w:val="0"/>
         </w:rPr>
-        <w:t xml:space="preserve"> (2026) apontam o resto da conversa. Mudando só a execução das ações, a compactação de contexto e o tratamento das observações, cortaram de 44,7% a 49,0% dos tokens em relação ao pi e mantiveram de 93,7% a 94,3% da pontuação dele. Ning </w:t>
+        <w:t xml:space="preserve"> (2026) apontam o resto da conversa. Mudando só a execução das ações, a compactação de contexto e o tratamento das observações, cortaram de 44,7% a 49,0% dos tokens em relação ao Pi e mantiveram de 93,7% a 94,3% da pontuação dele. Ning </w:t>
       </w:r>
       <w:r>
         <w:rPr>
@@ -1887,8 +1989,8 @@
       <w:r>
         <w:rPr>
           <w:b w:val="0"/>
-          <w:i w:val="0"/>
-          <w:bCs w:val="0"/>
+          <w:bCs w:val="0"/>
+          <w:i w:val="0"/>
           <w:iCs w:val="0"/>
           <w:rtl w:val="0"/>
         </w:rPr>
@@ -1897,9 +1999,9 @@
       <w:r>
         <w:rPr>
           <w:b w:val="0"/>
-          <w:i/>
-          <w:bCs w:val="0"/>
-          <w:iCs w:val="0"/>
+          <w:bCs w:val="0"/>
+          <w:i w:val="1"/>
+          <w:iCs w:val="1"/>
           <w:rtl w:val="0"/>
         </w:rPr>
         <w:t xml:space="preserve">harness</w:t>
@@ -1907,8 +2009,8 @@
       <w:r>
         <w:rPr>
           <w:b w:val="0"/>
-          <w:i w:val="0"/>
-          <w:bCs w:val="0"/>
+          <w:bCs w:val="0"/>
+          <w:i w:val="0"/>
           <w:iCs w:val="0"/>
           <w:rtl w:val="0"/>
         </w:rPr>
@@ -1917,9 +2019,9 @@
       <w:r>
         <w:rPr>
           <w:b w:val="0"/>
-          <w:i/>
-          <w:bCs w:val="0"/>
-          <w:iCs w:val="0"/>
+          <w:bCs w:val="0"/>
+          <w:i w:val="1"/>
+          <w:iCs w:val="1"/>
           <w:rtl w:val="0"/>
         </w:rPr>
         <w:t xml:space="preserve">et al.</w:t>
@@ -1927,8 +2029,8 @@
       <w:r>
         <w:rPr>
           <w:b w:val="0"/>
-          <w:i w:val="0"/>
-          <w:bCs w:val="0"/>
+          <w:bCs w:val="0"/>
+          <w:i w:val="0"/>
           <w:iCs w:val="0"/>
           <w:rtl w:val="0"/>
         </w:rPr>
@@ -1937,9 +2039,9 @@
       <w:r>
         <w:rPr>
           <w:b w:val="0"/>
-          <w:i/>
-          <w:bCs w:val="0"/>
-          <w:iCs w:val="0"/>
+          <w:bCs w:val="0"/>
+          <w:i w:val="1"/>
+          <w:iCs w:val="1"/>
           <w:rtl w:val="0"/>
         </w:rPr>
         <w:t xml:space="preserve">proxy</w:t>
@@ -1947,8 +2049,8 @@
       <w:r>
         <w:rPr>
           <w:b w:val="0"/>
-          <w:i w:val="0"/>
-          <w:bCs w:val="0"/>
+          <w:bCs w:val="0"/>
+          <w:i w:val="0"/>
           <w:iCs w:val="0"/>
           <w:rtl w:val="0"/>
         </w:rPr>
@@ -1957,9 +2059,9 @@
       <w:r>
         <w:rPr>
           <w:b w:val="0"/>
-          <w:i/>
-          <w:bCs w:val="0"/>
-          <w:iCs w:val="0"/>
+          <w:bCs w:val="0"/>
+          <w:i w:val="1"/>
+          <w:iCs w:val="1"/>
           <w:rtl w:val="0"/>
         </w:rPr>
         <w:t xml:space="preserve">harness</w:t>
@@ -1967,12 +2069,17 @@
       <w:r>
         <w:rPr>
           <w:b w:val="0"/>
-          <w:i w:val="0"/>
-          <w:bCs w:val="0"/>
+          <w:bCs w:val="0"/>
+          <w:i w:val="0"/>
           <w:iCs w:val="0"/>
           <w:rtl w:val="0"/>
         </w:rPr>
         <w:t xml:space="preserve">.</w:t>
+      </w:r>
+      <w:r>
+        <w:rPr>
+          <w:rtl w:val="0"/>
+        </w:rPr>
       </w:r>
     </w:p>
     <w:p>
@@ -1985,8 +2092,8 @@
       <w:r>
         <w:rPr>
           <w:b w:val="0"/>
-          <w:i w:val="0"/>
-          <w:bCs w:val="0"/>
+          <w:bCs w:val="0"/>
+          <w:i w:val="0"/>
           <w:iCs w:val="0"/>
           <w:rtl w:val="0"/>
         </w:rPr>
@@ -1995,9 +2102,9 @@
       <w:r>
         <w:rPr>
           <w:b w:val="0"/>
-          <w:i/>
-          <w:bCs w:val="0"/>
-          <w:iCs w:val="0"/>
+          <w:bCs w:val="0"/>
+          <w:i w:val="1"/>
+          <w:iCs w:val="1"/>
           <w:rtl w:val="0"/>
         </w:rPr>
         <w:t xml:space="preserve">et al.</w:t>
@@ -2005,8 +2112,8 @@
       <w:r>
         <w:rPr>
           <w:b w:val="0"/>
-          <w:i w:val="0"/>
-          <w:bCs w:val="0"/>
+          <w:bCs w:val="0"/>
+          <w:i w:val="0"/>
           <w:iCs w:val="0"/>
           <w:rtl w:val="0"/>
         </w:rPr>
@@ -2015,9 +2122,9 @@
       <w:r>
         <w:rPr>
           <w:b w:val="0"/>
-          <w:i/>
-          <w:bCs w:val="0"/>
-          <w:iCs w:val="0"/>
+          <w:bCs w:val="0"/>
+          <w:i w:val="1"/>
+          <w:iCs w:val="1"/>
           <w:rtl w:val="0"/>
         </w:rPr>
         <w:t xml:space="preserve">et al.</w:t>
@@ -2025,8 +2132,8 @@
       <w:r>
         <w:rPr>
           <w:b w:val="0"/>
-          <w:i w:val="0"/>
-          <w:bCs w:val="0"/>
+          <w:bCs w:val="0"/>
+          <w:i w:val="0"/>
           <w:iCs w:val="0"/>
           <w:rtl w:val="0"/>
         </w:rPr>
@@ -2035,9 +2142,9 @@
       <w:r>
         <w:rPr>
           <w:b w:val="0"/>
-          <w:i/>
-          <w:bCs w:val="0"/>
-          <w:iCs w:val="0"/>
+          <w:bCs w:val="0"/>
+          <w:i w:val="1"/>
+          <w:iCs w:val="1"/>
           <w:rtl w:val="0"/>
         </w:rPr>
         <w:t xml:space="preserve">harness</w:t>
@@ -2045,12 +2152,17 @@
       <w:r>
         <w:rPr>
           <w:b w:val="0"/>
-          <w:i w:val="0"/>
-          <w:bCs w:val="0"/>
+          <w:bCs w:val="0"/>
+          <w:i w:val="0"/>
           <w:iCs w:val="0"/>
           <w:rtl w:val="0"/>
         </w:rPr>
         <w:t xml:space="preserve"> de outro fornecedor. Por isso o desenho terá dois níveis de modelo.</w:t>
+      </w:r>
+      <w:r>
+        <w:rPr>
+          <w:rtl w:val="0"/>
+        </w:rPr>
       </w:r>
     </w:p>
     <w:p>
@@ -2085,8 +2197,8 @@
       <w:r>
         <w:rPr>
           <w:b w:val="0"/>
-          <w:i w:val="0"/>
-          <w:bCs w:val="0"/>
+          <w:bCs w:val="0"/>
+          <w:i w:val="0"/>
           <w:iCs w:val="0"/>
           <w:rtl w:val="0"/>
         </w:rPr>
@@ -2095,9 +2207,9 @@
       <w:r>
         <w:rPr>
           <w:b w:val="0"/>
-          <w:i/>
-          <w:bCs w:val="0"/>
-          <w:iCs w:val="0"/>
+          <w:bCs w:val="0"/>
+          <w:i w:val="1"/>
+          <w:iCs w:val="1"/>
           <w:rtl w:val="0"/>
         </w:rPr>
         <w:t xml:space="preserve">harnesses</w:t>
@@ -2105,8 +2217,8 @@
       <w:r>
         <w:rPr>
           <w:b w:val="0"/>
-          <w:i w:val="0"/>
-          <w:bCs w:val="0"/>
+          <w:bCs w:val="0"/>
+          <w:i w:val="0"/>
           <w:iCs w:val="0"/>
           <w:rtl w:val="0"/>
         </w:rPr>
@@ -2115,9 +2227,9 @@
       <w:r>
         <w:rPr>
           <w:b w:val="0"/>
-          <w:i/>
-          <w:bCs w:val="0"/>
-          <w:iCs w:val="0"/>
+          <w:bCs w:val="0"/>
+          <w:i w:val="1"/>
+          <w:iCs w:val="1"/>
           <w:rtl w:val="0"/>
         </w:rPr>
         <w:t xml:space="preserve">harness</w:t>
@@ -2125,12 +2237,17 @@
       <w:r>
         <w:rPr>
           <w:b w:val="0"/>
-          <w:i w:val="0"/>
-          <w:bCs w:val="0"/>
+          <w:bCs w:val="0"/>
+          <w:i w:val="0"/>
           <w:iCs w:val="0"/>
           <w:rtl w:val="0"/>
         </w:rPr>
         <w:t xml:space="preserve"> é a variável manipulada, e modelo, especificação, espaço de trabalho inicial e limites ficam controlados.</w:t>
+      </w:r>
+      <w:r>
+        <w:rPr>
+          <w:rtl w:val="0"/>
+        </w:rPr>
       </w:r>
     </w:p>
     <w:p>
@@ -2148,7 +2265,7 @@
           <w:iCs w:val="0"/>
           <w:rtl w:val="0"/>
         </w:rPr>
-        <w:t xml:space="preserve">Conforme a Portaria CNPq nº 2.664/2026 (Brasil, 2026), declara-se o uso do Claude Code no levantamento das fontes, organizado pelo método </w:t>
+        <w:t xml:space="preserve">Declara-se o uso do Claude Code no levantamento das fontes, organizado pelo método </w:t>
       </w:r>
       <w:r>
         <w:rPr>
@@ -2168,7 +2285,7 @@
           <w:iCs w:val="0"/>
           <w:rtl w:val="0"/>
         </w:rPr>
-        <w:t xml:space="preserve"> de Karpathy (2026) no repositório do projeto (YuukiFST, 2026c), e na especificação do Finn, feita com o Helmsman (YuukiFST, 2026a). O autor conferiu cada afirmação citada na obra original e responde pelo texto e pelas decisões de produto.</w:t>
+        <w:t xml:space="preserve"> de Karpathy (2026) no repositório do projeto (YuukiFST, 2026c), nas decisões do Finn, mapeadas com o Helmsman (YuukiFST, 2026a), e na sua versão de referência. O autor conferiu cada afirmação citada na obra original e responde pelo texto e pelas decisões de produto.</w:t>
       </w:r>
     </w:p>
     <w:p>
@@ -2216,17 +2333,17 @@
           <w:iCs w:val="0"/>
           <w:rtl w:val="0"/>
         </w:rPr>
-        <w:t xml:space="preserve">prompt</w:t>
-      </w:r>
-      <w:r>
-        <w:rPr>
-          <w:b w:val="0"/>
-          <w:i w:val="0"/>
-          <w:bCs w:val="0"/>
-          <w:iCs w:val="0"/>
-          <w:rtl w:val="0"/>
-        </w:rPr>
-        <w:t xml:space="preserve"> de sistema e os tokens de cada requisição, e fornece a carga fixa que H2 usa. A Camada 2 mede a construção do produto contra o modelo real.</w:t>
+        <w:t xml:space="preserve">system prompt</w:t>
+      </w:r>
+      <w:r>
+        <w:rPr>
+          <w:b w:val="0"/>
+          <w:i w:val="0"/>
+          <w:bCs w:val="0"/>
+          <w:iCs w:val="0"/>
+          <w:rtl w:val="0"/>
+        </w:rPr>
+        <w:t xml:space="preserve"> e os tokens de cada requisição, ou seja, a carga fixa de cada braço sem tarefa. A Camada 2 mede a construção do produto contra o modelo real.</w:t>
       </w:r>
     </w:p>
     <w:p>
@@ -2244,7 +2361,7 @@
           <w:iCs w:val="0"/>
           <w:rtl w:val="0"/>
         </w:rPr>
-        <w:t xml:space="preserve">Os braços serão o OpenCode (Opencode, 2026a) e o pi (Earendil, 2026). Os dois são de código aberto, rodam sem interface e aceitam URL base compatível com a API da OpenAI, o que permite passá-los pelo </w:t>
+        <w:t xml:space="preserve">Os braços serão o OpenCode (Opencode, 2026a) e o Pi (Earendil, 2026). Os dois são de código aberto, rodam sem interface e aceitam URL base compatível com a API da OpenAI, o que permite passá-los pelo </w:t>
       </w:r>
       <w:r>
         <w:rPr>
@@ -2282,7 +2399,7 @@
           <w:iCs w:val="0"/>
           <w:rtl w:val="0"/>
         </w:rPr>
-        <w:t xml:space="preserve">O produto será o Finn, SaaS multiempresa em que a empresa cliente fala com o próprio financeiro por voz e recebe lançamento, relatório e aviso no celular (YuukiFST, 2026b). Produto e pilha foram decididos antes do experimento, em 21 </w:t>
+        <w:t xml:space="preserve">O produto será o Finn, SaaS multiempresa em que a empresa cliente fala com o próprio financeiro por voz e recebe lançamento, relatório e aviso no celular (YuukiFST, 2026b), decidido em 21 </w:t>
       </w:r>
       <w:r>
         <w:rPr>
@@ -2302,7 +2419,7 @@
           <w:iCs w:val="0"/>
           <w:rtl w:val="0"/>
         </w:rPr>
-        <w:t xml:space="preserve">. O autor escreverá uma especificação única, congelada por SHA-256, com a pilha (TypeScript, TanStack Start, tRPC, Drizzle ORM, PostgreSQL, Vitest) e nove unidades em ordem de dependência. O executor chama o </w:t>
+        <w:t xml:space="preserve">. O autor construirá antes uma versão de referência e marcará no git o fim de cada etapa. Dela sairá a especificação, congelada por SHA-256: produto, pilha, interface dos testes e funcionalidades em JSON, no formato de Young (2025), uma unidade por etapa, ao menos seis. O executor chama o </w:t>
       </w:r>
       <w:r>
         <w:rPr>
@@ -2342,7 +2459,7 @@
           <w:iCs w:val="0"/>
           <w:rtl w:val="0"/>
         </w:rPr>
-        <w:t xml:space="preserve"> nos dois braços, e cada unidade parte do que o agente construiu na anterior. O autor não escreve código no espaço de trabalho.</w:t>
+        <w:t xml:space="preserve"> nos dois braços, e cada unidade parte do que o agente construiu na anterior. Nenhum código do autor entra no espaço de trabalho.</w:t>
       </w:r>
     </w:p>
     <w:p>
@@ -2360,7 +2477,7 @@
           <w:iCs w:val="0"/>
           <w:rtl w:val="0"/>
         </w:rPr>
-        <w:t xml:space="preserve">A pontuação será a fração dos testes de aceitação aprovados. O autor escreverá os testes antes da execução, os manterá fora do espaço de trabalho e os rodará sobre uma cópia dele ao fim de cada unidade. Os testes escritos pelo agente não contam, e uma unidade conta como concluída quando todos os seus testes passam.</w:t>
+        <w:t xml:space="preserve">A pontuação será a fração dos testes de aceitação aprovados. O autor escreverá os testes antes da execução, fora do espaço de trabalho, e os rodará sobre uma cópia dele ao fim de cada unidade. Todos devem passar antes na referência, no marco da etapa. Os testes escritos pelo agente não contam, e uma unidade conta como concluída quando todos os seus testes passam.</w:t>
       </w:r>
     </w:p>
     <w:p>
@@ -2373,8 +2490,8 @@
       <w:r>
         <w:rPr>
           <w:b w:val="0"/>
-          <w:i w:val="0"/>
-          <w:bCs w:val="0"/>
+          <w:bCs w:val="0"/>
+          <w:i w:val="0"/>
           <w:iCs w:val="0"/>
           <w:rtl w:val="0"/>
         </w:rPr>
@@ -2383,9 +2500,9 @@
       <w:r>
         <w:rPr>
           <w:b w:val="0"/>
-          <w:i/>
-          <w:bCs w:val="0"/>
-          <w:iCs w:val="0"/>
+          <w:bCs w:val="0"/>
+          <w:i w:val="1"/>
+          <w:iCs w:val="1"/>
           <w:rtl w:val="0"/>
         </w:rPr>
         <w:t xml:space="preserve">gateway</w:t>
@@ -2393,12 +2510,17 @@
       <w:r>
         <w:rPr>
           <w:b w:val="0"/>
-          <w:i w:val="0"/>
-          <w:bCs w:val="0"/>
+          <w:bCs w:val="0"/>
+          <w:i w:val="0"/>
           <w:iCs w:val="0"/>
           <w:rtl w:val="0"/>
         </w:rPr>
         <w:t xml:space="preserve"> (Opencode, 2026b), com resultados relatados por nível. Se a ordenação dos braços inverter de um nível para o outro, a inversão será reportada como resultado.</w:t>
+      </w:r>
+      <w:r>
+        <w:rPr>
+          <w:rtl w:val="0"/>
+        </w:rPr>
       </w:r>
     </w:p>
     <w:p>
@@ -2412,6 +2534,8 @@
         <w:rPr>
           <w:b w:val="0"/>
           <w:i w:val="0"/>
+          <w:bCs w:val="0"/>
+          <w:iCs w:val="0"/>
           <w:rtl w:val="0"/>
         </w:rPr>
         <w:t xml:space="preserve">O </w:t>
@@ -2420,6 +2544,8 @@
         <w:rPr>
           <w:b w:val="0"/>
           <w:i/>
+          <w:bCs w:val="0"/>
+          <w:iCs w:val="0"/>
           <w:rtl w:val="0"/>
         </w:rPr>
         <w:t xml:space="preserve">proxy</w:t>
@@ -2428,14 +2554,58 @@
         <w:rPr>
           <w:b w:val="0"/>
           <w:i w:val="0"/>
-          <w:rtl w:val="0"/>
-        </w:rPr>
-        <w:t xml:space="preserve"> contará os tokens sobre os bytes transmitidos, com o mesmo tokenizador para os dois braços. As contagens do </w:t>
+          <w:bCs w:val="0"/>
+          <w:iCs w:val="0"/>
+          <w:rtl w:val="0"/>
+        </w:rPr>
+        <w:t xml:space="preserve"> guardará os tokens que o </w:t>
       </w:r>
       <w:r>
         <w:rPr>
           <w:b w:val="0"/>
           <w:i/>
+          <w:bCs w:val="0"/>
+          <w:iCs w:val="0"/>
+          <w:rtl w:val="0"/>
+        </w:rPr>
+        <w:t xml:space="preserve">gateway</w:t>
+      </w:r>
+      <w:r>
+        <w:rPr>
+          <w:b w:val="0"/>
+          <w:i w:val="0"/>
+          <w:bCs w:val="0"/>
+          <w:iCs w:val="0"/>
+          <w:rtl w:val="0"/>
+        </w:rPr>
+        <w:t xml:space="preserve"> informa em cada resposta, com o cache à parte, e separará em cada requisição a carga fixa (</w:t>
+      </w:r>
+      <w:r>
+        <w:rPr>
+          <w:b w:val="0"/>
+          <w:i/>
+          <w:bCs w:val="0"/>
+          <w:iCs w:val="0"/>
+          <w:rtl w:val="0"/>
+        </w:rPr>
+        <w:t xml:space="preserve">system prompt</w:t>
+      </w:r>
+      <w:r>
+        <w:rPr>
+          <w:b w:val="0"/>
+          <w:i w:val="0"/>
+          <w:bCs w:val="0"/>
+          <w:iCs w:val="0"/>
+          <w:rtl w:val="0"/>
+        </w:rPr>
+        <w:t xml:space="preserve"> e ferramentas) do resto da conversa, para H2. A contagem do </w:t>
+      </w:r>
+      <w:r>
+        <w:rPr>
+          <w:b w:val="0"/>
+          <w:i/>
+          <w:bCs w:val="0"/>
+          <w:iCs w:val="0"/>
           <w:rtl w:val="0"/>
         </w:rPr>
         <w:t xml:space="preserve">harness</w:t>
@@ -2444,25 +2614,11 @@
         <w:rPr>
           <w:b w:val="0"/>
           <w:i w:val="0"/>
-          <w:rtl w:val="0"/>
-        </w:rPr>
-        <w:t xml:space="preserve"> e do </w:t>
-      </w:r>
-      <w:r>
-        <w:rPr>
-          <w:b w:val="0"/>
-          <w:i/>
-          <w:rtl w:val="0"/>
-        </w:rPr>
-        <w:t xml:space="preserve">gateway</w:t>
-      </w:r>
-      <w:r>
-        <w:rPr>
-          <w:b w:val="0"/>
-          <w:i w:val="0"/>
-          <w:rtl w:val="0"/>
-        </w:rPr>
-        <w:t xml:space="preserve"> servem só para verificação cruzada.</w:t>
+          <w:bCs w:val="0"/>
+          <w:iCs w:val="0"/>
+          <w:rtl w:val="0"/>
+        </w:rPr>
+        <w:t xml:space="preserve"> serve só para verificação cruzada.</w:t>
       </w:r>
     </w:p>
     <w:p>
@@ -2475,8 +2631,8 @@
       <w:r>
         <w:rPr>
           <w:b w:val="0"/>
-          <w:i w:val="0"/>
-          <w:bCs w:val="0"/>
+          <w:bCs w:val="0"/>
+          <w:i w:val="0"/>
           <w:iCs w:val="0"/>
           <w:rtl w:val="0"/>
         </w:rPr>
@@ -2485,9 +2641,9 @@
       <w:r>
         <w:rPr>
           <w:b w:val="0"/>
-          <w:i/>
-          <w:bCs w:val="0"/>
-          <w:iCs w:val="0"/>
+          <w:bCs w:val="0"/>
+          <w:i w:val="1"/>
+          <w:iCs w:val="1"/>
           <w:rtl w:val="0"/>
         </w:rPr>
         <w:t xml:space="preserve">harness</w:t>
@@ -2495,12 +2651,17 @@
       <w:r>
         <w:rPr>
           <w:b w:val="0"/>
-          <w:i w:val="0"/>
-          <w:bCs w:val="0"/>
+          <w:bCs w:val="0"/>
+          <w:i w:val="0"/>
           <w:iCs w:val="0"/>
           <w:rtl w:val="0"/>
         </w:rPr>
         <w:t xml:space="preserve"> e apagaria a diferença sob teste.</w:t>
+      </w:r>
+      <w:r>
+        <w:rPr>
+          <w:rtl w:val="0"/>
+        </w:rPr>
       </w:r>
     </w:p>
     <w:p>
@@ -2514,12 +2675,17 @@
         <w:rPr>
           <w:rFonts w:ascii="Gungsuh" w:cs="Gungsuh" w:eastAsia="Gungsuh" w:hAnsi="Gungsuh"/>
           <w:b w:val="0"/>
-          <w:i w:val="0"/>
-          <w:bCs w:val="0"/>
+          <w:bCs w:val="0"/>
+          <w:i w:val="0"/>
           <w:iCs w:val="0"/>
           <w:rtl w:val="0"/>
         </w:rPr>
         <w:t xml:space="preserve">Cada combinação de braço e nível terá ao menos três construções completas válidas, relatadas em mediana e dispersão.</w:t>
+      </w:r>
+      <w:r>
+        <w:rPr>
+          <w:rtl w:val="0"/>
+        </w:rPr>
       </w:r>
     </w:p>
     <w:p>
@@ -2537,7 +2703,7 @@
           <w:iCs w:val="0"/>
           <w:rtl w:val="0"/>
         </w:rPr>
-        <w:t xml:space="preserve">A comparação usará o teste de Wilcoxon dos postos sinalizados, bilateral, α = 0,05, sobre tokens, fração de testes aprovados e Succ/Mtok, pareado por unidade porque a dificuldade da unidade é a maior fonte de variação (Miller, 2024). Para H2, os tokens de cada unidade serão divididos em carga fixa (Camada 1 vezes o número de passos) e conversa. As predições serão registradas antes da coleta.</w:t>
+        <w:t xml:space="preserve">A comparação usará o teste de Wilcoxon dos postos sinalizados, bilateral, α = 0,05, sobre tokens e Succ/Mtok, pareado por unidade porque a dificuldade da unidade é a maior fonte de variação (Miller, 2024). O resultado principal será a razão entre as medianas de tokens por construção dos braços. A fração de testes aprovados será relatada sem teste, pois um empate em 100% não deixa diferença a testar. As predições serão registradas antes da coleta.</w:t>
       </w:r>
     </w:p>
     <w:p>
@@ -2550,12 +2716,17 @@
       <w:r>
         <w:rPr>
           <w:b w:val="0"/>
-          <w:i w:val="0"/>
-          <w:bCs w:val="0"/>
+          <w:bCs w:val="0"/>
+          <w:i w:val="0"/>
           <w:iCs w:val="0"/>
           <w:rtl w:val="0"/>
         </w:rPr>
         <w:t xml:space="preserve">Unidade não concluída conta como resultado, com a fração de testes aprovada, e a construção segue. Medição não confiável, como a troca do modelo servido no meio da coleta, descarta a construção inteira.</w:t>
+      </w:r>
+      <w:r>
+        <w:rPr>
+          <w:rtl w:val="0"/>
+        </w:rPr>
       </w:r>
     </w:p>
     <w:p>
@@ -2612,7 +2783,7 @@
           <w:iCs w:val="0"/>
           <w:rtl w:val="0"/>
         </w:rPr>
-        <w:t xml:space="preserve"> depende do modelo, então as conclusões valem por nível. O produto é um único SaaS em uma única pilha. Cada braço carrega os próprios erros de uma unidade à seguinte, então as unidades não são independentes, embora o teste de Wilcoxon suponha que sejam; o valor-p será lido como indicativo, ao lado da diferença e da dispersão. Por fim, o nível gratuito do </w:t>
+        <w:t xml:space="preserve"> depende do modelo, então as conclusões valem por nível. O produto é um único SaaS, especificado a partir da solução do autor. Cada braço carrega os próprios erros de uma unidade à seguinte, então as unidades não são independentes, embora o teste de Wilcoxon suponha que sejam; o valor-p será lido como indicativo, ao lado da diferença e da dispersão. Por fim, o nível gratuito do </w:t>
       </w:r>
       <w:r>
         <w:rPr>
@@ -2773,7 +2944,9 @@
             <w:r>
               <w:rPr>
                 <w:b w:val="0"/>
+                <w:bCs w:val="0"/>
                 <w:i w:val="0"/>
+                <w:iCs w:val="0"/>
                 <w:sz w:val="22"/>
                 <w:szCs w:val="22"/>
                 <w:rtl w:val="0"/>
@@ -2783,7 +2956,9 @@
             <w:r>
               <w:rPr>
                 <w:b w:val="0"/>
-                <w:i/>
+                <w:bCs w:val="0"/>
+                <w:i w:val="1"/>
+                <w:iCs w:val="1"/>
                 <w:sz w:val="22"/>
                 <w:szCs w:val="22"/>
                 <w:rtl w:val="0"/>
@@ -2793,12 +2968,19 @@
             <w:r>
               <w:rPr>
                 <w:b w:val="0"/>
+                <w:bCs w:val="0"/>
                 <w:i w:val="0"/>
+                <w:iCs w:val="0"/>
                 <w:sz w:val="22"/>
                 <w:szCs w:val="22"/>
                 <w:rtl w:val="0"/>
               </w:rPr>
               <w:t xml:space="preserve">)</w:t>
+            </w:r>
+            <w:r>
+              <w:rPr>
+                <w:rtl w:val="0"/>
+              </w:rPr>
             </w:r>
           </w:p>
         </w:tc>
@@ -2841,8 +3023,8 @@
             <w:r>
               <w:rPr>
                 <w:b w:val="0"/>
-                <w:i/>
                 <w:bCs w:val="0"/>
+                <w:i w:val="1"/>
                 <w:iCs w:val="1"/>
                 <w:sz w:val="22"/>
                 <w:szCs w:val="22"/>
@@ -2853,14 +3035,19 @@
             <w:r>
               <w:rPr>
                 <w:b w:val="0"/>
+                <w:bCs w:val="0"/>
                 <w:i w:val="0"/>
-                <w:bCs w:val="0"/>
-                <w:iCs w:val="1"/>
+                <w:iCs w:val="0"/>
                 <w:sz w:val="22"/>
                 <w:szCs w:val="22"/>
                 <w:rtl w:val="0"/>
               </w:rPr>
               <w:t xml:space="preserve"> e ferramentas de código aberto</w:t>
+            </w:r>
+            <w:r>
+              <w:rPr>
+                <w:rtl w:val="0"/>
+              </w:rPr>
             </w:r>
           </w:p>
         </w:tc>
@@ -2906,7 +3093,7 @@
                 <w:szCs w:val="22"/>
                 <w:rtl w:val="0"/>
               </w:rPr>
-              <w:t xml:space="preserve">Máquinas (estação pessoal NixOS e estação pessoal Windows)</w:t>
+              <w:t xml:space="preserve">Hardware (PC pessoal, NixOS)</w:t>
             </w:r>
             <w:r>
               <w:rPr>
@@ -2925,16 +3112,13 @@
             </w:pPr>
             <w:r>
               <w:rPr>
+                <w:b w:val="0"/>
+                <w:i w:val="0"/>
                 <w:sz w:val="22"/>
                 <w:szCs w:val="22"/>
                 <w:rtl w:val="0"/>
               </w:rPr>
-              <w:t xml:space="preserve">R$ 0,00 (já disponíveis)</w:t>
-            </w:r>
-            <w:r>
-              <w:rPr>
-                <w:rtl w:val="0"/>
-              </w:rPr>
+              <w:t xml:space="preserve">R$ 0,00</w:t>
             </w:r>
           </w:p>
         </w:tc>
@@ -3077,15 +3261,13 @@
         <w:tblLook w:val="0400"/>
       </w:tblPr>
       <w:tblGrid>
-        <w:gridCol w:w="4191"/>
-        <w:gridCol w:w="1220"/>
+        <w:gridCol w:w="5411"/>
         <w:gridCol w:w="1220"/>
         <w:gridCol w:w="1220"/>
         <w:gridCol w:w="1220"/>
         <w:tblGridChange w:id="0">
           <w:tblGrid>
-            <w:gridCol w:w="4191"/>
-            <w:gridCol w:w="1220"/>
+            <w:gridCol w:w="5411"/>
             <w:gridCol w:w="1220"/>
             <w:gridCol w:w="1220"/>
             <w:gridCol w:w="1220"/>
@@ -3196,6 +3378,34 @@
             </w:r>
           </w:p>
         </w:tc>
+      </w:tr>
+      <w:tr>
+        <w:trPr>
+          <w:cantSplit w:val="0"/>
+          <w:tblHeader w:val="0"/>
+        </w:trPr>
+        <w:tc>
+          <w:tcPr/>
+          <w:p>
+            <w:pPr>
+              <w:spacing w:after="20" w:before="20" w:lineRule="auto"/>
+              <w:rPr/>
+            </w:pPr>
+            <w:r>
+              <w:rPr>
+                <w:sz w:val="18"/>
+                <w:szCs w:val="18"/>
+                <w:rtl w:val="0"/>
+              </w:rPr>
+              <w:t xml:space="preserve">LEITURA E LEVANTAMENTO BIBLIOGRÁFICO</w:t>
+            </w:r>
+            <w:r>
+              <w:rPr>
+                <w:rtl w:val="0"/>
+              </w:rPr>
+            </w:r>
+          </w:p>
+        </w:tc>
         <w:tc>
           <w:tcPr/>
           <w:p>
@@ -3206,14 +3416,50 @@
             </w:pPr>
             <w:r>
               <w:rPr>
-                <w:b w:val="1"/>
-                <w:bCs w:val="1"/>
                 <w:sz w:val="18"/>
                 <w:szCs w:val="18"/>
                 <w:rtl w:val="0"/>
               </w:rPr>
-              <w:t xml:space="preserve">NOVEMBRO</w:t>
-            </w:r>
+              <w:t xml:space="preserve">X</w:t>
+            </w:r>
+            <w:r>
+              <w:rPr>
+                <w:rtl w:val="0"/>
+              </w:rPr>
+            </w:r>
+          </w:p>
+        </w:tc>
+        <w:tc>
+          <w:tcPr/>
+          <w:p>
+            <w:pPr>
+              <w:spacing w:after="20" w:before="20" w:lineRule="auto"/>
+              <w:jc w:val="center"/>
+              <w:rPr/>
+            </w:pPr>
+            <w:r>
+              <w:rPr>
+                <w:sz w:val="18"/>
+                <w:szCs w:val="18"/>
+                <w:rtl w:val="0"/>
+              </w:rPr>
+              <w:t xml:space="preserve">X</w:t>
+            </w:r>
+            <w:r>
+              <w:rPr>
+                <w:rtl w:val="0"/>
+              </w:rPr>
+            </w:r>
+          </w:p>
+        </w:tc>
+        <w:tc>
+          <w:tcPr/>
+          <w:p>
+            <w:pPr>
+              <w:spacing w:after="20" w:before="20" w:lineRule="auto"/>
+              <w:jc w:val="center"/>
+              <w:rPr/>
+            </w:pPr>
             <w:r>
               <w:rPr>
                 <w:rtl w:val="0"/>
@@ -3236,11 +3482,15 @@
             </w:pPr>
             <w:r>
               <w:rPr>
+                <w:b w:val="0"/>
+                <w:bCs w:val="0"/>
+                <w:i w:val="0"/>
+                <w:iCs w:val="0"/>
                 <w:sz w:val="18"/>
                 <w:szCs w:val="18"/>
                 <w:rtl w:val="0"/>
               </w:rPr>
-              <w:t xml:space="preserve">LEITURA E LEVANTAMENTO BIBLIOGRÁFICO</w:t>
+              <w:t xml:space="preserve">DEFINIÇÃO DO TEMA E DAS HIPÓTESES</w:t>
             </w:r>
             <w:r>
               <w:rPr>
@@ -3288,21 +3538,6 @@
               </w:rPr>
               <w:t xml:space="preserve">X</w:t>
             </w:r>
-            <w:r>
-              <w:rPr>
-                <w:rtl w:val="0"/>
-              </w:rPr>
-            </w:r>
-          </w:p>
-        </w:tc>
-        <w:tc>
-          <w:tcPr/>
-          <w:p>
-            <w:pPr>
-              <w:spacing w:after="20" w:before="20" w:lineRule="auto"/>
-              <w:jc w:val="center"/>
-              <w:rPr/>
-            </w:pPr>
             <w:r>
               <w:rPr>
                 <w:rtl w:val="0"/>
@@ -3342,11 +3577,13 @@
               <w:rPr>
                 <w:b w:val="0"/>
                 <w:i w:val="0"/>
+                <w:bCs w:val="0"/>
+                <w:iCs w:val="0"/>
                 <w:sz w:val="18"/>
                 <w:szCs w:val="18"/>
                 <w:rtl w:val="0"/>
               </w:rPr>
-              <w:t xml:space="preserve">DEFINIÇÃO DO TEMA E DAS HIPÓTESES</w:t>
+              <w:t xml:space="preserve">FINN DE REFERÊNCIA, PROXY E TESTES</w:t>
             </w:r>
           </w:p>
         </w:tc>
@@ -3360,14 +3597,6 @@
             </w:pPr>
             <w:r>
               <w:rPr>
-                <w:sz w:val="18"/>
-                <w:szCs w:val="18"/>
-                <w:rtl w:val="0"/>
-              </w:rPr>
-              <w:t xml:space="preserve">X</w:t>
-            </w:r>
-            <w:r>
-              <w:rPr>
                 <w:rtl w:val="0"/>
               </w:rPr>
             </w:r>
@@ -3383,14 +3612,6 @@
             </w:pPr>
             <w:r>
               <w:rPr>
-                <w:sz w:val="18"/>
-                <w:szCs w:val="18"/>
-                <w:rtl w:val="0"/>
-              </w:rPr>
-              <w:t xml:space="preserve">X</w:t>
-            </w:r>
-            <w:r>
-              <w:rPr>
                 <w:rtl w:val="0"/>
               </w:rPr>
             </w:r>
@@ -3406,19 +3627,12 @@
             </w:pPr>
             <w:r>
               <w:rPr>
-                <w:rtl w:val="0"/>
-              </w:rPr>
-            </w:r>
-          </w:p>
-        </w:tc>
-        <w:tc>
-          <w:tcPr/>
-          <w:p>
-            <w:pPr>
-              <w:spacing w:after="20" w:before="20" w:lineRule="auto"/>
-              <w:jc w:val="center"/>
-              <w:rPr/>
-            </w:pPr>
+                <w:sz w:val="18"/>
+                <w:szCs w:val="18"/>
+                <w:rtl w:val="0"/>
+              </w:rPr>
+              <w:t xml:space="preserve">X</w:t>
+            </w:r>
             <w:r>
               <w:rPr>
                 <w:rtl w:val="0"/>
@@ -3441,15 +3655,16 @@
             </w:pPr>
             <w:r>
               <w:rPr>
-                <w:b w:val="0"/>
-                <w:i w:val="0"/>
-                <w:bCs w:val="0"/>
-                <w:iCs w:val="0"/>
                 <w:sz w:val="18"/>
                 <w:szCs w:val="18"/>
                 <w:rtl w:val="0"/>
               </w:rPr>
-              <w:t xml:space="preserve">CONSTRUÇÃO DO PROXY E DOS TESTES</w:t>
+              <w:t xml:space="preserve">ESCREVENDO INTRODUÇÃO</w:t>
+            </w:r>
+            <w:r>
+              <w:rPr>
+                <w:rtl w:val="0"/>
+              </w:rPr>
             </w:r>
           </w:p>
         </w:tc>
@@ -3463,8 +3678,11 @@
             </w:pPr>
             <w:r>
               <w:rPr>
-                <w:rtl w:val="0"/>
-              </w:rPr>
+                <w:sz w:val="18"/>
+                <w:szCs w:val="18"/>
+                <w:rtl w:val="0"/>
+              </w:rPr>
+              <w:t xml:space="preserve">X</w:t>
             </w:r>
           </w:p>
         </w:tc>
@@ -3478,8 +3696,11 @@
             </w:pPr>
             <w:r>
               <w:rPr>
-                <w:rtl w:val="0"/>
-              </w:rPr>
+                <w:sz w:val="18"/>
+                <w:szCs w:val="18"/>
+                <w:rtl w:val="0"/>
+              </w:rPr>
+              <w:t xml:space="preserve">X</w:t>
             </w:r>
           </w:p>
         </w:tc>
@@ -3491,37 +3712,6 @@
               <w:jc w:val="center"/>
               <w:rPr/>
             </w:pPr>
-            <w:r>
-              <w:rPr>
-                <w:sz w:val="18"/>
-                <w:szCs w:val="18"/>
-                <w:rtl w:val="0"/>
-              </w:rPr>
-              <w:t xml:space="preserve">X</w:t>
-            </w:r>
-            <w:r>
-              <w:rPr>
-                <w:rtl w:val="0"/>
-              </w:rPr>
-            </w:r>
-          </w:p>
-        </w:tc>
-        <w:tc>
-          <w:tcPr/>
-          <w:p>
-            <w:pPr>
-              <w:spacing w:after="20" w:before="20" w:lineRule="auto"/>
-              <w:jc w:val="center"/>
-              <w:rPr/>
-            </w:pPr>
-            <w:r>
-              <w:rPr>
-                <w:sz w:val="18"/>
-                <w:szCs w:val="18"/>
-                <w:rtl w:val="0"/>
-              </w:rPr>
-              <w:t xml:space="preserve">X</w:t>
-            </w:r>
             <w:r>
               <w:rPr>
                 <w:rtl w:val="0"/>
@@ -3548,7 +3738,7 @@
                 <w:szCs w:val="18"/>
                 <w:rtl w:val="0"/>
               </w:rPr>
-              <w:t xml:space="preserve">ESCREVENDO INTRODUÇÃO</w:t>
+              <w:t xml:space="preserve">ESCREVENDO REFERENCIAL TEÓRICO</w:t>
             </w:r>
             <w:r>
               <w:rPr>
@@ -3590,21 +3780,6 @@
                 <w:rtl w:val="0"/>
               </w:rPr>
               <w:t xml:space="preserve">X</w:t>
-            </w:r>
-          </w:p>
-        </w:tc>
-        <w:tc>
-          <w:tcPr/>
-          <w:p>
-            <w:pPr>
-              <w:spacing w:after="20" w:before="20" w:lineRule="auto"/>
-              <w:jc w:val="center"/>
-              <w:rPr/>
-            </w:pPr>
-            <w:r>
-              <w:rPr>
-                <w:rtl w:val="0"/>
-              </w:rPr>
             </w:r>
           </w:p>
         </w:tc>
@@ -3642,7 +3817,7 @@
                 <w:szCs w:val="18"/>
                 <w:rtl w:val="0"/>
               </w:rPr>
-              <w:t xml:space="preserve">ESCREVENDO REFERENCIAL TEÓRICO</w:t>
+              <w:t xml:space="preserve">ESCREVENDO MATERIAL E MÉTODO</w:t>
             </w:r>
             <w:r>
               <w:rPr>
@@ -3684,21 +3859,6 @@
                 <w:rtl w:val="0"/>
               </w:rPr>
               <w:t xml:space="preserve">X</w:t>
-            </w:r>
-          </w:p>
-        </w:tc>
-        <w:tc>
-          <w:tcPr/>
-          <w:p>
-            <w:pPr>
-              <w:spacing w:after="20" w:before="20" w:lineRule="auto"/>
-              <w:jc w:val="center"/>
-              <w:rPr/>
-            </w:pPr>
-            <w:r>
-              <w:rPr>
-                <w:rtl w:val="0"/>
-              </w:rPr>
             </w:r>
           </w:p>
         </w:tc>
@@ -3736,7 +3896,7 @@
                 <w:szCs w:val="18"/>
                 <w:rtl w:val="0"/>
               </w:rPr>
-              <w:t xml:space="preserve">ESCREVENDO MATERIAL E MÉTODO</w:t>
+              <w:t xml:space="preserve">EXECUÇÃO DA MATRIZ DE EXPERIMENTOS</w:t>
             </w:r>
             <w:r>
               <w:rPr>
@@ -3755,11 +3915,8 @@
             </w:pPr>
             <w:r>
               <w:rPr>
-                <w:sz w:val="18"/>
-                <w:szCs w:val="18"/>
-                <w:rtl w:val="0"/>
-              </w:rPr>
-              <w:t xml:space="preserve">X</w:t>
+                <w:rtl w:val="0"/>
+              </w:rPr>
             </w:r>
           </w:p>
         </w:tc>
@@ -3773,11 +3930,8 @@
             </w:pPr>
             <w:r>
               <w:rPr>
-                <w:sz w:val="18"/>
-                <w:szCs w:val="18"/>
-                <w:rtl w:val="0"/>
-              </w:rPr>
-              <w:t xml:space="preserve">X</w:t>
+                <w:rtl w:val="0"/>
+              </w:rPr>
             </w:r>
           </w:p>
         </w:tc>
@@ -3791,19 +3945,12 @@
             </w:pPr>
             <w:r>
               <w:rPr>
-                <w:rtl w:val="0"/>
-              </w:rPr>
-            </w:r>
-          </w:p>
-        </w:tc>
-        <w:tc>
-          <w:tcPr/>
-          <w:p>
-            <w:pPr>
-              <w:spacing w:after="20" w:before="20" w:lineRule="auto"/>
-              <w:jc w:val="center"/>
-              <w:rPr/>
-            </w:pPr>
+                <w:sz w:val="18"/>
+                <w:szCs w:val="18"/>
+                <w:rtl w:val="0"/>
+              </w:rPr>
+              <w:t xml:space="preserve">X</w:t>
+            </w:r>
             <w:r>
               <w:rPr>
                 <w:rtl w:val="0"/>
@@ -3830,7 +3977,7 @@
                 <w:szCs w:val="18"/>
                 <w:rtl w:val="0"/>
               </w:rPr>
-              <w:t xml:space="preserve">EXECUÇÃO DA MATRIZ DE EXPERIMENTOS</w:t>
+              <w:t xml:space="preserve">ANÁLISE DOS RESULTADOS</w:t>
             </w:r>
             <w:r>
               <w:rPr>
@@ -3885,21 +4032,6 @@
               </w:rPr>
               <w:t xml:space="preserve">X</w:t>
             </w:r>
-            <w:r>
-              <w:rPr>
-                <w:rtl w:val="0"/>
-              </w:rPr>
-            </w:r>
-          </w:p>
-        </w:tc>
-        <w:tc>
-          <w:tcPr/>
-          <w:p>
-            <w:pPr>
-              <w:spacing w:after="20" w:before="20" w:lineRule="auto"/>
-              <w:jc w:val="center"/>
-              <w:rPr/>
-            </w:pPr>
             <w:r>
               <w:rPr>
                 <w:rtl w:val="0"/>
@@ -3926,7 +4058,7 @@
                 <w:szCs w:val="18"/>
                 <w:rtl w:val="0"/>
               </w:rPr>
-              <w:t xml:space="preserve">ANÁLISE DOS RESULTADOS</w:t>
+              <w:t xml:space="preserve">ELABORANDO AS REFERÊNCIAS</w:t>
             </w:r>
             <w:r>
               <w:rPr>
@@ -3945,8 +4077,11 @@
             </w:pPr>
             <w:r>
               <w:rPr>
-                <w:rtl w:val="0"/>
-              </w:rPr>
+                <w:sz w:val="18"/>
+                <w:szCs w:val="18"/>
+                <w:rtl w:val="0"/>
+              </w:rPr>
+              <w:t xml:space="preserve">X</w:t>
             </w:r>
           </w:p>
         </w:tc>
@@ -3960,31 +4095,11 @@
             </w:pPr>
             <w:r>
               <w:rPr>
-                <w:rtl w:val="0"/>
-              </w:rPr>
-            </w:r>
-          </w:p>
-        </w:tc>
-        <w:tc>
-          <w:tcPr/>
-          <w:p>
-            <w:pPr>
-              <w:spacing w:after="20" w:before="20" w:lineRule="auto"/>
-              <w:jc w:val="center"/>
-              <w:rPr/>
-            </w:pPr>
-            <w:r>
-              <w:rPr>
                 <w:sz w:val="18"/>
                 <w:szCs w:val="18"/>
                 <w:rtl w:val="0"/>
               </w:rPr>
               <w:t xml:space="preserve">X</w:t>
-            </w:r>
-            <w:r>
-              <w:rPr>
-                <w:rtl w:val="0"/>
-              </w:rPr>
             </w:r>
           </w:p>
         </w:tc>
@@ -4018,11 +4133,15 @@
             </w:pPr>
             <w:r>
               <w:rPr>
+                <w:b w:val="0"/>
+                <w:bCs w:val="0"/>
+                <w:i w:val="0"/>
+                <w:iCs w:val="0"/>
                 <w:sz w:val="18"/>
                 <w:szCs w:val="18"/>
                 <w:rtl w:val="0"/>
               </w:rPr>
-              <w:t xml:space="preserve">ELABORANDO AS REFERÊNCIAS</w:t>
+              <w:t xml:space="preserve">REVISÃO FINAL E APRESENTAÇÃO</w:t>
             </w:r>
             <w:r>
               <w:rPr>
@@ -4041,11 +4160,8 @@
             </w:pPr>
             <w:r>
               <w:rPr>
-                <w:sz w:val="18"/>
-                <w:szCs w:val="18"/>
-                <w:rtl w:val="0"/>
-              </w:rPr>
-              <w:t xml:space="preserve">X</w:t>
+                <w:rtl w:val="0"/>
+              </w:rPr>
             </w:r>
           </w:p>
         </w:tc>
@@ -4065,6 +4181,11 @@
               </w:rPr>
               <w:t xml:space="preserve">X</w:t>
             </w:r>
+            <w:r>
+              <w:rPr>
+                <w:rtl w:val="0"/>
+              </w:rPr>
+            </w:r>
           </w:p>
         </w:tc>
         <w:tc>
@@ -4082,114 +4203,6 @@
             </w:r>
           </w:p>
         </w:tc>
-        <w:tc>
-          <w:tcPr/>
-          <w:p>
-            <w:pPr>
-              <w:spacing w:after="20" w:before="20" w:lineRule="auto"/>
-              <w:jc w:val="center"/>
-              <w:rPr/>
-            </w:pPr>
-            <w:r>
-              <w:rPr>
-                <w:rtl w:val="0"/>
-              </w:rPr>
-            </w:r>
-          </w:p>
-        </w:tc>
-      </w:tr>
-      <w:tr>
-        <w:trPr>
-          <w:cantSplit w:val="0"/>
-          <w:tblHeader w:val="0"/>
-        </w:trPr>
-        <w:tc>
-          <w:tcPr/>
-          <w:p>
-            <w:pPr>
-              <w:spacing w:after="20" w:before="20" w:lineRule="auto"/>
-              <w:rPr/>
-            </w:pPr>
-            <w:r>
-              <w:rPr>
-                <w:b w:val="0"/>
-                <w:i w:val="0"/>
-                <w:sz w:val="18"/>
-                <w:szCs w:val="18"/>
-                <w:rtl w:val="0"/>
-              </w:rPr>
-              <w:t xml:space="preserve">REVISÃO FINAL E APRESENTAÇÃO</w:t>
-            </w:r>
-          </w:p>
-        </w:tc>
-        <w:tc>
-          <w:tcPr/>
-          <w:p>
-            <w:pPr>
-              <w:spacing w:after="20" w:before="20" w:lineRule="auto"/>
-              <w:jc w:val="center"/>
-              <w:rPr/>
-            </w:pPr>
-            <w:r>
-              <w:rPr>
-                <w:rtl w:val="0"/>
-              </w:rPr>
-            </w:r>
-          </w:p>
-        </w:tc>
-        <w:tc>
-          <w:tcPr/>
-          <w:p>
-            <w:pPr>
-              <w:spacing w:after="20" w:before="20" w:lineRule="auto"/>
-              <w:jc w:val="center"/>
-              <w:rPr/>
-            </w:pPr>
-            <w:r>
-              <w:rPr>
-                <w:sz w:val="18"/>
-                <w:szCs w:val="18"/>
-                <w:rtl w:val="0"/>
-              </w:rPr>
-              <w:t xml:space="preserve">X</w:t>
-            </w:r>
-            <w:r>
-              <w:rPr>
-                <w:rtl w:val="0"/>
-              </w:rPr>
-            </w:r>
-          </w:p>
-        </w:tc>
-        <w:tc>
-          <w:tcPr/>
-          <w:p>
-            <w:pPr>
-              <w:spacing w:after="20" w:before="20" w:lineRule="auto"/>
-              <w:jc w:val="center"/>
-              <w:rPr/>
-            </w:pPr>
-            <w:r>
-              <w:rPr>
-                <w:rtl w:val="0"/>
-              </w:rPr>
-            </w:r>
-          </w:p>
-        </w:tc>
-        <w:tc>
-          <w:tcPr/>
-          <w:p>
-            <w:pPr>
-              <w:spacing w:after="20" w:before="20" w:lineRule="auto"/>
-              <w:jc w:val="center"/>
-              <w:rPr/>
-            </w:pPr>
-            <w:r>
-              <w:rPr>
-                <w:rtl w:val="0"/>
-              </w:rPr>
-            </w:r>
-          </w:p>
-        </w:tc>
       </w:tr>
     </w:tbl>
     <w:p>
@@ -4240,38 +4253,23 @@
       </w:pPr>
       <w:r>
         <w:rPr>
-          <w:b w:val="0"/>
-          <w:bCs w:val="0"/>
-          <w:i w:val="0"/>
-          <w:iCs w:val="0"/>
-          <w:rtl w:val="0"/>
-        </w:rPr>
-        <w:t xml:space="preserve">BRASIL. Conselho Nacional de Desenvolvimento Científico e Tecnológico. </w:t>
+          <w:rtl w:val="0"/>
+        </w:rPr>
+        <w:t xml:space="preserve">EARENDIL. </w:t>
       </w:r>
       <w:r>
         <w:rPr>
           <w:b w:val="1"/>
           <w:bCs w:val="1"/>
-          <w:i w:val="0"/>
-          <w:iCs w:val="0"/>
-          <w:rtl w:val="0"/>
-        </w:rPr>
-        <w:t xml:space="preserve">Portaria CNPq nº 2.664, de 6 de março de 2026</w:t>
-      </w:r>
-      <w:r>
-        <w:rPr>
-          <w:b w:val="0"/>
-          <w:bCs w:val="0"/>
-          <w:i w:val="0"/>
-          <w:iCs w:val="0"/>
-          <w:rtl w:val="0"/>
-        </w:rPr>
-        <w:t xml:space="preserve">. Institui a Política de Integridade na Atividade Científica do CNPq. Diário Oficial da União: seção 1, Brasília, DF, p. 4, 11 mar. 2026. Disponível em: http://memoria2.cnpq.br/web/guest/view/-/journal_content/56_INSTANCE_0oED/10157/23142775. Acesso em: 11 set. 2026.</w:t>
-      </w:r>
-      <w:r>
-        <w:rPr>
-          <w:rtl w:val="0"/>
-        </w:rPr>
+          <w:rtl w:val="0"/>
+        </w:rPr>
+        <w:t xml:space="preserve">Pi, minimal and performant</w:t>
+      </w:r>
+      <w:r>
+        <w:rPr>
+          <w:rtl w:val="0"/>
+        </w:rPr>
+        <w:t xml:space="preserve">. 2026. Publicação de blogue institucional. Disponível em: https://earendil.com/posts/pi-autoresearch-and-databricks/. Acesso em: 28 ago. 2026.</w:t>
       </w:r>
     </w:p>
     <w:p>
@@ -4281,23 +4279,38 @@
       </w:pPr>
       <w:r>
         <w:rPr>
-          <w:rtl w:val="0"/>
-        </w:rPr>
-        <w:t xml:space="preserve">EARENDIL. </w:t>
+          <w:b w:val="0"/>
+          <w:bCs w:val="0"/>
+          <w:i w:val="0"/>
+          <w:iCs w:val="0"/>
+          <w:rtl w:val="0"/>
+        </w:rPr>
+        <w:t xml:space="preserve">KARPATHY, Andrej. </w:t>
       </w:r>
       <w:r>
         <w:rPr>
           <w:b w:val="1"/>
           <w:bCs w:val="1"/>
-          <w:rtl w:val="0"/>
-        </w:rPr>
-        <w:t xml:space="preserve">Pi, minimal and performant</w:t>
-      </w:r>
-      <w:r>
-        <w:rPr>
-          <w:rtl w:val="0"/>
-        </w:rPr>
-        <w:t xml:space="preserve">. 2026. Publicação de blogue institucional. Disponível em: https://earendil.com/posts/pi-autoresearch-and-databricks/. Acesso em: 28 ago. 2026.</w:t>
+          <w:i w:val="0"/>
+          <w:iCs w:val="0"/>
+          <w:rtl w:val="0"/>
+        </w:rPr>
+        <w:t xml:space="preserve">LLM Wiki</w:t>
+      </w:r>
+      <w:r>
+        <w:rPr>
+          <w:b w:val="0"/>
+          <w:bCs w:val="0"/>
+          <w:i w:val="0"/>
+          <w:iCs w:val="0"/>
+          <w:rtl w:val="0"/>
+        </w:rPr>
+        <w:t xml:space="preserve">: a pattern for building personal knowledge bases using LLMs. 2026. Gist (GitHub). Disponível em: https://gist.github.com/karpathy/442a6bf555914893e9891c11519de94f. Acesso em: 14 set. 2026.</w:t>
+      </w:r>
+      <w:r>
+        <w:rPr>
+          <w:rtl w:val="0"/>
+        </w:rPr>
       </w:r>
     </w:p>
     <w:p>
@@ -4308,43 +4321,9 @@
       <w:r>
         <w:rPr>
           <w:b w:val="0"/>
-          <w:i w:val="0"/>
-          <w:bCs w:val="0"/>
-          <w:iCs w:val="0"/>
-          <w:rtl w:val="0"/>
-        </w:rPr>
-        <w:t xml:space="preserve">KARPATHY, Andrej. </w:t>
-      </w:r>
-      <w:r>
-        <w:rPr>
-          <w:b/>
-          <w:i w:val="0"/>
-          <w:bCs w:val="0"/>
-          <w:iCs w:val="0"/>
-          <w:rtl w:val="0"/>
-        </w:rPr>
-        <w:t xml:space="preserve">LLM Wiki</w:t>
-      </w:r>
-      <w:r>
-        <w:rPr>
-          <w:b w:val="0"/>
-          <w:i w:val="0"/>
-          <w:bCs w:val="0"/>
-          <w:iCs w:val="0"/>
-          <w:rtl w:val="0"/>
-        </w:rPr>
-        <w:t xml:space="preserve">: a pattern for building personal knowledge bases using LLMs. 2026. Gist (GitHub). Disponível em: https://gist.github.com/karpathy/442a6bf555914893e9891c11519de94f. Acesso em: 14 set. 2026.</w:t>
-      </w:r>
-    </w:p>
-    <w:p>
-      <w:pPr>
-        <w:spacing w:after="240" w:line="240" w:lineRule="auto"/>
-        <w:rPr/>
-      </w:pPr>
-      <w:r>
-        <w:rPr>
-          <w:b w:val="0"/>
-          <w:i w:val="0"/>
+          <w:bCs w:val="0"/>
+          <w:i w:val="0"/>
+          <w:iCs w:val="0"/>
           <w:rtl w:val="0"/>
         </w:rPr>
         <w:t xml:space="preserve">LIN, Jiahang </w:t>
@@ -4352,7 +4331,9 @@
       <w:r>
         <w:rPr>
           <w:b w:val="0"/>
-          <w:i/>
+          <w:bCs w:val="0"/>
+          <w:i w:val="1"/>
+          <w:iCs w:val="1"/>
           <w:rtl w:val="0"/>
         </w:rPr>
         <w:t xml:space="preserve">et al.</w:t>
@@ -4360,120 +4341,12 @@
       <w:r>
         <w:rPr>
           <w:b w:val="0"/>
-          <w:i w:val="0"/>
+          <w:bCs w:val="0"/>
+          <w:i w:val="0"/>
+          <w:iCs w:val="0"/>
           <w:rtl w:val="0"/>
         </w:rPr>
         <w:t xml:space="preserve"> </w:t>
-      </w:r>
-      <w:r>
-        <w:rPr>
-          <w:b/>
-          <w:i w:val="0"/>
-          <w:rtl w:val="0"/>
-        </w:rPr>
-        <w:t xml:space="preserve">Agentic harness engineering</w:t>
-      </w:r>
-      <w:r>
-        <w:rPr>
-          <w:b w:val="0"/>
-          <w:i w:val="0"/>
-          <w:rtl w:val="0"/>
-        </w:rPr>
-        <w:t xml:space="preserve">: observability-driven automatic evolution of coding-agent harnesses. arXiv:2604.25850, 2026. </w:t>
-      </w:r>
-      <w:r>
-        <w:rPr>
-          <w:b w:val="0"/>
-          <w:i/>
-          <w:rtl w:val="0"/>
-        </w:rPr>
-        <w:t xml:space="preserve">Preprint</w:t>
-      </w:r>
-      <w:r>
-        <w:rPr>
-          <w:b w:val="0"/>
-          <w:i w:val="0"/>
-          <w:rtl w:val="0"/>
-        </w:rPr>
-        <w:t xml:space="preserve">, não revisado por pares. Disponível em: https://arxiv.org/abs/2604.25850. Acesso em: 28 ago. 2026.</w:t>
-      </w:r>
-    </w:p>
-    <w:p>
-      <w:pPr>
-        <w:spacing w:after="240" w:line="240" w:lineRule="auto"/>
-        <w:rPr/>
-      </w:pPr>
-      <w:r>
-        <w:rPr>
-          <w:b w:val="0"/>
-          <w:i w:val="0"/>
-          <w:rtl w:val="0"/>
-        </w:rPr>
-        <w:t xml:space="preserve">LIU, Haozhe </w:t>
-      </w:r>
-      <w:r>
-        <w:rPr>
-          <w:b w:val="0"/>
-          <w:i/>
-          <w:rtl w:val="0"/>
-        </w:rPr>
-        <w:t xml:space="preserve">et al.</w:t>
-      </w:r>
-      <w:r>
-        <w:rPr>
-          <w:b w:val="0"/>
-          <w:i w:val="0"/>
-          <w:rtl w:val="0"/>
-        </w:rPr>
-        <w:t xml:space="preserve"> </w:t>
-      </w:r>
-      <w:r>
-        <w:rPr>
-          <w:b/>
-          <w:i w:val="0"/>
-          <w:rtl w:val="0"/>
-        </w:rPr>
-        <w:t xml:space="preserve">SoL-Pi</w:t>
-      </w:r>
-      <w:r>
-        <w:rPr>
-          <w:b w:val="0"/>
-          <w:i w:val="0"/>
-          <w:rtl w:val="0"/>
-        </w:rPr>
-        <w:t xml:space="preserve">: recursively scaling auto-research loops for efficient agent harness. arXiv:2609.20519, 2026. </w:t>
-      </w:r>
-      <w:r>
-        <w:rPr>
-          <w:b w:val="0"/>
-          <w:i/>
-          <w:rtl w:val="0"/>
-        </w:rPr>
-        <w:t xml:space="preserve">Preprint</w:t>
-      </w:r>
-      <w:r>
-        <w:rPr>
-          <w:b w:val="0"/>
-          <w:i w:val="0"/>
-          <w:rtl w:val="0"/>
-        </w:rPr>
-        <w:t xml:space="preserve">, não revisado por pares. Disponível em: https://arxiv.org/abs/2609.20519. Acesso em: 23 set. 2026.</w:t>
-      </w:r>
-    </w:p>
-    <w:p>
-      <w:pPr>
-        <w:spacing w:after="240" w:line="240" w:lineRule="auto"/>
-        <w:rPr/>
-      </w:pPr>
-      <w:r>
-        <w:rPr>
-          <w:b w:val="0"/>
-          <w:bCs w:val="0"/>
-          <w:i w:val="0"/>
-          <w:iCs w:val="0"/>
-          <w:rtl w:val="0"/>
-        </w:rPr>
-        <w:t xml:space="preserve">MILLER, Evan. </w:t>
       </w:r>
       <w:r>
         <w:rPr>
@@ -4483,17 +4356,17 @@
           <w:iCs w:val="0"/>
           <w:rtl w:val="0"/>
         </w:rPr>
-        <w:t xml:space="preserve">Adding error bars to evals</w:t>
-      </w:r>
-      <w:r>
-        <w:rPr>
-          <w:b w:val="0"/>
-          <w:bCs w:val="0"/>
-          <w:i w:val="0"/>
-          <w:iCs w:val="0"/>
-          <w:rtl w:val="0"/>
-        </w:rPr>
-        <w:t xml:space="preserve">: a statistical approach to language model evaluations. arXiv:2411.00640, 2024. </w:t>
+        <w:t xml:space="preserve">Agentic harness engineering</w:t>
+      </w:r>
+      <w:r>
+        <w:rPr>
+          <w:b w:val="0"/>
+          <w:bCs w:val="0"/>
+          <w:i w:val="0"/>
+          <w:iCs w:val="0"/>
+          <w:rtl w:val="0"/>
+        </w:rPr>
+        <w:t xml:space="preserve">: observability-driven automatic evolution of coding-agent harnesses. arXiv:2604.25850, 2026. </w:t>
       </w:r>
       <w:r>
         <w:rPr>
@@ -4513,7 +4386,7 @@
           <w:iCs w:val="0"/>
           <w:rtl w:val="0"/>
         </w:rPr>
-        <w:t xml:space="preserve">, não revisado por pares. Disponível em: https://arxiv.org/abs/2411.00640. Acesso em: 28 ago. 2026.</w:t>
+        <w:t xml:space="preserve">, não revisado por pares. Disponível em: https://arxiv.org/abs/2604.25850. Acesso em: 28 ago. 2026.</w:t>
       </w:r>
       <w:r>
         <w:rPr>
@@ -4528,12 +4401,18 @@
       </w:pPr>
       <w:r>
         <w:rPr>
-          <w:rtl w:val="0"/>
-        </w:rPr>
-        <w:t xml:space="preserve">NING, Xuying </w:t>
-      </w:r>
-      <w:r>
-        <w:rPr>
+          <w:b w:val="0"/>
+          <w:bCs w:val="0"/>
+          <w:i w:val="0"/>
+          <w:iCs w:val="0"/>
+          <w:rtl w:val="0"/>
+        </w:rPr>
+        <w:t xml:space="preserve">LIU, Haozhe </w:t>
+      </w:r>
+      <w:r>
+        <w:rPr>
+          <w:b w:val="0"/>
+          <w:bCs w:val="0"/>
           <w:i w:val="1"/>
           <w:iCs w:val="1"/>
           <w:rtl w:val="0"/>
@@ -4542,6 +4421,10 @@
       </w:r>
       <w:r>
         <w:rPr>
+          <w:b w:val="0"/>
+          <w:bCs w:val="0"/>
+          <w:i w:val="0"/>
+          <w:iCs w:val="0"/>
           <w:rtl w:val="0"/>
         </w:rPr>
         <w:t xml:space="preserve"> </w:t>
@@ -4550,18 +4433,26 @@
         <w:rPr>
           <w:b w:val="1"/>
           <w:bCs w:val="1"/>
-          <w:rtl w:val="0"/>
-        </w:rPr>
-        <w:t xml:space="preserve">Code as agent harness</w:t>
-      </w:r>
-      <w:r>
-        <w:rPr>
-          <w:rtl w:val="0"/>
-        </w:rPr>
-        <w:t xml:space="preserve">. arXiv:2605.18747, 2026. </w:t>
-      </w:r>
-      <w:r>
-        <w:rPr>
+          <w:i w:val="0"/>
+          <w:iCs w:val="0"/>
+          <w:rtl w:val="0"/>
+        </w:rPr>
+        <w:t xml:space="preserve">SoL-Pi</w:t>
+      </w:r>
+      <w:r>
+        <w:rPr>
+          <w:b w:val="0"/>
+          <w:bCs w:val="0"/>
+          <w:i w:val="0"/>
+          <w:iCs w:val="0"/>
+          <w:rtl w:val="0"/>
+        </w:rPr>
+        <w:t xml:space="preserve">: recursively scaling auto-research loops for efficient agent harness. arXiv:2609.20519, 2026. </w:t>
+      </w:r>
+      <w:r>
+        <w:rPr>
+          <w:b w:val="0"/>
+          <w:bCs w:val="0"/>
           <w:i w:val="1"/>
           <w:iCs w:val="1"/>
           <w:rtl w:val="0"/>
@@ -4570,6 +4461,130 @@
       </w:r>
       <w:r>
         <w:rPr>
+          <w:b w:val="0"/>
+          <w:bCs w:val="0"/>
+          <w:i w:val="0"/>
+          <w:iCs w:val="0"/>
+          <w:rtl w:val="0"/>
+        </w:rPr>
+        <w:t xml:space="preserve">, não revisado por pares. Disponível em: https://arxiv.org/abs/2609.20519. Acesso em: 23 set. 2026.</w:t>
+      </w:r>
+      <w:r>
+        <w:rPr>
+          <w:rtl w:val="0"/>
+        </w:rPr>
+      </w:r>
+    </w:p>
+    <w:p>
+      <w:pPr>
+        <w:spacing w:after="240" w:line="240" w:lineRule="auto"/>
+        <w:rPr/>
+      </w:pPr>
+      <w:r>
+        <w:rPr>
+          <w:b w:val="0"/>
+          <w:bCs w:val="0"/>
+          <w:i w:val="0"/>
+          <w:iCs w:val="0"/>
+          <w:rtl w:val="0"/>
+        </w:rPr>
+        <w:t xml:space="preserve">MILLER, Evan. </w:t>
+      </w:r>
+      <w:r>
+        <w:rPr>
+          <w:b w:val="1"/>
+          <w:bCs w:val="1"/>
+          <w:i w:val="0"/>
+          <w:iCs w:val="0"/>
+          <w:rtl w:val="0"/>
+        </w:rPr>
+        <w:t xml:space="preserve">Adding error bars to evals</w:t>
+      </w:r>
+      <w:r>
+        <w:rPr>
+          <w:b w:val="0"/>
+          <w:bCs w:val="0"/>
+          <w:i w:val="0"/>
+          <w:iCs w:val="0"/>
+          <w:rtl w:val="0"/>
+        </w:rPr>
+        <w:t xml:space="preserve">: a statistical approach to language model evaluations. arXiv:2411.00640, 2024. </w:t>
+      </w:r>
+      <w:r>
+        <w:rPr>
+          <w:b w:val="0"/>
+          <w:bCs w:val="0"/>
+          <w:i w:val="1"/>
+          <w:iCs w:val="1"/>
+          <w:rtl w:val="0"/>
+        </w:rPr>
+        <w:t xml:space="preserve">Preprint</w:t>
+      </w:r>
+      <w:r>
+        <w:rPr>
+          <w:b w:val="0"/>
+          <w:bCs w:val="0"/>
+          <w:i w:val="0"/>
+          <w:iCs w:val="0"/>
+          <w:rtl w:val="0"/>
+        </w:rPr>
+        <w:t xml:space="preserve">, não revisado por pares. Disponível em: https://arxiv.org/abs/2411.00640. Acesso em: 28 ago. 2026.</w:t>
+      </w:r>
+      <w:r>
+        <w:rPr>
+          <w:rtl w:val="0"/>
+        </w:rPr>
+      </w:r>
+    </w:p>
+    <w:p>
+      <w:pPr>
+        <w:spacing w:after="240" w:line="240" w:lineRule="auto"/>
+        <w:rPr/>
+      </w:pPr>
+      <w:r>
+        <w:rPr>
+          <w:rtl w:val="0"/>
+        </w:rPr>
+        <w:t xml:space="preserve">NING, Xuying </w:t>
+      </w:r>
+      <w:r>
+        <w:rPr>
+          <w:i w:val="1"/>
+          <w:iCs w:val="1"/>
+          <w:rtl w:val="0"/>
+        </w:rPr>
+        <w:t xml:space="preserve">et al.</w:t>
+      </w:r>
+      <w:r>
+        <w:rPr>
+          <w:rtl w:val="0"/>
+        </w:rPr>
+        <w:t xml:space="preserve"> </w:t>
+      </w:r>
+      <w:r>
+        <w:rPr>
+          <w:b w:val="1"/>
+          <w:bCs w:val="1"/>
+          <w:rtl w:val="0"/>
+        </w:rPr>
+        <w:t xml:space="preserve">Code as agent harness</w:t>
+      </w:r>
+      <w:r>
+        <w:rPr>
+          <w:rtl w:val="0"/>
+        </w:rPr>
+        <w:t xml:space="preserve">. arXiv:2605.18747, 2026. </w:t>
+      </w:r>
+      <w:r>
+        <w:rPr>
+          <w:i w:val="1"/>
+          <w:iCs w:val="1"/>
+          <w:rtl w:val="0"/>
+        </w:rPr>
+        <w:t xml:space="preserve">Preprint</w:t>
+      </w:r>
+      <w:r>
+        <w:rPr>
           <w:rtl w:val="0"/>
         </w:rPr>
         <w:t xml:space="preserve">, não revisado por pares. Disponível em: https://arxiv.org/abs/2605.18747. Acesso em: 28 ago. 2026.</w:t>
@@ -4583,8 +4598,8 @@
       <w:r>
         <w:rPr>
           <w:b w:val="0"/>
-          <w:i w:val="0"/>
-          <w:bCs w:val="0"/>
+          <w:bCs w:val="0"/>
+          <w:i w:val="0"/>
           <w:iCs w:val="0"/>
           <w:rtl w:val="0"/>
         </w:rPr>
@@ -4592,23 +4607,166 @@
       </w:r>
       <w:r>
         <w:rPr>
+          <w:b w:val="1"/>
+          <w:bCs w:val="1"/>
+          <w:i w:val="0"/>
+          <w:iCs w:val="0"/>
+          <w:rtl w:val="0"/>
+        </w:rPr>
+        <w:t xml:space="preserve">OpenCode</w:t>
+      </w:r>
+      <w:r>
+        <w:rPr>
+          <w:b w:val="0"/>
+          <w:bCs w:val="0"/>
+          <w:i w:val="0"/>
+          <w:iCs w:val="0"/>
+          <w:rtl w:val="0"/>
+        </w:rPr>
+        <w:t xml:space="preserve">: the open source coding agent. 2026a. Repositório de código. Disponível em: https://github.com/anomalyco/opencode. Acesso em: 14 set. 2026.</w:t>
+      </w:r>
+      <w:r>
+        <w:rPr>
+          <w:rtl w:val="0"/>
+        </w:rPr>
+      </w:r>
+    </w:p>
+    <w:p>
+      <w:pPr>
+        <w:spacing w:after="240" w:line="240" w:lineRule="auto"/>
+        <w:rPr/>
+      </w:pPr>
+      <w:r>
+        <w:rPr>
+          <w:b w:val="0"/>
+          <w:bCs w:val="0"/>
+          <w:i w:val="0"/>
+          <w:iCs w:val="0"/>
+          <w:rtl w:val="0"/>
+        </w:rPr>
+        <w:t xml:space="preserve">OPENCODE. </w:t>
+      </w:r>
+      <w:r>
+        <w:rPr>
+          <w:b w:val="1"/>
+          <w:bCs w:val="1"/>
+          <w:i w:val="0"/>
+          <w:iCs w:val="0"/>
+          <w:rtl w:val="0"/>
+        </w:rPr>
+        <w:t xml:space="preserve">Zen</w:t>
+      </w:r>
+      <w:r>
+        <w:rPr>
+          <w:b w:val="0"/>
+          <w:bCs w:val="0"/>
+          <w:i w:val="0"/>
+          <w:iCs w:val="0"/>
+          <w:rtl w:val="0"/>
+        </w:rPr>
+        <w:t xml:space="preserve">. 2026b. Documentação do produto. Disponível em: https://opencode.ai/docs/zen/. Acesso em: 28 ago. 2026.</w:t>
+      </w:r>
+      <w:r>
+        <w:rPr>
+          <w:rtl w:val="0"/>
+        </w:rPr>
+      </w:r>
+    </w:p>
+    <w:p>
+      <w:pPr>
+        <w:spacing w:after="240" w:line="240" w:lineRule="auto"/>
+        <w:rPr/>
+      </w:pPr>
+      <w:r>
+        <w:rPr>
+          <w:b w:val="0"/>
+          <w:bCs w:val="0"/>
+          <w:i w:val="0"/>
+          <w:iCs w:val="0"/>
+          <w:rtl w:val="0"/>
+        </w:rPr>
+        <w:t xml:space="preserve">PAN, Melissa Z. </w:t>
+      </w:r>
+      <w:r>
+        <w:rPr>
+          <w:b w:val="0"/>
+          <w:bCs w:val="0"/>
+          <w:i w:val="1"/>
+          <w:iCs w:val="1"/>
+          <w:rtl w:val="0"/>
+        </w:rPr>
+        <w:t xml:space="preserve">et al.</w:t>
+      </w:r>
+      <w:r>
+        <w:rPr>
+          <w:b w:val="0"/>
+          <w:bCs w:val="0"/>
+          <w:i w:val="0"/>
+          <w:iCs w:val="0"/>
+          <w:rtl w:val="0"/>
+        </w:rPr>
+        <w:t xml:space="preserve"> </w:t>
+      </w:r>
+      <w:r>
+        <w:rPr>
+          <w:b w:val="1"/>
+          <w:bCs w:val="1"/>
+          <w:i w:val="0"/>
+          <w:iCs w:val="0"/>
+          <w:rtl w:val="0"/>
+        </w:rPr>
+        <w:t xml:space="preserve">HarnessTax</w:t>
+      </w:r>
+      <w:r>
+        <w:rPr>
+          <w:b w:val="0"/>
+          <w:bCs w:val="0"/>
+          <w:i w:val="0"/>
+          <w:iCs w:val="0"/>
+          <w:rtl w:val="0"/>
+        </w:rPr>
+        <w:t xml:space="preserve">: how much does the harness matter for coding agents? 2026. Publicação de blogue de pesquisa, não revisada por pares. Disponível em: https://harnesstax.github.io/. Acesso em: 23 set. 2026.</w:t>
+      </w:r>
+      <w:r>
+        <w:rPr>
+          <w:rtl w:val="0"/>
+        </w:rPr>
+      </w:r>
+    </w:p>
+    <w:p>
+      <w:pPr>
+        <w:spacing w:after="240" w:line="240" w:lineRule="auto"/>
+        <w:rPr/>
+      </w:pPr>
+      <w:r>
+        <w:rPr>
+          <w:b w:val="0"/>
+          <w:i w:val="0"/>
+          <w:bCs w:val="0"/>
+          <w:iCs w:val="0"/>
+          <w:rtl w:val="0"/>
+        </w:rPr>
+        <w:t xml:space="preserve">YOUNG, Justin. </w:t>
+      </w:r>
+      <w:r>
+        <w:rPr>
           <w:b/>
           <w:i w:val="0"/>
           <w:bCs w:val="0"/>
           <w:iCs w:val="0"/>
           <w:rtl w:val="0"/>
         </w:rPr>
-        <w:t xml:space="preserve">OpenCode</w:t>
-      </w:r>
-      <w:r>
-        <w:rPr>
-          <w:b w:val="0"/>
-          <w:i w:val="0"/>
-          <w:bCs w:val="0"/>
-          <w:iCs w:val="0"/>
-          <w:rtl w:val="0"/>
-        </w:rPr>
-        <w:t xml:space="preserve">: the open source coding agent. 2026a. Repositório de código. Disponível em: https://github.com/anomalyco/opencode. Acesso em: 14 set. 2026.</w:t>
+        <w:t xml:space="preserve">Effective harnesses for long-running agents</w:t>
+      </w:r>
+      <w:r>
+        <w:rPr>
+          <w:b w:val="0"/>
+          <w:i w:val="0"/>
+          <w:bCs w:val="0"/>
+          <w:iCs w:val="0"/>
+          <w:rtl w:val="0"/>
+        </w:rPr>
+        <w:t xml:space="preserve">. 2025. Publicação de blogue de engenharia (Anthropic), não revisada por pares. Disponível em: https://www.anthropic.com/engineering/effective-harnesses-for-long-running-agents. Acesso em: 24 set. 2026.</w:t>
       </w:r>
     </w:p>
     <w:p>
@@ -4619,32 +4777,37 @@
       <w:r>
         <w:rPr>
           <w:b w:val="0"/>
-          <w:i w:val="0"/>
-          <w:bCs w:val="0"/>
-          <w:iCs w:val="0"/>
-          <w:rtl w:val="0"/>
-        </w:rPr>
-        <w:t xml:space="preserve">OPENCODE. </w:t>
-      </w:r>
-      <w:r>
-        <w:rPr>
-          <w:b/>
-          <w:i w:val="0"/>
-          <w:bCs w:val="0"/>
-          <w:iCs w:val="0"/>
-          <w:rtl w:val="0"/>
-        </w:rPr>
-        <w:t xml:space="preserve">Zen</w:t>
-      </w:r>
-      <w:r>
-        <w:rPr>
-          <w:b w:val="0"/>
-          <w:i w:val="0"/>
-          <w:bCs w:val="0"/>
-          <w:iCs w:val="0"/>
-          <w:rtl w:val="0"/>
-        </w:rPr>
-        <w:t xml:space="preserve">. 2026b. Documentação do produto. Disponível em: https://opencode.ai/docs/zen/. Acesso em: 28 ago. 2026.</w:t>
+          <w:bCs w:val="0"/>
+          <w:i w:val="0"/>
+          <w:iCs w:val="0"/>
+          <w:rtl w:val="0"/>
+        </w:rPr>
+        <w:t xml:space="preserve">YUUKIFST. </w:t>
+      </w:r>
+      <w:r>
+        <w:rPr>
+          <w:b w:val="1"/>
+          <w:bCs w:val="1"/>
+          <w:i w:val="0"/>
+          <w:iCs w:val="0"/>
+          <w:rtl w:val="0"/>
+        </w:rPr>
+        <w:t xml:space="preserve">agent-dotfiles</w:t>
+      </w:r>
+      <w:r>
+        <w:rPr>
+          <w:b w:val="0"/>
+          <w:bCs w:val="0"/>
+          <w:i w:val="0"/>
+          <w:iCs w:val="0"/>
+          <w:rtl w:val="0"/>
+        </w:rPr>
+        <w:t xml:space="preserve">: skill Helmsman, mapa de decisões para agentes de codificação. 2026a. Repositório de código. Disponível em: https://github.com/YuukiFST/agent-dotfiles/tree/main/skills/helmsman. Acesso em: 15 set. 2026.</w:t>
+      </w:r>
+      <w:r>
+        <w:rPr>
+          <w:rtl w:val="0"/>
+        </w:rPr>
       </w:r>
     </w:p>
     <w:p>
@@ -4655,19 +4818,101 @@
       <w:r>
         <w:rPr>
           <w:b w:val="0"/>
-          <w:i w:val="0"/>
-          <w:bCs w:val="0"/>
-          <w:iCs w:val="0"/>
-          <w:rtl w:val="0"/>
-        </w:rPr>
-        <w:t xml:space="preserve">PAN, Melissa Z. </w:t>
-      </w:r>
-      <w:r>
-        <w:rPr>
-          <w:b w:val="0"/>
-          <w:i/>
-          <w:bCs w:val="0"/>
-          <w:iCs w:val="0"/>
+          <w:bCs w:val="0"/>
+          <w:i w:val="0"/>
+          <w:iCs w:val="0"/>
+          <w:rtl w:val="0"/>
+        </w:rPr>
+        <w:t xml:space="preserve">YUUKIFST. </w:t>
+      </w:r>
+      <w:r>
+        <w:rPr>
+          <w:b w:val="1"/>
+          <w:bCs w:val="1"/>
+          <w:i w:val="0"/>
+          <w:iCs w:val="0"/>
+          <w:rtl w:val="0"/>
+        </w:rPr>
+        <w:t xml:space="preserve">Finn</w:t>
+      </w:r>
+      <w:r>
+        <w:rPr>
+          <w:b w:val="0"/>
+          <w:bCs w:val="0"/>
+          <w:i w:val="0"/>
+          <w:iCs w:val="0"/>
+          <w:rtl w:val="0"/>
+        </w:rPr>
+        <w:t xml:space="preserve">: SaaS universal de financeiro por voz. 2026b. Repositório de código. Disponível em: https://github.com/YuukiFST/Finn. Acesso em: 14 set. 2026.</w:t>
+      </w:r>
+      <w:r>
+        <w:rPr>
+          <w:rtl w:val="0"/>
+        </w:rPr>
+      </w:r>
+    </w:p>
+    <w:p>
+      <w:pPr>
+        <w:spacing w:after="240" w:line="240" w:lineRule="auto"/>
+        <w:rPr/>
+      </w:pPr>
+      <w:r>
+        <w:rPr>
+          <w:b w:val="0"/>
+          <w:bCs w:val="0"/>
+          <w:i w:val="0"/>
+          <w:iCs w:val="0"/>
+          <w:rtl w:val="0"/>
+        </w:rPr>
+        <w:t xml:space="preserve">YUUKIFST. </w:t>
+      </w:r>
+      <w:r>
+        <w:rPr>
+          <w:b w:val="1"/>
+          <w:bCs w:val="1"/>
+          <w:i w:val="0"/>
+          <w:iCs w:val="0"/>
+          <w:rtl w:val="0"/>
+        </w:rPr>
+        <w:t xml:space="preserve">harness-bench</w:t>
+      </w:r>
+      <w:r>
+        <w:rPr>
+          <w:b w:val="0"/>
+          <w:bCs w:val="0"/>
+          <w:i w:val="0"/>
+          <w:iCs w:val="0"/>
+          <w:rtl w:val="0"/>
+        </w:rPr>
+        <w:t xml:space="preserve">: executor, prompts, testes de aceitação, dados brutos e scripts de análise deste projeto. 2026c. Repositório de código. Disponível em: https://github.com/YuukiFST/harness-bench. Acesso em: 28 ago. 2026.</w:t>
+      </w:r>
+      <w:r>
+        <w:rPr>
+          <w:rtl w:val="0"/>
+        </w:rPr>
+      </w:r>
+    </w:p>
+    <w:p>
+      <w:pPr>
+        <w:spacing w:after="240" w:line="240" w:lineRule="auto"/>
+        <w:rPr/>
+      </w:pPr>
+      <w:r>
+        <w:rPr>
+          <w:b w:val="0"/>
+          <w:bCs w:val="0"/>
+          <w:i w:val="0"/>
+          <w:iCs w:val="0"/>
+          <w:rtl w:val="0"/>
+        </w:rPr>
+        <w:t xml:space="preserve">ZHANG, Yunbei </w:t>
+      </w:r>
+      <w:r>
+        <w:rPr>
+          <w:b w:val="0"/>
+          <w:bCs w:val="0"/>
+          <w:i w:val="1"/>
+          <w:iCs w:val="1"/>
           <w:rtl w:val="0"/>
         </w:rPr>
         <w:t xml:space="preserve">et al.</w:t>
@@ -4675,8 +4920,8 @@
       <w:r>
         <w:rPr>
           <w:b w:val="0"/>
-          <w:i w:val="0"/>
-          <w:bCs w:val="0"/>
+          <w:bCs w:val="0"/>
+          <w:i w:val="0"/>
           <w:iCs w:val="0"/>
           <w:rtl w:val="0"/>
         </w:rPr>
@@ -4684,166 +4929,10 @@
       </w:r>
       <w:r>
         <w:rPr>
-          <w:b/>
-          <w:i w:val="0"/>
-          <w:bCs w:val="0"/>
-          <w:iCs w:val="0"/>
-          <w:rtl w:val="0"/>
-        </w:rPr>
-        <w:t xml:space="preserve">HarnessTax</w:t>
-      </w:r>
-      <w:r>
-        <w:rPr>
-          <w:b w:val="0"/>
-          <w:i w:val="0"/>
-          <w:bCs w:val="0"/>
-          <w:iCs w:val="0"/>
-          <w:rtl w:val="0"/>
-        </w:rPr>
-        <w:t xml:space="preserve">: how much does the harness matter for coding agents? 2026. Publicação de blogue de pesquisa, não revisada por pares. Disponível em: https://harnesstax.github.io/. Acesso em: 23 set. 2026.</w:t>
-      </w:r>
-    </w:p>
-    <w:p>
-      <w:pPr>
-        <w:spacing w:after="240" w:line="240" w:lineRule="auto"/>
-        <w:rPr/>
-      </w:pPr>
-      <w:r>
-        <w:rPr>
-          <w:b w:val="0"/>
-          <w:i w:val="0"/>
-          <w:bCs w:val="0"/>
-          <w:iCs w:val="0"/>
-          <w:rtl w:val="0"/>
-        </w:rPr>
-        <w:t xml:space="preserve">YUUKIFST. </w:t>
-      </w:r>
-      <w:r>
-        <w:rPr>
-          <w:b/>
-          <w:i w:val="0"/>
-          <w:bCs w:val="0"/>
-          <w:iCs w:val="0"/>
-          <w:rtl w:val="0"/>
-        </w:rPr>
-        <w:t xml:space="preserve">agent-dotfiles</w:t>
-      </w:r>
-      <w:r>
-        <w:rPr>
-          <w:b w:val="0"/>
-          <w:i w:val="0"/>
-          <w:bCs w:val="0"/>
-          <w:iCs w:val="0"/>
-          <w:rtl w:val="0"/>
-        </w:rPr>
-        <w:t xml:space="preserve">: skill Helmsman, mapa de decisões para agentes de codificação. 2026a. Repositório de código. Disponível em: https://github.com/YuukiFST/agent-dotfiles/tree/main/skills/helmsman. Acesso em: 15 set. 2026.</w:t>
-      </w:r>
-    </w:p>
-    <w:p>
-      <w:pPr>
-        <w:spacing w:after="240" w:line="240" w:lineRule="auto"/>
-        <w:rPr/>
-      </w:pPr>
-      <w:r>
-        <w:rPr>
-          <w:b w:val="0"/>
-          <w:i w:val="0"/>
-          <w:bCs w:val="0"/>
-          <w:iCs w:val="0"/>
-          <w:rtl w:val="0"/>
-        </w:rPr>
-        <w:t xml:space="preserve">YUUKIFST. </w:t>
-      </w:r>
-      <w:r>
-        <w:rPr>
-          <w:b/>
-          <w:i w:val="0"/>
-          <w:bCs w:val="0"/>
-          <w:iCs w:val="0"/>
-          <w:rtl w:val="0"/>
-        </w:rPr>
-        <w:t xml:space="preserve">Finn</w:t>
-      </w:r>
-      <w:r>
-        <w:rPr>
-          <w:b w:val="0"/>
-          <w:i w:val="0"/>
-          <w:bCs w:val="0"/>
-          <w:iCs w:val="0"/>
-          <w:rtl w:val="0"/>
-        </w:rPr>
-        <w:t xml:space="preserve">: SaaS universal de financeiro por voz. 2026b. Repositório de código. Disponível em: https://github.com/YuukiFST/Finn. Acesso em: 14 set. 2026.</w:t>
-      </w:r>
-    </w:p>
-    <w:p>
-      <w:pPr>
-        <w:spacing w:after="240" w:line="240" w:lineRule="auto"/>
-        <w:rPr/>
-      </w:pPr>
-      <w:r>
-        <w:rPr>
-          <w:b w:val="0"/>
-          <w:i w:val="0"/>
-          <w:bCs w:val="0"/>
-          <w:iCs w:val="0"/>
-          <w:rtl w:val="0"/>
-        </w:rPr>
-        <w:t xml:space="preserve">YUUKIFST. </w:t>
-      </w:r>
-      <w:r>
-        <w:rPr>
-          <w:b/>
-          <w:i w:val="0"/>
-          <w:bCs w:val="0"/>
-          <w:iCs w:val="0"/>
-          <w:rtl w:val="0"/>
-        </w:rPr>
-        <w:t xml:space="preserve">harness-bench</w:t>
-      </w:r>
-      <w:r>
-        <w:rPr>
-          <w:b w:val="0"/>
-          <w:i w:val="0"/>
-          <w:bCs w:val="0"/>
-          <w:iCs w:val="0"/>
-          <w:rtl w:val="0"/>
-        </w:rPr>
-        <w:t xml:space="preserve">: executor, prompts, testes de aceitação, dados brutos e scripts de análise deste projeto. 2026c. Repositório de código. Disponível em: https://github.com/YuukiFST/harness-bench. Acesso em: 28 ago. 2026.</w:t>
-      </w:r>
-    </w:p>
-    <w:p>
-      <w:pPr>
-        <w:spacing w:after="240" w:line="240" w:lineRule="auto"/>
-        <w:rPr/>
-      </w:pPr>
-      <w:r>
-        <w:rPr>
-          <w:b w:val="0"/>
-          <w:i w:val="0"/>
-          <w:rtl w:val="0"/>
-        </w:rPr>
-        <w:t xml:space="preserve">ZHANG, Yunbei </w:t>
-      </w:r>
-      <w:r>
-        <w:rPr>
-          <w:b w:val="0"/>
-          <w:i/>
-          <w:rtl w:val="0"/>
-        </w:rPr>
-        <w:t xml:space="preserve">et al.</w:t>
-      </w:r>
-      <w:r>
-        <w:rPr>
-          <w:b w:val="0"/>
-          <w:i w:val="0"/>
-          <w:rtl w:val="0"/>
-        </w:rPr>
-        <w:t xml:space="preserve"> </w:t>
-      </w:r>
-      <w:r>
-        <w:rPr>
-          <w:b/>
-          <w:i w:val="0"/>
+          <w:b w:val="1"/>
+          <w:bCs w:val="1"/>
+          <w:i w:val="0"/>
+          <w:iCs w:val="0"/>
           <w:rtl w:val="0"/>
         </w:rPr>
         <w:t xml:space="preserve">Stop comparing LLM agents without disclosing the harness</w:t>
@@ -4851,7 +4940,9 @@
       <w:r>
         <w:rPr>
           <w:b w:val="0"/>
-          <w:i w:val="0"/>
+          <w:bCs w:val="0"/>
+          <w:i w:val="0"/>
+          <w:iCs w:val="0"/>
           <w:rtl w:val="0"/>
         </w:rPr>
         <w:t xml:space="preserve">. arXiv:2605.23950, 2026. </w:t>
@@ -4859,7 +4950,9 @@
       <w:r>
         <w:rPr>
           <w:b w:val="0"/>
-          <w:i/>
+          <w:bCs w:val="0"/>
+          <w:i w:val="1"/>
+          <w:iCs w:val="1"/>
           <w:rtl w:val="0"/>
         </w:rPr>
         <w:t xml:space="preserve">Preprint</w:t>
@@ -4867,10 +4960,17 @@
       <w:r>
         <w:rPr>
           <w:b w:val="0"/>
-          <w:i w:val="0"/>
+          <w:bCs w:val="0"/>
+          <w:i w:val="0"/>
+          <w:iCs w:val="0"/>
           <w:rtl w:val="0"/>
         </w:rPr>
         <w:t xml:space="preserve">, não revisado por pares. Disponível em: https://arxiv.org/abs/2605.23950. Acesso em: 28 ago. 2026.</w:t>
+      </w:r>
+      <w:r>
+        <w:rPr>
+          <w:rtl w:val="0"/>
+        </w:rPr>
       </w:r>
     </w:p>
     <w:sectPr>
@@ -4890,7 +4990,6 @@
     <w:pPr>
       <w:keepNext w:val="0"/>
       <w:keepLines w:val="0"/>
-      <w:pageBreakBefore w:val="0"/>
       <w:widowControl w:val="1"/>
       <w:pBdr>
         <w:top w:space="0" w:sz="0" w:val="nil"/>

</xml_diff>

<commit_message>
docs(project): fix the docx against the handouts and cited sources
Title bold with italic HARNESS (template), city and state on the cover
pages (Aula 3), and page numbers on the three direct quotes (Aula 5).
Claims now match their sources: Zhang is about variance in long tasks,
Pan's 2.0x is a mean and the first-request tax "can begin", Liu changed
four mechanisms, and Miller only recommends pairing. [67] gains its
citations, [73] no longer asserts an uncitable negative, and H1's
success clause follows the cell-median rule of docs/spec/11. Word
still counts 9 pages with the same sumario.
</commit_message>
<xml_diff>
--- a/dist/projeto-de-pesquisa.docx
+++ b/dist/projeto-de-pesquisa.docx
@@ -152,15 +152,39 @@
       </w:pPr>
       <w:r>
         <w:rPr>
-          <w:b w:val="0"/>
-          <w:bCs w:val="0"/>
+          <w:b w:val="1"/>
+          <w:bCs w:val="1"/>
           <w:i w:val="0"/>
           <w:iCs w:val="0"/>
           <w:sz w:val="32"/>
           <w:szCs w:val="32"/>
           <w:rtl w:val="0"/>
         </w:rPr>
-        <w:t xml:space="preserve">O HARNESS NO CUSTO E NO DESEMPENHO DE AGENTES DE CODIFICAÇÃO: TOKENS E TAXA DE SUCESSO COM O MODELO FIXO</w:t>
+        <w:t xml:space="preserve">O </w:t>
+      </w:r>
+      <w:r>
+        <w:rPr>
+          <w:b w:val="1"/>
+          <w:bCs w:val="1"/>
+          <w:i w:val="1"/>
+          <w:iCs w:val="1"/>
+          <w:sz w:val="32"/>
+          <w:szCs w:val="32"/>
+          <w:rtl w:val="0"/>
+        </w:rPr>
+        <w:t xml:space="preserve">HARNESS</w:t>
+      </w:r>
+      <w:r>
+        <w:rPr>
+          <w:b w:val="1"/>
+          <w:bCs w:val="1"/>
+          <w:i w:val="0"/>
+          <w:iCs w:val="0"/>
+          <w:sz w:val="32"/>
+          <w:szCs w:val="32"/>
+          <w:rtl w:val="0"/>
+        </w:rPr>
+        <w:t xml:space="preserve"> NO CUSTO E NO DESEMPENHO DE AGENTES DE CODIFICAÇÃO: TOKENS E TAXA DE SUCESSO COM O MODELO FIXO</w:t>
       </w:r>
       <w:r>
         <w:rPr>
@@ -256,9 +280,11 @@
       </w:pPr>
       <w:r>
         <w:rPr>
-          <w:rtl w:val="0"/>
-        </w:rPr>
-        <w:t xml:space="preserve">Cuiabá</w:t>
+          <w:b w:val="0"/>
+          <w:i w:val="0"/>
+          <w:rtl w:val="0"/>
+        </w:rPr>
+        <w:t xml:space="preserve">Cuiabá – MT</w:t>
       </w:r>
     </w:p>
     <w:p>
@@ -318,15 +344,39 @@
       </w:pPr>
       <w:r>
         <w:rPr>
-          <w:b w:val="0"/>
-          <w:bCs w:val="0"/>
+          <w:b w:val="1"/>
+          <w:bCs w:val="1"/>
           <w:i w:val="0"/>
           <w:iCs w:val="0"/>
           <w:sz w:val="32"/>
           <w:szCs w:val="32"/>
           <w:rtl w:val="0"/>
         </w:rPr>
-        <w:t xml:space="preserve">O HARNESS NO CUSTO E NO DESEMPENHO DE AGENTES DE CODIFICAÇÃO: TOKENS E TAXA DE SUCESSO COM O MODELO FIXO</w:t>
+        <w:t xml:space="preserve">O </w:t>
+      </w:r>
+      <w:r>
+        <w:rPr>
+          <w:b w:val="1"/>
+          <w:bCs w:val="1"/>
+          <w:i w:val="1"/>
+          <w:iCs w:val="1"/>
+          <w:sz w:val="32"/>
+          <w:szCs w:val="32"/>
+          <w:rtl w:val="0"/>
+        </w:rPr>
+        <w:t xml:space="preserve">HARNESS</w:t>
+      </w:r>
+      <w:r>
+        <w:rPr>
+          <w:b w:val="1"/>
+          <w:bCs w:val="1"/>
+          <w:i w:val="0"/>
+          <w:iCs w:val="0"/>
+          <w:sz w:val="32"/>
+          <w:szCs w:val="32"/>
+          <w:rtl w:val="0"/>
+        </w:rPr>
+        <w:t xml:space="preserve"> NO CUSTO E NO DESEMPENHO DE AGENTES DE CODIFICAÇÃO: TOKENS E TAXA DE SUCESSO COM O MODELO FIXO</w:t>
       </w:r>
       <w:r>
         <w:rPr>
@@ -439,9 +489,11 @@
       </w:pPr>
       <w:r>
         <w:rPr>
-          <w:rtl w:val="0"/>
-        </w:rPr>
-        <w:t xml:space="preserve">Cuiabá</w:t>
+          <w:b w:val="0"/>
+          <w:i w:val="0"/>
+          <w:rtl w:val="0"/>
+        </w:rPr>
+        <w:t xml:space="preserve">Cuiabá – MT</w:t>
       </w:r>
     </w:p>
     <w:p>
@@ -972,27 +1024,7 @@
           <w:iCs w:val="0"/>
           <w:rtl w:val="0"/>
         </w:rPr>
-        <w:t xml:space="preserve"> pode influenciar no custo e na taxa de sucesso ao construir o mesmo software com um </w:t>
-      </w:r>
-      <w:r>
-        <w:rPr>
-          <w:b w:val="0"/>
-          <w:i/>
-          <w:bCs w:val="0"/>
-          <w:iCs w:val="0"/>
-          <w:rtl w:val="0"/>
-        </w:rPr>
-        <w:t xml:space="preserve">harness</w:t>
-      </w:r>
-      <w:r>
-        <w:rPr>
-          <w:b w:val="0"/>
-          <w:i w:val="0"/>
-          <w:bCs w:val="0"/>
-          <w:iCs w:val="0"/>
-          <w:rtl w:val="0"/>
-        </w:rPr>
-        <w:t xml:space="preserve"> em vez de outro?</w:t>
+        <w:t xml:space="preserve"> influencia o custo e a taxa de sucesso na construção do mesmo software?</w:t>
       </w:r>
     </w:p>
     <w:p>
@@ -1455,7 +1487,7 @@
           <w:iCs w:val="0"/>
           <w:rtl w:val="0"/>
         </w:rPr>
-        <w:t xml:space="preserve"> muda mais o custo do que o sucesso. Os tokens por unidade diferem entre o OpenCode e o Pi, e a fração de testes aprovados fica igual. H1 será refutada se o teste pareado não apontar diferença de tokens ou se a fração final de testes aprovados diferir.</w:t>
+        <w:t xml:space="preserve"> muda mais o custo do que o sucesso. Os tokens por unidade diferem entre o OpenCode e o Pi, e a fração de testes aprovados fica igual. H1 será refutada se o teste pareado não apontar diferença de tokens ou se as medianas da fração final de testes aprovados diferirem entre os braços.</w:t>
       </w:r>
     </w:p>
     <w:p>
@@ -1554,8 +1586,8 @@
       <w:r>
         <w:rPr>
           <w:b w:val="0"/>
-          <w:bCs w:val="0"/>
-          <w:i w:val="0"/>
+          <w:i w:val="0"/>
+          <w:bCs w:val="0"/>
           <w:iCs w:val="0"/>
           <w:rtl w:val="0"/>
         </w:rPr>
@@ -1564,9 +1596,9 @@
       <w:r>
         <w:rPr>
           <w:b w:val="0"/>
-          <w:bCs w:val="0"/>
-          <w:i w:val="1"/>
-          <w:iCs w:val="1"/>
+          <w:i/>
+          <w:bCs w:val="0"/>
+          <w:iCs w:val="0"/>
           <w:rtl w:val="0"/>
         </w:rPr>
         <w:t xml:space="preserve">et al.</w:t>
@@ -1574,19 +1606,19 @@
       <w:r>
         <w:rPr>
           <w:b w:val="0"/>
-          <w:bCs w:val="0"/>
-          <w:i w:val="0"/>
-          <w:iCs w:val="0"/>
-          <w:rtl w:val="0"/>
-        </w:rPr>
-        <w:t xml:space="preserve"> (2026, §2, tradução nossa), um </w:t>
-      </w:r>
-      <w:r>
-        <w:rPr>
-          <w:b w:val="0"/>
-          <w:bCs w:val="0"/>
-          <w:i w:val="1"/>
-          <w:iCs w:val="1"/>
+          <w:i w:val="0"/>
+          <w:bCs w:val="0"/>
+          <w:iCs w:val="0"/>
+          <w:rtl w:val="0"/>
+        </w:rPr>
+        <w:t xml:space="preserve"> (2026, p. 7, tradução nossa), um </w:t>
+      </w:r>
+      <w:r>
+        <w:rPr>
+          <w:b w:val="0"/>
+          <w:i/>
+          <w:bCs w:val="0"/>
+          <w:iCs w:val="0"/>
           <w:rtl w:val="0"/>
         </w:rPr>
         <w:t xml:space="preserve">harness</w:t>
@@ -1594,8 +1626,8 @@
       <w:r>
         <w:rPr>
           <w:b w:val="0"/>
-          <w:bCs w:val="0"/>
-          <w:i w:val="0"/>
+          <w:i w:val="0"/>
+          <w:bCs w:val="0"/>
           <w:iCs w:val="0"/>
           <w:rtl w:val="0"/>
         </w:rPr>
@@ -1604,9 +1636,9 @@
       <w:r>
         <w:rPr>
           <w:b w:val="0"/>
-          <w:bCs w:val="0"/>
-          <w:i w:val="1"/>
-          <w:iCs w:val="1"/>
+          <w:i/>
+          <w:bCs w:val="0"/>
+          <w:iCs w:val="0"/>
           <w:rtl w:val="0"/>
         </w:rPr>
         <w:t xml:space="preserve">et al.</w:t>
@@ -1614,17 +1646,12 @@
       <w:r>
         <w:rPr>
           <w:b w:val="0"/>
-          <w:bCs w:val="0"/>
-          <w:i w:val="0"/>
+          <w:i w:val="0"/>
+          <w:bCs w:val="0"/>
           <w:iCs w:val="0"/>
           <w:rtl w:val="0"/>
         </w:rPr>
         <w:t xml:space="preserve"> (2026) delimitam o que essa camada contém:</w:t>
-      </w:r>
-      <w:r>
-        <w:rPr>
-          <w:rtl w:val="0"/>
-        </w:rPr>
       </w:r>
     </w:p>
     <w:p>
@@ -1662,7 +1689,7 @@
           <w:szCs w:val="20"/>
           <w:rtl w:val="0"/>
         </w:rPr>
-        <w:t xml:space="preserve"> que molda o estilo de trabalho, as ferramentas que expõem o sistema de arquivos e o shell, e o middleware que controla contexto, execução e recuperação. Esse conjunto de componentes externos ao modelo e editáveis é chamado coletivamente de harness do agente. (Lin </w:t>
+        <w:t xml:space="preserve"> que molda o estilo de trabalho, as ferramentas que expõem o sistema de arquivos e o shell, e o middleware que controla contexto, execução e recuperação. Esse conjunto de componentes externos ao modelo e editáveis é chamado coletivamente de </w:t>
       </w:r>
       <w:r>
         <w:rPr>
@@ -1672,7 +1699,7 @@
           <w:szCs w:val="20"/>
           <w:rtl w:val="0"/>
         </w:rPr>
-        <w:t xml:space="preserve">et al.</w:t>
+        <w:t xml:space="preserve">harness</w:t>
       </w:r>
       <w:r>
         <w:rPr>
@@ -1682,7 +1709,27 @@
           <w:szCs w:val="20"/>
           <w:rtl w:val="0"/>
         </w:rPr>
-        <w:t xml:space="preserve">, 2026, §1, tradução nossa).</w:t>
+        <w:t xml:space="preserve"> do agente. (Lin </w:t>
+      </w:r>
+      <w:r>
+        <w:rPr>
+          <w:b w:val="0"/>
+          <w:i/>
+          <w:sz w:val="20"/>
+          <w:szCs w:val="20"/>
+          <w:rtl w:val="0"/>
+        </w:rPr>
+        <w:t xml:space="preserve">et al.</w:t>
+      </w:r>
+      <w:r>
+        <w:rPr>
+          <w:b w:val="0"/>
+          <w:i w:val="0"/>
+          <w:sz w:val="20"/>
+          <w:szCs w:val="20"/>
+          <w:rtl w:val="0"/>
+        </w:rPr>
+        <w:t xml:space="preserve">, 2026, p. 1, tradução nossa).</w:t>
       </w:r>
     </w:p>
     <w:p>
@@ -1720,27 +1767,7 @@
           <w:iCs w:val="0"/>
           <w:rtl w:val="0"/>
         </w:rPr>
-        <w:t xml:space="preserve"> curto, e o OpenCode envia mais ferramentas, um </w:t>
-      </w:r>
-      <w:r>
-        <w:rPr>
-          <w:b w:val="0"/>
-          <w:i/>
-          <w:bCs w:val="0"/>
-          <w:iCs w:val="0"/>
-          <w:rtl w:val="0"/>
-        </w:rPr>
-        <w:t xml:space="preserve">prompt</w:t>
-      </w:r>
-      <w:r>
-        <w:rPr>
-          <w:b w:val="0"/>
-          <w:i w:val="0"/>
-          <w:bCs w:val="0"/>
-          <w:iCs w:val="0"/>
-          <w:rtl w:val="0"/>
-        </w:rPr>
-        <w:t xml:space="preserve"> maior, subagentes e permissões.</w:t>
+        <w:t xml:space="preserve"> curto (Earendil, 2026), e o OpenCode envia mais ferramentas, subagentes e permissões (Opencode, 2026a).</w:t>
       </w:r>
     </w:p>
     <w:p>
@@ -1818,7 +1845,7 @@
           <w:iCs w:val="0"/>
           <w:rtl w:val="0"/>
         </w:rPr>
-        <w:t xml:space="preserve"> (2026) sustentam que, entre modelos de fronteira comparáveis, a parcela do desempenho que vem do </w:t>
+        <w:t xml:space="preserve"> (2026) sustentam que, em tarefas longas e entre modelos de fronteira comparáveis, a variação de desempenho devida ao </w:t>
       </w:r>
       <w:r>
         <w:rPr>
@@ -1838,7 +1865,7 @@
           <w:iCs w:val="0"/>
           <w:rtl w:val="0"/>
         </w:rPr>
-        <w:t xml:space="preserve"> é comparável ou maior que a do modelo. Pan </w:t>
+        <w:t xml:space="preserve"> é comparável ou maior que a devida ao modelo. Pan </w:t>
       </w:r>
       <w:r>
         <w:rPr>
@@ -1878,7 +1905,7 @@
           <w:iCs w:val="0"/>
           <w:rtl w:val="0"/>
         </w:rPr>
-        <w:t xml:space="preserve"> sobre a taxa de sucesso ficou dentro de ±2%, enquanto o Claude Code custou cerca de 2,0 vezes o Pi. Como as fontes divergem sobre o sucesso, este projeto mede sucesso e custo juntos.</w:t>
+        <w:t xml:space="preserve"> sobre a taxa de sucesso ficou dentro de ±2%, enquanto o Claude Code custou, em média, cerca de 2,0 vezes o Pi. Como as fontes divergem sobre o sucesso, este projeto mede sucesso e custo juntos.</w:t>
       </w:r>
     </w:p>
     <w:p>
@@ -1896,7 +1923,7 @@
           <w:iCs w:val="0"/>
           <w:rtl w:val="0"/>
         </w:rPr>
-        <w:t xml:space="preserve">A primeira pendência é saber de onde vem a diferença de custo. Pan </w:t>
+        <w:t xml:space="preserve">A primeira pendência é saber de onde vem a diferença de custo. Para Pan </w:t>
       </w:r>
       <w:r>
         <w:rPr>
@@ -1916,7 +1943,7 @@
           <w:iCs w:val="0"/>
           <w:rtl w:val="0"/>
         </w:rPr>
-        <w:t xml:space="preserve"> (2026) apontam a primeira requisição. O contexto inicial do Claude Code passa de dez vezes o do Pi, com número de turnos parecido (15,3 contra 15,4 no Claude Fable 5). Liu </w:t>
+        <w:t xml:space="preserve"> (2026), o imposto pode começar na primeira requisição: nos sete modelos, o contexto inicial médio do Claude Code passa de dez vezes o do Pi, e no Claude Fable 5 os turnos quase se igualam (15,3 contra 15,4). Liu </w:t>
       </w:r>
       <w:r>
         <w:rPr>
@@ -1936,7 +1963,7 @@
           <w:iCs w:val="0"/>
           <w:rtl w:val="0"/>
         </w:rPr>
-        <w:t xml:space="preserve"> (2026) apontam o resto da conversa. Mudando só a execução das ações, a compactação de contexto e o tratamento das observações, cortaram de 44,7% a 49,0% dos tokens em relação ao Pi e mantiveram de 93,7% a 94,3% da pontuação dele. Ning </w:t>
+        <w:t xml:space="preserve"> (2026) apontam o resto da conversa. Mudando só a execução das ações, a compactação de contexto, o tratamento das observações e a leitura delegada, cortaram de 44,7% a 49,0% dos tokens em relação ao Pi e mantiveram de 93,7% a 94,3% da pontuação dele. Ning </w:t>
       </w:r>
       <w:r>
         <w:rPr>
@@ -1956,7 +1983,7 @@
           <w:iCs w:val="0"/>
           <w:rtl w:val="0"/>
         </w:rPr>
-        <w:t xml:space="preserve"> (2026, §5.2.7, tradução nossa) pedem “métricas que isolem componentes do </w:t>
+        <w:t xml:space="preserve"> (2026, p. 66, tradução nossa) pedem “métricas que isolem componentes do </w:t>
       </w:r>
       <w:r>
         <w:rPr>
@@ -2092,8 +2119,8 @@
       <w:r>
         <w:rPr>
           <w:b w:val="0"/>
-          <w:bCs w:val="0"/>
-          <w:i w:val="0"/>
+          <w:i w:val="0"/>
+          <w:bCs w:val="0"/>
           <w:iCs w:val="0"/>
           <w:rtl w:val="0"/>
         </w:rPr>
@@ -2102,9 +2129,9 @@
       <w:r>
         <w:rPr>
           <w:b w:val="0"/>
-          <w:bCs w:val="0"/>
-          <w:i w:val="1"/>
-          <w:iCs w:val="1"/>
+          <w:i/>
+          <w:bCs w:val="0"/>
+          <w:iCs w:val="0"/>
           <w:rtl w:val="0"/>
         </w:rPr>
         <w:t xml:space="preserve">et al.</w:t>
@@ -2112,8 +2139,8 @@
       <w:r>
         <w:rPr>
           <w:b w:val="0"/>
-          <w:bCs w:val="0"/>
-          <w:i w:val="0"/>
+          <w:i w:val="0"/>
+          <w:bCs w:val="0"/>
           <w:iCs w:val="0"/>
           <w:rtl w:val="0"/>
         </w:rPr>
@@ -2122,9 +2149,9 @@
       <w:r>
         <w:rPr>
           <w:b w:val="0"/>
-          <w:bCs w:val="0"/>
-          <w:i w:val="1"/>
-          <w:iCs w:val="1"/>
+          <w:i/>
+          <w:bCs w:val="0"/>
+          <w:iCs w:val="0"/>
           <w:rtl w:val="0"/>
         </w:rPr>
         <w:t xml:space="preserve">et al.</w:t>
@@ -2132,8 +2159,8 @@
       <w:r>
         <w:rPr>
           <w:b w:val="0"/>
-          <w:bCs w:val="0"/>
-          <w:i w:val="0"/>
+          <w:i w:val="0"/>
+          <w:bCs w:val="0"/>
           <w:iCs w:val="0"/>
           <w:rtl w:val="0"/>
         </w:rPr>
@@ -2142,9 +2169,9 @@
       <w:r>
         <w:rPr>
           <w:b w:val="0"/>
-          <w:bCs w:val="0"/>
-          <w:i w:val="1"/>
-          <w:iCs w:val="1"/>
+          <w:i/>
+          <w:bCs w:val="0"/>
+          <w:iCs w:val="0"/>
           <w:rtl w:val="0"/>
         </w:rPr>
         <w:t xml:space="preserve">harness</w:t>
@@ -2152,17 +2179,12 @@
       <w:r>
         <w:rPr>
           <w:b w:val="0"/>
-          <w:bCs w:val="0"/>
-          <w:i w:val="0"/>
-          <w:iCs w:val="0"/>
-          <w:rtl w:val="0"/>
-        </w:rPr>
-        <w:t xml:space="preserve"> de outro fornecedor. Por isso o desenho terá dois níveis de modelo.</w:t>
-      </w:r>
-      <w:r>
-        <w:rPr>
-          <w:rtl w:val="0"/>
-        </w:rPr>
+          <w:i w:val="0"/>
+          <w:bCs w:val="0"/>
+          <w:iCs w:val="0"/>
+          <w:rtl w:val="0"/>
+        </w:rPr>
+        <w:t xml:space="preserve"> que não é o do fornecedor do modelo. Por isso o desenho terá dois níveis de modelo.</w:t>
       </w:r>
     </w:p>
     <w:p>
@@ -2197,19 +2219,19 @@
       <w:r>
         <w:rPr>
           <w:b w:val="0"/>
-          <w:bCs w:val="0"/>
-          <w:i w:val="0"/>
-          <w:iCs w:val="0"/>
-          <w:rtl w:val="0"/>
-        </w:rPr>
-        <w:t xml:space="preserve">A pesquisa é aplicada quanto à finalidade, quali-quantitativa quanto à abordagem, exploratória quanto aos objetivos, experimental quanto aos procedimentos e dedutiva quanto ao método. É exploratória porque não há comparação publicada de </w:t>
-      </w:r>
-      <w:r>
-        <w:rPr>
-          <w:b w:val="0"/>
-          <w:bCs w:val="0"/>
-          <w:i w:val="1"/>
-          <w:iCs w:val="1"/>
+          <w:i w:val="0"/>
+          <w:bCs w:val="0"/>
+          <w:iCs w:val="0"/>
+          <w:rtl w:val="0"/>
+        </w:rPr>
+        <w:t xml:space="preserve">A pesquisa é aplicada quanto à finalidade, quali-quantitativa quanto à abordagem, exploratória quanto aos objetivos, experimental quanto aos procedimentos e dedutiva quanto ao método. É exploratória porque não se encontrou comparação publicada de </w:t>
+      </w:r>
+      <w:r>
+        <w:rPr>
+          <w:b w:val="0"/>
+          <w:i/>
+          <w:bCs w:val="0"/>
+          <w:iCs w:val="0"/>
           <w:rtl w:val="0"/>
         </w:rPr>
         <w:t xml:space="preserve">harnesses</w:t>
@@ -2217,8 +2239,8 @@
       <w:r>
         <w:rPr>
           <w:b w:val="0"/>
-          <w:bCs w:val="0"/>
-          <w:i w:val="0"/>
+          <w:i w:val="0"/>
+          <w:bCs w:val="0"/>
           <w:iCs w:val="0"/>
           <w:rtl w:val="0"/>
         </w:rPr>
@@ -2227,9 +2249,9 @@
       <w:r>
         <w:rPr>
           <w:b w:val="0"/>
-          <w:bCs w:val="0"/>
-          <w:i w:val="1"/>
-          <w:iCs w:val="1"/>
+          <w:i/>
+          <w:bCs w:val="0"/>
+          <w:iCs w:val="0"/>
           <w:rtl w:val="0"/>
         </w:rPr>
         <w:t xml:space="preserve">harness</w:t>
@@ -2237,17 +2259,12 @@
       <w:r>
         <w:rPr>
           <w:b w:val="0"/>
-          <w:bCs w:val="0"/>
-          <w:i w:val="0"/>
+          <w:i w:val="0"/>
+          <w:bCs w:val="0"/>
           <w:iCs w:val="0"/>
           <w:rtl w:val="0"/>
         </w:rPr>
         <w:t xml:space="preserve"> é a variável manipulada, e modelo, especificação, espaço de trabalho inicial e limites ficam controlados.</w:t>
-      </w:r>
-      <w:r>
-        <w:rPr>
-          <w:rtl w:val="0"/>
-        </w:rPr>
       </w:r>
     </w:p>
     <w:p>
@@ -2703,7 +2720,7 @@
           <w:iCs w:val="0"/>
           <w:rtl w:val="0"/>
         </w:rPr>
-        <w:t xml:space="preserve">A comparação usará o teste de Wilcoxon dos postos sinalizados, bilateral, α = 0,05, sobre tokens e Succ/Mtok, pareado por unidade porque a dificuldade da unidade é a maior fonte de variação (Miller, 2024). O resultado principal será a razão entre as medianas de tokens por construção dos braços. A fração de testes aprovados será relatada sem teste, pois um empate em 100% não deixa diferença a testar. As predições serão registradas antes da coleta.</w:t>
+        <w:t xml:space="preserve">A comparação usará o teste de Wilcoxon dos postos sinalizados, bilateral, α = 0,05, sobre tokens e Succ/Mtok, pareado por unidade. O pareamento remove a dificuldade comum aos dois braços (Miller, 2024). O resultado principal será a razão entre as medianas de tokens por construção dos braços. A fração de testes aprovados será relatada sem teste, pois um empate em 100% não deixa diferença a testar. As predições serão registradas antes da coleta.</w:t>
       </w:r>
     </w:p>
     <w:p>

</xml_diff>

<commit_message>
docs(project): padroniza para mesmo modelo e coding agents no docx
</commit_message>
<xml_diff>
--- a/dist/projeto-de-pesquisa.docx
+++ b/dist/projeto-de-pesquisa.docx
@@ -184,7 +184,17 @@
           <w:szCs w:val="32"/>
           <w:rtl w:val="0"/>
         </w:rPr>
-        <w:t xml:space="preserve"> NO CUSTO E NO DESEMPENHO DE AGENTES DE CODIFICAÇÃO: TOKENS E TAXA DE SUCESSO COM O MODELO FIXO</w:t>
+        <w:t xml:space="preserve"> NO CUSTO E NO DESEMPENHO DE AGENTES DE CODIFICAÇÃO: TOKENS E TAXA DE SUCESSO COM O </w:t>
+      </w:r>
+      <w:r>
+        <w:rPr>
+          <w:b w:val="1"/>
+          <w:bCs w:val="1"/>
+          <w:sz w:val="32"/>
+          <w:szCs w:val="32"/>
+          <w:rtl w:val="0"/>
+        </w:rPr>
+        <w:t xml:space="preserve">MESMO MODELO</w:t>
       </w:r>
       <w:r>
         <w:rPr>
@@ -281,10 +291,17 @@
       <w:r>
         <w:rPr>
           <w:b w:val="0"/>
-          <w:i w:val="0"/>
+          <w:bCs w:val="0"/>
+          <w:i w:val="0"/>
+          <w:iCs w:val="0"/>
           <w:rtl w:val="0"/>
         </w:rPr>
         <w:t xml:space="preserve">Cuiabá – MT</w:t>
+      </w:r>
+      <w:r>
+        <w:rPr>
+          <w:rtl w:val="0"/>
+        </w:rPr>
       </w:r>
     </w:p>
     <w:p>
@@ -376,7 +393,17 @@
           <w:szCs w:val="32"/>
           <w:rtl w:val="0"/>
         </w:rPr>
-        <w:t xml:space="preserve"> NO CUSTO E NO DESEMPENHO DE AGENTES DE CODIFICAÇÃO: TOKENS E TAXA DE SUCESSO COM O MODELO FIXO</w:t>
+        <w:t xml:space="preserve"> NO CUSTO E NO DESEMPENHO DE AGENTES DE CODIFICAÇÃO: TOKENS E TAXA DE SUCESSO COM O </w:t>
+      </w:r>
+      <w:r>
+        <w:rPr>
+          <w:b w:val="1"/>
+          <w:bCs w:val="1"/>
+          <w:sz w:val="32"/>
+          <w:szCs w:val="32"/>
+          <w:rtl w:val="0"/>
+        </w:rPr>
+        <w:t xml:space="preserve">MESMO MODELO</w:t>
       </w:r>
       <w:r>
         <w:rPr>
@@ -490,10 +517,17 @@
       <w:r>
         <w:rPr>
           <w:b w:val="0"/>
-          <w:i w:val="0"/>
+          <w:bCs w:val="0"/>
+          <w:i w:val="0"/>
+          <w:iCs w:val="0"/>
           <w:rtl w:val="0"/>
         </w:rPr>
         <w:t xml:space="preserve">Cuiabá – MT</w:t>
+      </w:r>
+      <w:r>
+        <w:rPr>
+          <w:rtl w:val="0"/>
+        </w:rPr>
       </w:r>
     </w:p>
     <w:p>
@@ -702,8 +736,8 @@
       <w:r>
         <w:rPr>
           <w:b w:val="0"/>
-          <w:i w:val="0"/>
-          <w:bCs w:val="0"/>
+          <w:bCs w:val="0"/>
+          <w:i w:val="0"/>
           <w:iCs w:val="0"/>
           <w:rtl w:val="0"/>
         </w:rPr>
@@ -712,18 +746,28 @@
       <w:r>
         <w:rPr>
           <w:b w:val="0"/>
-          <w:i/>
-          <w:bCs w:val="0"/>
-          <w:iCs w:val="0"/>
-          <w:rtl w:val="0"/>
-        </w:rPr>
-        <w:t xml:space="preserve">coding agent</w:t>
-      </w:r>
-      <w:r>
-        <w:rPr>
-          <w:b w:val="0"/>
-          <w:i w:val="0"/>
-          <w:bCs w:val="0"/>
+          <w:bCs w:val="0"/>
+          <w:i w:val="1"/>
+          <w:iCs w:val="1"/>
+          <w:rtl w:val="0"/>
+        </w:rPr>
+        <w:t xml:space="preserve">coding </w:t>
+      </w:r>
+      <w:r>
+        <w:rPr>
+          <w:b w:val="0"/>
+          <w:bCs w:val="0"/>
+          <w:i w:val="1"/>
+          <w:iCs w:val="1"/>
+          <w:rtl w:val="0"/>
+        </w:rPr>
+        <w:t xml:space="preserve">agent</w:t>
+      </w:r>
+      <w:r>
+        <w:rPr>
+          <w:b w:val="0"/>
+          <w:bCs w:val="0"/>
+          <w:i w:val="0"/>
           <w:iCs w:val="0"/>
           <w:rtl w:val="0"/>
         </w:rPr>
@@ -732,9 +776,9 @@
       <w:r>
         <w:rPr>
           <w:b w:val="0"/>
-          <w:i/>
-          <w:bCs w:val="0"/>
-          <w:iCs w:val="0"/>
+          <w:bCs w:val="0"/>
+          <w:i w:val="1"/>
+          <w:iCs w:val="1"/>
           <w:rtl w:val="0"/>
         </w:rPr>
         <w:t xml:space="preserve">harness</w:t>
@@ -742,8 +786,8 @@
       <w:r>
         <w:rPr>
           <w:b w:val="0"/>
-          <w:i w:val="0"/>
-          <w:bCs w:val="0"/>
+          <w:bCs w:val="0"/>
+          <w:i w:val="0"/>
           <w:iCs w:val="0"/>
           <w:rtl w:val="0"/>
         </w:rPr>
@@ -752,9 +796,9 @@
       <w:r>
         <w:rPr>
           <w:b w:val="0"/>
-          <w:i/>
-          <w:bCs w:val="0"/>
-          <w:iCs w:val="0"/>
+          <w:bCs w:val="0"/>
+          <w:i w:val="1"/>
+          <w:iCs w:val="1"/>
           <w:rtl w:val="0"/>
         </w:rPr>
         <w:t xml:space="preserve">et al.</w:t>
@@ -762,8 +806,8 @@
       <w:r>
         <w:rPr>
           <w:b w:val="0"/>
-          <w:i w:val="0"/>
-          <w:bCs w:val="0"/>
+          <w:bCs w:val="0"/>
+          <w:i w:val="0"/>
           <w:iCs w:val="0"/>
           <w:rtl w:val="0"/>
         </w:rPr>
@@ -772,9 +816,9 @@
       <w:r>
         <w:rPr>
           <w:b w:val="0"/>
-          <w:i/>
-          <w:bCs w:val="0"/>
-          <w:iCs w:val="0"/>
+          <w:bCs w:val="0"/>
+          <w:i w:val="1"/>
+          <w:iCs w:val="1"/>
           <w:rtl w:val="0"/>
         </w:rPr>
         <w:t xml:space="preserve">harnesses</w:t>
@@ -782,8 +826,8 @@
       <w:r>
         <w:rPr>
           <w:b w:val="0"/>
-          <w:i w:val="0"/>
-          <w:bCs w:val="0"/>
+          <w:bCs w:val="0"/>
+          <w:i w:val="0"/>
           <w:iCs w:val="0"/>
           <w:rtl w:val="0"/>
         </w:rPr>
@@ -792,9 +836,9 @@
       <w:r>
         <w:rPr>
           <w:b w:val="0"/>
-          <w:i/>
-          <w:bCs w:val="0"/>
-          <w:iCs w:val="0"/>
+          <w:bCs w:val="0"/>
+          <w:i w:val="1"/>
+          <w:iCs w:val="1"/>
           <w:rtl w:val="0"/>
         </w:rPr>
         <w:t xml:space="preserve">harness</w:t>
@@ -802,12 +846,33 @@
       <w:r>
         <w:rPr>
           <w:b w:val="0"/>
-          <w:i w:val="0"/>
-          <w:bCs w:val="0"/>
-          <w:iCs w:val="0"/>
-          <w:rtl w:val="0"/>
-        </w:rPr>
-        <w:t xml:space="preserve"> influencia notavelmente o custo. No SWE-bench Lite, o Claude Fable 5 resolve 97,8% das tentativas no Claude Code e 96,7% no Pi, e o Claude Code custa cerca do dobro por tentativa (US$ 1,33 contra US$ 0,67).</w:t>
+          <w:bCs w:val="0"/>
+          <w:i w:val="0"/>
+          <w:iCs w:val="0"/>
+          <w:rtl w:val="0"/>
+        </w:rPr>
+        <w:t xml:space="preserve"> influencia notavelmente o custo. No SWE-bench Lite, o Fable 5 resolve 97,8% das tentativas no Claude Code e 96,7% no Pi, e o Claude Code custa </w:t>
+      </w:r>
+      <w:r>
+        <w:rPr>
+          <w:rtl w:val="0"/>
+        </w:rPr>
+        <w:t xml:space="preserve">aproximadamente</w:t>
+      </w:r>
+      <w:r>
+        <w:rPr>
+          <w:b w:val="0"/>
+          <w:bCs w:val="0"/>
+          <w:i w:val="0"/>
+          <w:iCs w:val="0"/>
+          <w:rtl w:val="0"/>
+        </w:rPr>
+        <w:t xml:space="preserve"> o dobro por tentativa (US$ 1,33 contra US$ 0,67).</w:t>
+      </w:r>
+      <w:r>
+        <w:rPr>
+          <w:rtl w:val="0"/>
+        </w:rPr>
       </w:r>
     </w:p>
     <w:p>
@@ -820,19 +885,39 @@
       <w:r>
         <w:rPr>
           <w:b w:val="0"/>
-          <w:i w:val="0"/>
-          <w:bCs w:val="0"/>
-          <w:iCs w:val="0"/>
-          <w:rtl w:val="0"/>
-        </w:rPr>
-        <w:t xml:space="preserve">Quem paga por tokens paga também essa diferença, que os autores chamam de imposto do </w:t>
-      </w:r>
-      <w:r>
-        <w:rPr>
-          <w:b w:val="0"/>
-          <w:i/>
-          <w:bCs w:val="0"/>
-          <w:iCs w:val="0"/>
+          <w:bCs w:val="0"/>
+          <w:i w:val="0"/>
+          <w:iCs w:val="0"/>
+          <w:rtl w:val="0"/>
+        </w:rPr>
+        <w:t xml:space="preserve">Quem paga por tokens paga pagando também essa diferença. Essas medições usam tarefas isoladas de </w:t>
+      </w:r>
+      <w:r>
+        <w:rPr>
+          <w:b w:val="0"/>
+          <w:bCs w:val="0"/>
+          <w:i w:val="1"/>
+          <w:iCs w:val="1"/>
+          <w:rtl w:val="0"/>
+        </w:rPr>
+        <w:t xml:space="preserve">benchmarks</w:t>
+      </w:r>
+      <w:r>
+        <w:rPr>
+          <w:b w:val="0"/>
+          <w:bCs w:val="0"/>
+          <w:i w:val="0"/>
+          <w:iCs w:val="0"/>
+          <w:rtl w:val="0"/>
+        </w:rPr>
+        <w:t xml:space="preserve"> que os modelos podem ter visto no treino, e os próprios autores apontam como próximo passo medir o </w:t>
+      </w:r>
+      <w:r>
+        <w:rPr>
+          <w:b w:val="0"/>
+          <w:bCs w:val="0"/>
+          <w:i w:val="1"/>
+          <w:iCs w:val="1"/>
           <w:rtl w:val="0"/>
         </w:rPr>
         <w:t xml:space="preserve">harness</w:t>
@@ -840,39 +925,67 @@
       <w:r>
         <w:rPr>
           <w:b w:val="0"/>
-          <w:i w:val="0"/>
-          <w:bCs w:val="0"/>
-          <w:iCs w:val="0"/>
-          <w:rtl w:val="0"/>
-        </w:rPr>
-        <w:t xml:space="preserve">. Essas medições usam tarefas isoladas de </w:t>
-      </w:r>
-      <w:r>
-        <w:rPr>
-          <w:b w:val="0"/>
-          <w:i/>
-          <w:bCs w:val="0"/>
-          <w:iCs w:val="0"/>
-          <w:rtl w:val="0"/>
-        </w:rPr>
-        <w:t xml:space="preserve">benchmarks</w:t>
-      </w:r>
-      <w:r>
-        <w:rPr>
-          <w:b w:val="0"/>
-          <w:i w:val="0"/>
-          <w:bCs w:val="0"/>
-          <w:iCs w:val="0"/>
-          <w:rtl w:val="0"/>
-        </w:rPr>
-        <w:t xml:space="preserve"> que os modelos podem ter visto no treino, e os próprios autores apontam como próximo passo medir o </w:t>
-      </w:r>
-      <w:r>
-        <w:rPr>
-          <w:b w:val="0"/>
-          <w:i/>
-          <w:bCs w:val="0"/>
-          <w:iCs w:val="0"/>
+          <w:bCs w:val="0"/>
+          <w:i w:val="0"/>
+          <w:iCs w:val="0"/>
+          <w:rtl w:val="0"/>
+        </w:rPr>
+        <w:t xml:space="preserve"> em fluxos reais de desenvolvimento, com tarefas de várias sessões. Este projeto constrói o mesmo produto, o Finn, um </w:t>
+      </w:r>
+      <w:r>
+        <w:rPr>
+          <w:rtl w:val="0"/>
+        </w:rPr>
+        <w:t xml:space="preserve">SaaS voltado para o setor financeiro das empresas, e ele será construído</w:t>
+      </w:r>
+      <w:r>
+        <w:rPr>
+          <w:b w:val="0"/>
+          <w:bCs w:val="0"/>
+          <w:i w:val="0"/>
+          <w:iCs w:val="0"/>
+          <w:rtl w:val="0"/>
+        </w:rPr>
+        <w:t xml:space="preserve"> com o OpenCode e com o Pi, sobre o mesmo modelo e a mesma especificação, e </w:t>
+      </w:r>
+      <w:r>
+        <w:rPr>
+          <w:rtl w:val="0"/>
+        </w:rPr>
+        <w:t xml:space="preserve">a </w:t>
+      </w:r>
+      <w:r>
+        <w:rPr>
+          <w:b w:val="0"/>
+          <w:bCs w:val="0"/>
+          <w:i w:val="0"/>
+          <w:iCs w:val="0"/>
+          <w:rtl w:val="0"/>
+        </w:rPr>
+        <w:t xml:space="preserve">conta </w:t>
+      </w:r>
+      <w:r>
+        <w:rPr>
+          <w:rtl w:val="0"/>
+        </w:rPr>
+        <w:t xml:space="preserve">de</w:t>
+      </w:r>
+      <w:r>
+        <w:rPr>
+          <w:b w:val="0"/>
+          <w:bCs w:val="0"/>
+          <w:i w:val="0"/>
+          <w:iCs w:val="0"/>
+          <w:rtl w:val="0"/>
+        </w:rPr>
+        <w:t xml:space="preserve"> tokens fora do </w:t>
+      </w:r>
+      <w:r>
+        <w:rPr>
+          <w:b w:val="0"/>
+          <w:bCs w:val="0"/>
+          <w:i w:val="1"/>
+          <w:iCs w:val="1"/>
           <w:rtl w:val="0"/>
         </w:rPr>
         <w:t xml:space="preserve">harness</w:t>
@@ -880,32 +993,17 @@
       <w:r>
         <w:rPr>
           <w:b w:val="0"/>
-          <w:i w:val="0"/>
-          <w:bCs w:val="0"/>
-          <w:iCs w:val="0"/>
-          <w:rtl w:val="0"/>
-        </w:rPr>
-        <w:t xml:space="preserve"> em fluxos reais de desenvolvimento, com tarefas de várias sessões. Este projeto constrói o mesmo produto, o Finn, com o OpenCode e com o Pi, sobre o mesmo modelo e a mesma especificação, e conta os tokens fora do </w:t>
-      </w:r>
-      <w:r>
-        <w:rPr>
-          <w:b w:val="0"/>
-          <w:i/>
-          <w:bCs w:val="0"/>
-          <w:iCs w:val="0"/>
-          <w:rtl w:val="0"/>
-        </w:rPr>
-        <w:t xml:space="preserve">harness</w:t>
-      </w:r>
-      <w:r>
-        <w:rPr>
-          <w:b w:val="0"/>
-          <w:i w:val="0"/>
-          <w:bCs w:val="0"/>
+          <w:bCs w:val="0"/>
+          <w:i w:val="0"/>
           <w:iCs w:val="0"/>
           <w:rtl w:val="0"/>
         </w:rPr>
         <w:t xml:space="preserve">.</w:t>
+      </w:r>
+      <w:r>
+        <w:rPr>
+          <w:rtl w:val="0"/>
+        </w:rPr>
       </w:r>
     </w:p>
     <w:p>
@@ -999,19 +1097,35 @@
       <w:r>
         <w:rPr>
           <w:b w:val="0"/>
-          <w:i w:val="0"/>
-          <w:bCs w:val="0"/>
-          <w:iCs w:val="0"/>
-          <w:rtl w:val="0"/>
-        </w:rPr>
-        <w:t xml:space="preserve">Com o modelo fixo, quanto a escolha do </w:t>
-      </w:r>
-      <w:r>
-        <w:rPr>
-          <w:b w:val="0"/>
-          <w:i/>
-          <w:bCs w:val="0"/>
-          <w:iCs w:val="0"/>
+          <w:bCs w:val="0"/>
+          <w:i w:val="0"/>
+          <w:iCs w:val="0"/>
+          <w:rtl w:val="0"/>
+        </w:rPr>
+        <w:t xml:space="preserve">Com o </w:t>
+      </w:r>
+      <w:r>
+        <w:rPr>
+          <w:rtl w:val="0"/>
+        </w:rPr>
+        <w:t xml:space="preserve">mesmo modelo,</w:t>
+      </w:r>
+      <w:r>
+        <w:rPr>
+          <w:b w:val="0"/>
+          <w:bCs w:val="0"/>
+          <w:i w:val="0"/>
+          <w:iCs w:val="0"/>
+          <w:rtl w:val="0"/>
+        </w:rPr>
+        <w:t xml:space="preserve"> quanto a escolha do </w:t>
+      </w:r>
+      <w:r>
+        <w:rPr>
+          <w:b w:val="0"/>
+          <w:bCs w:val="0"/>
+          <w:i w:val="1"/>
+          <w:iCs w:val="1"/>
           <w:rtl w:val="0"/>
         </w:rPr>
         <w:t xml:space="preserve">harness</w:t>
@@ -1019,12 +1133,17 @@
       <w:r>
         <w:rPr>
           <w:b w:val="0"/>
-          <w:i w:val="0"/>
-          <w:bCs w:val="0"/>
+          <w:bCs w:val="0"/>
+          <w:i w:val="0"/>
           <w:iCs w:val="0"/>
           <w:rtl w:val="0"/>
         </w:rPr>
         <w:t xml:space="preserve"> influencia o custo e a taxa de sucesso na construção do mesmo software?</w:t>
+      </w:r>
+      <w:r>
+        <w:rPr>
+          <w:rtl w:val="0"/>
+        </w:rPr>
       </w:r>
     </w:p>
     <w:p>
@@ -1056,19 +1175,35 @@
       <w:r>
         <w:rPr>
           <w:b w:val="0"/>
-          <w:i w:val="0"/>
-          <w:bCs w:val="0"/>
-          <w:iCs w:val="0"/>
-          <w:rtl w:val="0"/>
-        </w:rPr>
-        <w:t xml:space="preserve">Medir, com o modelo fixo, a diferença de tokens e de taxa de sucesso atribuível ao </w:t>
-      </w:r>
-      <w:r>
-        <w:rPr>
-          <w:b w:val="0"/>
-          <w:i/>
-          <w:bCs w:val="0"/>
-          <w:iCs w:val="0"/>
+          <w:bCs w:val="0"/>
+          <w:i w:val="0"/>
+          <w:iCs w:val="0"/>
+          <w:rtl w:val="0"/>
+        </w:rPr>
+        <w:t xml:space="preserve">Medir, com o </w:t>
+      </w:r>
+      <w:r>
+        <w:rPr>
+          <w:rtl w:val="0"/>
+        </w:rPr>
+        <w:t xml:space="preserve">mesmo modelo, </w:t>
+      </w:r>
+      <w:r>
+        <w:rPr>
+          <w:b w:val="0"/>
+          <w:bCs w:val="0"/>
+          <w:i w:val="0"/>
+          <w:iCs w:val="0"/>
+          <w:rtl w:val="0"/>
+        </w:rPr>
+        <w:t xml:space="preserve">a diferença de tokens e de taxa de sucesso atribuível ao </w:t>
+      </w:r>
+      <w:r>
+        <w:rPr>
+          <w:b w:val="0"/>
+          <w:bCs w:val="0"/>
+          <w:i w:val="1"/>
+          <w:iCs w:val="1"/>
           <w:rtl w:val="0"/>
         </w:rPr>
         <w:t xml:space="preserve">harness</w:t>
@@ -1076,12 +1211,35 @@
       <w:r>
         <w:rPr>
           <w:b w:val="0"/>
-          <w:i w:val="0"/>
-          <w:bCs w:val="0"/>
-          <w:iCs w:val="0"/>
-          <w:rtl w:val="0"/>
-        </w:rPr>
-        <w:t xml:space="preserve"> na construção do mesmo produto a partir da mesma especificação, com o OpenCode e o Pi como braços, e separar a parcela que vem da carga fixa por requisição.</w:t>
+          <w:bCs w:val="0"/>
+          <w:i w:val="0"/>
+          <w:iCs w:val="0"/>
+          <w:rtl w:val="0"/>
+        </w:rPr>
+        <w:t xml:space="preserve"> na construção do mesmo produto a partir da mesma especificação, com o OpenCode e o Pi como </w:t>
+      </w:r>
+      <w:r>
+        <w:rPr>
+          <w:i w:val="1"/>
+          <w:iCs w:val="1"/>
+          <w:rtl w:val="0"/>
+        </w:rPr>
+        <w:t xml:space="preserve">coding agents</w:t>
+      </w:r>
+      <w:r>
+        <w:rPr>
+          <w:b w:val="0"/>
+          <w:bCs w:val="0"/>
+          <w:i w:val="0"/>
+          <w:iCs w:val="0"/>
+          <w:rtl w:val="0"/>
+        </w:rPr>
+        <w:t xml:space="preserve">, e separar a parcela que vem da carga fixa por requisição.</w:t>
+      </w:r>
+      <w:r>
+        <w:rPr>
+          <w:rtl w:val="0"/>
+        </w:rPr>
       </w:r>
     </w:p>
     <w:p>
@@ -1138,7 +1296,25 @@
           <w:iCs w:val="0"/>
           <w:rtl w:val="0"/>
         </w:rPr>
-        <w:t xml:space="preserve"> que conta requisições, tokens e latência por braço;</w:t>
+        <w:t xml:space="preserve"> que conta requisições, tokens e latência por </w:t>
+      </w:r>
+      <w:r>
+        <w:rPr>
+          <w:i w:val="1"/>
+          <w:iCs w:val="1"/>
+          <w:rtl w:val="0"/>
+        </w:rPr>
+        <w:t xml:space="preserve">coding agent</w:t>
+      </w:r>
+      <w:r>
+        <w:rPr>
+          <w:b w:val="0"/>
+          <w:bCs w:val="0"/>
+          <w:i w:val="0"/>
+          <w:iCs w:val="0"/>
+          <w:rtl w:val="0"/>
+        </w:rPr>
+        <w:t xml:space="preserve">;</w:t>
       </w:r>
       <w:r>
         <w:rPr>
@@ -1156,12 +1332,17 @@
       <w:r>
         <w:rPr>
           <w:b w:val="0"/>
-          <w:i w:val="0"/>
-          <w:bCs w:val="0"/>
+          <w:bCs w:val="0"/>
+          <w:i w:val="0"/>
           <w:iCs w:val="0"/>
           <w:rtl w:val="0"/>
         </w:rPr>
         <w:t xml:space="preserve">2) construir o Finn de referência e extrair dele a especificação e os testes;</w:t>
+      </w:r>
+      <w:r>
+        <w:rPr>
+          <w:rtl w:val="0"/>
+        </w:rPr>
       </w:r>
     </w:p>
     <w:p>
@@ -1242,7 +1423,25 @@
           <w:iCs w:val="0"/>
           <w:rtl w:val="0"/>
         </w:rPr>
-        <w:t xml:space="preserve">4) repetir em um segundo modelo e verificar se a ordenação dos braços se mantém;</w:t>
+        <w:t xml:space="preserve">4) repetir em um segundo modelo e verificar se a ordenação dos </w:t>
+      </w:r>
+      <w:r>
+        <w:rPr>
+          <w:i w:val="1"/>
+          <w:iCs w:val="1"/>
+          <w:rtl w:val="0"/>
+        </w:rPr>
+        <w:t xml:space="preserve">coding agents</w:t>
+      </w:r>
+      <w:r>
+        <w:rPr>
+          <w:b w:val="0"/>
+          <w:bCs w:val="0"/>
+          <w:i w:val="0"/>
+          <w:iCs w:val="0"/>
+          <w:rtl w:val="0"/>
+        </w:rPr>
+        <w:t xml:space="preserve"> se mantém;</w:t>
       </w:r>
       <w:r>
         <w:rPr>
@@ -1385,8 +1584,8 @@
       <w:r>
         <w:rPr>
           <w:b w:val="0"/>
-          <w:i w:val="0"/>
-          <w:bCs w:val="0"/>
+          <w:bCs w:val="0"/>
+          <w:i w:val="0"/>
           <w:iCs w:val="0"/>
           <w:rtl w:val="0"/>
         </w:rPr>
@@ -1395,9 +1594,9 @@
       <w:r>
         <w:rPr>
           <w:b w:val="0"/>
-          <w:i/>
-          <w:bCs w:val="0"/>
-          <w:iCs w:val="0"/>
+          <w:bCs w:val="0"/>
+          <w:i w:val="1"/>
+          <w:iCs w:val="1"/>
           <w:rtl w:val="0"/>
         </w:rPr>
         <w:t xml:space="preserve">proxy</w:t>
@@ -1405,8 +1604,8 @@
       <w:r>
         <w:rPr>
           <w:b w:val="0"/>
-          <w:i w:val="0"/>
-          <w:bCs w:val="0"/>
+          <w:bCs w:val="0"/>
+          <w:i w:val="0"/>
           <w:iCs w:val="0"/>
           <w:rtl w:val="0"/>
         </w:rPr>
@@ -1415,9 +1614,9 @@
       <w:r>
         <w:rPr>
           <w:b w:val="0"/>
-          <w:i/>
-          <w:bCs w:val="0"/>
-          <w:iCs w:val="0"/>
+          <w:bCs w:val="0"/>
+          <w:i w:val="1"/>
+          <w:iCs w:val="1"/>
           <w:rtl w:val="0"/>
         </w:rPr>
         <w:t xml:space="preserve">harness</w:t>
@@ -1425,12 +1624,101 @@
       <w:r>
         <w:rPr>
           <w:b w:val="0"/>
-          <w:i w:val="0"/>
-          <w:bCs w:val="0"/>
-          <w:iCs w:val="0"/>
-          <w:rtl w:val="0"/>
-        </w:rPr>
-        <w:t xml:space="preserve"> e o modelo contará requisições, tokens e latência da mesma forma para os dois braços. Cada braço construirá o Finn do zero ao menos três vezes, a partir da especificação extraída do Finn de referência do autor, e a diferença entre os braços será comparada unidade a unidade.</w:t>
+          <w:bCs w:val="0"/>
+          <w:i w:val="0"/>
+          <w:iCs w:val="0"/>
+          <w:rtl w:val="0"/>
+        </w:rPr>
+        <w:t xml:space="preserve"> e o modelo contará requisições, tokens e latência da mesma forma para os dois </w:t>
+      </w:r>
+      <w:r>
+        <w:rPr>
+          <w:i w:val="1"/>
+          <w:iCs w:val="1"/>
+          <w:rtl w:val="0"/>
+        </w:rPr>
+        <w:t xml:space="preserve">coding </w:t>
+      </w:r>
+      <w:r>
+        <w:rPr>
+          <w:i w:val="1"/>
+          <w:iCs w:val="1"/>
+          <w:rtl w:val="0"/>
+        </w:rPr>
+        <w:t xml:space="preserve">agents</w:t>
+      </w:r>
+      <w:r>
+        <w:rPr>
+          <w:rtl w:val="0"/>
+        </w:rPr>
+        <w:t xml:space="preserve">. </w:t>
+      </w:r>
+      <w:r>
+        <w:rPr>
+          <w:b w:val="0"/>
+          <w:bCs w:val="0"/>
+          <w:i w:val="0"/>
+          <w:iCs w:val="0"/>
+          <w:rtl w:val="0"/>
+        </w:rPr>
+        <w:t xml:space="preserve">Cada </w:t>
+      </w:r>
+      <w:r>
+        <w:rPr>
+          <w:i w:val="1"/>
+          <w:iCs w:val="1"/>
+          <w:rtl w:val="0"/>
+        </w:rPr>
+        <w:t xml:space="preserve">coding </w:t>
+      </w:r>
+      <w:r>
+        <w:rPr>
+          <w:i w:val="1"/>
+          <w:iCs w:val="1"/>
+          <w:rtl w:val="0"/>
+        </w:rPr>
+        <w:t xml:space="preserve">agent</w:t>
+      </w:r>
+      <w:r>
+        <w:rPr>
+          <w:i w:val="1"/>
+          <w:iCs w:val="1"/>
+          <w:rtl w:val="0"/>
+        </w:rPr>
+        <w:t xml:space="preserve"> </w:t>
+      </w:r>
+      <w:r>
+        <w:rPr>
+          <w:b w:val="0"/>
+          <w:bCs w:val="0"/>
+          <w:i w:val="0"/>
+          <w:iCs w:val="0"/>
+          <w:rtl w:val="0"/>
+        </w:rPr>
+        <w:t xml:space="preserve">construirá o Finn do zero ao menos três vezes, a partir da especificação extraída do Finn de referência do autor, e a diferença entre os </w:t>
+      </w:r>
+      <w:r>
+        <w:rPr>
+          <w:i w:val="1"/>
+          <w:iCs w:val="1"/>
+          <w:rtl w:val="0"/>
+        </w:rPr>
+        <w:t xml:space="preserve">coding agents </w:t>
+      </w:r>
+      <w:r>
+        <w:rPr>
+          <w:b w:val="0"/>
+          <w:bCs w:val="0"/>
+          <w:i w:val="0"/>
+          <w:iCs w:val="0"/>
+          <w:rtl w:val="0"/>
+        </w:rPr>
+        <w:t xml:space="preserve">será comparada unidade a unidade.</w:t>
+      </w:r>
+      <w:r>
+        <w:rPr>
+          <w:rtl w:val="0"/>
+        </w:rPr>
       </w:r>
     </w:p>
     <w:p>
@@ -1462,8 +1750,8 @@
       <w:r>
         <w:rPr>
           <w:b w:val="0"/>
-          <w:i w:val="0"/>
-          <w:bCs w:val="0"/>
+          <w:bCs w:val="0"/>
+          <w:i w:val="0"/>
           <w:iCs w:val="0"/>
           <w:rtl w:val="0"/>
         </w:rPr>
@@ -1472,9 +1760,9 @@
       <w:r>
         <w:rPr>
           <w:b w:val="0"/>
-          <w:i/>
-          <w:bCs w:val="0"/>
-          <w:iCs w:val="0"/>
+          <w:bCs w:val="0"/>
+          <w:i w:val="1"/>
+          <w:iCs w:val="1"/>
           <w:rtl w:val="0"/>
         </w:rPr>
         <w:t xml:space="preserve">harness</w:t>
@@ -1482,12 +1770,25 @@
       <w:r>
         <w:rPr>
           <w:b w:val="0"/>
-          <w:i w:val="0"/>
-          <w:bCs w:val="0"/>
-          <w:iCs w:val="0"/>
-          <w:rtl w:val="0"/>
-        </w:rPr>
-        <w:t xml:space="preserve"> muda mais o custo do que o sucesso. Os tokens por unidade diferem entre o OpenCode e o Pi, e a fração de testes aprovados fica igual. H1 será refutada se o teste pareado não apontar diferença de tokens ou se as medianas da fração final de testes aprovados diferirem entre os braços.</w:t>
+          <w:bCs w:val="0"/>
+          <w:i w:val="0"/>
+          <w:iCs w:val="0"/>
+          <w:rtl w:val="0"/>
+        </w:rPr>
+        <w:t xml:space="preserve"> muda mais o custo do que o sucesso. Os tokens por unidade diferem entre o OpenCode e o Pi, e a fração de testes aprovados fica igual. H1 será refutada se o teste pareado não apontar diferença de tokens ou se as medianas da fração final de testes aprovados diferirem entre os </w:t>
+      </w:r>
+      <w:r>
+        <w:rPr>
+          <w:i w:val="1"/>
+          <w:iCs w:val="1"/>
+          <w:rtl w:val="0"/>
+        </w:rPr>
+        <w:t xml:space="preserve">coding agents.</w:t>
+      </w:r>
+      <w:r>
+        <w:rPr>
+          <w:rtl w:val="0"/>
+        </w:rPr>
       </w:r>
     </w:p>
     <w:p>
@@ -1586,8 +1887,8 @@
       <w:r>
         <w:rPr>
           <w:b w:val="0"/>
-          <w:i w:val="0"/>
-          <w:bCs w:val="0"/>
+          <w:bCs w:val="0"/>
+          <w:i w:val="0"/>
           <w:iCs w:val="0"/>
           <w:rtl w:val="0"/>
         </w:rPr>
@@ -1596,9 +1897,9 @@
       <w:r>
         <w:rPr>
           <w:b w:val="0"/>
-          <w:i/>
-          <w:bCs w:val="0"/>
-          <w:iCs w:val="0"/>
+          <w:bCs w:val="0"/>
+          <w:i w:val="1"/>
+          <w:iCs w:val="1"/>
           <w:rtl w:val="0"/>
         </w:rPr>
         <w:t xml:space="preserve">et al.</w:t>
@@ -1606,8 +1907,8 @@
       <w:r>
         <w:rPr>
           <w:b w:val="0"/>
-          <w:i w:val="0"/>
-          <w:bCs w:val="0"/>
+          <w:bCs w:val="0"/>
+          <w:i w:val="0"/>
           <w:iCs w:val="0"/>
           <w:rtl w:val="0"/>
         </w:rPr>
@@ -1616,9 +1917,9 @@
       <w:r>
         <w:rPr>
           <w:b w:val="0"/>
-          <w:i/>
-          <w:bCs w:val="0"/>
-          <w:iCs w:val="0"/>
+          <w:bCs w:val="0"/>
+          <w:i w:val="1"/>
+          <w:iCs w:val="1"/>
           <w:rtl w:val="0"/>
         </w:rPr>
         <w:t xml:space="preserve">harness</w:t>
@@ -1626,8 +1927,8 @@
       <w:r>
         <w:rPr>
           <w:b w:val="0"/>
-          <w:i w:val="0"/>
-          <w:bCs w:val="0"/>
+          <w:bCs w:val="0"/>
+          <w:i w:val="0"/>
           <w:iCs w:val="0"/>
           <w:rtl w:val="0"/>
         </w:rPr>
@@ -1636,9 +1937,9 @@
       <w:r>
         <w:rPr>
           <w:b w:val="0"/>
-          <w:i/>
-          <w:bCs w:val="0"/>
-          <w:iCs w:val="0"/>
+          <w:bCs w:val="0"/>
+          <w:i w:val="1"/>
+          <w:iCs w:val="1"/>
           <w:rtl w:val="0"/>
         </w:rPr>
         <w:t xml:space="preserve">et al.</w:t>
@@ -1646,12 +1947,17 @@
       <w:r>
         <w:rPr>
           <w:b w:val="0"/>
-          <w:i w:val="0"/>
-          <w:bCs w:val="0"/>
+          <w:bCs w:val="0"/>
+          <w:i w:val="0"/>
           <w:iCs w:val="0"/>
           <w:rtl w:val="0"/>
         </w:rPr>
         <w:t xml:space="preserve"> (2026) delimitam o que essa camada contém:</w:t>
+      </w:r>
+      <w:r>
+        <w:rPr>
+          <w:rtl w:val="0"/>
+        </w:rPr>
       </w:r>
     </w:p>
     <w:p>
@@ -1664,7 +1970,9 @@
       <w:r>
         <w:rPr>
           <w:b w:val="0"/>
-          <w:i w:val="0"/>
+          <w:bCs w:val="0"/>
+          <w:i w:val="0"/>
+          <w:iCs w:val="0"/>
           <w:sz w:val="20"/>
           <w:szCs w:val="20"/>
           <w:rtl w:val="0"/>
@@ -1674,7 +1982,9 @@
       <w:r>
         <w:rPr>
           <w:b w:val="0"/>
-          <w:i/>
+          <w:bCs w:val="0"/>
+          <w:i w:val="1"/>
+          <w:iCs w:val="1"/>
           <w:sz w:val="20"/>
           <w:szCs w:val="20"/>
           <w:rtl w:val="0"/>
@@ -1684,7 +1994,9 @@
       <w:r>
         <w:rPr>
           <w:b w:val="0"/>
-          <w:i w:val="0"/>
+          <w:bCs w:val="0"/>
+          <w:i w:val="0"/>
+          <w:iCs w:val="0"/>
           <w:sz w:val="20"/>
           <w:szCs w:val="20"/>
           <w:rtl w:val="0"/>
@@ -1694,7 +2006,9 @@
       <w:r>
         <w:rPr>
           <w:b w:val="0"/>
-          <w:i/>
+          <w:bCs w:val="0"/>
+          <w:i w:val="1"/>
+          <w:iCs w:val="1"/>
           <w:sz w:val="20"/>
           <w:szCs w:val="20"/>
           <w:rtl w:val="0"/>
@@ -1704,7 +2018,9 @@
       <w:r>
         <w:rPr>
           <w:b w:val="0"/>
-          <w:i w:val="0"/>
+          <w:bCs w:val="0"/>
+          <w:i w:val="0"/>
+          <w:iCs w:val="0"/>
           <w:sz w:val="20"/>
           <w:szCs w:val="20"/>
           <w:rtl w:val="0"/>
@@ -1714,7 +2030,9 @@
       <w:r>
         <w:rPr>
           <w:b w:val="0"/>
-          <w:i/>
+          <w:bCs w:val="0"/>
+          <w:i w:val="1"/>
+          <w:iCs w:val="1"/>
           <w:sz w:val="20"/>
           <w:szCs w:val="20"/>
           <w:rtl w:val="0"/>
@@ -1724,12 +2042,19 @@
       <w:r>
         <w:rPr>
           <w:b w:val="0"/>
-          <w:i w:val="0"/>
+          <w:bCs w:val="0"/>
+          <w:i w:val="0"/>
+          <w:iCs w:val="0"/>
           <w:sz w:val="20"/>
           <w:szCs w:val="20"/>
           <w:rtl w:val="0"/>
         </w:rPr>
         <w:t xml:space="preserve">, 2026, p. 1, tradução nossa).</w:t>
+      </w:r>
+      <w:r>
+        <w:rPr>
+          <w:rtl w:val="0"/>
+        </w:rPr>
       </w:r>
     </w:p>
     <w:p>
@@ -1742,19 +2067,37 @@
       <w:r>
         <w:rPr>
           <w:b w:val="0"/>
-          <w:i w:val="0"/>
-          <w:bCs w:val="0"/>
-          <w:iCs w:val="0"/>
-          <w:rtl w:val="0"/>
-        </w:rPr>
-        <w:t xml:space="preserve">Só esse conjunto varia entre os braços deste experimento. O Pi envia quatro ferramentas e um </w:t>
-      </w:r>
-      <w:r>
-        <w:rPr>
-          <w:b w:val="0"/>
-          <w:i/>
-          <w:bCs w:val="0"/>
-          <w:iCs w:val="0"/>
+          <w:bCs w:val="0"/>
+          <w:i w:val="0"/>
+          <w:iCs w:val="0"/>
+          <w:rtl w:val="0"/>
+        </w:rPr>
+        <w:t xml:space="preserve">Só esse conjunto varia entre os </w:t>
+      </w:r>
+      <w:r>
+        <w:rPr>
+          <w:i w:val="1"/>
+          <w:iCs w:val="1"/>
+          <w:rtl w:val="0"/>
+        </w:rPr>
+        <w:t xml:space="preserve">coding agents</w:t>
+      </w:r>
+      <w:r>
+        <w:rPr>
+          <w:b w:val="0"/>
+          <w:bCs w:val="0"/>
+          <w:i w:val="0"/>
+          <w:iCs w:val="0"/>
+          <w:rtl w:val="0"/>
+        </w:rPr>
+        <w:t xml:space="preserve"> deste experimento. O Pi envia quatro ferramentas e um </w:t>
+      </w:r>
+      <w:r>
+        <w:rPr>
+          <w:b w:val="0"/>
+          <w:bCs w:val="0"/>
+          <w:i w:val="1"/>
+          <w:iCs w:val="1"/>
           <w:rtl w:val="0"/>
         </w:rPr>
         <w:t xml:space="preserve">system prompt</w:t>
@@ -1762,12 +2105,17 @@
       <w:r>
         <w:rPr>
           <w:b w:val="0"/>
-          <w:i w:val="0"/>
-          <w:bCs w:val="0"/>
+          <w:bCs w:val="0"/>
+          <w:i w:val="0"/>
           <w:iCs w:val="0"/>
           <w:rtl w:val="0"/>
         </w:rPr>
         <w:t xml:space="preserve"> curto (Earendil, 2026), e o OpenCode envia mais ferramentas, subagentes e permissões (Opencode, 2026a).</w:t>
+      </w:r>
+      <w:r>
+        <w:rPr>
+          <w:rtl w:val="0"/>
+        </w:rPr>
       </w:r>
     </w:p>
     <w:p>
@@ -1780,8 +2128,8 @@
       <w:r>
         <w:rPr>
           <w:b w:val="0"/>
-          <w:i w:val="0"/>
-          <w:bCs w:val="0"/>
+          <w:bCs w:val="0"/>
+          <w:i w:val="0"/>
           <w:iCs w:val="0"/>
           <w:rtl w:val="0"/>
         </w:rPr>
@@ -1790,9 +2138,9 @@
       <w:r>
         <w:rPr>
           <w:b w:val="0"/>
-          <w:i/>
-          <w:bCs w:val="0"/>
-          <w:iCs w:val="0"/>
+          <w:bCs w:val="0"/>
+          <w:i w:val="1"/>
+          <w:iCs w:val="1"/>
           <w:rtl w:val="0"/>
         </w:rPr>
         <w:t xml:space="preserve">et al.</w:t>
@@ -1800,8 +2148,8 @@
       <w:r>
         <w:rPr>
           <w:b w:val="0"/>
-          <w:i w:val="0"/>
-          <w:bCs w:val="0"/>
+          <w:bCs w:val="0"/>
+          <w:i w:val="0"/>
           <w:iCs w:val="0"/>
           <w:rtl w:val="0"/>
         </w:rPr>
@@ -1810,9 +2158,9 @@
       <w:r>
         <w:rPr>
           <w:b w:val="0"/>
-          <w:i/>
-          <w:bCs w:val="0"/>
-          <w:iCs w:val="0"/>
+          <w:bCs w:val="0"/>
+          <w:i w:val="1"/>
+          <w:iCs w:val="1"/>
           <w:rtl w:val="0"/>
         </w:rPr>
         <w:t xml:space="preserve">harnesses</w:t>
@@ -1820,8 +2168,8 @@
       <w:r>
         <w:rPr>
           <w:b w:val="0"/>
-          <w:i w:val="0"/>
-          <w:bCs w:val="0"/>
+          <w:bCs w:val="0"/>
+          <w:i w:val="0"/>
           <w:iCs w:val="0"/>
           <w:rtl w:val="0"/>
         </w:rPr>
@@ -1830,9 +2178,9 @@
       <w:r>
         <w:rPr>
           <w:b w:val="0"/>
-          <w:i/>
-          <w:bCs w:val="0"/>
-          <w:iCs w:val="0"/>
+          <w:bCs w:val="0"/>
+          <w:i w:val="1"/>
+          <w:iCs w:val="1"/>
           <w:rtl w:val="0"/>
         </w:rPr>
         <w:t xml:space="preserve">et al.</w:t>
@@ -1840,8 +2188,8 @@
       <w:r>
         <w:rPr>
           <w:b w:val="0"/>
-          <w:i w:val="0"/>
-          <w:bCs w:val="0"/>
+          <w:bCs w:val="0"/>
+          <w:i w:val="0"/>
           <w:iCs w:val="0"/>
           <w:rtl w:val="0"/>
         </w:rPr>
@@ -1850,9 +2198,9 @@
       <w:r>
         <w:rPr>
           <w:b w:val="0"/>
-          <w:i/>
-          <w:bCs w:val="0"/>
-          <w:iCs w:val="0"/>
+          <w:bCs w:val="0"/>
+          <w:i w:val="1"/>
+          <w:iCs w:val="1"/>
           <w:rtl w:val="0"/>
         </w:rPr>
         <w:t xml:space="preserve">harness</w:t>
@@ -1860,8 +2208,8 @@
       <w:r>
         <w:rPr>
           <w:b w:val="0"/>
-          <w:i w:val="0"/>
-          <w:bCs w:val="0"/>
+          <w:bCs w:val="0"/>
+          <w:i w:val="0"/>
           <w:iCs w:val="0"/>
           <w:rtl w:val="0"/>
         </w:rPr>
@@ -1870,9 +2218,9 @@
       <w:r>
         <w:rPr>
           <w:b w:val="0"/>
-          <w:i/>
-          <w:bCs w:val="0"/>
-          <w:iCs w:val="0"/>
+          <w:bCs w:val="0"/>
+          <w:i w:val="1"/>
+          <w:iCs w:val="1"/>
           <w:rtl w:val="0"/>
         </w:rPr>
         <w:t xml:space="preserve">et al.</w:t>
@@ -1880,8 +2228,8 @@
       <w:r>
         <w:rPr>
           <w:b w:val="0"/>
-          <w:i w:val="0"/>
-          <w:bCs w:val="0"/>
+          <w:bCs w:val="0"/>
+          <w:i w:val="0"/>
           <w:iCs w:val="0"/>
           <w:rtl w:val="0"/>
         </w:rPr>
@@ -1890,9 +2238,9 @@
       <w:r>
         <w:rPr>
           <w:b w:val="0"/>
-          <w:i/>
-          <w:bCs w:val="0"/>
-          <w:iCs w:val="0"/>
+          <w:bCs w:val="0"/>
+          <w:i w:val="1"/>
+          <w:iCs w:val="1"/>
           <w:rtl w:val="0"/>
         </w:rPr>
         <w:t xml:space="preserve">harness</w:t>
@@ -1900,12 +2248,17 @@
       <w:r>
         <w:rPr>
           <w:b w:val="0"/>
-          <w:i w:val="0"/>
-          <w:bCs w:val="0"/>
+          <w:bCs w:val="0"/>
+          <w:i w:val="0"/>
           <w:iCs w:val="0"/>
           <w:rtl w:val="0"/>
         </w:rPr>
         <w:t xml:space="preserve"> sobre a taxa de sucesso ficou dentro de ±2%, enquanto o Claude Code custou, em média, cerca de 2,0 vezes o Pi. Como as fontes divergem sobre o sucesso, este projeto mede sucesso e custo juntos.</w:t>
+      </w:r>
+      <w:r>
+        <w:rPr>
+          <w:rtl w:val="0"/>
+        </w:rPr>
       </w:r>
     </w:p>
     <w:p>
@@ -1918,8 +2271,8 @@
       <w:r>
         <w:rPr>
           <w:b w:val="0"/>
-          <w:i w:val="0"/>
-          <w:bCs w:val="0"/>
+          <w:bCs w:val="0"/>
+          <w:i w:val="0"/>
           <w:iCs w:val="0"/>
           <w:rtl w:val="0"/>
         </w:rPr>
@@ -1928,9 +2281,9 @@
       <w:r>
         <w:rPr>
           <w:b w:val="0"/>
-          <w:i/>
-          <w:bCs w:val="0"/>
-          <w:iCs w:val="0"/>
+          <w:bCs w:val="0"/>
+          <w:i w:val="1"/>
+          <w:iCs w:val="1"/>
           <w:rtl w:val="0"/>
         </w:rPr>
         <w:t xml:space="preserve">et al.</w:t>
@@ -1938,8 +2291,8 @@
       <w:r>
         <w:rPr>
           <w:b w:val="0"/>
-          <w:i w:val="0"/>
-          <w:bCs w:val="0"/>
+          <w:bCs w:val="0"/>
+          <w:i w:val="0"/>
           <w:iCs w:val="0"/>
           <w:rtl w:val="0"/>
         </w:rPr>
@@ -1948,9 +2301,9 @@
       <w:r>
         <w:rPr>
           <w:b w:val="0"/>
-          <w:i/>
-          <w:bCs w:val="0"/>
-          <w:iCs w:val="0"/>
+          <w:bCs w:val="0"/>
+          <w:i w:val="1"/>
+          <w:iCs w:val="1"/>
           <w:rtl w:val="0"/>
         </w:rPr>
         <w:t xml:space="preserve">et al.</w:t>
@@ -1958,8 +2311,8 @@
       <w:r>
         <w:rPr>
           <w:b w:val="0"/>
-          <w:i w:val="0"/>
-          <w:bCs w:val="0"/>
+          <w:bCs w:val="0"/>
+          <w:i w:val="0"/>
           <w:iCs w:val="0"/>
           <w:rtl w:val="0"/>
         </w:rPr>
@@ -1968,9 +2321,9 @@
       <w:r>
         <w:rPr>
           <w:b w:val="0"/>
-          <w:i/>
-          <w:bCs w:val="0"/>
-          <w:iCs w:val="0"/>
+          <w:bCs w:val="0"/>
+          <w:i w:val="1"/>
+          <w:iCs w:val="1"/>
           <w:rtl w:val="0"/>
         </w:rPr>
         <w:t xml:space="preserve">et al.</w:t>
@@ -1978,8 +2331,8 @@
       <w:r>
         <w:rPr>
           <w:b w:val="0"/>
-          <w:i w:val="0"/>
-          <w:bCs w:val="0"/>
+          <w:bCs w:val="0"/>
+          <w:i w:val="0"/>
           <w:iCs w:val="0"/>
           <w:rtl w:val="0"/>
         </w:rPr>
@@ -1988,9 +2341,9 @@
       <w:r>
         <w:rPr>
           <w:b w:val="0"/>
-          <w:i/>
-          <w:bCs w:val="0"/>
-          <w:iCs w:val="0"/>
+          <w:bCs w:val="0"/>
+          <w:i w:val="1"/>
+          <w:iCs w:val="1"/>
           <w:rtl w:val="0"/>
         </w:rPr>
         <w:t xml:space="preserve">harness</w:t>
@@ -1998,12 +2351,17 @@
       <w:r>
         <w:rPr>
           <w:b w:val="0"/>
-          <w:i w:val="0"/>
-          <w:bCs w:val="0"/>
+          <w:bCs w:val="0"/>
+          <w:i w:val="0"/>
           <w:iCs w:val="0"/>
           <w:rtl w:val="0"/>
         </w:rPr>
         <w:t xml:space="preserve">”, e H2 testa se pesa mais a carga fixa ou a conversa.</w:t>
+      </w:r>
+      <w:r>
+        <w:rPr>
+          <w:rtl w:val="0"/>
+        </w:rPr>
       </w:r>
     </w:p>
     <w:p>
@@ -2081,7 +2439,25 @@
           <w:iCs w:val="0"/>
           <w:rtl w:val="0"/>
         </w:rPr>
-        <w:t xml:space="preserve"> externo, igual para os dois braços, e o objetivo (5) compara essa medida com o relato de cada </w:t>
+        <w:t xml:space="preserve"> externo, igual para os dois </w:t>
+      </w:r>
+      <w:r>
+        <w:rPr>
+          <w:i w:val="1"/>
+          <w:iCs w:val="1"/>
+          <w:rtl w:val="0"/>
+        </w:rPr>
+        <w:t xml:space="preserve">coding agents</w:t>
+      </w:r>
+      <w:r>
+        <w:rPr>
+          <w:b w:val="0"/>
+          <w:bCs w:val="0"/>
+          <w:i w:val="0"/>
+          <w:iCs w:val="0"/>
+          <w:rtl w:val="0"/>
+        </w:rPr>
+        <w:t xml:space="preserve">, e o objetivo (5) compara essa medida com o relato de cada </w:t>
       </w:r>
       <w:r>
         <w:rPr>
@@ -2119,8 +2495,8 @@
       <w:r>
         <w:rPr>
           <w:b w:val="0"/>
-          <w:i w:val="0"/>
-          <w:bCs w:val="0"/>
+          <w:bCs w:val="0"/>
+          <w:i w:val="0"/>
           <w:iCs w:val="0"/>
           <w:rtl w:val="0"/>
         </w:rPr>
@@ -2129,9 +2505,9 @@
       <w:r>
         <w:rPr>
           <w:b w:val="0"/>
-          <w:i/>
-          <w:bCs w:val="0"/>
-          <w:iCs w:val="0"/>
+          <w:bCs w:val="0"/>
+          <w:i w:val="1"/>
+          <w:iCs w:val="1"/>
           <w:rtl w:val="0"/>
         </w:rPr>
         <w:t xml:space="preserve">et al.</w:t>
@@ -2139,8 +2515,8 @@
       <w:r>
         <w:rPr>
           <w:b w:val="0"/>
-          <w:i w:val="0"/>
-          <w:bCs w:val="0"/>
+          <w:bCs w:val="0"/>
+          <w:i w:val="0"/>
           <w:iCs w:val="0"/>
           <w:rtl w:val="0"/>
         </w:rPr>
@@ -2149,9 +2525,9 @@
       <w:r>
         <w:rPr>
           <w:b w:val="0"/>
-          <w:i/>
-          <w:bCs w:val="0"/>
-          <w:iCs w:val="0"/>
+          <w:bCs w:val="0"/>
+          <w:i w:val="1"/>
+          <w:iCs w:val="1"/>
           <w:rtl w:val="0"/>
         </w:rPr>
         <w:t xml:space="preserve">et al.</w:t>
@@ -2159,8 +2535,8 @@
       <w:r>
         <w:rPr>
           <w:b w:val="0"/>
-          <w:i w:val="0"/>
-          <w:bCs w:val="0"/>
+          <w:bCs w:val="0"/>
+          <w:i w:val="0"/>
           <w:iCs w:val="0"/>
           <w:rtl w:val="0"/>
         </w:rPr>
@@ -2169,9 +2545,9 @@
       <w:r>
         <w:rPr>
           <w:b w:val="0"/>
-          <w:i/>
-          <w:bCs w:val="0"/>
-          <w:iCs w:val="0"/>
+          <w:bCs w:val="0"/>
+          <w:i w:val="1"/>
+          <w:iCs w:val="1"/>
           <w:rtl w:val="0"/>
         </w:rPr>
         <w:t xml:space="preserve">harness</w:t>
@@ -2179,12 +2555,17 @@
       <w:r>
         <w:rPr>
           <w:b w:val="0"/>
-          <w:i w:val="0"/>
-          <w:bCs w:val="0"/>
+          <w:bCs w:val="0"/>
+          <w:i w:val="0"/>
           <w:iCs w:val="0"/>
           <w:rtl w:val="0"/>
         </w:rPr>
         <w:t xml:space="preserve"> que não é o do fornecedor do modelo. Por isso o desenho terá dois níveis de modelo.</w:t>
+      </w:r>
+      <w:r>
+        <w:rPr>
+          <w:rtl w:val="0"/>
+        </w:rPr>
       </w:r>
     </w:p>
     <w:p>
@@ -2219,8 +2600,8 @@
       <w:r>
         <w:rPr>
           <w:b w:val="0"/>
-          <w:i w:val="0"/>
-          <w:bCs w:val="0"/>
+          <w:bCs w:val="0"/>
+          <w:i w:val="0"/>
           <w:iCs w:val="0"/>
           <w:rtl w:val="0"/>
         </w:rPr>
@@ -2229,9 +2610,9 @@
       <w:r>
         <w:rPr>
           <w:b w:val="0"/>
-          <w:i/>
-          <w:bCs w:val="0"/>
-          <w:iCs w:val="0"/>
+          <w:bCs w:val="0"/>
+          <w:i w:val="1"/>
+          <w:iCs w:val="1"/>
           <w:rtl w:val="0"/>
         </w:rPr>
         <w:t xml:space="preserve">harnesses</w:t>
@@ -2239,8 +2620,8 @@
       <w:r>
         <w:rPr>
           <w:b w:val="0"/>
-          <w:i w:val="0"/>
-          <w:bCs w:val="0"/>
+          <w:bCs w:val="0"/>
+          <w:i w:val="0"/>
           <w:iCs w:val="0"/>
           <w:rtl w:val="0"/>
         </w:rPr>
@@ -2249,9 +2630,9 @@
       <w:r>
         <w:rPr>
           <w:b w:val="0"/>
-          <w:i/>
-          <w:bCs w:val="0"/>
-          <w:iCs w:val="0"/>
+          <w:bCs w:val="0"/>
+          <w:i w:val="1"/>
+          <w:iCs w:val="1"/>
           <w:rtl w:val="0"/>
         </w:rPr>
         <w:t xml:space="preserve">harness</w:t>
@@ -2259,12 +2640,17 @@
       <w:r>
         <w:rPr>
           <w:b w:val="0"/>
-          <w:i w:val="0"/>
-          <w:bCs w:val="0"/>
+          <w:bCs w:val="0"/>
+          <w:i w:val="0"/>
           <w:iCs w:val="0"/>
           <w:rtl w:val="0"/>
         </w:rPr>
         <w:t xml:space="preserve"> é a variável manipulada, e modelo, especificação, espaço de trabalho inicial e limites ficam controlados.</w:t>
+      </w:r>
+      <w:r>
+        <w:rPr>
+          <w:rtl w:val="0"/>
+        </w:rPr>
       </w:r>
     </w:p>
     <w:p>
@@ -2277,8 +2663,8 @@
       <w:r>
         <w:rPr>
           <w:b w:val="0"/>
-          <w:i w:val="0"/>
-          <w:bCs w:val="0"/>
+          <w:bCs w:val="0"/>
+          <w:i w:val="0"/>
           <w:iCs w:val="0"/>
           <w:rtl w:val="0"/>
         </w:rPr>
@@ -2287,9 +2673,9 @@
       <w:r>
         <w:rPr>
           <w:b w:val="0"/>
-          <w:i/>
-          <w:bCs w:val="0"/>
-          <w:iCs w:val="0"/>
+          <w:bCs w:val="0"/>
+          <w:i w:val="1"/>
+          <w:iCs w:val="1"/>
           <w:rtl w:val="0"/>
         </w:rPr>
         <w:t xml:space="preserve">LLM Wiki</w:t>
@@ -2297,12 +2683,17 @@
       <w:r>
         <w:rPr>
           <w:b w:val="0"/>
-          <w:i w:val="0"/>
-          <w:bCs w:val="0"/>
+          <w:bCs w:val="0"/>
+          <w:i w:val="0"/>
           <w:iCs w:val="0"/>
           <w:rtl w:val="0"/>
         </w:rPr>
         <w:t xml:space="preserve"> de Karpathy (2026) no repositório do projeto (YuukiFST, 2026c), nas decisões do Finn, mapeadas com o Helmsman (YuukiFST, 2026a), e na sua versão de referência. O autor conferiu cada afirmação citada na obra original e responde pelo texto e pelas decisões de produto.</w:t>
+      </w:r>
+      <w:r>
+        <w:rPr>
+          <w:rtl w:val="0"/>
+        </w:rPr>
       </w:r>
     </w:p>
     <w:p>
@@ -2315,8 +2706,8 @@
       <w:r>
         <w:rPr>
           <w:b w:val="0"/>
-          <w:i w:val="0"/>
-          <w:bCs w:val="0"/>
+          <w:bCs w:val="0"/>
+          <w:i w:val="0"/>
           <w:iCs w:val="0"/>
           <w:rtl w:val="0"/>
         </w:rPr>
@@ -2325,9 +2716,9 @@
       <w:r>
         <w:rPr>
           <w:b w:val="0"/>
-          <w:i/>
-          <w:bCs w:val="0"/>
-          <w:iCs w:val="0"/>
+          <w:bCs w:val="0"/>
+          <w:i w:val="1"/>
+          <w:iCs w:val="1"/>
           <w:rtl w:val="0"/>
         </w:rPr>
         <w:t xml:space="preserve">endpoint</w:t>
@@ -2335,8 +2726,8 @@
       <w:r>
         <w:rPr>
           <w:b w:val="0"/>
-          <w:i w:val="0"/>
-          <w:bCs w:val="0"/>
+          <w:bCs w:val="0"/>
+          <w:i w:val="0"/>
           <w:iCs w:val="0"/>
           <w:rtl w:val="0"/>
         </w:rPr>
@@ -2345,9 +2736,9 @@
       <w:r>
         <w:rPr>
           <w:b w:val="0"/>
-          <w:i/>
-          <w:bCs w:val="0"/>
-          <w:iCs w:val="0"/>
+          <w:bCs w:val="0"/>
+          <w:i w:val="1"/>
+          <w:iCs w:val="1"/>
           <w:rtl w:val="0"/>
         </w:rPr>
         <w:t xml:space="preserve">system prompt</w:t>
@@ -2355,12 +2746,35 @@
       <w:r>
         <w:rPr>
           <w:b w:val="0"/>
-          <w:i w:val="0"/>
-          <w:bCs w:val="0"/>
-          <w:iCs w:val="0"/>
-          <w:rtl w:val="0"/>
-        </w:rPr>
-        <w:t xml:space="preserve"> e os tokens de cada requisição, ou seja, a carga fixa de cada braço sem tarefa. A Camada 2 mede a construção do produto contra o modelo real.</w:t>
+          <w:bCs w:val="0"/>
+          <w:i w:val="0"/>
+          <w:iCs w:val="0"/>
+          <w:rtl w:val="0"/>
+        </w:rPr>
+        <w:t xml:space="preserve"> e os tokens de cada requisição, ou seja, a carga fixa de cada </w:t>
+      </w:r>
+      <w:r>
+        <w:rPr>
+          <w:i w:val="1"/>
+          <w:iCs w:val="1"/>
+          <w:rtl w:val="0"/>
+        </w:rPr>
+        <w:t xml:space="preserve">coding agent</w:t>
+      </w:r>
+      <w:r>
+        <w:rPr>
+          <w:b w:val="0"/>
+          <w:bCs w:val="0"/>
+          <w:i w:val="0"/>
+          <w:iCs w:val="0"/>
+          <w:rtl w:val="0"/>
+        </w:rPr>
+        <w:t xml:space="preserve"> sem tarefa. A Camada 2 mede a construção do produto contra o modelo real.</w:t>
+      </w:r>
+      <w:r>
+        <w:rPr>
+          <w:rtl w:val="0"/>
+        </w:rPr>
       </w:r>
     </w:p>
     <w:p>
@@ -2373,32 +2787,51 @@
       <w:r>
         <w:rPr>
           <w:b w:val="0"/>
-          <w:i w:val="0"/>
-          <w:bCs w:val="0"/>
-          <w:iCs w:val="0"/>
-          <w:rtl w:val="0"/>
-        </w:rPr>
-        <w:t xml:space="preserve">Os braços serão o OpenCode (Opencode, 2026a) e o Pi (Earendil, 2026). Os dois são de código aberto, rodam sem interface e aceitam URL base compatível com a API da OpenAI, o que permite passá-los pelo </w:t>
-      </w:r>
-      <w:r>
-        <w:rPr>
-          <w:b w:val="0"/>
-          <w:i/>
-          <w:bCs w:val="0"/>
-          <w:iCs w:val="0"/>
-          <w:rtl w:val="0"/>
-        </w:rPr>
-        <w:t xml:space="preserve">proxy</w:t>
-      </w:r>
-      <w:r>
-        <w:rPr>
-          <w:b w:val="0"/>
-          <w:i w:val="0"/>
-          <w:bCs w:val="0"/>
-          <w:iCs w:val="0"/>
-          <w:rtl w:val="0"/>
-        </w:rPr>
-        <w:t xml:space="preserve">. As versões serão fixadas e registradas no repositório (YuukiFST, 2026c).</w:t>
+          <w:bCs w:val="0"/>
+          <w:i w:val="0"/>
+          <w:iCs w:val="0"/>
+          <w:rtl w:val="0"/>
+        </w:rPr>
+        <w:t xml:space="preserve">Os </w:t>
+      </w:r>
+      <w:r>
+        <w:rPr>
+          <w:i w:val="1"/>
+          <w:iCs w:val="1"/>
+          <w:rtl w:val="0"/>
+        </w:rPr>
+        <w:t xml:space="preserve">coding agents</w:t>
+      </w:r>
+      <w:r>
+        <w:rPr>
+          <w:b w:val="0"/>
+          <w:bCs w:val="0"/>
+          <w:i w:val="0"/>
+          <w:iCs w:val="0"/>
+          <w:rtl w:val="0"/>
+        </w:rPr>
+        <w:t xml:space="preserve"> serão o OpenCode (Opencode, 2026a) e o Pi (Earendil, 2026). Os dois são de código aberto</w:t>
+      </w:r>
+      <w:r>
+        <w:rPr>
+          <w:rtl w:val="0"/>
+        </w:rPr>
+        <w:t xml:space="preserve">.</w:t>
+      </w:r>
+      <w:r>
+        <w:rPr>
+          <w:b w:val="0"/>
+          <w:bCs w:val="0"/>
+          <w:i w:val="0"/>
+          <w:iCs w:val="0"/>
+          <w:rtl w:val="0"/>
+        </w:rPr>
+        <w:t xml:space="preserve"> As versões serão fixadas e registradas no repositório (YuukiFST, 2026c).</w:t>
+      </w:r>
+      <w:r>
+        <w:rPr>
+          <w:rtl w:val="0"/>
+        </w:rPr>
       </w:r>
     </w:p>
     <w:p>
@@ -2411,8 +2844,8 @@
       <w:r>
         <w:rPr>
           <w:b w:val="0"/>
-          <w:i w:val="0"/>
-          <w:bCs w:val="0"/>
+          <w:bCs w:val="0"/>
+          <w:i w:val="0"/>
           <w:iCs w:val="0"/>
           <w:rtl w:val="0"/>
         </w:rPr>
@@ -2421,9 +2854,9 @@
       <w:r>
         <w:rPr>
           <w:b w:val="0"/>
-          <w:i/>
-          <w:bCs w:val="0"/>
-          <w:iCs w:val="0"/>
+          <w:bCs w:val="0"/>
+          <w:i w:val="1"/>
+          <w:iCs w:val="1"/>
           <w:rtl w:val="0"/>
         </w:rPr>
         <w:t xml:space="preserve">tickets</w:t>
@@ -2431,8 +2864,8 @@
       <w:r>
         <w:rPr>
           <w:b w:val="0"/>
-          <w:i w:val="0"/>
-          <w:bCs w:val="0"/>
+          <w:bCs w:val="0"/>
+          <w:i w:val="0"/>
           <w:iCs w:val="0"/>
           <w:rtl w:val="0"/>
         </w:rPr>
@@ -2441,9 +2874,9 @@
       <w:r>
         <w:rPr>
           <w:b w:val="0"/>
-          <w:i/>
-          <w:bCs w:val="0"/>
-          <w:iCs w:val="0"/>
+          <w:bCs w:val="0"/>
+          <w:i w:val="1"/>
+          <w:iCs w:val="1"/>
           <w:rtl w:val="0"/>
         </w:rPr>
         <w:t xml:space="preserve">harness</w:t>
@@ -2451,8 +2884,8 @@
       <w:r>
         <w:rPr>
           <w:b w:val="0"/>
-          <w:i w:val="0"/>
-          <w:bCs w:val="0"/>
+          <w:bCs w:val="0"/>
+          <w:i w:val="0"/>
           <w:iCs w:val="0"/>
           <w:rtl w:val="0"/>
         </w:rPr>
@@ -2461,9 +2894,9 @@
       <w:r>
         <w:rPr>
           <w:b w:val="0"/>
-          <w:i/>
-          <w:bCs w:val="0"/>
-          <w:iCs w:val="0"/>
+          <w:bCs w:val="0"/>
+          <w:i w:val="1"/>
+          <w:iCs w:val="1"/>
           <w:rtl w:val="0"/>
         </w:rPr>
         <w:t xml:space="preserve">prompt</w:t>
@@ -2471,12 +2904,35 @@
       <w:r>
         <w:rPr>
           <w:b w:val="0"/>
-          <w:i w:val="0"/>
-          <w:bCs w:val="0"/>
-          <w:iCs w:val="0"/>
-          <w:rtl w:val="0"/>
-        </w:rPr>
-        <w:t xml:space="preserve"> nos dois braços, e cada unidade parte do que o agente construiu na anterior. Nenhum código do autor entra no espaço de trabalho.</w:t>
+          <w:bCs w:val="0"/>
+          <w:i w:val="0"/>
+          <w:iCs w:val="0"/>
+          <w:rtl w:val="0"/>
+        </w:rPr>
+        <w:t xml:space="preserve"> nos dois </w:t>
+      </w:r>
+      <w:r>
+        <w:rPr>
+          <w:i w:val="1"/>
+          <w:iCs w:val="1"/>
+          <w:rtl w:val="0"/>
+        </w:rPr>
+        <w:t xml:space="preserve">coding agents</w:t>
+      </w:r>
+      <w:r>
+        <w:rPr>
+          <w:b w:val="0"/>
+          <w:bCs w:val="0"/>
+          <w:i w:val="0"/>
+          <w:iCs w:val="0"/>
+          <w:rtl w:val="0"/>
+        </w:rPr>
+        <w:t xml:space="preserve">, e cada unidade parte do que o agente construiu na anterior. Nenhum código do autor entra no espaço de trabalho.</w:t>
+      </w:r>
+      <w:r>
+        <w:rPr>
+          <w:rtl w:val="0"/>
+        </w:rPr>
       </w:r>
     </w:p>
     <w:p>
@@ -2489,12 +2945,17 @@
       <w:r>
         <w:rPr>
           <w:b w:val="0"/>
-          <w:i w:val="0"/>
-          <w:bCs w:val="0"/>
+          <w:bCs w:val="0"/>
+          <w:i w:val="0"/>
           <w:iCs w:val="0"/>
           <w:rtl w:val="0"/>
         </w:rPr>
         <w:t xml:space="preserve">A pontuação será a fração dos testes de aceitação aprovados. O autor escreverá os testes antes da execução, fora do espaço de trabalho, e os rodará sobre uma cópia dele ao fim de cada unidade. Todos devem passar antes na referência, no marco da etapa. Os testes escritos pelo agente não contam, e uma unidade conta como concluída quando todos os seus testes passam.</w:t>
+      </w:r>
+      <w:r>
+        <w:rPr>
+          <w:rtl w:val="0"/>
+        </w:rPr>
       </w:r>
     </w:p>
     <w:p>
@@ -2512,12 +2973,16 @@
           <w:iCs w:val="0"/>
           <w:rtl w:val="0"/>
         </w:rPr>
-        <w:t xml:space="preserve">Serão dois níveis de modelo, primário e de robustez, ambos gratuitos no mesmo </w:t>
-      </w:r>
-      <w:r>
-        <w:rPr>
-          <w:b w:val="0"/>
-          <w:bCs w:val="0"/>
+        <w:t xml:space="preserve">Serão dois níveis de modelo, primário e de robustez, ambos gratuitos no mesm</w:t>
+      </w:r>
+      <w:r>
+        <w:rPr>
+          <w:rtl w:val="0"/>
+        </w:rPr>
+        <w:t xml:space="preserve">o </w:t>
+      </w:r>
+      <w:r>
+        <w:rPr>
           <w:i w:val="1"/>
           <w:iCs w:val="1"/>
           <w:rtl w:val="0"/>
@@ -2526,13 +2991,27 @@
       </w:r>
       <w:r>
         <w:rPr>
-          <w:b w:val="0"/>
-          <w:bCs w:val="0"/>
-          <w:i w:val="0"/>
-          <w:iCs w:val="0"/>
-          <w:rtl w:val="0"/>
-        </w:rPr>
-        <w:t xml:space="preserve"> (Opencode, 2026b), com resultados relatados por nível. Se a ordenação dos braços inverter de um nível para o outro, a inversão será reportada como resultado.</w:t>
+          <w:rtl w:val="0"/>
+        </w:rPr>
+        <w:t xml:space="preserve"> (Opencode, 2026b), com resultados relatados por nível. Se a ordenação dos </w:t>
+      </w:r>
+      <w:r>
+        <w:rPr>
+          <w:i w:val="1"/>
+          <w:iCs w:val="1"/>
+          <w:rtl w:val="0"/>
+        </w:rPr>
+        <w:t xml:space="preserve">coding agents</w:t>
+      </w:r>
+      <w:r>
+        <w:rPr>
+          <w:b w:val="0"/>
+          <w:bCs w:val="0"/>
+          <w:i w:val="0"/>
+          <w:iCs w:val="0"/>
+          <w:rtl w:val="0"/>
+        </w:rPr>
+        <w:t xml:space="preserve"> inverter de um nível para o outro, a inversão será reportada como resultado.</w:t>
       </w:r>
       <w:r>
         <w:rPr>
@@ -2550,8 +3029,8 @@
       <w:r>
         <w:rPr>
           <w:b w:val="0"/>
-          <w:i w:val="0"/>
-          <w:bCs w:val="0"/>
+          <w:bCs w:val="0"/>
+          <w:i w:val="0"/>
           <w:iCs w:val="0"/>
           <w:rtl w:val="0"/>
         </w:rPr>
@@ -2560,9 +3039,9 @@
       <w:r>
         <w:rPr>
           <w:b w:val="0"/>
-          <w:i/>
-          <w:bCs w:val="0"/>
-          <w:iCs w:val="0"/>
+          <w:bCs w:val="0"/>
+          <w:i w:val="1"/>
+          <w:iCs w:val="1"/>
           <w:rtl w:val="0"/>
         </w:rPr>
         <w:t xml:space="preserve">proxy</w:t>
@@ -2570,8 +3049,8 @@
       <w:r>
         <w:rPr>
           <w:b w:val="0"/>
-          <w:i w:val="0"/>
-          <w:bCs w:val="0"/>
+          <w:bCs w:val="0"/>
+          <w:i w:val="0"/>
           <w:iCs w:val="0"/>
           <w:rtl w:val="0"/>
         </w:rPr>
@@ -2580,9 +3059,9 @@
       <w:r>
         <w:rPr>
           <w:b w:val="0"/>
-          <w:i/>
-          <w:bCs w:val="0"/>
-          <w:iCs w:val="0"/>
+          <w:bCs w:val="0"/>
+          <w:i w:val="1"/>
+          <w:iCs w:val="1"/>
           <w:rtl w:val="0"/>
         </w:rPr>
         <w:t xml:space="preserve">gateway</w:t>
@@ -2590,8 +3069,8 @@
       <w:r>
         <w:rPr>
           <w:b w:val="0"/>
-          <w:i w:val="0"/>
-          <w:bCs w:val="0"/>
+          <w:bCs w:val="0"/>
+          <w:i w:val="0"/>
           <w:iCs w:val="0"/>
           <w:rtl w:val="0"/>
         </w:rPr>
@@ -2600,9 +3079,9 @@
       <w:r>
         <w:rPr>
           <w:b w:val="0"/>
-          <w:i/>
-          <w:bCs w:val="0"/>
-          <w:iCs w:val="0"/>
+          <w:bCs w:val="0"/>
+          <w:i w:val="1"/>
+          <w:iCs w:val="1"/>
           <w:rtl w:val="0"/>
         </w:rPr>
         <w:t xml:space="preserve">system prompt</w:t>
@@ -2610,8 +3089,8 @@
       <w:r>
         <w:rPr>
           <w:b w:val="0"/>
-          <w:i w:val="0"/>
-          <w:bCs w:val="0"/>
+          <w:bCs w:val="0"/>
+          <w:i w:val="0"/>
           <w:iCs w:val="0"/>
           <w:rtl w:val="0"/>
         </w:rPr>
@@ -2620,9 +3099,9 @@
       <w:r>
         <w:rPr>
           <w:b w:val="0"/>
-          <w:i/>
-          <w:bCs w:val="0"/>
-          <w:iCs w:val="0"/>
+          <w:bCs w:val="0"/>
+          <w:i w:val="1"/>
+          <w:iCs w:val="1"/>
           <w:rtl w:val="0"/>
         </w:rPr>
         <w:t xml:space="preserve">harness</w:t>
@@ -2630,12 +3109,17 @@
       <w:r>
         <w:rPr>
           <w:b w:val="0"/>
-          <w:i w:val="0"/>
-          <w:bCs w:val="0"/>
+          <w:bCs w:val="0"/>
+          <w:i w:val="0"/>
           <w:iCs w:val="0"/>
           <w:rtl w:val="0"/>
         </w:rPr>
         <w:t xml:space="preserve"> serve só para verificação cruzada.</w:t>
+      </w:r>
+      <w:r>
+        <w:rPr>
+          <w:rtl w:val="0"/>
+        </w:rPr>
       </w:r>
     </w:p>
     <w:p>
@@ -2653,7 +3137,43 @@
           <w:iCs w:val="0"/>
           <w:rtl w:val="0"/>
         </w:rPr>
-        <w:t xml:space="preserve">Haverá um único limite, igual para os dois braços: tempo de relógio por unidade, de três vezes a maior mediana dos braços nas unidades-piloto. O número de passos fica livre, porque um teto de passos é decisão de projeto de </w:t>
+        <w:t xml:space="preserve">Haverá um único limite, igual para os dois </w:t>
+      </w:r>
+      <w:r>
+        <w:rPr>
+          <w:i w:val="1"/>
+          <w:iCs w:val="1"/>
+          <w:rtl w:val="0"/>
+        </w:rPr>
+        <w:t xml:space="preserve">coding agents</w:t>
+      </w:r>
+      <w:r>
+        <w:rPr>
+          <w:b w:val="0"/>
+          <w:bCs w:val="0"/>
+          <w:i w:val="0"/>
+          <w:iCs w:val="0"/>
+          <w:rtl w:val="0"/>
+        </w:rPr>
+        <w:t xml:space="preserve">: tempo de relógio por unidade, de três vezes a maior mediana dos </w:t>
+      </w:r>
+      <w:r>
+        <w:rPr>
+          <w:i w:val="1"/>
+          <w:iCs w:val="1"/>
+          <w:rtl w:val="0"/>
+        </w:rPr>
+        <w:t xml:space="preserve">coding agents</w:t>
+      </w:r>
+      <w:r>
+        <w:rPr>
+          <w:b w:val="0"/>
+          <w:bCs w:val="0"/>
+          <w:i w:val="0"/>
+          <w:iCs w:val="0"/>
+          <w:rtl w:val="0"/>
+        </w:rPr>
+        <w:t xml:space="preserve"> nas unidades-piloto. O número de passos fica livre, porque um teto de passos é decisão de projeto de </w:t>
       </w:r>
       <w:r>
         <w:rPr>
@@ -2697,7 +3217,26 @@
           <w:iCs w:val="0"/>
           <w:rtl w:val="0"/>
         </w:rPr>
-        <w:t xml:space="preserve">Cada combinação de braço e nível terá ao menos três construções completas válidas, relatadas em mediana e dispersão.</w:t>
+        <w:t xml:space="preserve">Cada combinação de </w:t>
+      </w:r>
+      <w:r>
+        <w:rPr>
+          <w:i w:val="1"/>
+          <w:iCs w:val="1"/>
+          <w:rtl w:val="0"/>
+        </w:rPr>
+        <w:t xml:space="preserve">coding agent</w:t>
+      </w:r>
+      <w:r>
+        <w:rPr>
+          <w:rFonts w:ascii="Gungsuh" w:cs="Gungsuh" w:eastAsia="Gungsuh" w:hAnsi="Gungsuh"/>
+          <w:b w:val="0"/>
+          <w:bCs w:val="0"/>
+          <w:i w:val="0"/>
+          <w:iCs w:val="0"/>
+          <w:rtl w:val="0"/>
+        </w:rPr>
+        <w:t xml:space="preserve"> e nível terá ao menos três construções completas válidas, relatadas em mediana e dispersão.</w:t>
       </w:r>
       <w:r>
         <w:rPr>
@@ -2715,12 +3254,59 @@
       <w:r>
         <w:rPr>
           <w:b w:val="0"/>
-          <w:i w:val="0"/>
-          <w:bCs w:val="0"/>
-          <w:iCs w:val="0"/>
-          <w:rtl w:val="0"/>
-        </w:rPr>
-        <w:t xml:space="preserve">A comparação usará o teste de Wilcoxon dos postos sinalizados, bilateral, α = 0,05, sobre tokens e Succ/Mtok, pareado por unidade. O pareamento remove a dificuldade comum aos dois braços (Miller, 2024). O resultado principal será a razão entre as medianas de tokens por construção dos braços. A fração de testes aprovados será relatada sem teste, pois um empate em 100% não deixa diferença a testar. As predições serão registradas antes da coleta.</w:t>
+          <w:bCs w:val="0"/>
+          <w:i w:val="0"/>
+          <w:iCs w:val="0"/>
+          <w:rtl w:val="0"/>
+        </w:rPr>
+        <w:t xml:space="preserve">A comparação usará o teste de Wilcoxon dos postos sinalizados, bilateral, α = 0,05, sobre tokens e Succ/Mtok, pareado por unidade. O pareamento remove a dificuldade comum </w:t>
+      </w:r>
+      <w:r>
+        <w:rPr>
+          <w:rtl w:val="0"/>
+        </w:rPr>
+        <w:t xml:space="preserve">em ambos </w:t>
+      </w:r>
+      <w:r>
+        <w:rPr>
+          <w:i w:val="1"/>
+          <w:iCs w:val="1"/>
+          <w:rtl w:val="0"/>
+        </w:rPr>
+        <w:t xml:space="preserve">coding agents </w:t>
+      </w:r>
+      <w:r>
+        <w:rPr>
+          <w:b w:val="0"/>
+          <w:bCs w:val="0"/>
+          <w:i w:val="0"/>
+          <w:iCs w:val="0"/>
+          <w:rtl w:val="0"/>
+        </w:rPr>
+        <w:t xml:space="preserve">(Miller, 2024). O resultado principal será a razão entre as medianas de tokens por construção dos </w:t>
+      </w:r>
+      <w:r>
+        <w:rPr>
+          <w:i w:val="1"/>
+          <w:iCs w:val="1"/>
+          <w:rtl w:val="0"/>
+        </w:rPr>
+        <w:t xml:space="preserve">coding agents</w:t>
+      </w:r>
+      <w:r>
+        <w:rPr>
+          <w:b w:val="0"/>
+          <w:bCs w:val="0"/>
+          <w:i w:val="0"/>
+          <w:iCs w:val="0"/>
+          <w:rtl w:val="0"/>
+        </w:rPr>
+        <w:t xml:space="preserve">. A fração de testes aprovados será relatada sem teste, pois um empate em 100% não deixa diferença a testar. As predições serão registradas antes da coleta.</w:t>
+      </w:r>
+      <w:r>
+        <w:rPr>
+          <w:rtl w:val="0"/>
+        </w:rPr>
       </w:r>
     </w:p>
     <w:p>
@@ -2775,8 +3361,8 @@
       <w:r>
         <w:rPr>
           <w:b w:val="0"/>
-          <w:i w:val="0"/>
-          <w:bCs w:val="0"/>
+          <w:bCs w:val="0"/>
+          <w:i w:val="0"/>
           <w:iCs w:val="0"/>
           <w:rtl w:val="0"/>
         </w:rPr>
@@ -2785,9 +3371,9 @@
       <w:r>
         <w:rPr>
           <w:b w:val="0"/>
-          <w:i/>
-          <w:bCs w:val="0"/>
-          <w:iCs w:val="0"/>
+          <w:bCs w:val="0"/>
+          <w:i w:val="1"/>
+          <w:iCs w:val="1"/>
           <w:rtl w:val="0"/>
         </w:rPr>
         <w:t xml:space="preserve">harness</w:t>
@@ -2795,19 +3381,37 @@
       <w:r>
         <w:rPr>
           <w:b w:val="0"/>
-          <w:i w:val="0"/>
-          <w:bCs w:val="0"/>
-          <w:iCs w:val="0"/>
-          <w:rtl w:val="0"/>
-        </w:rPr>
-        <w:t xml:space="preserve"> depende do modelo, então as conclusões valem por nível. O produto é um único SaaS, especificado a partir da solução do autor. Cada braço carrega os próprios erros de uma unidade à seguinte, então as unidades não são independentes, embora o teste de Wilcoxon suponha que sejam; o valor-p será lido como indicativo, ao lado da diferença e da dispersão. Por fim, o nível gratuito do </w:t>
-      </w:r>
-      <w:r>
-        <w:rPr>
-          <w:b w:val="0"/>
-          <w:i/>
-          <w:bCs w:val="0"/>
-          <w:iCs w:val="0"/>
+          <w:bCs w:val="0"/>
+          <w:i w:val="0"/>
+          <w:iCs w:val="0"/>
+          <w:rtl w:val="0"/>
+        </w:rPr>
+        <w:t xml:space="preserve"> depende do modelo, então as conclusões valem por nível. O produto é um único SaaS, especificado a partir da solução do autor. Cada </w:t>
+      </w:r>
+      <w:r>
+        <w:rPr>
+          <w:i w:val="1"/>
+          <w:iCs w:val="1"/>
+          <w:rtl w:val="0"/>
+        </w:rPr>
+        <w:t xml:space="preserve">coding agent</w:t>
+      </w:r>
+      <w:r>
+        <w:rPr>
+          <w:b w:val="0"/>
+          <w:bCs w:val="0"/>
+          <w:i w:val="0"/>
+          <w:iCs w:val="0"/>
+          <w:rtl w:val="0"/>
+        </w:rPr>
+        <w:t xml:space="preserve"> carrega os próprios erros de uma unidade à seguinte, então as unidades não são independentes, embora o teste de Wilcoxon suponha que sejam; o valor-p será lido como indicativo, ao lado da diferença e da dispersão. Por fim, o nível gratuito do </w:t>
+      </w:r>
+      <w:r>
+        <w:rPr>
+          <w:b w:val="0"/>
+          <w:bCs w:val="0"/>
+          <w:i w:val="1"/>
+          <w:iCs w:val="1"/>
           <w:rtl w:val="0"/>
         </w:rPr>
         <w:t xml:space="preserve">gateway</w:t>
@@ -2815,12 +3419,17 @@
       <w:r>
         <w:rPr>
           <w:b w:val="0"/>
-          <w:i w:val="0"/>
-          <w:bCs w:val="0"/>
+          <w:bCs w:val="0"/>
+          <w:i w:val="0"/>
           <w:iCs w:val="0"/>
           <w:rtl w:val="0"/>
         </w:rPr>
         <w:t xml:space="preserve"> pode trocar o modelo ou cortar a cota durante a coleta.</w:t>
+      </w:r>
+      <w:r>
+        <w:rPr>
+          <w:rtl w:val="0"/>
+        </w:rPr>
       </w:r>
     </w:p>
     <w:p>
@@ -3130,12 +3739,19 @@
             <w:r>
               <w:rPr>
                 <w:b w:val="0"/>
+                <w:bCs w:val="0"/>
                 <w:i w:val="0"/>
+                <w:iCs w:val="0"/>
                 <w:sz w:val="22"/>
                 <w:szCs w:val="22"/>
                 <w:rtl w:val="0"/>
               </w:rPr>
               <w:t xml:space="preserve">R$ 0,00</w:t>
+            </w:r>
+            <w:r>
+              <w:rPr>
+                <w:rtl w:val="0"/>
+              </w:rPr>
             </w:r>
           </w:p>
         </w:tc>
@@ -3260,7 +3876,7 @@
     <w:tbl>
       <w:tblPr>
         <w:tblStyle w:val="Table2"/>
-        <w:tblW w:w="9071" w:type="dxa"/>
+        <w:tblW w:w="9071.0" w:type="dxa"/>
         <w:jc w:val="center"/>
         <w:tblBorders>
           <w:top w:color="000000" w:space="0" w:sz="4" w:val="single"/>
@@ -3271,10 +3887,6 @@
           <w:insideV w:color="000000" w:space="0" w:sz="4" w:val="single"/>
         </w:tblBorders>
         <w:tblLayout w:type="fixed"/>
-        <w:tblCellMar>
-          <w:left w:w="57" w:type="dxa"/>
-          <w:right w:w="57" w:type="dxa"/>
-        </w:tblCellMar>
         <w:tblLook w:val="0400"/>
       </w:tblPr>
       <w:tblGrid>
@@ -3593,14 +4205,19 @@
             <w:r>
               <w:rPr>
                 <w:b w:val="0"/>
+                <w:bCs w:val="0"/>
                 <w:i w:val="0"/>
-                <w:bCs w:val="0"/>
                 <w:iCs w:val="0"/>
                 <w:sz w:val="18"/>
                 <w:szCs w:val="18"/>
                 <w:rtl w:val="0"/>
               </w:rPr>
               <w:t xml:space="preserve">FINN DE REFERÊNCIA, PROXY E TESTES</w:t>
+            </w:r>
+            <w:r>
+              <w:rPr>
+                <w:rtl w:val="0"/>
+              </w:rPr>
             </w:r>
           </w:p>
         </w:tc>
@@ -3701,6 +4318,11 @@
               </w:rPr>
               <w:t xml:space="preserve">X</w:t>
             </w:r>
+            <w:r>
+              <w:rPr>
+                <w:rtl w:val="0"/>
+              </w:rPr>
+            </w:r>
           </w:p>
         </w:tc>
         <w:tc>
@@ -3718,6 +4340,11 @@
                 <w:rtl w:val="0"/>
               </w:rPr>
               <w:t xml:space="preserve">X</w:t>
+            </w:r>
+            <w:r>
+              <w:rPr>
+                <w:rtl w:val="0"/>
+              </w:rPr>
             </w:r>
           </w:p>
         </w:tc>
@@ -3780,6 +4407,11 @@
               </w:rPr>
               <w:t xml:space="preserve">X</w:t>
             </w:r>
+            <w:r>
+              <w:rPr>
+                <w:rtl w:val="0"/>
+              </w:rPr>
+            </w:r>
           </w:p>
         </w:tc>
         <w:tc>
@@ -3797,6 +4429,11 @@
                 <w:rtl w:val="0"/>
               </w:rPr>
               <w:t xml:space="preserve">X</w:t>
+            </w:r>
+            <w:r>
+              <w:rPr>
+                <w:rtl w:val="0"/>
+              </w:rPr>
             </w:r>
           </w:p>
         </w:tc>
@@ -3859,6 +4496,11 @@
               </w:rPr>
               <w:t xml:space="preserve">X</w:t>
             </w:r>
+            <w:r>
+              <w:rPr>
+                <w:rtl w:val="0"/>
+              </w:rPr>
+            </w:r>
           </w:p>
         </w:tc>
         <w:tc>
@@ -3876,6 +4518,11 @@
                 <w:rtl w:val="0"/>
               </w:rPr>
               <w:t xml:space="preserve">X</w:t>
+            </w:r>
+            <w:r>
+              <w:rPr>
+                <w:rtl w:val="0"/>
+              </w:rPr>
             </w:r>
           </w:p>
         </w:tc>
@@ -4100,6 +4747,11 @@
               </w:rPr>
               <w:t xml:space="preserve">X</w:t>
             </w:r>
+            <w:r>
+              <w:rPr>
+                <w:rtl w:val="0"/>
+              </w:rPr>
+            </w:r>
           </w:p>
         </w:tc>
         <w:tc>
@@ -4117,6 +4769,11 @@
                 <w:rtl w:val="0"/>
               </w:rPr>
               <w:t xml:space="preserve">X</w:t>
+            </w:r>
+            <w:r>
+              <w:rPr>
+                <w:rtl w:val="0"/>
+              </w:rPr>
             </w:r>
           </w:p>
         </w:tc>
@@ -4758,8 +5415,8 @@
       <w:r>
         <w:rPr>
           <w:b w:val="0"/>
-          <w:i w:val="0"/>
-          <w:bCs w:val="0"/>
+          <w:bCs w:val="0"/>
+          <w:i w:val="0"/>
           <w:iCs w:val="0"/>
           <w:rtl w:val="0"/>
         </w:rPr>
@@ -4767,9 +5424,9 @@
       </w:r>
       <w:r>
         <w:rPr>
-          <w:b/>
-          <w:i w:val="0"/>
-          <w:bCs w:val="0"/>
+          <w:b w:val="1"/>
+          <w:bCs w:val="1"/>
+          <w:i w:val="0"/>
           <w:iCs w:val="0"/>
           <w:rtl w:val="0"/>
         </w:rPr>
@@ -4778,12 +5435,17 @@
       <w:r>
         <w:rPr>
           <w:b w:val="0"/>
-          <w:i w:val="0"/>
-          <w:bCs w:val="0"/>
+          <w:bCs w:val="0"/>
+          <w:i w:val="0"/>
           <w:iCs w:val="0"/>
           <w:rtl w:val="0"/>
         </w:rPr>
         <w:t xml:space="preserve">. 2025. Publicação de blogue de engenharia (Anthropic), não revisada por pares. Disponível em: https://www.anthropic.com/engineering/effective-harnesses-for-long-running-agents. Acesso em: 24 set. 2026.</w:t>
+      </w:r>
+      <w:r>
+        <w:rPr>
+          <w:rtl w:val="0"/>
+        </w:rPr>
       </w:r>
     </w:p>
     <w:p>
@@ -5258,9 +5920,9 @@
       <w:tblStyleColBandSize w:val="1"/>
       <w:tblCellMar>
         <w:top w:w="0.0" w:type="dxa"/>
-        <w:left w:w="108.0" w:type="dxa"/>
+        <w:left w:w="57.0" w:type="dxa"/>
         <w:bottom w:w="0.0" w:type="dxa"/>
-        <w:right w:w="108.0" w:type="dxa"/>
+        <w:right w:w="57.0" w:type="dxa"/>
       </w:tblCellMar>
     </w:tblPr>
   </w:style>

</xml_diff>

<commit_message>
docs(project): fix citations the sources do not support
Lin et al. never states the model of Table 1's human-written harnesses,
so [68] drops "sobre o GPT-5.4"; Zhang's claim regains "often"; [69]
names the harness tax again; [76] cites Pan and the OpenCode repository
for open source; [77] counts the 24 decision tickets of the Finn map.
Also fixes grammar left by 9c0fe11 in [44], [83] and [84], and trims
three one-word last lines so Word stays at 9 pages.

Refs #83
</commit_message>
<xml_diff>
--- a/dist/projeto-de-pesquisa.docx
+++ b/dist/projeto-de-pesquisa.docx
@@ -885,19 +885,19 @@
       <w:r>
         <w:rPr>
           <w:b w:val="0"/>
-          <w:bCs w:val="0"/>
-          <w:i w:val="0"/>
-          <w:iCs w:val="0"/>
-          <w:rtl w:val="0"/>
-        </w:rPr>
-        <w:t xml:space="preserve">Quem paga por tokens paga pagando também essa diferença. Essas medições usam tarefas isoladas de </w:t>
-      </w:r>
-      <w:r>
-        <w:rPr>
-          <w:b w:val="0"/>
-          <w:bCs w:val="0"/>
-          <w:i w:val="1"/>
-          <w:iCs w:val="1"/>
+          <w:i w:val="0"/>
+          <w:bCs w:val="0"/>
+          <w:iCs w:val="0"/>
+          <w:rtl w:val="0"/>
+        </w:rPr>
+        <w:t xml:space="preserve">Quem paga por tokens paga também essa diferença. Essas medições usam tarefas isoladas de </w:t>
+      </w:r>
+      <w:r>
+        <w:rPr>
+          <w:b w:val="0"/>
+          <w:i/>
+          <w:bCs w:val="0"/>
+          <w:iCs w:val="0"/>
           <w:rtl w:val="0"/>
         </w:rPr>
         <w:t xml:space="preserve">benchmarks</w:t>
@@ -905,8 +905,8 @@
       <w:r>
         <w:rPr>
           <w:b w:val="0"/>
-          <w:bCs w:val="0"/>
-          <w:i w:val="0"/>
+          <w:i w:val="0"/>
+          <w:bCs w:val="0"/>
           <w:iCs w:val="0"/>
           <w:rtl w:val="0"/>
         </w:rPr>
@@ -915,9 +915,9 @@
       <w:r>
         <w:rPr>
           <w:b w:val="0"/>
-          <w:bCs w:val="0"/>
-          <w:i w:val="1"/>
-          <w:iCs w:val="1"/>
+          <w:i/>
+          <w:bCs w:val="0"/>
+          <w:iCs w:val="0"/>
           <w:rtl w:val="0"/>
         </w:rPr>
         <w:t xml:space="preserve">harness</w:t>
@@ -925,67 +925,19 @@
       <w:r>
         <w:rPr>
           <w:b w:val="0"/>
-          <w:bCs w:val="0"/>
-          <w:i w:val="0"/>
-          <w:iCs w:val="0"/>
-          <w:rtl w:val="0"/>
-        </w:rPr>
-        <w:t xml:space="preserve"> em fluxos reais de desenvolvimento, com tarefas de várias sessões. Este projeto constrói o mesmo produto, o Finn, um </w:t>
-      </w:r>
-      <w:r>
-        <w:rPr>
-          <w:rtl w:val="0"/>
-        </w:rPr>
-        <w:t xml:space="preserve">SaaS voltado para o setor financeiro das empresas, e ele será construído</w:t>
-      </w:r>
-      <w:r>
-        <w:rPr>
-          <w:b w:val="0"/>
-          <w:bCs w:val="0"/>
-          <w:i w:val="0"/>
-          <w:iCs w:val="0"/>
-          <w:rtl w:val="0"/>
-        </w:rPr>
-        <w:t xml:space="preserve"> com o OpenCode e com o Pi, sobre o mesmo modelo e a mesma especificação, e </w:t>
-      </w:r>
-      <w:r>
-        <w:rPr>
-          <w:rtl w:val="0"/>
-        </w:rPr>
-        <w:t xml:space="preserve">a </w:t>
-      </w:r>
-      <w:r>
-        <w:rPr>
-          <w:b w:val="0"/>
-          <w:bCs w:val="0"/>
-          <w:i w:val="0"/>
-          <w:iCs w:val="0"/>
-          <w:rtl w:val="0"/>
-        </w:rPr>
-        <w:t xml:space="preserve">conta </w:t>
-      </w:r>
-      <w:r>
-        <w:rPr>
-          <w:rtl w:val="0"/>
-        </w:rPr>
-        <w:t xml:space="preserve">de</w:t>
-      </w:r>
-      <w:r>
-        <w:rPr>
-          <w:b w:val="0"/>
-          <w:bCs w:val="0"/>
-          <w:i w:val="0"/>
-          <w:iCs w:val="0"/>
-          <w:rtl w:val="0"/>
-        </w:rPr>
-        <w:t xml:space="preserve"> tokens fora do </w:t>
-      </w:r>
-      <w:r>
-        <w:rPr>
-          <w:b w:val="0"/>
-          <w:bCs w:val="0"/>
-          <w:i w:val="1"/>
-          <w:iCs w:val="1"/>
+          <w:i w:val="0"/>
+          <w:bCs w:val="0"/>
+          <w:iCs w:val="0"/>
+          <w:rtl w:val="0"/>
+        </w:rPr>
+        <w:t xml:space="preserve"> em fluxos reais de desenvolvimento, com tarefas de várias sessões. Este projeto constrói o mesmo produto com o OpenCode e com o Pi, sobre o mesmo modelo e a mesma especificação, e conta os tokens fora do </w:t>
+      </w:r>
+      <w:r>
+        <w:rPr>
+          <w:b w:val="0"/>
+          <w:i/>
+          <w:bCs w:val="0"/>
+          <w:iCs w:val="0"/>
           <w:rtl w:val="0"/>
         </w:rPr>
         <w:t xml:space="preserve">harness</w:t>
@@ -993,17 +945,12 @@
       <w:r>
         <w:rPr>
           <w:b w:val="0"/>
-          <w:bCs w:val="0"/>
-          <w:i w:val="0"/>
-          <w:iCs w:val="0"/>
-          <w:rtl w:val="0"/>
-        </w:rPr>
-        <w:t xml:space="preserve">.</w:t>
-      </w:r>
-      <w:r>
-        <w:rPr>
-          <w:rtl w:val="0"/>
-        </w:rPr>
+          <w:i w:val="0"/>
+          <w:bCs w:val="0"/>
+          <w:iCs w:val="0"/>
+          <w:rtl w:val="0"/>
+        </w:rPr>
+        <w:t xml:space="preserve">. O produto é o Finn, um SaaS voltado para o setor financeiro das empresas.</w:t>
       </w:r>
     </w:p>
     <w:p>
@@ -1887,8 +1834,8 @@
       <w:r>
         <w:rPr>
           <w:b w:val="0"/>
-          <w:bCs w:val="0"/>
-          <w:i w:val="0"/>
+          <w:i w:val="0"/>
+          <w:bCs w:val="0"/>
           <w:iCs w:val="0"/>
           <w:rtl w:val="0"/>
         </w:rPr>
@@ -1897,9 +1844,9 @@
       <w:r>
         <w:rPr>
           <w:b w:val="0"/>
-          <w:bCs w:val="0"/>
-          <w:i w:val="1"/>
-          <w:iCs w:val="1"/>
+          <w:i/>
+          <w:bCs w:val="0"/>
+          <w:iCs w:val="0"/>
           <w:rtl w:val="0"/>
         </w:rPr>
         <w:t xml:space="preserve">et al.</w:t>
@@ -1907,8 +1854,8 @@
       <w:r>
         <w:rPr>
           <w:b w:val="0"/>
-          <w:bCs w:val="0"/>
-          <w:i w:val="0"/>
+          <w:i w:val="0"/>
+          <w:bCs w:val="0"/>
           <w:iCs w:val="0"/>
           <w:rtl w:val="0"/>
         </w:rPr>
@@ -1917,9 +1864,9 @@
       <w:r>
         <w:rPr>
           <w:b w:val="0"/>
-          <w:bCs w:val="0"/>
-          <w:i w:val="1"/>
-          <w:iCs w:val="1"/>
+          <w:i/>
+          <w:bCs w:val="0"/>
+          <w:iCs w:val="0"/>
           <w:rtl w:val="0"/>
         </w:rPr>
         <w:t xml:space="preserve">harness</w:t>
@@ -1927,8 +1874,8 @@
       <w:r>
         <w:rPr>
           <w:b w:val="0"/>
-          <w:bCs w:val="0"/>
-          <w:i w:val="0"/>
+          <w:i w:val="0"/>
+          <w:bCs w:val="0"/>
           <w:iCs w:val="0"/>
           <w:rtl w:val="0"/>
         </w:rPr>
@@ -1937,9 +1884,9 @@
       <w:r>
         <w:rPr>
           <w:b w:val="0"/>
-          <w:bCs w:val="0"/>
-          <w:i w:val="1"/>
-          <w:iCs w:val="1"/>
+          <w:i/>
+          <w:bCs w:val="0"/>
+          <w:iCs w:val="0"/>
           <w:rtl w:val="0"/>
         </w:rPr>
         <w:t xml:space="preserve">et al.</w:t>
@@ -1947,17 +1894,12 @@
       <w:r>
         <w:rPr>
           <w:b w:val="0"/>
-          <w:bCs w:val="0"/>
-          <w:i w:val="0"/>
-          <w:iCs w:val="0"/>
-          <w:rtl w:val="0"/>
-        </w:rPr>
-        <w:t xml:space="preserve"> (2026) delimitam o que essa camada contém:</w:t>
-      </w:r>
-      <w:r>
-        <w:rPr>
-          <w:rtl w:val="0"/>
-        </w:rPr>
+          <w:i w:val="0"/>
+          <w:bCs w:val="0"/>
+          <w:iCs w:val="0"/>
+          <w:rtl w:val="0"/>
+        </w:rPr>
+        <w:t xml:space="preserve"> (2026) delimitam essa camada:</w:t>
       </w:r>
     </w:p>
     <w:p>
@@ -2128,8 +2070,8 @@
       <w:r>
         <w:rPr>
           <w:b w:val="0"/>
-          <w:bCs w:val="0"/>
-          <w:i w:val="0"/>
+          <w:i w:val="0"/>
+          <w:bCs w:val="0"/>
           <w:iCs w:val="0"/>
           <w:rtl w:val="0"/>
         </w:rPr>
@@ -2138,9 +2080,9 @@
       <w:r>
         <w:rPr>
           <w:b w:val="0"/>
-          <w:bCs w:val="0"/>
-          <w:i w:val="1"/>
-          <w:iCs w:val="1"/>
+          <w:i/>
+          <w:bCs w:val="0"/>
+          <w:iCs w:val="0"/>
           <w:rtl w:val="0"/>
         </w:rPr>
         <w:t xml:space="preserve">et al.</w:t>
@@ -2148,8 +2090,8 @@
       <w:r>
         <w:rPr>
           <w:b w:val="0"/>
-          <w:bCs w:val="0"/>
-          <w:i w:val="0"/>
+          <w:i w:val="0"/>
+          <w:bCs w:val="0"/>
           <w:iCs w:val="0"/>
           <w:rtl w:val="0"/>
         </w:rPr>
@@ -2158,9 +2100,9 @@
       <w:r>
         <w:rPr>
           <w:b w:val="0"/>
-          <w:bCs w:val="0"/>
-          <w:i w:val="1"/>
-          <w:iCs w:val="1"/>
+          <w:i/>
+          <w:bCs w:val="0"/>
+          <w:iCs w:val="0"/>
           <w:rtl w:val="0"/>
         </w:rPr>
         <w:t xml:space="preserve">harnesses</w:t>
@@ -2168,19 +2110,19 @@
       <w:r>
         <w:rPr>
           <w:b w:val="0"/>
-          <w:bCs w:val="0"/>
-          <w:i w:val="0"/>
-          <w:iCs w:val="0"/>
-          <w:rtl w:val="0"/>
-        </w:rPr>
-        <w:t xml:space="preserve"> escritos por humanos sobre o GPT-5.4 vão de 47,2% de aprovação no OpenCode a 71,9% no Codex, no Terminal-Bench 2. Zhang </w:t>
-      </w:r>
-      <w:r>
-        <w:rPr>
-          <w:b w:val="0"/>
-          <w:bCs w:val="0"/>
-          <w:i w:val="1"/>
-          <w:iCs w:val="1"/>
+          <w:i w:val="0"/>
+          <w:bCs w:val="0"/>
+          <w:iCs w:val="0"/>
+          <w:rtl w:val="0"/>
+        </w:rPr>
+        <w:t xml:space="preserve"> escritos por humanos vão de 47,2% de aprovação no OpenCode a 71,9% no Codex, no Terminal-Bench 2. Zhang </w:t>
+      </w:r>
+      <w:r>
+        <w:rPr>
+          <w:b w:val="0"/>
+          <w:i/>
+          <w:bCs w:val="0"/>
+          <w:iCs w:val="0"/>
           <w:rtl w:val="0"/>
         </w:rPr>
         <w:t xml:space="preserve">et al.</w:t>
@@ -2188,8 +2130,8 @@
       <w:r>
         <w:rPr>
           <w:b w:val="0"/>
-          <w:bCs w:val="0"/>
-          <w:i w:val="0"/>
+          <w:i w:val="0"/>
+          <w:bCs w:val="0"/>
           <w:iCs w:val="0"/>
           <w:rtl w:val="0"/>
         </w:rPr>
@@ -2198,9 +2140,9 @@
       <w:r>
         <w:rPr>
           <w:b w:val="0"/>
-          <w:bCs w:val="0"/>
-          <w:i w:val="1"/>
-          <w:iCs w:val="1"/>
+          <w:i/>
+          <w:bCs w:val="0"/>
+          <w:iCs w:val="0"/>
           <w:rtl w:val="0"/>
         </w:rPr>
         <w:t xml:space="preserve">harness</w:t>
@@ -2208,19 +2150,19 @@
       <w:r>
         <w:rPr>
           <w:b w:val="0"/>
-          <w:bCs w:val="0"/>
-          <w:i w:val="0"/>
-          <w:iCs w:val="0"/>
-          <w:rtl w:val="0"/>
-        </w:rPr>
-        <w:t xml:space="preserve"> é comparável ou maior que a devida ao modelo. Pan </w:t>
-      </w:r>
-      <w:r>
-        <w:rPr>
-          <w:b w:val="0"/>
-          <w:bCs w:val="0"/>
-          <w:i w:val="1"/>
-          <w:iCs w:val="1"/>
+          <w:i w:val="0"/>
+          <w:bCs w:val="0"/>
+          <w:iCs w:val="0"/>
+          <w:rtl w:val="0"/>
+        </w:rPr>
+        <w:t xml:space="preserve"> é frequentemente comparável ou maior que a devida ao modelo. Pan </w:t>
+      </w:r>
+      <w:r>
+        <w:rPr>
+          <w:b w:val="0"/>
+          <w:i/>
+          <w:bCs w:val="0"/>
+          <w:iCs w:val="0"/>
           <w:rtl w:val="0"/>
         </w:rPr>
         <w:t xml:space="preserve">et al.</w:t>
@@ -2228,8 +2170,8 @@
       <w:r>
         <w:rPr>
           <w:b w:val="0"/>
-          <w:bCs w:val="0"/>
-          <w:i w:val="0"/>
+          <w:i w:val="0"/>
+          <w:bCs w:val="0"/>
           <w:iCs w:val="0"/>
           <w:rtl w:val="0"/>
         </w:rPr>
@@ -2238,9 +2180,9 @@
       <w:r>
         <w:rPr>
           <w:b w:val="0"/>
-          <w:bCs w:val="0"/>
-          <w:i w:val="1"/>
-          <w:iCs w:val="1"/>
+          <w:i/>
+          <w:bCs w:val="0"/>
+          <w:iCs w:val="0"/>
           <w:rtl w:val="0"/>
         </w:rPr>
         <w:t xml:space="preserve">harness</w:t>
@@ -2248,17 +2190,12 @@
       <w:r>
         <w:rPr>
           <w:b w:val="0"/>
-          <w:bCs w:val="0"/>
-          <w:i w:val="0"/>
+          <w:i w:val="0"/>
+          <w:bCs w:val="0"/>
           <w:iCs w:val="0"/>
           <w:rtl w:val="0"/>
         </w:rPr>
         <w:t xml:space="preserve"> sobre a taxa de sucesso ficou dentro de ±2%, enquanto o Claude Code custou, em média, cerca de 2,0 vezes o Pi. Como as fontes divergem sobre o sucesso, este projeto mede sucesso e custo juntos.</w:t>
-      </w:r>
-      <w:r>
-        <w:rPr>
-          <w:rtl w:val="0"/>
-        </w:rPr>
       </w:r>
     </w:p>
     <w:p>
@@ -2271,8 +2208,8 @@
       <w:r>
         <w:rPr>
           <w:b w:val="0"/>
-          <w:bCs w:val="0"/>
-          <w:i w:val="0"/>
+          <w:i w:val="0"/>
+          <w:bCs w:val="0"/>
           <w:iCs w:val="0"/>
           <w:rtl w:val="0"/>
         </w:rPr>
@@ -2281,9 +2218,9 @@
       <w:r>
         <w:rPr>
           <w:b w:val="0"/>
-          <w:bCs w:val="0"/>
-          <w:i w:val="1"/>
-          <w:iCs w:val="1"/>
+          <w:i/>
+          <w:bCs w:val="0"/>
+          <w:iCs w:val="0"/>
           <w:rtl w:val="0"/>
         </w:rPr>
         <w:t xml:space="preserve">et al.</w:t>
@@ -2291,19 +2228,39 @@
       <w:r>
         <w:rPr>
           <w:b w:val="0"/>
-          <w:bCs w:val="0"/>
-          <w:i w:val="0"/>
-          <w:iCs w:val="0"/>
-          <w:rtl w:val="0"/>
-        </w:rPr>
-        <w:t xml:space="preserve"> (2026), o imposto pode começar na primeira requisição: nos sete modelos, o contexto inicial médio do Claude Code passa de dez vezes o do Pi, e no Claude Fable 5 os turnos quase se igualam (15,3 contra 15,4). Liu </w:t>
-      </w:r>
-      <w:r>
-        <w:rPr>
-          <w:b w:val="0"/>
-          <w:bCs w:val="0"/>
-          <w:i w:val="1"/>
-          <w:iCs w:val="1"/>
+          <w:i w:val="0"/>
+          <w:bCs w:val="0"/>
+          <w:iCs w:val="0"/>
+          <w:rtl w:val="0"/>
+        </w:rPr>
+        <w:t xml:space="preserve"> (2026), o imposto do </w:t>
+      </w:r>
+      <w:r>
+        <w:rPr>
+          <w:b w:val="0"/>
+          <w:i/>
+          <w:bCs w:val="0"/>
+          <w:iCs w:val="0"/>
+          <w:rtl w:val="0"/>
+        </w:rPr>
+        <w:t xml:space="preserve">harness</w:t>
+      </w:r>
+      <w:r>
+        <w:rPr>
+          <w:b w:val="0"/>
+          <w:i w:val="0"/>
+          <w:bCs w:val="0"/>
+          <w:iCs w:val="0"/>
+          <w:rtl w:val="0"/>
+        </w:rPr>
+        <w:t xml:space="preserve"> pode começar na primeira requisição: nos sete modelos, o contexto inicial médio do Claude Code passa de dez vezes o do Pi, e no Claude Fable 5 os turnos quase se igualam (15,3 contra 15,4). Liu </w:t>
+      </w:r>
+      <w:r>
+        <w:rPr>
+          <w:b w:val="0"/>
+          <w:i/>
+          <w:bCs w:val="0"/>
+          <w:iCs w:val="0"/>
           <w:rtl w:val="0"/>
         </w:rPr>
         <w:t xml:space="preserve">et al.</w:t>
@@ -2311,8 +2268,8 @@
       <w:r>
         <w:rPr>
           <w:b w:val="0"/>
-          <w:bCs w:val="0"/>
-          <w:i w:val="0"/>
+          <w:i w:val="0"/>
+          <w:bCs w:val="0"/>
           <w:iCs w:val="0"/>
           <w:rtl w:val="0"/>
         </w:rPr>
@@ -2321,9 +2278,9 @@
       <w:r>
         <w:rPr>
           <w:b w:val="0"/>
-          <w:bCs w:val="0"/>
-          <w:i w:val="1"/>
-          <w:iCs w:val="1"/>
+          <w:i/>
+          <w:bCs w:val="0"/>
+          <w:iCs w:val="0"/>
           <w:rtl w:val="0"/>
         </w:rPr>
         <w:t xml:space="preserve">et al.</w:t>
@@ -2331,8 +2288,8 @@
       <w:r>
         <w:rPr>
           <w:b w:val="0"/>
-          <w:bCs w:val="0"/>
-          <w:i w:val="0"/>
+          <w:i w:val="0"/>
+          <w:bCs w:val="0"/>
           <w:iCs w:val="0"/>
           <w:rtl w:val="0"/>
         </w:rPr>
@@ -2341,9 +2298,9 @@
       <w:r>
         <w:rPr>
           <w:b w:val="0"/>
-          <w:bCs w:val="0"/>
-          <w:i w:val="1"/>
-          <w:iCs w:val="1"/>
+          <w:i/>
+          <w:bCs w:val="0"/>
+          <w:iCs w:val="0"/>
           <w:rtl w:val="0"/>
         </w:rPr>
         <w:t xml:space="preserve">harness</w:t>
@@ -2351,17 +2308,12 @@
       <w:r>
         <w:rPr>
           <w:b w:val="0"/>
-          <w:bCs w:val="0"/>
-          <w:i w:val="0"/>
+          <w:i w:val="0"/>
+          <w:bCs w:val="0"/>
           <w:iCs w:val="0"/>
           <w:rtl w:val="0"/>
         </w:rPr>
         <w:t xml:space="preserve">”, e H2 testa se pesa mais a carga fixa ou a conversa.</w:t>
-      </w:r>
-      <w:r>
-        <w:rPr>
-          <w:rtl w:val="0"/>
-        </w:rPr>
       </w:r>
     </w:p>
     <w:p>
@@ -2663,8 +2615,8 @@
       <w:r>
         <w:rPr>
           <w:b w:val="0"/>
-          <w:bCs w:val="0"/>
-          <w:i w:val="0"/>
+          <w:i w:val="0"/>
+          <w:bCs w:val="0"/>
           <w:iCs w:val="0"/>
           <w:rtl w:val="0"/>
         </w:rPr>
@@ -2673,9 +2625,9 @@
       <w:r>
         <w:rPr>
           <w:b w:val="0"/>
-          <w:bCs w:val="0"/>
-          <w:i w:val="1"/>
-          <w:iCs w:val="1"/>
+          <w:i/>
+          <w:bCs w:val="0"/>
+          <w:iCs w:val="0"/>
           <w:rtl w:val="0"/>
         </w:rPr>
         <w:t xml:space="preserve">LLM Wiki</w:t>
@@ -2683,17 +2635,12 @@
       <w:r>
         <w:rPr>
           <w:b w:val="0"/>
-          <w:bCs w:val="0"/>
-          <w:i w:val="0"/>
-          <w:iCs w:val="0"/>
-          <w:rtl w:val="0"/>
-        </w:rPr>
-        <w:t xml:space="preserve"> de Karpathy (2026) no repositório do projeto (YuukiFST, 2026c), nas decisões do Finn, mapeadas com o Helmsman (YuukiFST, 2026a), e na sua versão de referência. O autor conferiu cada afirmação citada na obra original e responde pelo texto e pelas decisões de produto.</w:t>
-      </w:r>
-      <w:r>
-        <w:rPr>
-          <w:rtl w:val="0"/>
-        </w:rPr>
+          <w:i w:val="0"/>
+          <w:bCs w:val="0"/>
+          <w:iCs w:val="0"/>
+          <w:rtl w:val="0"/>
+        </w:rPr>
+        <w:t xml:space="preserve"> de Karpathy (2026) no repositório do projeto (YuukiFST, 2026c), nas decisões do Finn, mapeadas com o Helmsman (YuukiFST, 2026a), e na sua versão de referência. O autor conferiu cada afirmação citada na obra e responde pelo texto e pelas decisões de produto.</w:t>
       </w:r>
     </w:p>
     <w:p>
@@ -2706,8 +2653,8 @@
       <w:r>
         <w:rPr>
           <w:b w:val="0"/>
-          <w:bCs w:val="0"/>
-          <w:i w:val="0"/>
+          <w:i w:val="0"/>
+          <w:bCs w:val="0"/>
           <w:iCs w:val="0"/>
           <w:rtl w:val="0"/>
         </w:rPr>
@@ -2716,9 +2663,9 @@
       <w:r>
         <w:rPr>
           <w:b w:val="0"/>
-          <w:bCs w:val="0"/>
-          <w:i w:val="1"/>
-          <w:iCs w:val="1"/>
+          <w:i/>
+          <w:bCs w:val="0"/>
+          <w:iCs w:val="0"/>
           <w:rtl w:val="0"/>
         </w:rPr>
         <w:t xml:space="preserve">endpoint</w:t>
@@ -2726,8 +2673,8 @@
       <w:r>
         <w:rPr>
           <w:b w:val="0"/>
-          <w:bCs w:val="0"/>
-          <w:i w:val="0"/>
+          <w:i w:val="0"/>
+          <w:bCs w:val="0"/>
           <w:iCs w:val="0"/>
           <w:rtl w:val="0"/>
         </w:rPr>
@@ -2736,9 +2683,9 @@
       <w:r>
         <w:rPr>
           <w:b w:val="0"/>
-          <w:bCs w:val="0"/>
-          <w:i w:val="1"/>
-          <w:iCs w:val="1"/>
+          <w:i/>
+          <w:bCs w:val="0"/>
+          <w:iCs w:val="0"/>
           <w:rtl w:val="0"/>
         </w:rPr>
         <w:t xml:space="preserve">system prompt</w:t>
@@ -2746,8 +2693,8 @@
       <w:r>
         <w:rPr>
           <w:b w:val="0"/>
-          <w:bCs w:val="0"/>
-          <w:i w:val="0"/>
+          <w:i w:val="0"/>
+          <w:bCs w:val="0"/>
           <w:iCs w:val="0"/>
           <w:rtl w:val="0"/>
         </w:rPr>
@@ -2755,8 +2702,10 @@
       </w:r>
       <w:r>
         <w:rPr>
-          <w:i w:val="1"/>
-          <w:iCs w:val="1"/>
+          <w:b w:val="0"/>
+          <w:i/>
+          <w:bCs w:val="0"/>
+          <w:iCs w:val="0"/>
           <w:rtl w:val="0"/>
         </w:rPr>
         <w:t xml:space="preserve">coding agent</w:t>
@@ -2764,17 +2713,12 @@
       <w:r>
         <w:rPr>
           <w:b w:val="0"/>
-          <w:bCs w:val="0"/>
-          <w:i w:val="0"/>
-          <w:iCs w:val="0"/>
-          <w:rtl w:val="0"/>
-        </w:rPr>
-        <w:t xml:space="preserve"> sem tarefa. A Camada 2 mede a construção do produto contra o modelo real.</w:t>
-      </w:r>
-      <w:r>
-        <w:rPr>
-          <w:rtl w:val="0"/>
-        </w:rPr>
+          <w:i w:val="0"/>
+          <w:bCs w:val="0"/>
+          <w:iCs w:val="0"/>
+          <w:rtl w:val="0"/>
+        </w:rPr>
+        <w:t xml:space="preserve"> sem tarefa. A Camada 2 mede a construção contra o modelo real.</w:t>
       </w:r>
     </w:p>
     <w:p>
@@ -2787,8 +2731,8 @@
       <w:r>
         <w:rPr>
           <w:b w:val="0"/>
-          <w:bCs w:val="0"/>
-          <w:i w:val="0"/>
+          <w:i w:val="0"/>
+          <w:bCs w:val="0"/>
           <w:iCs w:val="0"/>
           <w:rtl w:val="0"/>
         </w:rPr>
@@ -2796,8 +2740,10 @@
       </w:r>
       <w:r>
         <w:rPr>
-          <w:i w:val="1"/>
-          <w:iCs w:val="1"/>
+          <w:b w:val="0"/>
+          <w:i/>
+          <w:bCs w:val="0"/>
+          <w:iCs w:val="0"/>
           <w:rtl w:val="0"/>
         </w:rPr>
         <w:t xml:space="preserve">coding agents</w:t>
@@ -2805,33 +2751,32 @@
       <w:r>
         <w:rPr>
           <w:b w:val="0"/>
-          <w:bCs w:val="0"/>
-          <w:i w:val="0"/>
-          <w:iCs w:val="0"/>
-          <w:rtl w:val="0"/>
-        </w:rPr>
-        <w:t xml:space="preserve"> serão o OpenCode (Opencode, 2026a) e o Pi (Earendil, 2026). Os dois são de código aberto</w:t>
-      </w:r>
-      <w:r>
-        <w:rPr>
-          <w:rtl w:val="0"/>
-        </w:rPr>
-        <w:t xml:space="preserve">.</w:t>
-      </w:r>
-      <w:r>
-        <w:rPr>
-          <w:b w:val="0"/>
-          <w:bCs w:val="0"/>
-          <w:i w:val="0"/>
-          <w:iCs w:val="0"/>
-          <w:rtl w:val="0"/>
-        </w:rPr>
-        <w:t xml:space="preserve"> As versões serão fixadas e registradas no repositório (YuukiFST, 2026c).</w:t>
-      </w:r>
-      <w:r>
-        <w:rPr>
-          <w:rtl w:val="0"/>
-        </w:rPr>
+          <w:i w:val="0"/>
+          <w:bCs w:val="0"/>
+          <w:iCs w:val="0"/>
+          <w:rtl w:val="0"/>
+        </w:rPr>
+        <w:t xml:space="preserve"> serão o OpenCode (Opencode, 2026a) e o Pi (Earendil, 2026). Os dois são de código aberto (Opencode, 2026a; Pan </w:t>
+      </w:r>
+      <w:r>
+        <w:rPr>
+          <w:b w:val="0"/>
+          <w:i/>
+          <w:bCs w:val="0"/>
+          <w:iCs w:val="0"/>
+          <w:rtl w:val="0"/>
+        </w:rPr>
+        <w:t xml:space="preserve">et al.</w:t>
+      </w:r>
+      <w:r>
+        <w:rPr>
+          <w:b w:val="0"/>
+          <w:i w:val="0"/>
+          <w:bCs w:val="0"/>
+          <w:iCs w:val="0"/>
+          <w:rtl w:val="0"/>
+        </w:rPr>
+        <w:t xml:space="preserve">, 2026). As versões serão fixadas e registradas no repositório (YuukiFST, 2026c).</w:t>
       </w:r>
     </w:p>
     <w:p>
@@ -2844,19 +2789,19 @@
       <w:r>
         <w:rPr>
           <w:b w:val="0"/>
-          <w:bCs w:val="0"/>
-          <w:i w:val="0"/>
-          <w:iCs w:val="0"/>
-          <w:rtl w:val="0"/>
-        </w:rPr>
-        <w:t xml:space="preserve">O produto será o Finn, SaaS multiempresa em que a empresa cliente fala com o próprio financeiro por voz e recebe lançamento, relatório e aviso no celular (YuukiFST, 2026b), decidido em 21 </w:t>
-      </w:r>
-      <w:r>
-        <w:rPr>
-          <w:b w:val="0"/>
-          <w:bCs w:val="0"/>
-          <w:i w:val="1"/>
-          <w:iCs w:val="1"/>
+          <w:i w:val="0"/>
+          <w:bCs w:val="0"/>
+          <w:iCs w:val="0"/>
+          <w:rtl w:val="0"/>
+        </w:rPr>
+        <w:t xml:space="preserve">O produto será o Finn, SaaS multiempresa em que a empresa cliente fala com o próprio financeiro por voz e recebe lançamento, relatório e aviso no celular (YuukiFST, 2026b), decidido em 24 </w:t>
+      </w:r>
+      <w:r>
+        <w:rPr>
+          <w:b w:val="0"/>
+          <w:i/>
+          <w:bCs w:val="0"/>
+          <w:iCs w:val="0"/>
           <w:rtl w:val="0"/>
         </w:rPr>
         <w:t xml:space="preserve">tickets</w:t>
@@ -2864,8 +2809,8 @@
       <w:r>
         <w:rPr>
           <w:b w:val="0"/>
-          <w:bCs w:val="0"/>
-          <w:i w:val="0"/>
+          <w:i w:val="0"/>
+          <w:bCs w:val="0"/>
           <w:iCs w:val="0"/>
           <w:rtl w:val="0"/>
         </w:rPr>
@@ -2874,9 +2819,9 @@
       <w:r>
         <w:rPr>
           <w:b w:val="0"/>
-          <w:bCs w:val="0"/>
-          <w:i w:val="1"/>
-          <w:iCs w:val="1"/>
+          <w:i/>
+          <w:bCs w:val="0"/>
+          <w:iCs w:val="0"/>
           <w:rtl w:val="0"/>
         </w:rPr>
         <w:t xml:space="preserve">harness</w:t>
@@ -2884,8 +2829,8 @@
       <w:r>
         <w:rPr>
           <w:b w:val="0"/>
-          <w:bCs w:val="0"/>
-          <w:i w:val="0"/>
+          <w:i w:val="0"/>
+          <w:bCs w:val="0"/>
           <w:iCs w:val="0"/>
           <w:rtl w:val="0"/>
         </w:rPr>
@@ -2894,9 +2839,9 @@
       <w:r>
         <w:rPr>
           <w:b w:val="0"/>
-          <w:bCs w:val="0"/>
-          <w:i w:val="1"/>
-          <w:iCs w:val="1"/>
+          <w:i/>
+          <w:bCs w:val="0"/>
+          <w:iCs w:val="0"/>
           <w:rtl w:val="0"/>
         </w:rPr>
         <w:t xml:space="preserve">prompt</w:t>
@@ -2904,8 +2849,8 @@
       <w:r>
         <w:rPr>
           <w:b w:val="0"/>
-          <w:bCs w:val="0"/>
-          <w:i w:val="0"/>
+          <w:i w:val="0"/>
+          <w:bCs w:val="0"/>
           <w:iCs w:val="0"/>
           <w:rtl w:val="0"/>
         </w:rPr>
@@ -2913,8 +2858,10 @@
       </w:r>
       <w:r>
         <w:rPr>
-          <w:i w:val="1"/>
-          <w:iCs w:val="1"/>
+          <w:b w:val="0"/>
+          <w:i/>
+          <w:bCs w:val="0"/>
+          <w:iCs w:val="0"/>
           <w:rtl w:val="0"/>
         </w:rPr>
         <w:t xml:space="preserve">coding agents</w:t>
@@ -2922,17 +2869,12 @@
       <w:r>
         <w:rPr>
           <w:b w:val="0"/>
-          <w:bCs w:val="0"/>
-          <w:i w:val="0"/>
+          <w:i w:val="0"/>
+          <w:bCs w:val="0"/>
           <w:iCs w:val="0"/>
           <w:rtl w:val="0"/>
         </w:rPr>
         <w:t xml:space="preserve">, e cada unidade parte do que o agente construiu na anterior. Nenhum código do autor entra no espaço de trabalho.</w:t>
-      </w:r>
-      <w:r>
-        <w:rPr>
-          <w:rtl w:val="0"/>
-        </w:rPr>
       </w:r>
     </w:p>
     <w:p>
@@ -3254,41 +3196,19 @@
       <w:r>
         <w:rPr>
           <w:b w:val="0"/>
-          <w:bCs w:val="0"/>
-          <w:i w:val="0"/>
-          <w:iCs w:val="0"/>
-          <w:rtl w:val="0"/>
-        </w:rPr>
-        <w:t xml:space="preserve">A comparação usará o teste de Wilcoxon dos postos sinalizados, bilateral, α = 0,05, sobre tokens e Succ/Mtok, pareado por unidade. O pareamento remove a dificuldade comum </w:t>
-      </w:r>
-      <w:r>
-        <w:rPr>
-          <w:rtl w:val="0"/>
-        </w:rPr>
-        <w:t xml:space="preserve">em ambos </w:t>
-      </w:r>
-      <w:r>
-        <w:rPr>
-          <w:i w:val="1"/>
-          <w:iCs w:val="1"/>
-          <w:rtl w:val="0"/>
-        </w:rPr>
-        <w:t xml:space="preserve">coding agents </w:t>
-      </w:r>
-      <w:r>
-        <w:rPr>
-          <w:b w:val="0"/>
-          <w:bCs w:val="0"/>
-          <w:i w:val="0"/>
-          <w:iCs w:val="0"/>
-          <w:rtl w:val="0"/>
-        </w:rPr>
-        <w:t xml:space="preserve">(Miller, 2024). O resultado principal será a razão entre as medianas de tokens por construção dos </w:t>
-      </w:r>
-      <w:r>
-        <w:rPr>
-          <w:i w:val="1"/>
-          <w:iCs w:val="1"/>
+          <w:i w:val="0"/>
+          <w:bCs w:val="0"/>
+          <w:iCs w:val="0"/>
+          <w:rtl w:val="0"/>
+        </w:rPr>
+        <w:t xml:space="preserve">A comparação usará o teste de Wilcoxon dos postos sinalizados, bilateral, α = 0,05, sobre tokens e Succ/Mtok, pareado por unidade. O pareamento remove a dificuldade comum aos dois </w:t>
+      </w:r>
+      <w:r>
+        <w:rPr>
+          <w:b w:val="0"/>
+          <w:i/>
+          <w:bCs w:val="0"/>
+          <w:iCs w:val="0"/>
           <w:rtl w:val="0"/>
         </w:rPr>
         <w:t xml:space="preserve">coding agents</w:t>
@@ -3296,17 +3216,32 @@
       <w:r>
         <w:rPr>
           <w:b w:val="0"/>
-          <w:bCs w:val="0"/>
-          <w:i w:val="0"/>
+          <w:i w:val="0"/>
+          <w:bCs w:val="0"/>
+          <w:iCs w:val="0"/>
+          <w:rtl w:val="0"/>
+        </w:rPr>
+        <w:t xml:space="preserve"> (Miller, 2024). O resultado principal será a razão entre as medianas de tokens por construção dos </w:t>
+      </w:r>
+      <w:r>
+        <w:rPr>
+          <w:b w:val="0"/>
+          <w:i/>
+          <w:bCs w:val="0"/>
+          <w:iCs w:val="0"/>
+          <w:rtl w:val="0"/>
+        </w:rPr>
+        <w:t xml:space="preserve">coding agents</w:t>
+      </w:r>
+      <w:r>
+        <w:rPr>
+          <w:b w:val="0"/>
+          <w:i w:val="0"/>
+          <w:bCs w:val="0"/>
           <w:iCs w:val="0"/>
           <w:rtl w:val="0"/>
         </w:rPr>
         <w:t xml:space="preserve">. A fração de testes aprovados será relatada sem teste, pois um empate em 100% não deixa diferença a testar. As predições serão registradas antes da coleta.</w:t>
-      </w:r>
-      <w:r>
-        <w:rPr>
-          <w:rtl w:val="0"/>
-        </w:rPr>
       </w:r>
     </w:p>
     <w:p>
@@ -3319,17 +3254,12 @@
       <w:r>
         <w:rPr>
           <w:b w:val="0"/>
-          <w:bCs w:val="0"/>
-          <w:i w:val="0"/>
-          <w:iCs w:val="0"/>
-          <w:rtl w:val="0"/>
-        </w:rPr>
-        <w:t xml:space="preserve">Unidade não concluída conta como resultado, com a fração de testes aprovada, e a construção segue. Medição não confiável, como a troca do modelo servido no meio da coleta, descarta a construção inteira.</w:t>
-      </w:r>
-      <w:r>
-        <w:rPr>
-          <w:rtl w:val="0"/>
-        </w:rPr>
+          <w:i w:val="0"/>
+          <w:bCs w:val="0"/>
+          <w:iCs w:val="0"/>
+          <w:rtl w:val="0"/>
+        </w:rPr>
+        <w:t xml:space="preserve">Unidade não concluída conta como resultado, com a fração de testes aprovados, e a construção segue. Medição não confiável, como a troca do modelo servido no meio da coleta, descarta a construção inteira.</w:t>
       </w:r>
     </w:p>
     <w:p>

</xml_diff>